<commit_message>
Doc aggiornata con Class Diagram
</commit_message>
<xml_diff>
--- a/3_Documentazione/DocumentazioneFyt.docx
+++ b/3_Documentazione/DocumentazioneFyt.docx
@@ -10740,22 +10740,20 @@
         </w:rPr>
         <w:t xml:space="preserve"> CON LE VERSIONI</w:t>
       </w:r>
-      <w:bookmarkStart w:id="20" w:name="_GoBack"/>
+    </w:p>
+    <w:p>
+      <w:pPr>
+        <w:pStyle w:val="Titolo3"/>
+      </w:pPr>
+      <w:bookmarkStart w:id="20" w:name="_Toc413411420"/>
+      <w:bookmarkStart w:id="21" w:name="_Toc94790453"/>
+      <w:bookmarkStart w:id="22" w:name="_Toc189853861"/>
+      <w:r>
+        <w:t>Hardware</w:t>
+      </w:r>
       <w:bookmarkEnd w:id="20"/>
-    </w:p>
-    <w:p>
-      <w:pPr>
-        <w:pStyle w:val="Titolo3"/>
-      </w:pPr>
-      <w:bookmarkStart w:id="21" w:name="_Toc413411420"/>
-      <w:bookmarkStart w:id="22" w:name="_Toc94790453"/>
-      <w:bookmarkStart w:id="23" w:name="_Toc189853861"/>
-      <w:r>
-        <w:t>Hardware</w:t>
-      </w:r>
       <w:bookmarkEnd w:id="21"/>
       <w:bookmarkEnd w:id="22"/>
-      <w:bookmarkEnd w:id="23"/>
     </w:p>
     <w:p>
       <w:r>
@@ -10824,30 +10822,30 @@
       <w:pPr>
         <w:pStyle w:val="Titolo1"/>
       </w:pPr>
-      <w:bookmarkStart w:id="24" w:name="_Toc429059808"/>
-      <w:bookmarkStart w:id="25" w:name="_Toc94790454"/>
-      <w:bookmarkStart w:id="26" w:name="_Toc189853862"/>
+      <w:bookmarkStart w:id="23" w:name="_Toc429059808"/>
+      <w:bookmarkStart w:id="24" w:name="_Toc94790454"/>
+      <w:bookmarkStart w:id="25" w:name="_Toc189853862"/>
       <w:r>
         <w:lastRenderedPageBreak/>
         <w:t>Progettazione</w:t>
       </w:r>
+      <w:bookmarkEnd w:id="23"/>
       <w:bookmarkEnd w:id="24"/>
       <w:bookmarkEnd w:id="25"/>
+    </w:p>
+    <w:p>
+      <w:pPr>
+        <w:pStyle w:val="Titolo2"/>
+      </w:pPr>
+      <w:bookmarkStart w:id="26" w:name="_Toc429059809"/>
+      <w:bookmarkStart w:id="27" w:name="_Toc94790455"/>
+      <w:bookmarkStart w:id="28" w:name="_Toc189853863"/>
+      <w:r>
+        <w:t>Design dell’architettura del sistema</w:t>
+      </w:r>
       <w:bookmarkEnd w:id="26"/>
-    </w:p>
-    <w:p>
-      <w:pPr>
-        <w:pStyle w:val="Titolo2"/>
-      </w:pPr>
-      <w:bookmarkStart w:id="27" w:name="_Toc429059809"/>
-      <w:bookmarkStart w:id="28" w:name="_Toc94790455"/>
-      <w:bookmarkStart w:id="29" w:name="_Toc189853863"/>
-      <w:r>
-        <w:t>Design dell’architettura del sistema</w:t>
-      </w:r>
       <w:bookmarkEnd w:id="27"/>
       <w:bookmarkEnd w:id="28"/>
-      <w:bookmarkEnd w:id="29"/>
     </w:p>
     <w:p>
       <w:pPr>
@@ -11009,15 +11007,15 @@
       <w:pPr>
         <w:pStyle w:val="Titolo2"/>
       </w:pPr>
-      <w:bookmarkStart w:id="30" w:name="_Toc429059811"/>
-      <w:bookmarkStart w:id="31" w:name="_Toc94790457"/>
-      <w:bookmarkStart w:id="32" w:name="_Toc189853865"/>
+      <w:bookmarkStart w:id="29" w:name="_Toc429059811"/>
+      <w:bookmarkStart w:id="30" w:name="_Toc94790457"/>
+      <w:bookmarkStart w:id="31" w:name="_Toc189853865"/>
       <w:r>
         <w:t>Design delle interfacce</w:t>
       </w:r>
+      <w:bookmarkEnd w:id="29"/>
       <w:bookmarkEnd w:id="30"/>
       <w:bookmarkEnd w:id="31"/>
-      <w:bookmarkEnd w:id="32"/>
     </w:p>
     <w:p>
       <w:pPr>
@@ -11070,16 +11068,16 @@
         <w:pStyle w:val="Titolo2"/>
         <w:spacing w:line="480" w:lineRule="auto"/>
       </w:pPr>
-      <w:bookmarkStart w:id="33" w:name="_Toc429059812"/>
-      <w:bookmarkStart w:id="34" w:name="_Toc94790458"/>
-      <w:bookmarkStart w:id="35" w:name="_Toc189853866"/>
+      <w:bookmarkStart w:id="32" w:name="_Toc429059812"/>
+      <w:bookmarkStart w:id="33" w:name="_Toc94790458"/>
+      <w:bookmarkStart w:id="34" w:name="_Toc189853866"/>
       <w:r>
         <w:lastRenderedPageBreak/>
         <w:t>Design procedurale</w:t>
       </w:r>
+      <w:bookmarkEnd w:id="32"/>
       <w:bookmarkEnd w:id="33"/>
       <w:bookmarkEnd w:id="34"/>
-      <w:bookmarkEnd w:id="35"/>
     </w:p>
     <w:p>
       <w:pPr>
@@ -11813,8 +11811,349 @@
         <w:t>Design delle classi</w:t>
       </w:r>
     </w:p>
-    <w:p>
-      <w:pPr>
+    <w:p/>
+    <w:p>
+      <w:r>
+        <w:t>Di seguito, la descrizione generale del Class Diagram:</w:t>
+      </w:r>
+      <w:bookmarkStart w:id="35" w:name="_GoBack"/>
+      <w:bookmarkEnd w:id="35"/>
+    </w:p>
+    <w:p>
+      <w:pPr>
+        <w:spacing w:after="17"/>
+      </w:pPr>
+    </w:p>
+    <w:p>
+      <w:pPr>
+        <w:pStyle w:val="Paragrafoelenco"/>
+        <w:numPr>
+          <w:ilvl w:val="0"/>
+          <w:numId w:val="32"/>
+        </w:numPr>
+        <w:spacing w:after="20"/>
+        <w:ind w:left="714" w:hanging="357"/>
+        <w:contextualSpacing w:val="0"/>
+      </w:pPr>
+      <w:r>
+        <w:rPr>
+          <w:b/>
+        </w:rPr>
+        <w:t>User</w:t>
+      </w:r>
+      <w:r>
+        <w:t xml:space="preserve">: Classe base che rappresenta un utente generico del sistema. Include attributi come id, mail, password e </w:t>
+      </w:r>
+      <w:proofErr w:type="spellStart"/>
+      <w:r>
+        <w:t>role</w:t>
+      </w:r>
+      <w:proofErr w:type="spellEnd"/>
+      <w:r>
+        <w:t>. Fornisce metodi per effettuare il logi</w:t>
+      </w:r>
+      <w:r>
+        <w:t>n, logout e la richiesta dei prodotti al Database.</w:t>
+      </w:r>
+    </w:p>
+    <w:p>
+      <w:pPr>
+        <w:pStyle w:val="Paragrafoelenco"/>
+        <w:numPr>
+          <w:ilvl w:val="0"/>
+          <w:numId w:val="32"/>
+        </w:numPr>
+        <w:spacing w:after="20"/>
+        <w:ind w:left="714" w:hanging="357"/>
+        <w:contextualSpacing w:val="0"/>
+      </w:pPr>
+      <w:r>
+        <w:rPr>
+          <w:b/>
+        </w:rPr>
+        <w:t>Authenticator</w:t>
+      </w:r>
+      <w:r>
+        <w:t>: Classe responsabile della verifica delle credenziali degli utenti</w:t>
+      </w:r>
+      <w:r>
+        <w:t>.</w:t>
+      </w:r>
+    </w:p>
+    <w:p>
+      <w:pPr>
+        <w:pStyle w:val="Paragrafoelenco"/>
+        <w:numPr>
+          <w:ilvl w:val="0"/>
+          <w:numId w:val="32"/>
+        </w:numPr>
+        <w:spacing w:after="20"/>
+        <w:ind w:left="714" w:hanging="357"/>
+        <w:contextualSpacing w:val="0"/>
+      </w:pPr>
+      <w:r>
+        <w:rPr>
+          <w:b/>
+        </w:rPr>
+        <w:t>Account</w:t>
+      </w:r>
+      <w:r>
+        <w:t>: Classe per la gestione degli account utente, con metodi per creare</w:t>
+      </w:r>
+      <w:r>
+        <w:t xml:space="preserve"> </w:t>
+      </w:r>
+      <w:r>
+        <w:t>ed eliminare</w:t>
+      </w:r>
+      <w:r>
+        <w:t xml:space="preserve"> </w:t>
+      </w:r>
+      <w:r>
+        <w:t>un account.</w:t>
+      </w:r>
+    </w:p>
+    <w:p>
+      <w:pPr>
+        <w:pStyle w:val="Paragrafoelenco"/>
+        <w:numPr>
+          <w:ilvl w:val="0"/>
+          <w:numId w:val="32"/>
+        </w:numPr>
+        <w:spacing w:after="20"/>
+        <w:ind w:left="714" w:hanging="357"/>
+        <w:contextualSpacing w:val="0"/>
+      </w:pPr>
+      <w:r>
+        <w:rPr>
+          <w:b/>
+        </w:rPr>
+        <w:t>Vendor</w:t>
+      </w:r>
+      <w:r>
+        <w:t>: Rappresenta un venditore, con informazioni come il nome aziendale, l'indirizzo e-mail e il numero di telefono dell'azienda. Può gestire i propri prodotti e visualizzare le vendite</w:t>
+      </w:r>
+      <w:r>
+        <w:t>.</w:t>
+      </w:r>
+    </w:p>
+    <w:p>
+      <w:pPr>
+        <w:pStyle w:val="Paragrafoelenco"/>
+        <w:numPr>
+          <w:ilvl w:val="0"/>
+          <w:numId w:val="32"/>
+        </w:numPr>
+        <w:spacing w:after="20"/>
+        <w:ind w:left="714" w:hanging="357"/>
+        <w:contextualSpacing w:val="0"/>
+      </w:pPr>
+      <w:r>
+        <w:rPr>
+          <w:b/>
+        </w:rPr>
+        <w:t>Customer</w:t>
+      </w:r>
+      <w:r>
+        <w:t>: Classe che descrive il cliente finale, con attributi personali come name, surname, address e phone. Può visualizzare i prodotti, aggiungere articoli al carrello ed effettuare il checkout</w:t>
+      </w:r>
+      <w:r>
+        <w:t>.</w:t>
+      </w:r>
+    </w:p>
+    <w:p>
+      <w:pPr>
+        <w:pStyle w:val="Paragrafoelenco"/>
+        <w:numPr>
+          <w:ilvl w:val="0"/>
+          <w:numId w:val="32"/>
+        </w:numPr>
+        <w:spacing w:after="20"/>
+        <w:ind w:left="714" w:hanging="357"/>
+        <w:contextualSpacing w:val="0"/>
+      </w:pPr>
+      <w:r>
+        <w:rPr>
+          <w:b/>
+        </w:rPr>
+        <w:t>Admin</w:t>
+      </w:r>
+      <w:r>
+        <w:t>: Amministratore del sistema, con attributi personali e la possibilità di gestire utenti</w:t>
+      </w:r>
+      <w:r>
+        <w:t xml:space="preserve"> </w:t>
+      </w:r>
+      <w:r>
+        <w:t>e venditori.</w:t>
+      </w:r>
+    </w:p>
+    <w:p>
+      <w:pPr>
+        <w:pStyle w:val="Paragrafoelenco"/>
+        <w:numPr>
+          <w:ilvl w:val="0"/>
+          <w:numId w:val="32"/>
+        </w:numPr>
+        <w:spacing w:after="20"/>
+        <w:ind w:left="714" w:hanging="357"/>
+        <w:contextualSpacing w:val="0"/>
+      </w:pPr>
+      <w:r>
+        <w:rPr>
+          <w:b/>
+        </w:rPr>
+        <w:t>Order</w:t>
+      </w:r>
+      <w:r>
+        <w:t>: Rappresenta un ordine effettuato da un cliente, con attributi come l'id, l'id del cliente, il totale dell'ordine e lo stato.</w:t>
+      </w:r>
+    </w:p>
+    <w:p>
+      <w:pPr>
+        <w:pStyle w:val="Paragrafoelenco"/>
+        <w:numPr>
+          <w:ilvl w:val="0"/>
+          <w:numId w:val="32"/>
+        </w:numPr>
+        <w:spacing w:after="20"/>
+        <w:ind w:left="714" w:hanging="357"/>
+        <w:contextualSpacing w:val="0"/>
+      </w:pPr>
+      <w:r>
+        <w:rPr>
+          <w:b/>
+        </w:rPr>
+        <w:t>OrderItem</w:t>
+      </w:r>
+      <w:r>
+        <w:t>: Dettaglio di un ordine specifico, che collega un prodotto a un ordine, specificando quantità e prezzo.</w:t>
+      </w:r>
+    </w:p>
+    <w:p>
+      <w:pPr>
+        <w:pStyle w:val="Paragrafoelenco"/>
+        <w:numPr>
+          <w:ilvl w:val="0"/>
+          <w:numId w:val="32"/>
+        </w:numPr>
+        <w:spacing w:after="20"/>
+        <w:ind w:left="714" w:hanging="357"/>
+        <w:contextualSpacing w:val="0"/>
+      </w:pPr>
+      <w:r>
+        <w:rPr>
+          <w:b/>
+        </w:rPr>
+        <w:t>Cart</w:t>
+      </w:r>
+      <w:r>
+        <w:t>: Carrello di un cliente, associato al cliente stesso tramite il relativo customerId, con metodi per aggiungere, rimuovere</w:t>
+      </w:r>
+      <w:r>
+        <w:t xml:space="preserve"> </w:t>
+      </w:r>
+      <w:r>
+        <w:t>articoli e calcolare il totale</w:t>
+      </w:r>
+      <w:r>
+        <w:t>.</w:t>
+      </w:r>
+    </w:p>
+    <w:p>
+      <w:pPr>
+        <w:pStyle w:val="Paragrafoelenco"/>
+        <w:numPr>
+          <w:ilvl w:val="0"/>
+          <w:numId w:val="32"/>
+        </w:numPr>
+        <w:spacing w:after="20"/>
+        <w:ind w:left="714" w:hanging="357"/>
+        <w:contextualSpacing w:val="0"/>
+      </w:pPr>
+      <w:r>
+        <w:rPr>
+          <w:b/>
+        </w:rPr>
+        <w:t>CartItem</w:t>
+      </w:r>
+      <w:r>
+        <w:t>: Articolo presente in un carrello, con riferimento al prodotto, quantità e prezzo.</w:t>
+      </w:r>
+    </w:p>
+    <w:p>
+      <w:pPr>
+        <w:pStyle w:val="Paragrafoelenco"/>
+        <w:numPr>
+          <w:ilvl w:val="0"/>
+          <w:numId w:val="32"/>
+        </w:numPr>
+        <w:spacing w:after="20"/>
+        <w:ind w:left="714" w:hanging="357"/>
+        <w:contextualSpacing w:val="0"/>
+        <w:jc w:val="both"/>
+      </w:pPr>
+      <w:r>
+        <w:rPr>
+          <w:b/>
+        </w:rPr>
+        <w:t>Product</w:t>
+      </w:r>
+      <w:r>
+        <w:t>: Rappresenta un prodotto disponibile, con informazioni come nome, descrizione, prezzo e disponibilità di stock.</w:t>
+      </w:r>
+      <w:r>
+        <w:t xml:space="preserve"> Può aggiornare lo stock</w:t>
+      </w:r>
+      <w:r>
+        <w:t>.</w:t>
+      </w:r>
+    </w:p>
+    <w:p>
+      <w:pPr>
+        <w:pStyle w:val="Paragrafoelenco"/>
+        <w:numPr>
+          <w:ilvl w:val="0"/>
+          <w:numId w:val="32"/>
+        </w:numPr>
+        <w:spacing w:after="20"/>
+        <w:ind w:left="714" w:hanging="357"/>
+        <w:contextualSpacing w:val="0"/>
+      </w:pPr>
+      <w:r>
+        <w:rPr>
+          <w:b/>
+        </w:rPr>
+        <w:t>Security</w:t>
+      </w:r>
+      <w:r>
+        <w:t>: Classe con un solo metodo</w:t>
+      </w:r>
+      <w:r>
+        <w:t xml:space="preserve"> </w:t>
+      </w:r>
+      <w:r>
+        <w:t>destinata alla gestione della sicurezza</w:t>
+      </w:r>
+      <w:r>
+        <w:t xml:space="preserve"> dell’in</w:t>
+      </w:r>
+      <w:r>
+        <w:t>put</w:t>
+      </w:r>
+      <w:r>
+        <w:t xml:space="preserve"> </w:t>
+      </w:r>
+      <w:r>
+        <w:t xml:space="preserve">e </w:t>
+      </w:r>
+      <w:r>
+        <w:t>dei dati.</w:t>
+      </w:r>
+    </w:p>
+    <w:p>
+      <w:pPr>
+        <w:spacing w:after="17"/>
         <w:jc w:val="center"/>
         <w:rPr>
           <w:lang w:val="it-IT"/>
@@ -11823,13 +12162,13 @@
       <w:r>
         <w:rPr>
           <w:noProof/>
-          <w:lang w:val="it-IT"/>
-        </w:rPr>
+        </w:rPr>
+        <w:lastRenderedPageBreak/>
         <w:drawing>
-          <wp:inline distT="0" distB="0" distL="0" distR="0" wp14:anchorId="29A7984C" wp14:editId="5A2FDC04">
-            <wp:extent cx="4640118" cy="5106009"/>
-            <wp:effectExtent l="95250" t="133350" r="103505" b="133350"/>
-            <wp:docPr id="21" name="Immagine 21"/>
+          <wp:inline distT="0" distB="0" distL="0" distR="0" wp14:anchorId="2997DC23" wp14:editId="38D1C956">
+            <wp:extent cx="5731764" cy="6313335"/>
+            <wp:effectExtent l="114300" t="133350" r="116840" b="125730"/>
+            <wp:docPr id="12" name="Immagine 12"/>
             <wp:cNvGraphicFramePr>
               <a:graphicFrameLocks xmlns:a="http://schemas.openxmlformats.org/drawingml/2006/main" noChangeAspect="1"/>
             </wp:cNvGraphicFramePr>
@@ -11837,7 +12176,7 @@
               <a:graphicData uri="http://schemas.openxmlformats.org/drawingml/2006/picture">
                 <pic:pic xmlns:pic="http://schemas.openxmlformats.org/drawingml/2006/picture">
                   <pic:nvPicPr>
-                    <pic:cNvPr id="0" name="Picture 11"/>
+                    <pic:cNvPr id="0" name="Picture 2"/>
                     <pic:cNvPicPr>
                       <a:picLocks noChangeAspect="1" noChangeArrowheads="1"/>
                     </pic:cNvPicPr>
@@ -11858,7 +12197,7 @@
                   <pic:spPr bwMode="auto">
                     <a:xfrm>
                       <a:off x="0" y="0"/>
-                      <a:ext cx="4644269" cy="5110577"/>
+                      <a:ext cx="5749593" cy="6332973"/>
                     </a:xfrm>
                     <a:prstGeom prst="rect">
                       <a:avLst/>
@@ -11881,28 +12220,12 @@
           </wp:inline>
         </w:drawing>
       </w:r>
-    </w:p>
-    <w:p>
-      <w:pPr>
-        <w:rPr>
-          <w:lang w:val="it-IT"/>
-        </w:rPr>
-      </w:pPr>
       <w:r>
         <w:rPr>
           <w:lang w:val="it-IT"/>
         </w:rPr>
         <w:br w:type="page"/>
       </w:r>
-    </w:p>
-    <w:p>
-      <w:pPr>
-        <w:spacing w:line="360" w:lineRule="auto"/>
-        <w:jc w:val="center"/>
-        <w:rPr>
-          <w:lang w:val="it-IT"/>
-        </w:rPr>
-      </w:pPr>
     </w:p>
     <w:p>
       <w:pPr>
@@ -11915,6 +12238,7 @@
       <w:bookmarkStart w:id="37" w:name="_Toc94790459"/>
       <w:bookmarkStart w:id="38" w:name="_Toc189853867"/>
       <w:r>
+        <w:lastRenderedPageBreak/>
         <w:t>Implementazione</w:t>
       </w:r>
       <w:bookmarkEnd w:id="36"/>
@@ -17961,6 +18285,119 @@
       </w:rPr>
     </w:lvl>
   </w:abstractNum>
+  <w:abstractNum w:abstractNumId="22" w15:restartNumberingAfterBreak="0">
+    <w:nsid w:val="7F593CD8"/>
+    <w:multiLevelType w:val="hybridMultilevel"/>
+    <w:tmpl w:val="3508C29C"/>
+    <w:lvl w:ilvl="0" w:tplc="08100001">
+      <w:start w:val="1"/>
+      <w:numFmt w:val="bullet"/>
+      <w:lvlText w:val=""/>
+      <w:lvlJc w:val="left"/>
+      <w:pPr>
+        <w:ind w:left="720" w:hanging="360"/>
+      </w:pPr>
+      <w:rPr>
+        <w:rFonts w:ascii="Symbol" w:hAnsi="Symbol" w:hint="default"/>
+      </w:rPr>
+    </w:lvl>
+    <w:lvl w:ilvl="1" w:tplc="08100003" w:tentative="1">
+      <w:start w:val="1"/>
+      <w:numFmt w:val="bullet"/>
+      <w:lvlText w:val="o"/>
+      <w:lvlJc w:val="left"/>
+      <w:pPr>
+        <w:ind w:left="1440" w:hanging="360"/>
+      </w:pPr>
+      <w:rPr>
+        <w:rFonts w:ascii="Courier New" w:hAnsi="Courier New" w:cs="Courier New" w:hint="default"/>
+      </w:rPr>
+    </w:lvl>
+    <w:lvl w:ilvl="2" w:tplc="08100005" w:tentative="1">
+      <w:start w:val="1"/>
+      <w:numFmt w:val="bullet"/>
+      <w:lvlText w:val=""/>
+      <w:lvlJc w:val="left"/>
+      <w:pPr>
+        <w:ind w:left="2160" w:hanging="360"/>
+      </w:pPr>
+      <w:rPr>
+        <w:rFonts w:ascii="Wingdings" w:hAnsi="Wingdings" w:hint="default"/>
+      </w:rPr>
+    </w:lvl>
+    <w:lvl w:ilvl="3" w:tplc="08100001" w:tentative="1">
+      <w:start w:val="1"/>
+      <w:numFmt w:val="bullet"/>
+      <w:lvlText w:val=""/>
+      <w:lvlJc w:val="left"/>
+      <w:pPr>
+        <w:ind w:left="2880" w:hanging="360"/>
+      </w:pPr>
+      <w:rPr>
+        <w:rFonts w:ascii="Symbol" w:hAnsi="Symbol" w:hint="default"/>
+      </w:rPr>
+    </w:lvl>
+    <w:lvl w:ilvl="4" w:tplc="08100003" w:tentative="1">
+      <w:start w:val="1"/>
+      <w:numFmt w:val="bullet"/>
+      <w:lvlText w:val="o"/>
+      <w:lvlJc w:val="left"/>
+      <w:pPr>
+        <w:ind w:left="3600" w:hanging="360"/>
+      </w:pPr>
+      <w:rPr>
+        <w:rFonts w:ascii="Courier New" w:hAnsi="Courier New" w:cs="Courier New" w:hint="default"/>
+      </w:rPr>
+    </w:lvl>
+    <w:lvl w:ilvl="5" w:tplc="08100005" w:tentative="1">
+      <w:start w:val="1"/>
+      <w:numFmt w:val="bullet"/>
+      <w:lvlText w:val=""/>
+      <w:lvlJc w:val="left"/>
+      <w:pPr>
+        <w:ind w:left="4320" w:hanging="360"/>
+      </w:pPr>
+      <w:rPr>
+        <w:rFonts w:ascii="Wingdings" w:hAnsi="Wingdings" w:hint="default"/>
+      </w:rPr>
+    </w:lvl>
+    <w:lvl w:ilvl="6" w:tplc="08100001" w:tentative="1">
+      <w:start w:val="1"/>
+      <w:numFmt w:val="bullet"/>
+      <w:lvlText w:val=""/>
+      <w:lvlJc w:val="left"/>
+      <w:pPr>
+        <w:ind w:left="5040" w:hanging="360"/>
+      </w:pPr>
+      <w:rPr>
+        <w:rFonts w:ascii="Symbol" w:hAnsi="Symbol" w:hint="default"/>
+      </w:rPr>
+    </w:lvl>
+    <w:lvl w:ilvl="7" w:tplc="08100003" w:tentative="1">
+      <w:start w:val="1"/>
+      <w:numFmt w:val="bullet"/>
+      <w:lvlText w:val="o"/>
+      <w:lvlJc w:val="left"/>
+      <w:pPr>
+        <w:ind w:left="5760" w:hanging="360"/>
+      </w:pPr>
+      <w:rPr>
+        <w:rFonts w:ascii="Courier New" w:hAnsi="Courier New" w:cs="Courier New" w:hint="default"/>
+      </w:rPr>
+    </w:lvl>
+    <w:lvl w:ilvl="8" w:tplc="08100005" w:tentative="1">
+      <w:start w:val="1"/>
+      <w:numFmt w:val="bullet"/>
+      <w:lvlText w:val=""/>
+      <w:lvlJc w:val="left"/>
+      <w:pPr>
+        <w:ind w:left="6480" w:hanging="360"/>
+      </w:pPr>
+      <w:rPr>
+        <w:rFonts w:ascii="Wingdings" w:hAnsi="Wingdings" w:hint="default"/>
+      </w:rPr>
+    </w:lvl>
+  </w:abstractNum>
   <w:num w:numId="1">
     <w:abstractNumId w:val="12"/>
   </w:num>
@@ -18059,6 +18496,9 @@
   </w:num>
   <w:num w:numId="31">
     <w:abstractNumId w:val="19"/>
+  </w:num>
+  <w:num w:numId="32">
+    <w:abstractNumId w:val="22"/>
   </w:num>
   <w:numIdMacAtCleanup w:val="14"/>
 </w:numbering>
@@ -19333,7 +19773,7 @@
 </file>
 
 <file path=customXml/itemProps1.xml><?xml version="1.0" encoding="utf-8"?>
-<ds:datastoreItem xmlns:ds="http://schemas.openxmlformats.org/officeDocument/2006/customXml" ds:itemID="{B15466EA-C1A3-4920-B1DC-9FFCBA923477}">
+<ds:datastoreItem xmlns:ds="http://schemas.openxmlformats.org/officeDocument/2006/customXml" ds:itemID="{2242DB63-DE64-4D75-B88F-8D3EFEA2E676}">
   <ds:schemaRefs>
     <ds:schemaRef ds:uri="http://schemas.openxmlformats.org/officeDocument/2006/bibliography"/>
   </ds:schemaRefs>

</xml_diff>

<commit_message>
Aggiornata documentazione con le interfacce e il diagramma di classi.
</commit_message>
<xml_diff>
--- a/3_Documentazione/DocumentazioneFyt.docx
+++ b/3_Documentazione/DocumentazioneFyt.docx
@@ -1,6 +1,6 @@
 
 <file path=word/document.xml><?xml version="1.0" encoding="utf-8"?>
-<w:document xmlns:wpc="http://schemas.microsoft.com/office/word/2010/wordprocessingCanvas" xmlns:cx="http://schemas.microsoft.com/office/drawing/2014/chartex" xmlns:cx1="http://schemas.microsoft.com/office/drawing/2015/9/8/chartex" xmlns:cx2="http://schemas.microsoft.com/office/drawing/2015/10/21/chartex" xmlns:cx3="http://schemas.microsoft.com/office/drawing/2016/5/9/chartex" xmlns:cx4="http://schemas.microsoft.com/office/drawing/2016/5/10/chartex" xmlns:cx5="http://schemas.microsoft.com/office/drawing/2016/5/11/chartex" xmlns:cx6="http://schemas.microsoft.com/office/drawing/2016/5/12/chartex" xmlns:cx7="http://schemas.microsoft.com/office/drawing/2016/5/13/chartex" xmlns:cx8="http://schemas.microsoft.com/office/drawing/2016/5/14/chartex" xmlns:mc="http://schemas.openxmlformats.org/markup-compatibility/2006" xmlns:aink="http://schemas.microsoft.com/office/drawing/2016/ink" xmlns:am3d="http://schemas.microsoft.com/office/drawing/2017/model3d" xmlns:o="urn:schemas-microsoft-com:office:office" xmlns:r="http://schemas.openxmlformats.org/officeDocument/2006/relationships" xmlns:m="http://schemas.openxmlformats.org/officeDocument/2006/math" xmlns:v="urn:schemas-microsoft-com:vml" xmlns:wp14="http://schemas.microsoft.com/office/word/2010/wordprocessingDrawing" xmlns:wp="http://schemas.openxmlformats.org/drawingml/2006/wordprocessingDrawing" xmlns:w10="urn:schemas-microsoft-com:office:word" xmlns:w="http://schemas.openxmlformats.org/wordprocessingml/2006/main" xmlns:w14="http://schemas.microsoft.com/office/word/2010/wordml" xmlns:w15="http://schemas.microsoft.com/office/word/2012/wordml" xmlns:w16cid="http://schemas.microsoft.com/office/word/2016/wordml/cid" xmlns:w16se="http://schemas.microsoft.com/office/word/2015/wordml/symex" xmlns:wpg="http://schemas.microsoft.com/office/word/2010/wordprocessingGroup" xmlns:wpi="http://schemas.microsoft.com/office/word/2010/wordprocessingInk" xmlns:wne="http://schemas.microsoft.com/office/word/2006/wordml" xmlns:wps="http://schemas.microsoft.com/office/word/2010/wordprocessingShape" mc:Ignorable="w14 w15 w16se w16cid wp14">
+<w:document xmlns:wpc="http://schemas.microsoft.com/office/word/2010/wordprocessingCanvas" xmlns:cx="http://schemas.microsoft.com/office/drawing/2014/chartex" xmlns:cx1="http://schemas.microsoft.com/office/drawing/2015/9/8/chartex" xmlns:cx2="http://schemas.microsoft.com/office/drawing/2015/10/21/chartex" xmlns:cx3="http://schemas.microsoft.com/office/drawing/2016/5/9/chartex" xmlns:cx4="http://schemas.microsoft.com/office/drawing/2016/5/10/chartex" xmlns:cx5="http://schemas.microsoft.com/office/drawing/2016/5/11/chartex" xmlns:cx6="http://schemas.microsoft.com/office/drawing/2016/5/12/chartex" xmlns:cx7="http://schemas.microsoft.com/office/drawing/2016/5/13/chartex" xmlns:cx8="http://schemas.microsoft.com/office/drawing/2016/5/14/chartex" xmlns:mc="http://schemas.openxmlformats.org/markup-compatibility/2006" xmlns:aink="http://schemas.microsoft.com/office/drawing/2016/ink" xmlns:am3d="http://schemas.microsoft.com/office/drawing/2017/model3d" xmlns:o="urn:schemas-microsoft-com:office:office" xmlns:oel="http://schemas.microsoft.com/office/2019/extlst" xmlns:r="http://schemas.openxmlformats.org/officeDocument/2006/relationships" xmlns:m="http://schemas.openxmlformats.org/officeDocument/2006/math" xmlns:v="urn:schemas-microsoft-com:vml" xmlns:wp14="http://schemas.microsoft.com/office/word/2010/wordprocessingDrawing" xmlns:wp="http://schemas.openxmlformats.org/drawingml/2006/wordprocessingDrawing" xmlns:w10="urn:schemas-microsoft-com:office:word" xmlns:w="http://schemas.openxmlformats.org/wordprocessingml/2006/main" xmlns:w14="http://schemas.microsoft.com/office/word/2010/wordml" xmlns:w15="http://schemas.microsoft.com/office/word/2012/wordml" xmlns:w16cex="http://schemas.microsoft.com/office/word/2018/wordml/cex" xmlns:w16cid="http://schemas.microsoft.com/office/word/2016/wordml/cid" xmlns:w16="http://schemas.microsoft.com/office/word/2018/wordml" xmlns:w16du="http://schemas.microsoft.com/office/word/2023/wordml/word16du" xmlns:w16sdtdh="http://schemas.microsoft.com/office/word/2020/wordml/sdtdatahash" xmlns:w16sdtfl="http://schemas.microsoft.com/office/word/2024/wordml/sdtformatlock" xmlns:w16se="http://schemas.microsoft.com/office/word/2015/wordml/symex" xmlns:wpg="http://schemas.microsoft.com/office/word/2010/wordprocessingGroup" xmlns:wpi="http://schemas.microsoft.com/office/word/2010/wordprocessingInk" xmlns:wne="http://schemas.microsoft.com/office/word/2006/wordml" xmlns:wps="http://schemas.microsoft.com/office/word/2010/wordprocessingShape" mc:Ignorable="w14 w15 w16se w16cid w16 w16cex w16sdtdh w16sdtfl w16du wp14">
   <w:body>
     <w:p>
       <w:pPr>
@@ -10981,6 +10981,7 @@
         <w:rPr>
           <w:i/>
           <w:iCs/>
+          <w:highlight w:val="yellow"/>
           <w:lang w:val="it-IT"/>
         </w:rPr>
       </w:pPr>
@@ -11005,12 +11006,32 @@
     </w:p>
     <w:p>
       <w:pPr>
+        <w:rPr>
+          <w:i/>
+          <w:iCs/>
+          <w:highlight w:val="yellow"/>
+          <w:lang w:val="it-IT"/>
+        </w:rPr>
+      </w:pPr>
+      <w:r>
+        <w:rPr>
+          <w:i/>
+          <w:iCs/>
+          <w:highlight w:val="yellow"/>
+          <w:lang w:val="it-IT"/>
+        </w:rPr>
+        <w:br w:type="page"/>
+      </w:r>
+    </w:p>
+    <w:p>
+      <w:pPr>
         <w:pStyle w:val="Titolo2"/>
       </w:pPr>
       <w:bookmarkStart w:id="29" w:name="_Toc429059811"/>
       <w:bookmarkStart w:id="30" w:name="_Toc94790457"/>
       <w:bookmarkStart w:id="31" w:name="_Toc189853865"/>
       <w:r>
+        <w:lastRenderedPageBreak/>
         <w:t>Design delle interfacce</w:t>
       </w:r>
       <w:bookmarkEnd w:id="29"/>
@@ -11027,27 +11048,1774 @@
         <w:rPr>
           <w:lang w:val="it-IT"/>
         </w:rPr>
-        <w:t>Descrizione delle interfacce interne ed esterne del sistema e dell’interfaccia utente. La progettazione delle interfacce è basata sulle informazioni rica</w:t>
-      </w:r>
-      <w:r>
-        <w:rPr>
-          <w:lang w:val="it-IT"/>
-        </w:rPr>
-        <w:t xml:space="preserve">vate durante la fase di analisi e realizzata tramite </w:t>
+        <w:t>Il design progettato è molto semplice</w:t>
+      </w:r>
+      <w:r>
+        <w:rPr>
+          <w:lang w:val="it-IT"/>
+        </w:rPr>
+        <w:t xml:space="preserve"> e grezzo</w:t>
+      </w:r>
+      <w:r>
+        <w:rPr>
+          <w:lang w:val="it-IT"/>
+        </w:rPr>
+        <w:t>, abbiamo pensato di progettare una base su cui poi eventualmente apporteremo modifiche per valorizzare la parte grafica del sito.</w:t>
+      </w:r>
+    </w:p>
+    <w:p>
+      <w:pPr>
+        <w:spacing w:before="240"/>
+        <w:rPr>
+          <w:lang w:val="it-IT"/>
+        </w:rPr>
+      </w:pPr>
+      <w:r>
+        <w:rPr>
+          <w:lang w:val="it-IT"/>
+        </w:rPr>
+        <w:t>Nella maggior parte delle pagine abbiamo deciso di mettere il logo in alto a sinistra per dare subito un impatto visivo sul cliente.</w:t>
+      </w:r>
+    </w:p>
+    <w:p>
+      <w:pPr>
+        <w:pStyle w:val="Titolo3"/>
+      </w:pPr>
+      <w:r>
+        <w:t>Pagina Home</w:t>
+      </w:r>
+    </w:p>
+    <w:p>
+      <w:pPr>
+        <w:rPr>
+          <w:lang w:val="it-IT"/>
+        </w:rPr>
+      </w:pPr>
+      <w:r>
+        <w:rPr>
+          <w:lang w:val="it-IT"/>
+        </w:rPr>
+        <w:t>La home è</w:t>
+      </w:r>
+      <w:r>
+        <w:rPr>
+          <w:lang w:val="it-IT"/>
+        </w:rPr>
+        <w:t xml:space="preserve"> la pagina che comparirà quando si </w:t>
+      </w:r>
+      <w:r>
+        <w:rPr>
+          <w:lang w:val="it-IT"/>
+        </w:rPr>
+        <w:t>accederà</w:t>
+      </w:r>
+      <w:r>
+        <w:rPr>
+          <w:lang w:val="it-IT"/>
+        </w:rPr>
+        <w:t xml:space="preserve"> </w:t>
+      </w:r>
+      <w:r>
+        <w:rPr>
+          <w:lang w:val="it-IT"/>
+        </w:rPr>
+        <w:t>a</w:t>
+      </w:r>
+      <w:r>
+        <w:rPr>
+          <w:lang w:val="it-IT"/>
+        </w:rPr>
+        <w:t>l sito</w:t>
+      </w:r>
+      <w:r>
+        <w:rPr>
+          <w:lang w:val="it-IT"/>
+        </w:rPr>
+        <w:t xml:space="preserve"> ed</w:t>
+      </w:r>
+      <w:r>
+        <w:rPr>
+          <w:lang w:val="it-IT"/>
+        </w:rPr>
+        <w:t xml:space="preserve"> </w:t>
+      </w:r>
+      <w:r>
+        <w:rPr>
+          <w:lang w:val="it-IT"/>
+        </w:rPr>
+        <w:t>è</w:t>
+      </w:r>
+      <w:r>
+        <w:rPr>
+          <w:lang w:val="it-IT"/>
+        </w:rPr>
+        <w:t xml:space="preserve"> </w:t>
+      </w:r>
+      <w:r>
+        <w:rPr>
+          <w:lang w:val="it-IT"/>
+        </w:rPr>
+        <w:t>suddivisa</w:t>
+      </w:r>
+      <w:r>
+        <w:rPr>
+          <w:lang w:val="it-IT"/>
+        </w:rPr>
+        <w:t xml:space="preserve"> principalmente da </w:t>
+      </w:r>
+      <w:proofErr w:type="gramStart"/>
+      <w:r>
+        <w:rPr>
+          <w:lang w:val="it-IT"/>
+        </w:rPr>
+        <w:t>2</w:t>
+      </w:r>
+      <w:proofErr w:type="gramEnd"/>
+      <w:r>
+        <w:rPr>
+          <w:lang w:val="it-IT"/>
+        </w:rPr>
+        <w:t xml:space="preserve"> categorie. </w:t>
+      </w:r>
+      <w:r>
+        <w:rPr>
+          <w:lang w:val="it-IT"/>
+        </w:rPr>
+        <w:t xml:space="preserve">Nella parte in alto risiede la barra di navigazione che contiene </w:t>
+      </w:r>
+      <w:r>
+        <w:rPr>
+          <w:lang w:val="it-IT"/>
+        </w:rPr>
+        <w:t>i vari pulsanti per fare l’accesso o la registrazione</w:t>
+      </w:r>
+      <w:r>
+        <w:rPr>
+          <w:lang w:val="it-IT"/>
+        </w:rPr>
+        <w:t xml:space="preserve"> e i link che portano alle altre pagine del sito.</w:t>
+      </w:r>
+      <w:r>
+        <w:rPr>
+          <w:lang w:val="it-IT"/>
+        </w:rPr>
+        <w:t xml:space="preserve"> La parte centrale</w:t>
+      </w:r>
+      <w:r>
+        <w:rPr>
+          <w:lang w:val="it-IT"/>
+        </w:rPr>
+        <w:t xml:space="preserve"> </w:t>
+      </w:r>
+      <w:r>
+        <w:rPr>
+          <w:lang w:val="it-IT"/>
+        </w:rPr>
+        <w:t xml:space="preserve">ospita </w:t>
+      </w:r>
+      <w:r>
+        <w:rPr>
+          <w:lang w:val="it-IT"/>
+        </w:rPr>
+        <w:t xml:space="preserve">i prodotti in evidenza, le offerte e i nuovi arrivi. Quest’ultima </w:t>
+      </w:r>
+      <w:r>
+        <w:rPr>
+          <w:lang w:val="it-IT"/>
+        </w:rPr>
+        <w:t xml:space="preserve">è la più grande dove vengono </w:t>
+      </w:r>
+      <w:r>
+        <w:rPr>
+          <w:lang w:val="it-IT"/>
+        </w:rPr>
+        <w:t>visualizzat</w:t>
+      </w:r>
+      <w:r>
+        <w:rPr>
+          <w:lang w:val="it-IT"/>
+        </w:rPr>
+        <w:t>i i prodotti suddivisi per categoria</w:t>
+      </w:r>
+      <w:r>
+        <w:rPr>
+          <w:lang w:val="it-IT"/>
+        </w:rPr>
+        <w:t xml:space="preserve"> tramite un </w:t>
       </w:r>
       <w:proofErr w:type="spellStart"/>
       <w:r>
         <w:rPr>
           <w:lang w:val="it-IT"/>
         </w:rPr>
-        <w:t>mockups</w:t>
+        <w:t>carousel</w:t>
       </w:r>
       <w:proofErr w:type="spellEnd"/>
       <w:r>
         <w:rPr>
           <w:lang w:val="it-IT"/>
         </w:rPr>
+        <w:t xml:space="preserve"> </w:t>
+      </w:r>
+      <w:r>
+        <w:rPr>
+          <w:lang w:val="it-IT"/>
+        </w:rPr>
+        <w:t>continuo</w:t>
+      </w:r>
+      <w:r>
+        <w:rPr>
+          <w:lang w:val="it-IT"/>
+        </w:rPr>
         <w:t>.</w:t>
+      </w:r>
+      <w:r>
+        <w:rPr>
+          <w:lang w:val="it-IT"/>
+        </w:rPr>
+        <w:t xml:space="preserve"> </w:t>
+      </w:r>
+      <w:r>
+        <w:rPr>
+          <w:lang w:val="it-IT"/>
+        </w:rPr>
+        <w:t xml:space="preserve">Facendo </w:t>
+      </w:r>
+      <w:r>
+        <w:rPr>
+          <w:lang w:val="it-IT"/>
+        </w:rPr>
+        <w:t>l’accesso</w:t>
+      </w:r>
+      <w:r>
+        <w:rPr>
+          <w:lang w:val="it-IT"/>
+        </w:rPr>
+        <w:t xml:space="preserve"> si può sbloccare la funzionalità del carrello e il profilo (con la sua pagina integrata).</w:t>
+      </w:r>
+    </w:p>
+    <w:p>
+      <w:pPr>
+        <w:spacing w:before="240"/>
+        <w:rPr>
+          <w:lang w:val="it-IT"/>
+        </w:rPr>
+      </w:pPr>
+      <w:r>
+        <w:rPr>
+          <w:b/>
+          <w:bCs/>
+          <w:lang w:val="it-IT"/>
+        </w:rPr>
+        <w:t>Pagina senza l’accesso</w:t>
+      </w:r>
+      <w:r>
+        <w:rPr>
+          <w:lang w:val="it-IT"/>
+        </w:rPr>
+        <w:t>:</w:t>
+      </w:r>
+    </w:p>
+    <w:p>
+      <w:pPr>
+        <w:spacing w:before="240"/>
+        <w:jc w:val="center"/>
+        <w:rPr>
+          <w:lang w:val="it-IT"/>
+        </w:rPr>
+      </w:pPr>
+      <w:r>
+        <w:rPr>
+          <w:noProof/>
+          <w:lang w:val="it-IT"/>
+        </w:rPr>
+        <w:drawing>
+          <wp:inline distT="0" distB="0" distL="0" distR="0" wp14:anchorId="5664E152" wp14:editId="3F4A5F41">
+            <wp:extent cx="4400550" cy="2348605"/>
+            <wp:effectExtent l="95250" t="95250" r="95250" b="90170"/>
+            <wp:docPr id="874250915" name="Immagine 1"/>
+            <wp:cNvGraphicFramePr>
+              <a:graphicFrameLocks xmlns:a="http://schemas.openxmlformats.org/drawingml/2006/main" noChangeAspect="1"/>
+            </wp:cNvGraphicFramePr>
+            <a:graphic xmlns:a="http://schemas.openxmlformats.org/drawingml/2006/main">
+              <a:graphicData uri="http://schemas.openxmlformats.org/drawingml/2006/picture">
+                <pic:pic xmlns:pic="http://schemas.openxmlformats.org/drawingml/2006/picture">
+                  <pic:nvPicPr>
+                    <pic:cNvPr id="0" name="Picture 1"/>
+                    <pic:cNvPicPr>
+                      <a:picLocks noChangeAspect="1" noChangeArrowheads="1"/>
+                    </pic:cNvPicPr>
+                  </pic:nvPicPr>
+                  <pic:blipFill>
+                    <a:blip r:embed="rId16" cstate="print">
+                      <a:extLst>
+                        <a:ext uri="{28A0092B-C50C-407E-A947-70E740481C1C}">
+                          <a14:useLocalDpi xmlns:a14="http://schemas.microsoft.com/office/drawing/2010/main" val="0"/>
+                        </a:ext>
+                      </a:extLst>
+                    </a:blip>
+                    <a:srcRect/>
+                    <a:stretch>
+                      <a:fillRect/>
+                    </a:stretch>
+                  </pic:blipFill>
+                  <pic:spPr bwMode="auto">
+                    <a:xfrm>
+                      <a:off x="0" y="0"/>
+                      <a:ext cx="4498402" cy="2400829"/>
+                    </a:xfrm>
+                    <a:prstGeom prst="rect">
+                      <a:avLst/>
+                    </a:prstGeom>
+                    <a:noFill/>
+                    <a:ln>
+                      <a:noFill/>
+                    </a:ln>
+                    <a:effectLst>
+                      <a:outerShdw blurRad="63500" sx="102000" sy="102000" algn="ctr" rotWithShape="0">
+                        <a:prstClr val="black">
+                          <a:alpha val="40000"/>
+                        </a:prstClr>
+                      </a:outerShdw>
+                    </a:effectLst>
+                  </pic:spPr>
+                </pic:pic>
+              </a:graphicData>
+            </a:graphic>
+          </wp:inline>
+        </w:drawing>
+      </w:r>
+    </w:p>
+    <w:p>
+      <w:pPr>
+        <w:spacing w:before="240"/>
+        <w:rPr>
+          <w:lang w:val="it-IT"/>
+        </w:rPr>
+      </w:pPr>
+      <w:r>
+        <w:rPr>
+          <w:b/>
+          <w:bCs/>
+          <w:lang w:val="it-IT"/>
+        </w:rPr>
+        <w:t xml:space="preserve">Pagina </w:t>
+      </w:r>
+      <w:r>
+        <w:rPr>
+          <w:b/>
+          <w:bCs/>
+          <w:lang w:val="it-IT"/>
+        </w:rPr>
+        <w:t>con</w:t>
+      </w:r>
+      <w:r>
+        <w:rPr>
+          <w:b/>
+          <w:bCs/>
+          <w:lang w:val="it-IT"/>
+        </w:rPr>
+        <w:t xml:space="preserve"> l’accesso</w:t>
+      </w:r>
+      <w:r>
+        <w:rPr>
+          <w:lang w:val="it-IT"/>
+        </w:rPr>
+        <w:t>:</w:t>
+      </w:r>
+    </w:p>
+    <w:p>
+      <w:pPr>
+        <w:spacing w:before="240"/>
+        <w:jc w:val="center"/>
+        <w:rPr>
+          <w:lang w:val="it-IT"/>
+        </w:rPr>
+      </w:pPr>
+      <w:r>
+        <w:rPr>
+          <w:noProof/>
+          <w:lang w:val="it-IT"/>
+        </w:rPr>
+        <w:drawing>
+          <wp:inline distT="0" distB="0" distL="0" distR="0" wp14:anchorId="014C8E8D" wp14:editId="5CD700E6">
+            <wp:extent cx="4336415" cy="2367779"/>
+            <wp:effectExtent l="95250" t="95250" r="102235" b="90170"/>
+            <wp:docPr id="1985621628" name="Immagine 2"/>
+            <wp:cNvGraphicFramePr>
+              <a:graphicFrameLocks xmlns:a="http://schemas.openxmlformats.org/drawingml/2006/main" noChangeAspect="1"/>
+            </wp:cNvGraphicFramePr>
+            <a:graphic xmlns:a="http://schemas.openxmlformats.org/drawingml/2006/main">
+              <a:graphicData uri="http://schemas.openxmlformats.org/drawingml/2006/picture">
+                <pic:pic xmlns:pic="http://schemas.openxmlformats.org/drawingml/2006/picture">
+                  <pic:nvPicPr>
+                    <pic:cNvPr id="0" name="Picture 2"/>
+                    <pic:cNvPicPr>
+                      <a:picLocks noChangeAspect="1" noChangeArrowheads="1"/>
+                    </pic:cNvPicPr>
+                  </pic:nvPicPr>
+                  <pic:blipFill>
+                    <a:blip r:embed="rId17" cstate="print">
+                      <a:extLst>
+                        <a:ext uri="{28A0092B-C50C-407E-A947-70E740481C1C}">
+                          <a14:useLocalDpi xmlns:a14="http://schemas.microsoft.com/office/drawing/2010/main" val="0"/>
+                        </a:ext>
+                      </a:extLst>
+                    </a:blip>
+                    <a:srcRect/>
+                    <a:stretch>
+                      <a:fillRect/>
+                    </a:stretch>
+                  </pic:blipFill>
+                  <pic:spPr bwMode="auto">
+                    <a:xfrm>
+                      <a:off x="0" y="0"/>
+                      <a:ext cx="4389246" cy="2396626"/>
+                    </a:xfrm>
+                    <a:prstGeom prst="rect">
+                      <a:avLst/>
+                    </a:prstGeom>
+                    <a:noFill/>
+                    <a:ln>
+                      <a:noFill/>
+                    </a:ln>
+                    <a:effectLst>
+                      <a:outerShdw blurRad="63500" sx="102000" sy="102000" algn="ctr" rotWithShape="0">
+                        <a:prstClr val="black">
+                          <a:alpha val="40000"/>
+                        </a:prstClr>
+                      </a:outerShdw>
+                    </a:effectLst>
+                  </pic:spPr>
+                </pic:pic>
+              </a:graphicData>
+            </a:graphic>
+          </wp:inline>
+        </w:drawing>
+      </w:r>
+    </w:p>
+    <w:p>
+      <w:pPr>
+        <w:pStyle w:val="Titolo3"/>
+      </w:pPr>
+      <w:r>
+        <w:lastRenderedPageBreak/>
+        <w:t>Pagina Catalogo</w:t>
+      </w:r>
+    </w:p>
+    <w:p>
+      <w:r>
+        <w:t>È</w:t>
+      </w:r>
+      <w:r>
+        <w:t xml:space="preserve"> la pagina che permette all’utente di interfacciarsi con tutti i prodotti del sito. Questa parte avrà un altro </w:t>
+      </w:r>
+      <w:proofErr w:type="spellStart"/>
+      <w:r>
+        <w:t>carousel</w:t>
+      </w:r>
+      <w:proofErr w:type="spellEnd"/>
+      <w:r>
+        <w:t xml:space="preserve"> che permetterà di cambiare la pagina e passare alla prossima. Cliccando su un prodotto si verrà reindirizzati sulla </w:t>
+      </w:r>
+      <w:r>
+        <w:t xml:space="preserve">sua </w:t>
+      </w:r>
+      <w:r>
+        <w:t>pagina</w:t>
+      </w:r>
+      <w:r>
+        <w:t xml:space="preserve"> dedicata ad esso</w:t>
+      </w:r>
+      <w:r>
+        <w:t>.</w:t>
+      </w:r>
+      <w:r>
+        <w:t xml:space="preserve"> Sono presenti anche degli elementi </w:t>
+      </w:r>
+      <w:r>
+        <w:t xml:space="preserve">per la ricerca </w:t>
+      </w:r>
+      <w:r>
+        <w:t xml:space="preserve">e per il filtraggio </w:t>
+      </w:r>
+      <w:r>
+        <w:t>dei prodotti.</w:t>
+      </w:r>
+    </w:p>
+    <w:p>
+      <w:pPr>
+        <w:spacing w:before="240"/>
+        <w:jc w:val="center"/>
+        <w:rPr>
+          <w:lang w:val="it-IT"/>
+        </w:rPr>
+      </w:pPr>
+      <w:r>
+        <w:rPr>
+          <w:noProof/>
+          <w:lang w:val="it-IT"/>
+        </w:rPr>
+        <w:drawing>
+          <wp:inline distT="0" distB="0" distL="0" distR="0" wp14:anchorId="5BBDDCC7" wp14:editId="70BC3625">
+            <wp:extent cx="5453022" cy="2981325"/>
+            <wp:effectExtent l="133350" t="95250" r="128905" b="85725"/>
+            <wp:docPr id="974976734" name="Immagine 3"/>
+            <wp:cNvGraphicFramePr>
+              <a:graphicFrameLocks xmlns:a="http://schemas.openxmlformats.org/drawingml/2006/main" noChangeAspect="1"/>
+            </wp:cNvGraphicFramePr>
+            <a:graphic xmlns:a="http://schemas.openxmlformats.org/drawingml/2006/main">
+              <a:graphicData uri="http://schemas.openxmlformats.org/drawingml/2006/picture">
+                <pic:pic xmlns:pic="http://schemas.openxmlformats.org/drawingml/2006/picture">
+                  <pic:nvPicPr>
+                    <pic:cNvPr id="0" name="Picture 3"/>
+                    <pic:cNvPicPr>
+                      <a:picLocks noChangeAspect="1" noChangeArrowheads="1"/>
+                    </pic:cNvPicPr>
+                  </pic:nvPicPr>
+                  <pic:blipFill>
+                    <a:blip r:embed="rId18" cstate="print">
+                      <a:extLst>
+                        <a:ext uri="{28A0092B-C50C-407E-A947-70E740481C1C}">
+                          <a14:useLocalDpi xmlns:a14="http://schemas.microsoft.com/office/drawing/2010/main" val="0"/>
+                        </a:ext>
+                      </a:extLst>
+                    </a:blip>
+                    <a:srcRect/>
+                    <a:stretch>
+                      <a:fillRect/>
+                    </a:stretch>
+                  </pic:blipFill>
+                  <pic:spPr bwMode="auto">
+                    <a:xfrm>
+                      <a:off x="0" y="0"/>
+                      <a:ext cx="5486534" cy="2999647"/>
+                    </a:xfrm>
+                    <a:prstGeom prst="rect">
+                      <a:avLst/>
+                    </a:prstGeom>
+                    <a:noFill/>
+                    <a:ln>
+                      <a:noFill/>
+                    </a:ln>
+                    <a:effectLst>
+                      <a:outerShdw blurRad="63500" sx="102000" sy="102000" algn="ctr" rotWithShape="0">
+                        <a:prstClr val="black">
+                          <a:alpha val="40000"/>
+                        </a:prstClr>
+                      </a:outerShdw>
+                    </a:effectLst>
+                  </pic:spPr>
+                </pic:pic>
+              </a:graphicData>
+            </a:graphic>
+          </wp:inline>
+        </w:drawing>
+      </w:r>
+    </w:p>
+    <w:p>
+      <w:pPr>
+        <w:pStyle w:val="Titolo3"/>
+      </w:pPr>
+      <w:r>
+        <w:t>Pagina Prodotto</w:t>
+      </w:r>
+    </w:p>
+    <w:p>
+      <w:r>
+        <w:t>È</w:t>
+      </w:r>
+      <w:r>
+        <w:t xml:space="preserve"> la pagina che permette all’utente di interfacciarsi con il prodotto scelto. Questo permette all’utente di vedere tutti i dettagli del prodotto in modo più approfondito. </w:t>
+      </w:r>
+      <w:r>
+        <w:t>È</w:t>
+      </w:r>
+      <w:r>
+        <w:t xml:space="preserve"> possibile </w:t>
+      </w:r>
+      <w:r>
+        <w:t>visualizzare le varie immagini dei prodotti</w:t>
+      </w:r>
+      <w:r>
+        <w:t xml:space="preserve"> </w:t>
+      </w:r>
+      <w:r>
+        <w:t xml:space="preserve">con un </w:t>
+      </w:r>
+      <w:proofErr w:type="spellStart"/>
+      <w:r>
+        <w:t>carousel</w:t>
+      </w:r>
+      <w:proofErr w:type="spellEnd"/>
+      <w:r>
+        <w:t>.</w:t>
+      </w:r>
+    </w:p>
+    <w:p>
+      <w:pPr>
+        <w:spacing w:before="240"/>
+        <w:jc w:val="center"/>
+      </w:pPr>
+      <w:r>
+        <w:rPr>
+          <w:noProof/>
+        </w:rPr>
+        <w:drawing>
+          <wp:inline distT="0" distB="0" distL="0" distR="0" wp14:anchorId="48C8C546" wp14:editId="1DE18BC8">
+            <wp:extent cx="5381625" cy="2938485"/>
+            <wp:effectExtent l="133350" t="95250" r="123825" b="90805"/>
+            <wp:docPr id="569238808" name="Immagine 4"/>
+            <wp:cNvGraphicFramePr>
+              <a:graphicFrameLocks xmlns:a="http://schemas.openxmlformats.org/drawingml/2006/main" noChangeAspect="1"/>
+            </wp:cNvGraphicFramePr>
+            <a:graphic xmlns:a="http://schemas.openxmlformats.org/drawingml/2006/main">
+              <a:graphicData uri="http://schemas.openxmlformats.org/drawingml/2006/picture">
+                <pic:pic xmlns:pic="http://schemas.openxmlformats.org/drawingml/2006/picture">
+                  <pic:nvPicPr>
+                    <pic:cNvPr id="0" name="Picture 4"/>
+                    <pic:cNvPicPr>
+                      <a:picLocks noChangeAspect="1" noChangeArrowheads="1"/>
+                    </pic:cNvPicPr>
+                  </pic:nvPicPr>
+                  <pic:blipFill>
+                    <a:blip r:embed="rId19" cstate="print">
+                      <a:extLst>
+                        <a:ext uri="{28A0092B-C50C-407E-A947-70E740481C1C}">
+                          <a14:useLocalDpi xmlns:a14="http://schemas.microsoft.com/office/drawing/2010/main" val="0"/>
+                        </a:ext>
+                      </a:extLst>
+                    </a:blip>
+                    <a:srcRect/>
+                    <a:stretch>
+                      <a:fillRect/>
+                    </a:stretch>
+                  </pic:blipFill>
+                  <pic:spPr bwMode="auto">
+                    <a:xfrm>
+                      <a:off x="0" y="0"/>
+                      <a:ext cx="5415142" cy="2956786"/>
+                    </a:xfrm>
+                    <a:prstGeom prst="rect">
+                      <a:avLst/>
+                    </a:prstGeom>
+                    <a:noFill/>
+                    <a:ln>
+                      <a:noFill/>
+                    </a:ln>
+                    <a:effectLst>
+                      <a:outerShdw blurRad="63500" sx="102000" sy="102000" algn="ctr" rotWithShape="0">
+                        <a:prstClr val="black">
+                          <a:alpha val="40000"/>
+                        </a:prstClr>
+                      </a:outerShdw>
+                    </a:effectLst>
+                  </pic:spPr>
+                </pic:pic>
+              </a:graphicData>
+            </a:graphic>
+          </wp:inline>
+        </w:drawing>
+      </w:r>
+    </w:p>
+    <w:p>
+      <w:pPr>
+        <w:pStyle w:val="Titolo3"/>
+      </w:pPr>
+      <w:r>
+        <w:lastRenderedPageBreak/>
+        <w:t>Pagina Login e Registrazione</w:t>
+      </w:r>
+    </w:p>
+    <w:p>
+      <w:r>
+        <w:t>Come idea iniziale</w:t>
+      </w:r>
+      <w:r>
+        <w:t xml:space="preserve"> abbiamo pensato di fare delle pagine </w:t>
+      </w:r>
+      <w:r>
+        <w:t xml:space="preserve">dedicate </w:t>
+      </w:r>
+      <w:r>
+        <w:t xml:space="preserve">per il login e la registrazione. </w:t>
+      </w:r>
+      <w:r>
+        <w:t>Successivamente</w:t>
+      </w:r>
+      <w:r>
+        <w:t xml:space="preserve"> </w:t>
+      </w:r>
+      <w:r>
+        <w:t xml:space="preserve">ci siamo resi conto che </w:t>
+      </w:r>
+      <w:r>
+        <w:t xml:space="preserve">dei </w:t>
+      </w:r>
+      <w:r>
+        <w:t>pop-up</w:t>
+      </w:r>
+      <w:r>
+        <w:t xml:space="preserve"> </w:t>
+      </w:r>
+      <w:r>
+        <w:t>sarebbero stati più intuitivi e semplici per l’utente.</w:t>
+      </w:r>
+    </w:p>
+    <w:p>
+      <w:pPr>
+        <w:spacing w:before="240"/>
+      </w:pPr>
+      <w:r>
+        <w:t>Pertanto,</w:t>
+      </w:r>
+      <w:r>
+        <w:t xml:space="preserve"> </w:t>
+      </w:r>
+      <w:r>
+        <w:t>le immagini</w:t>
+      </w:r>
+      <w:r>
+        <w:t xml:space="preserve"> successive sono le versioni delle pagine dedicate.</w:t>
+      </w:r>
+    </w:p>
+    <w:p>
+      <w:pPr>
+        <w:spacing w:before="240"/>
+        <w:rPr>
+          <w:lang w:val="it-IT"/>
+        </w:rPr>
+      </w:pPr>
+      <w:r>
+        <w:rPr>
+          <w:b/>
+          <w:bCs/>
+          <w:lang w:val="it-IT"/>
+        </w:rPr>
+        <w:t>Pagina Login</w:t>
+      </w:r>
+      <w:r>
+        <w:rPr>
+          <w:lang w:val="it-IT"/>
+        </w:rPr>
+        <w:t>:</w:t>
+      </w:r>
+    </w:p>
+    <w:p>
+      <w:pPr>
+        <w:spacing w:before="240"/>
+        <w:jc w:val="center"/>
+        <w:rPr>
+          <w:lang w:val="it-IT"/>
+        </w:rPr>
+      </w:pPr>
+      <w:r>
+        <w:rPr>
+          <w:noProof/>
+          <w:lang w:val="it-IT"/>
+        </w:rPr>
+        <w:drawing>
+          <wp:inline distT="0" distB="0" distL="0" distR="0" wp14:anchorId="52AC6E42" wp14:editId="795B1F0C">
+            <wp:extent cx="5715000" cy="3115654"/>
+            <wp:effectExtent l="114300" t="95250" r="114300" b="104140"/>
+            <wp:docPr id="68425554" name="Immagine 5"/>
+            <wp:cNvGraphicFramePr>
+              <a:graphicFrameLocks xmlns:a="http://schemas.openxmlformats.org/drawingml/2006/main" noChangeAspect="1"/>
+            </wp:cNvGraphicFramePr>
+            <a:graphic xmlns:a="http://schemas.openxmlformats.org/drawingml/2006/main">
+              <a:graphicData uri="http://schemas.openxmlformats.org/drawingml/2006/picture">
+                <pic:pic xmlns:pic="http://schemas.openxmlformats.org/drawingml/2006/picture">
+                  <pic:nvPicPr>
+                    <pic:cNvPr id="0" name="Picture 5"/>
+                    <pic:cNvPicPr>
+                      <a:picLocks noChangeAspect="1" noChangeArrowheads="1"/>
+                    </pic:cNvPicPr>
+                  </pic:nvPicPr>
+                  <pic:blipFill>
+                    <a:blip r:embed="rId20" cstate="print">
+                      <a:extLst>
+                        <a:ext uri="{28A0092B-C50C-407E-A947-70E740481C1C}">
+                          <a14:useLocalDpi xmlns:a14="http://schemas.microsoft.com/office/drawing/2010/main" val="0"/>
+                        </a:ext>
+                      </a:extLst>
+                    </a:blip>
+                    <a:srcRect/>
+                    <a:stretch>
+                      <a:fillRect/>
+                    </a:stretch>
+                  </pic:blipFill>
+                  <pic:spPr bwMode="auto">
+                    <a:xfrm>
+                      <a:off x="0" y="0"/>
+                      <a:ext cx="5746962" cy="3133079"/>
+                    </a:xfrm>
+                    <a:prstGeom prst="rect">
+                      <a:avLst/>
+                    </a:prstGeom>
+                    <a:noFill/>
+                    <a:ln>
+                      <a:noFill/>
+                    </a:ln>
+                    <a:effectLst>
+                      <a:outerShdw blurRad="63500" sx="102000" sy="102000" algn="ctr" rotWithShape="0">
+                        <a:prstClr val="black">
+                          <a:alpha val="40000"/>
+                        </a:prstClr>
+                      </a:outerShdw>
+                    </a:effectLst>
+                  </pic:spPr>
+                </pic:pic>
+              </a:graphicData>
+            </a:graphic>
+          </wp:inline>
+        </w:drawing>
+      </w:r>
+    </w:p>
+    <w:p>
+      <w:pPr>
+        <w:spacing w:before="240"/>
+        <w:rPr>
+          <w:lang w:val="it-IT"/>
+        </w:rPr>
+      </w:pPr>
+      <w:r>
+        <w:rPr>
+          <w:b/>
+          <w:bCs/>
+          <w:lang w:val="it-IT"/>
+        </w:rPr>
+        <w:t xml:space="preserve">Pagina </w:t>
+      </w:r>
+      <w:r>
+        <w:rPr>
+          <w:b/>
+          <w:bCs/>
+          <w:lang w:val="it-IT"/>
+        </w:rPr>
+        <w:t>Registrazione</w:t>
+      </w:r>
+      <w:r>
+        <w:rPr>
+          <w:lang w:val="it-IT"/>
+        </w:rPr>
+        <w:t>:</w:t>
+      </w:r>
+    </w:p>
+    <w:p>
+      <w:pPr>
+        <w:spacing w:before="240"/>
+        <w:jc w:val="center"/>
+        <w:rPr>
+          <w:lang w:val="it-IT"/>
+        </w:rPr>
+      </w:pPr>
+      <w:r>
+        <w:rPr>
+          <w:noProof/>
+          <w:lang w:val="it-IT"/>
+        </w:rPr>
+        <w:drawing>
+          <wp:inline distT="0" distB="0" distL="0" distR="0" wp14:anchorId="43C247F0" wp14:editId="1AEC613D">
+            <wp:extent cx="5743575" cy="3131233"/>
+            <wp:effectExtent l="114300" t="95250" r="104775" b="88265"/>
+            <wp:docPr id="169729828" name="Immagine 6"/>
+            <wp:cNvGraphicFramePr>
+              <a:graphicFrameLocks xmlns:a="http://schemas.openxmlformats.org/drawingml/2006/main" noChangeAspect="1"/>
+            </wp:cNvGraphicFramePr>
+            <a:graphic xmlns:a="http://schemas.openxmlformats.org/drawingml/2006/main">
+              <a:graphicData uri="http://schemas.openxmlformats.org/drawingml/2006/picture">
+                <pic:pic xmlns:pic="http://schemas.openxmlformats.org/drawingml/2006/picture">
+                  <pic:nvPicPr>
+                    <pic:cNvPr id="0" name="Picture 6"/>
+                    <pic:cNvPicPr>
+                      <a:picLocks noChangeAspect="1" noChangeArrowheads="1"/>
+                    </pic:cNvPicPr>
+                  </pic:nvPicPr>
+                  <pic:blipFill>
+                    <a:blip r:embed="rId21" cstate="print">
+                      <a:extLst>
+                        <a:ext uri="{28A0092B-C50C-407E-A947-70E740481C1C}">
+                          <a14:useLocalDpi xmlns:a14="http://schemas.microsoft.com/office/drawing/2010/main" val="0"/>
+                        </a:ext>
+                      </a:extLst>
+                    </a:blip>
+                    <a:srcRect/>
+                    <a:stretch>
+                      <a:fillRect/>
+                    </a:stretch>
+                  </pic:blipFill>
+                  <pic:spPr bwMode="auto">
+                    <a:xfrm>
+                      <a:off x="0" y="0"/>
+                      <a:ext cx="5765985" cy="3143450"/>
+                    </a:xfrm>
+                    <a:prstGeom prst="rect">
+                      <a:avLst/>
+                    </a:prstGeom>
+                    <a:noFill/>
+                    <a:ln>
+                      <a:noFill/>
+                    </a:ln>
+                    <a:effectLst>
+                      <a:outerShdw blurRad="63500" sx="102000" sy="102000" algn="ctr" rotWithShape="0">
+                        <a:prstClr val="black">
+                          <a:alpha val="40000"/>
+                        </a:prstClr>
+                      </a:outerShdw>
+                    </a:effectLst>
+                  </pic:spPr>
+                </pic:pic>
+              </a:graphicData>
+            </a:graphic>
+          </wp:inline>
+        </w:drawing>
+      </w:r>
+    </w:p>
+    <w:p>
+      <w:pPr>
+        <w:pStyle w:val="Titolo3"/>
+      </w:pPr>
+      <w:r>
+        <w:lastRenderedPageBreak/>
+        <w:t xml:space="preserve">Pagina </w:t>
+      </w:r>
+      <w:r>
+        <w:t xml:space="preserve">visualizzazione </w:t>
+      </w:r>
+      <w:r>
+        <w:t xml:space="preserve">e aggiunta </w:t>
+      </w:r>
+      <w:r>
+        <w:t>u</w:t>
+      </w:r>
+      <w:r>
+        <w:t>tenti (Amministrazione)</w:t>
+      </w:r>
+    </w:p>
+    <w:p>
+      <w:r>
+        <w:t xml:space="preserve">È </w:t>
+      </w:r>
+      <w:r>
+        <w:t xml:space="preserve">la pagina di amministrazione accessibile solo all’admin e permette di visualizzare tutti gli utenti con </w:t>
+      </w:r>
+      <w:r>
+        <w:t>le loro</w:t>
+      </w:r>
+      <w:r>
+        <w:t xml:space="preserve"> informazioni e il</w:t>
+      </w:r>
+      <w:r>
+        <w:t xml:space="preserve"> loro</w:t>
+      </w:r>
+      <w:r>
+        <w:t xml:space="preserve"> ruolo</w:t>
+      </w:r>
+      <w:r>
+        <w:t>. L</w:t>
+      </w:r>
+      <w:r>
+        <w:t>’admin può creare, modificare o eliminare i vari utenti (attenzione gli admin non possono eliminare sé stessi).</w:t>
+      </w:r>
+    </w:p>
+    <w:p>
+      <w:pPr>
+        <w:spacing w:before="240"/>
+        <w:rPr>
+          <w:b/>
+          <w:bCs/>
+        </w:rPr>
+      </w:pPr>
+      <w:r>
+        <w:rPr>
+          <w:b/>
+          <w:bCs/>
+        </w:rPr>
+        <w:t>Pagina visualizzazione utenti:</w:t>
+      </w:r>
+    </w:p>
+    <w:p>
+      <w:pPr>
+        <w:spacing w:before="240"/>
+        <w:jc w:val="center"/>
+        <w:rPr>
+          <w:lang w:val="it-IT"/>
+        </w:rPr>
+      </w:pPr>
+      <w:r>
+        <w:rPr>
+          <w:noProof/>
+          <w:lang w:val="it-IT"/>
+        </w:rPr>
+        <w:drawing>
+          <wp:inline distT="0" distB="0" distL="0" distR="0" wp14:anchorId="3BEA6682" wp14:editId="667E9728">
+            <wp:extent cx="6027276" cy="1962150"/>
+            <wp:effectExtent l="114300" t="95250" r="107315" b="95250"/>
+            <wp:docPr id="1285927012" name="Immagine 7"/>
+            <wp:cNvGraphicFramePr>
+              <a:graphicFrameLocks xmlns:a="http://schemas.openxmlformats.org/drawingml/2006/main" noChangeAspect="1"/>
+            </wp:cNvGraphicFramePr>
+            <a:graphic xmlns:a="http://schemas.openxmlformats.org/drawingml/2006/main">
+              <a:graphicData uri="http://schemas.openxmlformats.org/drawingml/2006/picture">
+                <pic:pic xmlns:pic="http://schemas.openxmlformats.org/drawingml/2006/picture">
+                  <pic:nvPicPr>
+                    <pic:cNvPr id="0" name="Picture 7"/>
+                    <pic:cNvPicPr>
+                      <a:picLocks noChangeAspect="1" noChangeArrowheads="1"/>
+                    </pic:cNvPicPr>
+                  </pic:nvPicPr>
+                  <pic:blipFill>
+                    <a:blip r:embed="rId22" cstate="print">
+                      <a:extLst>
+                        <a:ext uri="{28A0092B-C50C-407E-A947-70E740481C1C}">
+                          <a14:useLocalDpi xmlns:a14="http://schemas.microsoft.com/office/drawing/2010/main" val="0"/>
+                        </a:ext>
+                      </a:extLst>
+                    </a:blip>
+                    <a:srcRect/>
+                    <a:stretch>
+                      <a:fillRect/>
+                    </a:stretch>
+                  </pic:blipFill>
+                  <pic:spPr bwMode="auto">
+                    <a:xfrm>
+                      <a:off x="0" y="0"/>
+                      <a:ext cx="6053849" cy="1970801"/>
+                    </a:xfrm>
+                    <a:prstGeom prst="rect">
+                      <a:avLst/>
+                    </a:prstGeom>
+                    <a:noFill/>
+                    <a:ln>
+                      <a:noFill/>
+                    </a:ln>
+                    <a:effectLst>
+                      <a:outerShdw blurRad="63500" sx="102000" sy="102000" algn="ctr" rotWithShape="0">
+                        <a:prstClr val="black">
+                          <a:alpha val="40000"/>
+                        </a:prstClr>
+                      </a:outerShdw>
+                    </a:effectLst>
+                  </pic:spPr>
+                </pic:pic>
+              </a:graphicData>
+            </a:graphic>
+          </wp:inline>
+        </w:drawing>
+      </w:r>
+    </w:p>
+    <w:p>
+      <w:pPr>
+        <w:spacing w:before="240"/>
+        <w:rPr>
+          <w:b/>
+          <w:bCs/>
+          <w:lang w:val="it-IT"/>
+        </w:rPr>
+      </w:pPr>
+      <w:r>
+        <w:rPr>
+          <w:b/>
+          <w:bCs/>
+          <w:lang w:val="it-IT"/>
+        </w:rPr>
+        <w:t>Pagina aggiunta utenti:</w:t>
+      </w:r>
+    </w:p>
+    <w:p>
+      <w:pPr>
+        <w:spacing w:before="240"/>
+        <w:rPr>
+          <w:lang w:val="it-IT"/>
+        </w:rPr>
+      </w:pPr>
+      <w:r>
+        <w:rPr>
+          <w:noProof/>
+          <w:lang w:val="it-IT"/>
+        </w:rPr>
+        <w:drawing>
+          <wp:inline distT="0" distB="0" distL="0" distR="0" wp14:anchorId="03775284" wp14:editId="1623624B">
+            <wp:extent cx="6022117" cy="3086100"/>
+            <wp:effectExtent l="114300" t="95250" r="112395" b="95250"/>
+            <wp:docPr id="1256487956" name="Immagine 8"/>
+            <wp:cNvGraphicFramePr>
+              <a:graphicFrameLocks xmlns:a="http://schemas.openxmlformats.org/drawingml/2006/main" noChangeAspect="1"/>
+            </wp:cNvGraphicFramePr>
+            <a:graphic xmlns:a="http://schemas.openxmlformats.org/drawingml/2006/main">
+              <a:graphicData uri="http://schemas.openxmlformats.org/drawingml/2006/picture">
+                <pic:pic xmlns:pic="http://schemas.openxmlformats.org/drawingml/2006/picture">
+                  <pic:nvPicPr>
+                    <pic:cNvPr id="0" name="Picture 8"/>
+                    <pic:cNvPicPr>
+                      <a:picLocks noChangeAspect="1" noChangeArrowheads="1"/>
+                    </pic:cNvPicPr>
+                  </pic:nvPicPr>
+                  <pic:blipFill>
+                    <a:blip r:embed="rId23" cstate="print">
+                      <a:extLst>
+                        <a:ext uri="{28A0092B-C50C-407E-A947-70E740481C1C}">
+                          <a14:useLocalDpi xmlns:a14="http://schemas.microsoft.com/office/drawing/2010/main" val="0"/>
+                        </a:ext>
+                      </a:extLst>
+                    </a:blip>
+                    <a:srcRect/>
+                    <a:stretch>
+                      <a:fillRect/>
+                    </a:stretch>
+                  </pic:blipFill>
+                  <pic:spPr bwMode="auto">
+                    <a:xfrm>
+                      <a:off x="0" y="0"/>
+                      <a:ext cx="6031113" cy="3090710"/>
+                    </a:xfrm>
+                    <a:prstGeom prst="rect">
+                      <a:avLst/>
+                    </a:prstGeom>
+                    <a:noFill/>
+                    <a:ln>
+                      <a:noFill/>
+                    </a:ln>
+                    <a:effectLst>
+                      <a:outerShdw blurRad="63500" sx="102000" sy="102000" algn="ctr" rotWithShape="0">
+                        <a:prstClr val="black">
+                          <a:alpha val="40000"/>
+                        </a:prstClr>
+                      </a:outerShdw>
+                    </a:effectLst>
+                  </pic:spPr>
+                </pic:pic>
+              </a:graphicData>
+            </a:graphic>
+          </wp:inline>
+        </w:drawing>
+      </w:r>
+    </w:p>
+    <w:p>
+      <w:pPr>
+        <w:rPr>
+          <w:lang w:val="it-IT"/>
+        </w:rPr>
+      </w:pPr>
+      <w:r>
+        <w:rPr>
+          <w:lang w:val="it-IT"/>
+        </w:rPr>
+        <w:br w:type="page"/>
+      </w:r>
+    </w:p>
+    <w:p>
+      <w:pPr>
+        <w:pStyle w:val="Titolo3"/>
+      </w:pPr>
+      <w:r>
+        <w:lastRenderedPageBreak/>
+        <w:t xml:space="preserve">Pagina </w:t>
+      </w:r>
+      <w:r>
+        <w:t>gestione</w:t>
+      </w:r>
+      <w:r>
+        <w:t xml:space="preserve"> Prodotti</w:t>
+      </w:r>
+      <w:r>
+        <w:t xml:space="preserve">: </w:t>
+      </w:r>
+      <w:r>
+        <w:t xml:space="preserve">aggiunta e </w:t>
+      </w:r>
+      <w:r>
+        <w:t xml:space="preserve">vendite </w:t>
+      </w:r>
+      <w:r>
+        <w:t>(</w:t>
+      </w:r>
+      <w:proofErr w:type="spellStart"/>
+      <w:r>
+        <w:t>Vendor</w:t>
+      </w:r>
+      <w:proofErr w:type="spellEnd"/>
+      <w:r>
+        <w:t>)</w:t>
+      </w:r>
+    </w:p>
+    <w:p>
+      <w:r>
+        <w:t>Sono</w:t>
+      </w:r>
+      <w:r>
+        <w:t xml:space="preserve"> le pagine che permett</w:t>
+      </w:r>
+      <w:r>
+        <w:t>ono</w:t>
+      </w:r>
+      <w:r>
+        <w:t xml:space="preserve"> al </w:t>
+      </w:r>
+      <w:proofErr w:type="spellStart"/>
+      <w:r>
+        <w:t>v</w:t>
+      </w:r>
+      <w:r>
+        <w:t>endor</w:t>
+      </w:r>
+      <w:proofErr w:type="spellEnd"/>
+      <w:r>
+        <w:t xml:space="preserve"> di gestire tutti i suoi prodotti. Il </w:t>
+      </w:r>
+      <w:proofErr w:type="spellStart"/>
+      <w:r>
+        <w:t>vendor</w:t>
+      </w:r>
+      <w:proofErr w:type="spellEnd"/>
+      <w:r>
+        <w:t xml:space="preserve"> </w:t>
+      </w:r>
+      <w:r>
+        <w:t>può</w:t>
+      </w:r>
+      <w:r>
+        <w:t xml:space="preserve"> visualizzare tutti i prodotti </w:t>
+      </w:r>
+      <w:r>
+        <w:t xml:space="preserve">e </w:t>
+      </w:r>
+      <w:r>
+        <w:t xml:space="preserve">il numero di prodotti ancora disponibili. </w:t>
+      </w:r>
+      <w:r>
+        <w:t>Può</w:t>
+      </w:r>
+      <w:r>
+        <w:t xml:space="preserve"> anche aggiungere, modificare </w:t>
+      </w:r>
+      <w:r>
+        <w:t>ed</w:t>
+      </w:r>
+      <w:r>
+        <w:t xml:space="preserve"> eliminare i vari prodotti.</w:t>
+      </w:r>
+      <w:r>
+        <w:t xml:space="preserve"> </w:t>
+      </w:r>
+      <w:r>
+        <w:t xml:space="preserve">Il </w:t>
+      </w:r>
+      <w:proofErr w:type="spellStart"/>
+      <w:r>
+        <w:t>v</w:t>
+      </w:r>
+      <w:r>
+        <w:t>endor</w:t>
+      </w:r>
+      <w:proofErr w:type="spellEnd"/>
+      <w:r>
+        <w:t xml:space="preserve"> </w:t>
+      </w:r>
+      <w:r>
+        <w:t>ha</w:t>
+      </w:r>
+      <w:r>
+        <w:t xml:space="preserve"> anche a disposizione una pagina che </w:t>
+      </w:r>
+      <w:r>
+        <w:t xml:space="preserve">mostra </w:t>
+      </w:r>
+      <w:r>
+        <w:t>i vari ordini eseguiti, con la data e tutti i prodotti comprati dai clienti.</w:t>
+      </w:r>
+    </w:p>
+    <w:p>
+      <w:pPr>
+        <w:spacing w:before="240"/>
+        <w:rPr>
+          <w:b/>
+          <w:bCs/>
+          <w:lang w:val="it-IT"/>
+        </w:rPr>
+      </w:pPr>
+      <w:r>
+        <w:rPr>
+          <w:b/>
+          <w:bCs/>
+          <w:lang w:val="it-IT"/>
+        </w:rPr>
+        <w:t>Visualizzazione prodotti:</w:t>
+      </w:r>
+    </w:p>
+    <w:p>
+      <w:pPr>
+        <w:spacing w:before="240"/>
+        <w:jc w:val="center"/>
+        <w:rPr>
+          <w:b/>
+          <w:bCs/>
+          <w:lang w:val="it-IT"/>
+        </w:rPr>
+      </w:pPr>
+      <w:r>
+        <w:rPr>
+          <w:b/>
+          <w:bCs/>
+          <w:noProof/>
+          <w:lang w:val="it-IT"/>
+        </w:rPr>
+        <w:drawing>
+          <wp:inline distT="0" distB="0" distL="0" distR="0" wp14:anchorId="57E4A202" wp14:editId="3B8CDC17">
+            <wp:extent cx="5904443" cy="3076575"/>
+            <wp:effectExtent l="114300" t="95250" r="115570" b="85725"/>
+            <wp:docPr id="1632404053" name="Immagine 9"/>
+            <wp:cNvGraphicFramePr>
+              <a:graphicFrameLocks xmlns:a="http://schemas.openxmlformats.org/drawingml/2006/main" noChangeAspect="1"/>
+            </wp:cNvGraphicFramePr>
+            <a:graphic xmlns:a="http://schemas.openxmlformats.org/drawingml/2006/main">
+              <a:graphicData uri="http://schemas.openxmlformats.org/drawingml/2006/picture">
+                <pic:pic xmlns:pic="http://schemas.openxmlformats.org/drawingml/2006/picture">
+                  <pic:nvPicPr>
+                    <pic:cNvPr id="0" name="Picture 9"/>
+                    <pic:cNvPicPr>
+                      <a:picLocks noChangeAspect="1" noChangeArrowheads="1"/>
+                    </pic:cNvPicPr>
+                  </pic:nvPicPr>
+                  <pic:blipFill>
+                    <a:blip r:embed="rId24" cstate="print">
+                      <a:extLst>
+                        <a:ext uri="{28A0092B-C50C-407E-A947-70E740481C1C}">
+                          <a14:useLocalDpi xmlns:a14="http://schemas.microsoft.com/office/drawing/2010/main" val="0"/>
+                        </a:ext>
+                      </a:extLst>
+                    </a:blip>
+                    <a:srcRect/>
+                    <a:stretch>
+                      <a:fillRect/>
+                    </a:stretch>
+                  </pic:blipFill>
+                  <pic:spPr bwMode="auto">
+                    <a:xfrm>
+                      <a:off x="0" y="0"/>
+                      <a:ext cx="5947349" cy="3098931"/>
+                    </a:xfrm>
+                    <a:prstGeom prst="rect">
+                      <a:avLst/>
+                    </a:prstGeom>
+                    <a:noFill/>
+                    <a:ln>
+                      <a:noFill/>
+                    </a:ln>
+                    <a:effectLst>
+                      <a:outerShdw blurRad="63500" sx="102000" sy="102000" algn="ctr" rotWithShape="0">
+                        <a:prstClr val="black">
+                          <a:alpha val="40000"/>
+                        </a:prstClr>
+                      </a:outerShdw>
+                    </a:effectLst>
+                  </pic:spPr>
+                </pic:pic>
+              </a:graphicData>
+            </a:graphic>
+          </wp:inline>
+        </w:drawing>
+      </w:r>
+    </w:p>
+    <w:p>
+      <w:pPr>
+        <w:spacing w:before="240"/>
+        <w:rPr>
+          <w:b/>
+          <w:bCs/>
+          <w:lang w:val="it-IT"/>
+        </w:rPr>
+      </w:pPr>
+      <w:r>
+        <w:rPr>
+          <w:b/>
+          <w:bCs/>
+          <w:lang w:val="it-IT"/>
+        </w:rPr>
+        <w:t>Aggiunta</w:t>
+      </w:r>
+      <w:r>
+        <w:rPr>
+          <w:b/>
+          <w:bCs/>
+          <w:lang w:val="it-IT"/>
+        </w:rPr>
+        <w:t xml:space="preserve"> prodotti:</w:t>
+      </w:r>
+    </w:p>
+    <w:p>
+      <w:pPr>
+        <w:spacing w:before="240"/>
+        <w:jc w:val="center"/>
+        <w:rPr>
+          <w:b/>
+          <w:bCs/>
+          <w:lang w:val="it-IT"/>
+        </w:rPr>
+      </w:pPr>
+      <w:r>
+        <w:rPr>
+          <w:b/>
+          <w:bCs/>
+          <w:noProof/>
+          <w:lang w:val="it-IT"/>
+        </w:rPr>
+        <w:drawing>
+          <wp:inline distT="0" distB="0" distL="0" distR="0" wp14:anchorId="00D12B1A" wp14:editId="79F4B33B">
+            <wp:extent cx="5881944" cy="3257550"/>
+            <wp:effectExtent l="114300" t="114300" r="119380" b="114300"/>
+            <wp:docPr id="1436627259" name="Immagine 11"/>
+            <wp:cNvGraphicFramePr>
+              <a:graphicFrameLocks xmlns:a="http://schemas.openxmlformats.org/drawingml/2006/main" noChangeAspect="1"/>
+            </wp:cNvGraphicFramePr>
+            <a:graphic xmlns:a="http://schemas.openxmlformats.org/drawingml/2006/main">
+              <a:graphicData uri="http://schemas.openxmlformats.org/drawingml/2006/picture">
+                <pic:pic xmlns:pic="http://schemas.openxmlformats.org/drawingml/2006/picture">
+                  <pic:nvPicPr>
+                    <pic:cNvPr id="0" name="Picture 11"/>
+                    <pic:cNvPicPr>
+                      <a:picLocks noChangeAspect="1" noChangeArrowheads="1"/>
+                    </pic:cNvPicPr>
+                  </pic:nvPicPr>
+                  <pic:blipFill>
+                    <a:blip r:embed="rId25" cstate="print">
+                      <a:extLst>
+                        <a:ext uri="{28A0092B-C50C-407E-A947-70E740481C1C}">
+                          <a14:useLocalDpi xmlns:a14="http://schemas.microsoft.com/office/drawing/2010/main" val="0"/>
+                        </a:ext>
+                      </a:extLst>
+                    </a:blip>
+                    <a:srcRect/>
+                    <a:stretch>
+                      <a:fillRect/>
+                    </a:stretch>
+                  </pic:blipFill>
+                  <pic:spPr bwMode="auto">
+                    <a:xfrm>
+                      <a:off x="0" y="0"/>
+                      <a:ext cx="5926667" cy="3282319"/>
+                    </a:xfrm>
+                    <a:prstGeom prst="rect">
+                      <a:avLst/>
+                    </a:prstGeom>
+                    <a:noFill/>
+                    <a:ln>
+                      <a:noFill/>
+                    </a:ln>
+                    <a:effectLst>
+                      <a:outerShdw blurRad="63500" sx="102000" sy="102000" algn="ctr" rotWithShape="0">
+                        <a:prstClr val="black">
+                          <a:alpha val="40000"/>
+                        </a:prstClr>
+                      </a:outerShdw>
+                    </a:effectLst>
+                  </pic:spPr>
+                </pic:pic>
+              </a:graphicData>
+            </a:graphic>
+          </wp:inline>
+        </w:drawing>
+      </w:r>
+    </w:p>
+    <w:p>
+      <w:pPr>
+        <w:rPr>
+          <w:b/>
+          <w:bCs/>
+          <w:lang w:val="it-IT"/>
+        </w:rPr>
+      </w:pPr>
+      <w:r>
+        <w:rPr>
+          <w:b/>
+          <w:bCs/>
+          <w:lang w:val="it-IT"/>
+        </w:rPr>
+        <w:lastRenderedPageBreak/>
+        <w:t>Visualizzazione vendite:</w:t>
+      </w:r>
+    </w:p>
+    <w:p>
+      <w:pPr>
+        <w:spacing w:before="240"/>
+        <w:jc w:val="center"/>
+        <w:rPr>
+          <w:b/>
+          <w:bCs/>
+          <w:lang w:val="it-IT"/>
+        </w:rPr>
+      </w:pPr>
+      <w:r>
+        <w:rPr>
+          <w:b/>
+          <w:bCs/>
+          <w:noProof/>
+          <w:lang w:val="it-IT"/>
+        </w:rPr>
+        <w:drawing>
+          <wp:inline distT="0" distB="0" distL="0" distR="0" wp14:anchorId="526B661D" wp14:editId="13BE4002">
+            <wp:extent cx="5958251" cy="3257550"/>
+            <wp:effectExtent l="114300" t="114300" r="118745" b="114300"/>
+            <wp:docPr id="359772663" name="Immagine 12"/>
+            <wp:cNvGraphicFramePr>
+              <a:graphicFrameLocks xmlns:a="http://schemas.openxmlformats.org/drawingml/2006/main" noChangeAspect="1"/>
+            </wp:cNvGraphicFramePr>
+            <a:graphic xmlns:a="http://schemas.openxmlformats.org/drawingml/2006/main">
+              <a:graphicData uri="http://schemas.openxmlformats.org/drawingml/2006/picture">
+                <pic:pic xmlns:pic="http://schemas.openxmlformats.org/drawingml/2006/picture">
+                  <pic:nvPicPr>
+                    <pic:cNvPr id="0" name="Picture 12"/>
+                    <pic:cNvPicPr>
+                      <a:picLocks noChangeAspect="1" noChangeArrowheads="1"/>
+                    </pic:cNvPicPr>
+                  </pic:nvPicPr>
+                  <pic:blipFill>
+                    <a:blip r:embed="rId26" cstate="print">
+                      <a:extLst>
+                        <a:ext uri="{28A0092B-C50C-407E-A947-70E740481C1C}">
+                          <a14:useLocalDpi xmlns:a14="http://schemas.microsoft.com/office/drawing/2010/main" val="0"/>
+                        </a:ext>
+                      </a:extLst>
+                    </a:blip>
+                    <a:srcRect/>
+                    <a:stretch>
+                      <a:fillRect/>
+                    </a:stretch>
+                  </pic:blipFill>
+                  <pic:spPr bwMode="auto">
+                    <a:xfrm>
+                      <a:off x="0" y="0"/>
+                      <a:ext cx="5991530" cy="3275745"/>
+                    </a:xfrm>
+                    <a:prstGeom prst="rect">
+                      <a:avLst/>
+                    </a:prstGeom>
+                    <a:noFill/>
+                    <a:ln>
+                      <a:noFill/>
+                    </a:ln>
+                    <a:effectLst>
+                      <a:outerShdw blurRad="63500" sx="102000" sy="102000" algn="ctr" rotWithShape="0">
+                        <a:prstClr val="black">
+                          <a:alpha val="40000"/>
+                        </a:prstClr>
+                      </a:outerShdw>
+                    </a:effectLst>
+                  </pic:spPr>
+                </pic:pic>
+              </a:graphicData>
+            </a:graphic>
+          </wp:inline>
+        </w:drawing>
+      </w:r>
+    </w:p>
+    <w:p>
+      <w:pPr>
+        <w:pStyle w:val="Titolo3"/>
+      </w:pPr>
+      <w:r>
+        <w:t>Pagina impostazioni</w:t>
+      </w:r>
+    </w:p>
+    <w:p>
+      <w:pPr>
+        <w:rPr>
+          <w:lang w:val="it-IT"/>
+        </w:rPr>
+      </w:pPr>
+      <w:r>
+        <w:rPr>
+          <w:lang w:val="it-IT"/>
+        </w:rPr>
+        <w:t xml:space="preserve">È </w:t>
+      </w:r>
+      <w:r>
+        <w:rPr>
+          <w:lang w:val="it-IT"/>
+        </w:rPr>
+        <w:t xml:space="preserve">la pagina dove l’utente dopo avere creato l’account potrà cambiare immagine, i propri dati personali </w:t>
+      </w:r>
+      <w:proofErr w:type="gramStart"/>
+      <w:r>
+        <w:rPr>
+          <w:lang w:val="it-IT"/>
+        </w:rPr>
+        <w:t>e</w:t>
+      </w:r>
+      <w:proofErr w:type="gramEnd"/>
+      <w:r>
+        <w:rPr>
+          <w:lang w:val="it-IT"/>
+        </w:rPr>
+        <w:t xml:space="preserve"> eventualmente anche la password.</w:t>
+      </w:r>
+    </w:p>
+    <w:p>
+      <w:pPr>
+        <w:spacing w:before="240"/>
+        <w:jc w:val="center"/>
+        <w:rPr>
+          <w:lang w:val="it-IT"/>
+        </w:rPr>
+      </w:pPr>
+      <w:r>
+        <w:rPr>
+          <w:noProof/>
+          <w:lang w:val="it-IT"/>
+        </w:rPr>
+        <w:drawing>
+          <wp:inline distT="0" distB="0" distL="0" distR="0" wp14:anchorId="0ECA0716" wp14:editId="7539B1AB">
+            <wp:extent cx="5905988" cy="3228975"/>
+            <wp:effectExtent l="114300" t="114300" r="114300" b="104775"/>
+            <wp:docPr id="459937217" name="Immagine 13"/>
+            <wp:cNvGraphicFramePr>
+              <a:graphicFrameLocks xmlns:a="http://schemas.openxmlformats.org/drawingml/2006/main" noChangeAspect="1"/>
+            </wp:cNvGraphicFramePr>
+            <a:graphic xmlns:a="http://schemas.openxmlformats.org/drawingml/2006/main">
+              <a:graphicData uri="http://schemas.openxmlformats.org/drawingml/2006/picture">
+                <pic:pic xmlns:pic="http://schemas.openxmlformats.org/drawingml/2006/picture">
+                  <pic:nvPicPr>
+                    <pic:cNvPr id="0" name="Picture 13"/>
+                    <pic:cNvPicPr>
+                      <a:picLocks noChangeAspect="1" noChangeArrowheads="1"/>
+                    </pic:cNvPicPr>
+                  </pic:nvPicPr>
+                  <pic:blipFill>
+                    <a:blip r:embed="rId27" cstate="print">
+                      <a:extLst>
+                        <a:ext uri="{28A0092B-C50C-407E-A947-70E740481C1C}">
+                          <a14:useLocalDpi xmlns:a14="http://schemas.microsoft.com/office/drawing/2010/main" val="0"/>
+                        </a:ext>
+                      </a:extLst>
+                    </a:blip>
+                    <a:srcRect/>
+                    <a:stretch>
+                      <a:fillRect/>
+                    </a:stretch>
+                  </pic:blipFill>
+                  <pic:spPr bwMode="auto">
+                    <a:xfrm>
+                      <a:off x="0" y="0"/>
+                      <a:ext cx="5925475" cy="3239629"/>
+                    </a:xfrm>
+                    <a:prstGeom prst="rect">
+                      <a:avLst/>
+                    </a:prstGeom>
+                    <a:noFill/>
+                    <a:ln>
+                      <a:noFill/>
+                    </a:ln>
+                    <a:effectLst>
+                      <a:outerShdw blurRad="63500" sx="102000" sy="102000" algn="ctr" rotWithShape="0">
+                        <a:prstClr val="black">
+                          <a:alpha val="40000"/>
+                        </a:prstClr>
+                      </a:outerShdw>
+                    </a:effectLst>
+                  </pic:spPr>
+                </pic:pic>
+              </a:graphicData>
+            </a:graphic>
+          </wp:inline>
+        </w:drawing>
+      </w:r>
+    </w:p>
+    <w:p>
+      <w:pPr>
+        <w:pStyle w:val="Titolo3"/>
+      </w:pPr>
+      <w:r>
+        <w:lastRenderedPageBreak/>
+        <w:t>Pagina carrello</w:t>
+      </w:r>
+    </w:p>
+    <w:p>
+      <w:r>
+        <w:t xml:space="preserve">È la pagina dove vengono </w:t>
+      </w:r>
+      <w:r>
+        <w:t>aggiunti tutti</w:t>
+      </w:r>
+      <w:r>
+        <w:t xml:space="preserve"> i prodotti che si vogliono acquistare, è possibile anche eliminare o aggiungere il prodotto ai preferiti. </w:t>
+      </w:r>
+      <w:r>
+        <w:t>È</w:t>
+      </w:r>
+      <w:r>
+        <w:t xml:space="preserve"> possibile cambiare la quantità del prodotto che si vuole acquistare. In basso sarà presente il totale </w:t>
+      </w:r>
+      <w:r>
+        <w:t>dell’acquisto</w:t>
+      </w:r>
+      <w:r>
+        <w:t>. Essa presenta anche un tasto che porterà al pagamento (che verrà effettuato tramite Stripe).</w:t>
+      </w:r>
+    </w:p>
+    <w:p>
+      <w:pPr>
+        <w:spacing w:before="240"/>
+        <w:jc w:val="center"/>
+      </w:pPr>
+      <w:r>
+        <w:rPr>
+          <w:noProof/>
+        </w:rPr>
+        <w:drawing>
+          <wp:inline distT="0" distB="0" distL="0" distR="0" wp14:anchorId="4D202908" wp14:editId="4CD9D4D0">
+            <wp:extent cx="5638800" cy="3175674"/>
+            <wp:effectExtent l="133350" t="114300" r="114300" b="120015"/>
+            <wp:docPr id="1712143787" name="Immagine 14"/>
+            <wp:cNvGraphicFramePr>
+              <a:graphicFrameLocks xmlns:a="http://schemas.openxmlformats.org/drawingml/2006/main" noChangeAspect="1"/>
+            </wp:cNvGraphicFramePr>
+            <a:graphic xmlns:a="http://schemas.openxmlformats.org/drawingml/2006/main">
+              <a:graphicData uri="http://schemas.openxmlformats.org/drawingml/2006/picture">
+                <pic:pic xmlns:pic="http://schemas.openxmlformats.org/drawingml/2006/picture">
+                  <pic:nvPicPr>
+                    <pic:cNvPr id="0" name="Picture 14"/>
+                    <pic:cNvPicPr>
+                      <a:picLocks noChangeAspect="1" noChangeArrowheads="1"/>
+                    </pic:cNvPicPr>
+                  </pic:nvPicPr>
+                  <pic:blipFill>
+                    <a:blip r:embed="rId28" cstate="print">
+                      <a:extLst>
+                        <a:ext uri="{28A0092B-C50C-407E-A947-70E740481C1C}">
+                          <a14:useLocalDpi xmlns:a14="http://schemas.microsoft.com/office/drawing/2010/main" val="0"/>
+                        </a:ext>
+                      </a:extLst>
+                    </a:blip>
+                    <a:srcRect/>
+                    <a:stretch>
+                      <a:fillRect/>
+                    </a:stretch>
+                  </pic:blipFill>
+                  <pic:spPr bwMode="auto">
+                    <a:xfrm>
+                      <a:off x="0" y="0"/>
+                      <a:ext cx="5645553" cy="3179477"/>
+                    </a:xfrm>
+                    <a:prstGeom prst="rect">
+                      <a:avLst/>
+                    </a:prstGeom>
+                    <a:noFill/>
+                    <a:ln>
+                      <a:noFill/>
+                    </a:ln>
+                    <a:effectLst>
+                      <a:outerShdw blurRad="63500" sx="102000" sy="102000" algn="ctr" rotWithShape="0">
+                        <a:prstClr val="black">
+                          <a:alpha val="40000"/>
+                        </a:prstClr>
+                      </a:outerShdw>
+                    </a:effectLst>
+                  </pic:spPr>
+                </pic:pic>
+              </a:graphicData>
+            </a:graphic>
+          </wp:inline>
+        </w:drawing>
       </w:r>
     </w:p>
     <w:p>
@@ -11144,7 +12912,7 @@
                     </pic:cNvPicPr>
                   </pic:nvPicPr>
                   <pic:blipFill>
-                    <a:blip r:embed="rId16">
+                    <a:blip r:embed="rId29">
                       <a:extLst>
                         <a:ext uri="{28A0092B-C50C-407E-A947-70E740481C1C}">
                           <a14:useLocalDpi xmlns:a14="http://schemas.microsoft.com/office/drawing/2010/main" val="0"/>
@@ -11235,7 +13003,7 @@
                     </pic:cNvPicPr>
                   </pic:nvPicPr>
                   <pic:blipFill>
-                    <a:blip r:embed="rId17">
+                    <a:blip r:embed="rId30">
                       <a:extLst>
                         <a:ext uri="{28A0092B-C50C-407E-A947-70E740481C1C}">
                           <a14:useLocalDpi xmlns:a14="http://schemas.microsoft.com/office/drawing/2010/main" val="0"/>
@@ -11339,7 +13107,7 @@
                     </pic:cNvPicPr>
                   </pic:nvPicPr>
                   <pic:blipFill>
-                    <a:blip r:embed="rId18">
+                    <a:blip r:embed="rId31">
                       <a:extLst>
                         <a:ext uri="{28A0092B-C50C-407E-A947-70E740481C1C}">
                           <a14:useLocalDpi xmlns:a14="http://schemas.microsoft.com/office/drawing/2010/main" val="0"/>
@@ -11449,7 +13217,7 @@
                     </pic:cNvPicPr>
                   </pic:nvPicPr>
                   <pic:blipFill>
-                    <a:blip r:embed="rId19">
+                    <a:blip r:embed="rId32">
                       <a:extLst>
                         <a:ext uri="{28A0092B-C50C-407E-A947-70E740481C1C}">
                           <a14:useLocalDpi xmlns:a14="http://schemas.microsoft.com/office/drawing/2010/main" val="0"/>
@@ -11541,7 +13309,7 @@
                     </pic:cNvPicPr>
                   </pic:nvPicPr>
                   <pic:blipFill>
-                    <a:blip r:embed="rId20">
+                    <a:blip r:embed="rId33">
                       <a:extLst>
                         <a:ext uri="{28A0092B-C50C-407E-A947-70E740481C1C}">
                           <a14:useLocalDpi xmlns:a14="http://schemas.microsoft.com/office/drawing/2010/main" val="0"/>
@@ -11659,7 +13427,7 @@
                     </pic:cNvPicPr>
                   </pic:nvPicPr>
                   <pic:blipFill>
-                    <a:blip r:embed="rId21">
+                    <a:blip r:embed="rId34">
                       <a:extLst>
                         <a:ext uri="{28A0092B-C50C-407E-A947-70E740481C1C}">
                           <a14:useLocalDpi xmlns:a14="http://schemas.microsoft.com/office/drawing/2010/main" val="0"/>
@@ -11763,7 +13531,7 @@
                     </pic:cNvPicPr>
                   </pic:nvPicPr>
                   <pic:blipFill>
-                    <a:blip r:embed="rId22">
+                    <a:blip r:embed="rId35">
                       <a:extLst>
                         <a:ext uri="{28A0092B-C50C-407E-A947-70E740481C1C}">
                           <a14:useLocalDpi xmlns:a14="http://schemas.microsoft.com/office/drawing/2010/main" val="0"/>
@@ -11816,8 +13584,6 @@
       <w:r>
         <w:t>Di seguito, la descrizione generale del Class Diagram:</w:t>
       </w:r>
-      <w:bookmarkStart w:id="35" w:name="_GoBack"/>
-      <w:bookmarkEnd w:id="35"/>
     </w:p>
     <w:p>
       <w:pPr>
@@ -12028,57 +13794,6 @@
       </w:r>
       <w:r>
         <w:t>: Dettaglio di un ordine specifico, che collega un prodotto a un ordine, specificando quantità e prezzo.</w:t>
-      </w:r>
-    </w:p>
-    <w:p>
-      <w:pPr>
-        <w:pStyle w:val="Paragrafoelenco"/>
-        <w:numPr>
-          <w:ilvl w:val="0"/>
-          <w:numId w:val="32"/>
-        </w:numPr>
-        <w:spacing w:after="20"/>
-        <w:ind w:left="714" w:hanging="357"/>
-        <w:contextualSpacing w:val="0"/>
-      </w:pPr>
-      <w:r>
-        <w:rPr>
-          <w:b/>
-        </w:rPr>
-        <w:t>Cart</w:t>
-      </w:r>
-      <w:r>
-        <w:t>: Carrello di un cliente, associato al cliente stesso tramite il relativo customerId, con metodi per aggiungere, rimuovere</w:t>
-      </w:r>
-      <w:r>
-        <w:t xml:space="preserve"> </w:t>
-      </w:r>
-      <w:r>
-        <w:t>articoli e calcolare il totale</w:t>
-      </w:r>
-      <w:r>
-        <w:t>.</w:t>
-      </w:r>
-    </w:p>
-    <w:p>
-      <w:pPr>
-        <w:pStyle w:val="Paragrafoelenco"/>
-        <w:numPr>
-          <w:ilvl w:val="0"/>
-          <w:numId w:val="32"/>
-        </w:numPr>
-        <w:spacing w:after="20"/>
-        <w:ind w:left="714" w:hanging="357"/>
-        <w:contextualSpacing w:val="0"/>
-      </w:pPr>
-      <w:r>
-        <w:rPr>
-          <w:b/>
-        </w:rPr>
-        <w:t>CartItem</w:t>
-      </w:r>
-      <w:r>
-        <w:t>: Articolo presente in un carrello, con riferimento al prodotto, quantità e prezzo.</w:t>
       </w:r>
     </w:p>
     <w:p>
@@ -12153,6 +13868,19 @@
     </w:p>
     <w:p>
       <w:pPr>
+        <w:rPr>
+          <w:b/>
+        </w:rPr>
+      </w:pPr>
+      <w:r>
+        <w:rPr>
+          <w:b/>
+        </w:rPr>
+        <w:br w:type="page"/>
+      </w:r>
+    </w:p>
+    <w:p>
+      <w:pPr>
         <w:spacing w:after="17"/>
         <w:jc w:val="center"/>
         <w:rPr>
@@ -12162,13 +13890,14 @@
       <w:r>
         <w:rPr>
           <w:noProof/>
+          <w:lang w:val="it-IT"/>
         </w:rPr>
         <w:lastRenderedPageBreak/>
         <w:drawing>
-          <wp:inline distT="0" distB="0" distL="0" distR="0" wp14:anchorId="2997DC23" wp14:editId="38D1C956">
-            <wp:extent cx="5731764" cy="6313335"/>
-            <wp:effectExtent l="114300" t="133350" r="116840" b="125730"/>
-            <wp:docPr id="12" name="Immagine 12"/>
+          <wp:inline distT="0" distB="0" distL="0" distR="0" wp14:anchorId="3D9AB3F7" wp14:editId="5B228941">
+            <wp:extent cx="5984757" cy="6562725"/>
+            <wp:effectExtent l="114300" t="133350" r="111760" b="123825"/>
+            <wp:docPr id="1020921113" name="Immagine 15"/>
             <wp:cNvGraphicFramePr>
               <a:graphicFrameLocks xmlns:a="http://schemas.openxmlformats.org/drawingml/2006/main" noChangeAspect="1"/>
             </wp:cNvGraphicFramePr>
@@ -12176,13 +13905,13 @@
               <a:graphicData uri="http://schemas.openxmlformats.org/drawingml/2006/picture">
                 <pic:pic xmlns:pic="http://schemas.openxmlformats.org/drawingml/2006/picture">
                   <pic:nvPicPr>
-                    <pic:cNvPr id="0" name="Picture 2"/>
+                    <pic:cNvPr id="0" name="Picture 15"/>
                     <pic:cNvPicPr>
                       <a:picLocks noChangeAspect="1" noChangeArrowheads="1"/>
                     </pic:cNvPicPr>
                   </pic:nvPicPr>
                   <pic:blipFill>
-                    <a:blip r:embed="rId23">
+                    <a:blip r:embed="rId36" cstate="print">
                       <a:extLst>
                         <a:ext uri="{28A0092B-C50C-407E-A947-70E740481C1C}">
                           <a14:useLocalDpi xmlns:a14="http://schemas.microsoft.com/office/drawing/2010/main" val="0"/>
@@ -12197,7 +13926,7 @@
                   <pic:spPr bwMode="auto">
                     <a:xfrm>
                       <a:off x="0" y="0"/>
-                      <a:ext cx="5749593" cy="6332973"/>
+                      <a:ext cx="6013434" cy="6594172"/>
                     </a:xfrm>
                     <a:prstGeom prst="rect">
                       <a:avLst/>
@@ -12220,6 +13949,14 @@
           </wp:inline>
         </w:drawing>
       </w:r>
+    </w:p>
+    <w:p>
+      <w:pPr>
+        <w:spacing w:after="17"/>
+        <w:rPr>
+          <w:lang w:val="it-IT"/>
+        </w:rPr>
+      </w:pPr>
       <w:r>
         <w:rPr>
           <w:lang w:val="it-IT"/>
@@ -12234,104 +13971,104 @@
           <w:bottom w:val="single" w:sz="4" w:space="1" w:color="auto"/>
         </w:pBdr>
       </w:pPr>
-      <w:bookmarkStart w:id="36" w:name="_Toc461179222"/>
-      <w:bookmarkStart w:id="37" w:name="_Toc94790459"/>
-      <w:bookmarkStart w:id="38" w:name="_Toc189853867"/>
+      <w:bookmarkStart w:id="35" w:name="_Toc461179222"/>
+      <w:bookmarkStart w:id="36" w:name="_Toc94790459"/>
+      <w:bookmarkStart w:id="37" w:name="_Toc189853867"/>
       <w:r>
         <w:lastRenderedPageBreak/>
         <w:t>Implementazione</w:t>
       </w:r>
+      <w:bookmarkEnd w:id="35"/>
       <w:bookmarkEnd w:id="36"/>
       <w:bookmarkEnd w:id="37"/>
+    </w:p>
+    <w:p>
+      <w:r>
+        <w:t>In questo capitolo dovrà essere mostrato come è stato realizzato il lavoro. Questa parte può differenziarsi dalla progettazione in quanto il risultato ottenuto non per forza può essere come era stato progettato.</w:t>
+      </w:r>
+    </w:p>
+    <w:p>
+      <w:r>
+        <w:t xml:space="preserve">Sulla base di queste informazioni il lavoro svolto dovrà essere riproducibile. </w:t>
+      </w:r>
+    </w:p>
+    <w:p>
+      <w:r>
+        <w:t>In questa parte è richiesto l’inserimento di codice sorgente</w:t>
+      </w:r>
+      <w:r>
+        <w:t xml:space="preserve"> - </w:t>
+      </w:r>
+      <w:r>
+        <w:t>P</w:t>
+      </w:r>
+      <w:r>
+        <w:t xml:space="preserve">rint </w:t>
+      </w:r>
+      <w:r>
+        <w:t>S</w:t>
+      </w:r>
+      <w:r>
+        <w:t xml:space="preserve">creen </w:t>
+      </w:r>
+      <w:r>
+        <w:t xml:space="preserve">- </w:t>
+      </w:r>
+      <w:r>
+        <w:t>di maschere solamente per quei passaggi particolarmente significativi e/o critici.</w:t>
+      </w:r>
+    </w:p>
+    <w:p>
+      <w:r>
+        <w:t>Inoltre,</w:t>
+      </w:r>
+      <w:r>
+        <w:t xml:space="preserve"> dovranno essere descritte eventuali varianti di soluzione o scelte di prodotti con motivazione delle scelte.</w:t>
+      </w:r>
+    </w:p>
+    <w:p>
+      <w:r>
+        <w:t>Non deve apparire nessuna forma di guida d’uso di librerie o di componenti utilizzati. Eventualmente questa va allegata.</w:t>
+      </w:r>
+    </w:p>
+    <w:p>
+      <w:r>
+        <w:t>Per eventuali dettagli si possono inserire riferimenti ai diari.</w:t>
+      </w:r>
+    </w:p>
+    <w:p>
+      <w:pPr>
+        <w:pStyle w:val="Titolo1"/>
+        <w:rPr>
+          <w:lang w:val="it-IT"/>
+        </w:rPr>
+      </w:pPr>
+      <w:bookmarkStart w:id="38" w:name="_Toc461179223"/>
+      <w:bookmarkStart w:id="39" w:name="_Toc94790460"/>
+      <w:bookmarkStart w:id="40" w:name="_Toc189853868"/>
+      <w:r>
+        <w:rPr>
+          <w:lang w:val="it-IT"/>
+        </w:rPr>
+        <w:t>Test</w:t>
+      </w:r>
       <w:bookmarkEnd w:id="38"/>
-    </w:p>
-    <w:p>
-      <w:r>
-        <w:t>In questo capitolo dovrà essere mostrato come è stato realizzato il lavoro. Questa parte può differenziarsi dalla progettazione in quanto il risultato ottenuto non per forza può essere come era stato progettato.</w:t>
-      </w:r>
-    </w:p>
-    <w:p>
-      <w:r>
-        <w:t xml:space="preserve">Sulla base di queste informazioni il lavoro svolto dovrà essere riproducibile. </w:t>
-      </w:r>
-    </w:p>
-    <w:p>
-      <w:r>
-        <w:t>In questa parte è richiesto l’inserimento di codice sorgente</w:t>
-      </w:r>
-      <w:r>
-        <w:t xml:space="preserve"> - </w:t>
-      </w:r>
-      <w:r>
-        <w:t>P</w:t>
-      </w:r>
-      <w:r>
-        <w:t xml:space="preserve">rint </w:t>
-      </w:r>
-      <w:r>
-        <w:t>S</w:t>
-      </w:r>
-      <w:r>
-        <w:t xml:space="preserve">creen </w:t>
-      </w:r>
-      <w:r>
-        <w:t xml:space="preserve">- </w:t>
-      </w:r>
-      <w:r>
-        <w:t>di maschere solamente per quei passaggi particolarmente significativi e/o critici.</w:t>
-      </w:r>
-    </w:p>
-    <w:p>
-      <w:r>
-        <w:t>Inoltre,</w:t>
-      </w:r>
-      <w:r>
-        <w:t xml:space="preserve"> dovranno essere descritte eventuali varianti di soluzione o scelte di prodotti con motivazione delle scelte.</w:t>
-      </w:r>
-    </w:p>
-    <w:p>
-      <w:r>
-        <w:t>Non deve apparire nessuna forma di guida d’uso di librerie o di componenti utilizzati. Eventualmente questa va allegata.</w:t>
-      </w:r>
-    </w:p>
-    <w:p>
-      <w:r>
-        <w:t>Per eventuali dettagli si possono inserire riferimenti ai diari.</w:t>
-      </w:r>
-    </w:p>
-    <w:p>
-      <w:pPr>
-        <w:pStyle w:val="Titolo1"/>
-        <w:rPr>
-          <w:lang w:val="it-IT"/>
-        </w:rPr>
-      </w:pPr>
-      <w:bookmarkStart w:id="39" w:name="_Toc461179223"/>
-      <w:bookmarkStart w:id="40" w:name="_Toc94790460"/>
-      <w:bookmarkStart w:id="41" w:name="_Toc189853868"/>
-      <w:r>
-        <w:rPr>
-          <w:lang w:val="it-IT"/>
-        </w:rPr>
-        <w:t>Test</w:t>
-      </w:r>
       <w:bookmarkEnd w:id="39"/>
       <w:bookmarkEnd w:id="40"/>
+    </w:p>
+    <w:p>
+      <w:pPr>
+        <w:pStyle w:val="Titolo2"/>
+      </w:pPr>
+      <w:bookmarkStart w:id="41" w:name="_Toc461179224"/>
+      <w:bookmarkStart w:id="42" w:name="_Toc94790461"/>
+      <w:bookmarkStart w:id="43" w:name="_Toc189853869"/>
+      <w:r>
+        <w:t>Protocollo di test</w:t>
+      </w:r>
       <w:bookmarkEnd w:id="41"/>
-    </w:p>
-    <w:p>
-      <w:pPr>
-        <w:pStyle w:val="Titolo2"/>
-      </w:pPr>
-      <w:bookmarkStart w:id="42" w:name="_Toc461179224"/>
-      <w:bookmarkStart w:id="43" w:name="_Toc94790461"/>
-      <w:bookmarkStart w:id="44" w:name="_Toc189853869"/>
-      <w:r>
-        <w:t>Protocollo di test</w:t>
-      </w:r>
       <w:bookmarkEnd w:id="42"/>
       <w:bookmarkEnd w:id="43"/>
-      <w:bookmarkEnd w:id="44"/>
     </w:p>
     <w:p>
       <w:pPr>
@@ -13368,7 +15105,7 @@
           <w:lang w:val="fr-CH"/>
         </w:rPr>
       </w:pPr>
-      <w:bookmarkStart w:id="45" w:name="_Toc461179225"/>
+      <w:bookmarkStart w:id="44" w:name="_Toc461179225"/>
       <w:r>
         <w:rPr>
           <w:lang w:val="fr-CH"/>
@@ -13380,313 +15117,313 @@
       <w:pPr>
         <w:pStyle w:val="Titolo2"/>
       </w:pPr>
-      <w:bookmarkStart w:id="46" w:name="_Toc94790462"/>
-      <w:bookmarkStart w:id="47" w:name="_Toc189853870"/>
+      <w:bookmarkStart w:id="45" w:name="_Toc94790462"/>
+      <w:bookmarkStart w:id="46" w:name="_Toc189853870"/>
       <w:r>
         <w:lastRenderedPageBreak/>
         <w:t>Risultati test</w:t>
       </w:r>
+      <w:bookmarkEnd w:id="44"/>
       <w:bookmarkEnd w:id="45"/>
       <w:bookmarkEnd w:id="46"/>
+    </w:p>
+    <w:p>
+      <w:pPr>
+        <w:rPr>
+          <w:lang w:val="it-IT"/>
+        </w:rPr>
+      </w:pPr>
+      <w:r>
+        <w:rPr>
+          <w:lang w:val="it-IT"/>
+        </w:rPr>
+        <w:t>Tabella riassuntiva in cui si inseriscono i test riusciti e non del prodotto finale. Se un test non riesce e viene corretto l’errore, questo dovrà risultare nel documento finale come riuscito (la procedura della correzione apparirà nel diario), altrimenti dovrà essere descritto l’errore con eventuali ipotesi di correzione.</w:t>
+      </w:r>
+    </w:p>
+    <w:p>
+      <w:pPr>
+        <w:pStyle w:val="Titolo2"/>
+      </w:pPr>
+      <w:bookmarkStart w:id="47" w:name="_Toc461179226"/>
+      <w:bookmarkStart w:id="48" w:name="_Toc94790463"/>
+      <w:bookmarkStart w:id="49" w:name="_Toc189853871"/>
+      <w:r>
+        <w:t>Mancanze</w:t>
+      </w:r>
+      <w:r>
+        <w:t>/limitazioni conosciute</w:t>
+      </w:r>
       <w:bookmarkEnd w:id="47"/>
-    </w:p>
-    <w:p>
-      <w:pPr>
-        <w:rPr>
-          <w:lang w:val="it-IT"/>
-        </w:rPr>
-      </w:pPr>
-      <w:r>
-        <w:rPr>
-          <w:lang w:val="it-IT"/>
-        </w:rPr>
-        <w:t>Tabella riassuntiva in cui si inseriscono i test riusciti e non del prodotto finale. Se un test non riesce e viene corretto l’errore, questo dovrà risultare nel documento finale come riuscito (la procedura della correzione apparirà nel diario), altrimenti dovrà essere descritto l’errore con eventuali ipotesi di correzione.</w:t>
-      </w:r>
-    </w:p>
-    <w:p>
-      <w:pPr>
-        <w:pStyle w:val="Titolo2"/>
-      </w:pPr>
-      <w:bookmarkStart w:id="48" w:name="_Toc461179226"/>
-      <w:bookmarkStart w:id="49" w:name="_Toc94790463"/>
-      <w:bookmarkStart w:id="50" w:name="_Toc189853871"/>
-      <w:r>
-        <w:t>Mancanze</w:t>
-      </w:r>
-      <w:r>
-        <w:t>/limitazioni conosciute</w:t>
-      </w:r>
       <w:bookmarkEnd w:id="48"/>
       <w:bookmarkEnd w:id="49"/>
+    </w:p>
+    <w:p>
+      <w:pPr>
+        <w:rPr>
+          <w:lang w:val="it-IT"/>
+        </w:rPr>
+      </w:pPr>
+      <w:r>
+        <w:rPr>
+          <w:lang w:val="it-IT"/>
+        </w:rPr>
+        <w:t>Descrizione con motivazione di eventuali elementi mancanti o non completamente implementati, al di fuori dei test case. Non devono essere riportati gli errori e i problemi riscontrati e poi risolti durante il progetto.</w:t>
+      </w:r>
+    </w:p>
+    <w:p>
+      <w:pPr>
+        <w:pStyle w:val="Titolo1"/>
+        <w:rPr>
+          <w:lang w:val="it-IT"/>
+        </w:rPr>
+      </w:pPr>
+      <w:bookmarkStart w:id="50" w:name="_Toc461179227"/>
+      <w:bookmarkStart w:id="51" w:name="_Toc94790464"/>
+      <w:bookmarkStart w:id="52" w:name="_Toc189853872"/>
+      <w:r>
+        <w:rPr>
+          <w:lang w:val="it-IT"/>
+        </w:rPr>
+        <w:t>Consuntivo</w:t>
+      </w:r>
       <w:bookmarkEnd w:id="50"/>
-    </w:p>
-    <w:p>
-      <w:pPr>
-        <w:rPr>
-          <w:lang w:val="it-IT"/>
-        </w:rPr>
-      </w:pPr>
-      <w:r>
-        <w:rPr>
-          <w:lang w:val="it-IT"/>
-        </w:rPr>
-        <w:t>Descrizione con motivazione di eventuali elementi mancanti o non completamente implementati, al di fuori dei test case. Non devono essere riportati gli errori e i problemi riscontrati e poi risolti durante il progetto.</w:t>
-      </w:r>
-    </w:p>
-    <w:p>
-      <w:pPr>
-        <w:pStyle w:val="Titolo1"/>
-        <w:rPr>
-          <w:lang w:val="it-IT"/>
-        </w:rPr>
-      </w:pPr>
-      <w:bookmarkStart w:id="51" w:name="_Toc461179227"/>
-      <w:bookmarkStart w:id="52" w:name="_Toc94790464"/>
-      <w:bookmarkStart w:id="53" w:name="_Toc189853872"/>
-      <w:r>
-        <w:rPr>
-          <w:lang w:val="it-IT"/>
-        </w:rPr>
-        <w:t>Consuntivo</w:t>
-      </w:r>
       <w:bookmarkEnd w:id="51"/>
       <w:bookmarkEnd w:id="52"/>
+    </w:p>
+    <w:p>
+      <w:pPr>
+        <w:rPr>
+          <w:lang w:val="it-IT"/>
+        </w:rPr>
+      </w:pPr>
+      <w:r>
+        <w:rPr>
+          <w:lang w:val="it-IT"/>
+        </w:rPr>
+        <w:t>Consuntivo del tempo di lavoro effettivo e considerazioni riguardo le differenze rispetto alla pianificazione (cap</w:t>
+      </w:r>
+      <w:r>
+        <w:rPr>
+          <w:lang w:val="it-IT"/>
+        </w:rPr>
+        <w:t>.</w:t>
+      </w:r>
+      <w:r>
+        <w:rPr>
+          <w:lang w:val="it-IT"/>
+        </w:rPr>
+        <w:t xml:space="preserve"> 1.7) (ad esempio </w:t>
+      </w:r>
+      <w:proofErr w:type="spellStart"/>
+      <w:r>
+        <w:rPr>
+          <w:lang w:val="it-IT"/>
+        </w:rPr>
+        <w:t>Gan</w:t>
+      </w:r>
+      <w:r>
+        <w:rPr>
+          <w:lang w:val="it-IT"/>
+        </w:rPr>
+        <w:t>t</w:t>
+      </w:r>
+      <w:r>
+        <w:rPr>
+          <w:lang w:val="it-IT"/>
+        </w:rPr>
+        <w:t>t</w:t>
+      </w:r>
+      <w:proofErr w:type="spellEnd"/>
+      <w:r>
+        <w:rPr>
+          <w:lang w:val="it-IT"/>
+        </w:rPr>
+        <w:t xml:space="preserve"> consuntivo).</w:t>
+      </w:r>
+    </w:p>
+    <w:p>
+      <w:pPr>
+        <w:pStyle w:val="Titolo1"/>
+        <w:rPr>
+          <w:lang w:val="it-IT"/>
+        </w:rPr>
+      </w:pPr>
+      <w:bookmarkStart w:id="53" w:name="_Toc461179228"/>
+      <w:bookmarkStart w:id="54" w:name="_Toc94790465"/>
+      <w:bookmarkStart w:id="55" w:name="_Toc189853873"/>
+      <w:r>
+        <w:rPr>
+          <w:lang w:val="it-IT"/>
+        </w:rPr>
+        <w:t>Conclusioni</w:t>
+      </w:r>
       <w:bookmarkEnd w:id="53"/>
-    </w:p>
-    <w:p>
-      <w:pPr>
-        <w:rPr>
-          <w:lang w:val="it-IT"/>
-        </w:rPr>
-      </w:pPr>
-      <w:r>
-        <w:rPr>
-          <w:lang w:val="it-IT"/>
-        </w:rPr>
-        <w:t>Consuntivo del tempo di lavoro effettivo e considerazioni riguardo le differenze rispetto alla pianificazione (cap</w:t>
-      </w:r>
-      <w:r>
-        <w:rPr>
-          <w:lang w:val="it-IT"/>
-        </w:rPr>
-        <w:t>.</w:t>
-      </w:r>
-      <w:r>
-        <w:rPr>
-          <w:lang w:val="it-IT"/>
-        </w:rPr>
-        <w:t xml:space="preserve"> 1.7) (ad esempio </w:t>
-      </w:r>
-      <w:proofErr w:type="spellStart"/>
-      <w:r>
-        <w:rPr>
-          <w:lang w:val="it-IT"/>
-        </w:rPr>
-        <w:t>Gan</w:t>
-      </w:r>
-      <w:r>
-        <w:rPr>
-          <w:lang w:val="it-IT"/>
-        </w:rPr>
-        <w:t>t</w:t>
-      </w:r>
-      <w:r>
-        <w:rPr>
-          <w:lang w:val="it-IT"/>
-        </w:rPr>
-        <w:t>t</w:t>
-      </w:r>
-      <w:proofErr w:type="spellEnd"/>
-      <w:r>
-        <w:rPr>
-          <w:lang w:val="it-IT"/>
-        </w:rPr>
-        <w:t xml:space="preserve"> consuntivo).</w:t>
-      </w:r>
-    </w:p>
-    <w:p>
-      <w:pPr>
-        <w:pStyle w:val="Titolo1"/>
-        <w:rPr>
-          <w:lang w:val="it-IT"/>
-        </w:rPr>
-      </w:pPr>
-      <w:bookmarkStart w:id="54" w:name="_Toc461179228"/>
-      <w:bookmarkStart w:id="55" w:name="_Toc94790465"/>
-      <w:bookmarkStart w:id="56" w:name="_Toc189853873"/>
-      <w:r>
-        <w:rPr>
-          <w:lang w:val="it-IT"/>
-        </w:rPr>
-        <w:t>Conclusioni</w:t>
-      </w:r>
       <w:bookmarkEnd w:id="54"/>
       <w:bookmarkEnd w:id="55"/>
+    </w:p>
+    <w:p>
+      <w:pPr>
+        <w:rPr>
+          <w:lang w:val="it-IT"/>
+        </w:rPr>
+      </w:pPr>
+      <w:r>
+        <w:rPr>
+          <w:lang w:val="it-IT"/>
+        </w:rPr>
+        <w:t>Quali sono le implicazioni della mia soluzione? Che impatto avrà?</w:t>
+      </w:r>
+      <w:r>
+        <w:rPr>
+          <w:lang w:val="it-IT"/>
+        </w:rPr>
+        <w:t xml:space="preserve"> Cambierà il mondo? È un successo importante? È </w:t>
+      </w:r>
+      <w:r>
+        <w:rPr>
+          <w:lang w:val="it-IT"/>
+        </w:rPr>
+        <w:t>solo un</w:t>
+      </w:r>
+      <w:r>
+        <w:rPr>
+          <w:lang w:val="it-IT"/>
+        </w:rPr>
+        <w:t>’</w:t>
+      </w:r>
+      <w:r>
+        <w:rPr>
+          <w:lang w:val="it-IT"/>
+        </w:rPr>
+        <w:t>aggiunta</w:t>
+      </w:r>
+      <w:r>
+        <w:rPr>
+          <w:lang w:val="it-IT"/>
+        </w:rPr>
+        <w:t xml:space="preserve"> marginale o</w:t>
+      </w:r>
+      <w:r>
+        <w:rPr>
+          <w:lang w:val="it-IT"/>
+        </w:rPr>
+        <w:t xml:space="preserve"> è semplicemente servita per scoprire che questo percorso è</w:t>
+      </w:r>
+      <w:r>
+        <w:rPr>
+          <w:lang w:val="it-IT"/>
+        </w:rPr>
+        <w:t xml:space="preserve"> stato</w:t>
+      </w:r>
+      <w:r>
+        <w:rPr>
+          <w:lang w:val="it-IT"/>
+        </w:rPr>
+        <w:t xml:space="preserve"> una perdita di tempo? I ris</w:t>
+      </w:r>
+      <w:r>
+        <w:rPr>
+          <w:lang w:val="it-IT"/>
+        </w:rPr>
+        <w:t xml:space="preserve">ultati ottenuti sono generali, </w:t>
+      </w:r>
+      <w:r>
+        <w:rPr>
+          <w:lang w:val="it-IT"/>
+        </w:rPr>
+        <w:t>facilmente generalizzabili o sono specifici di un caso particolare?</w:t>
+      </w:r>
+      <w:r>
+        <w:rPr>
+          <w:lang w:val="it-IT"/>
+        </w:rPr>
+        <w:t xml:space="preserve"> ecc</w:t>
+      </w:r>
+      <w:r>
+        <w:rPr>
+          <w:lang w:val="it-IT"/>
+        </w:rPr>
+        <w:t>.</w:t>
+      </w:r>
+    </w:p>
+    <w:p>
+      <w:pPr>
+        <w:pStyle w:val="Titolo2"/>
+      </w:pPr>
+      <w:bookmarkStart w:id="56" w:name="_Toc461179229"/>
+      <w:bookmarkStart w:id="57" w:name="_Toc94790466"/>
+      <w:bookmarkStart w:id="58" w:name="_Toc189853874"/>
+      <w:r>
+        <w:t>Sviluppi futuri</w:t>
+      </w:r>
       <w:bookmarkEnd w:id="56"/>
-    </w:p>
-    <w:p>
-      <w:pPr>
-        <w:rPr>
-          <w:lang w:val="it-IT"/>
-        </w:rPr>
-      </w:pPr>
-      <w:r>
-        <w:rPr>
-          <w:lang w:val="it-IT"/>
-        </w:rPr>
-        <w:t>Quali sono le implicazioni della mia soluzione? Che impatto avrà?</w:t>
-      </w:r>
-      <w:r>
-        <w:rPr>
-          <w:lang w:val="it-IT"/>
-        </w:rPr>
-        <w:t xml:space="preserve"> Cambierà il mondo? È un successo importante? È </w:t>
-      </w:r>
-      <w:r>
-        <w:rPr>
-          <w:lang w:val="it-IT"/>
-        </w:rPr>
-        <w:t>solo un</w:t>
-      </w:r>
-      <w:r>
-        <w:rPr>
-          <w:lang w:val="it-IT"/>
-        </w:rPr>
-        <w:t>’</w:t>
-      </w:r>
-      <w:r>
-        <w:rPr>
-          <w:lang w:val="it-IT"/>
-        </w:rPr>
-        <w:t>aggiunta</w:t>
-      </w:r>
-      <w:r>
-        <w:rPr>
-          <w:lang w:val="it-IT"/>
-        </w:rPr>
-        <w:t xml:space="preserve"> marginale o</w:t>
-      </w:r>
-      <w:r>
-        <w:rPr>
-          <w:lang w:val="it-IT"/>
-        </w:rPr>
-        <w:t xml:space="preserve"> è semplicemente servita per scoprire che questo percorso è</w:t>
-      </w:r>
-      <w:r>
-        <w:rPr>
-          <w:lang w:val="it-IT"/>
-        </w:rPr>
-        <w:t xml:space="preserve"> stato</w:t>
-      </w:r>
-      <w:r>
-        <w:rPr>
-          <w:lang w:val="it-IT"/>
-        </w:rPr>
-        <w:t xml:space="preserve"> una perdita di tempo? I ris</w:t>
-      </w:r>
-      <w:r>
-        <w:rPr>
-          <w:lang w:val="it-IT"/>
-        </w:rPr>
-        <w:t xml:space="preserve">ultati ottenuti sono generali, </w:t>
-      </w:r>
-      <w:r>
-        <w:rPr>
-          <w:lang w:val="it-IT"/>
-        </w:rPr>
-        <w:t>facilmente generalizzabili o sono specifici di un caso particolare?</w:t>
-      </w:r>
-      <w:r>
-        <w:rPr>
-          <w:lang w:val="it-IT"/>
-        </w:rPr>
-        <w:t xml:space="preserve"> ecc</w:t>
-      </w:r>
-      <w:r>
-        <w:rPr>
-          <w:lang w:val="it-IT"/>
-        </w:rPr>
-        <w:t>.</w:t>
-      </w:r>
-    </w:p>
-    <w:p>
-      <w:pPr>
-        <w:pStyle w:val="Titolo2"/>
-      </w:pPr>
-      <w:bookmarkStart w:id="57" w:name="_Toc461179229"/>
-      <w:bookmarkStart w:id="58" w:name="_Toc94790466"/>
-      <w:bookmarkStart w:id="59" w:name="_Toc189853874"/>
-      <w:r>
-        <w:t>Sviluppi futuri</w:t>
-      </w:r>
       <w:bookmarkEnd w:id="57"/>
       <w:bookmarkEnd w:id="58"/>
+    </w:p>
+    <w:p>
+      <w:pPr>
+        <w:rPr>
+          <w:lang w:val="it-IT"/>
+        </w:rPr>
+      </w:pPr>
+      <w:r>
+        <w:rPr>
+          <w:lang w:val="it-IT"/>
+        </w:rPr>
+        <w:t>Migliorie o estensioni che possono essere sviluppate sul prodotto.</w:t>
+      </w:r>
+    </w:p>
+    <w:p>
+      <w:pPr>
+        <w:pStyle w:val="Titolo2"/>
+      </w:pPr>
+      <w:bookmarkStart w:id="59" w:name="_Toc461179230"/>
+      <w:bookmarkStart w:id="60" w:name="_Toc94790467"/>
+      <w:bookmarkStart w:id="61" w:name="_Toc189853875"/>
+      <w:r>
+        <w:t>Considerazioni personali</w:t>
+      </w:r>
       <w:bookmarkEnd w:id="59"/>
-    </w:p>
-    <w:p>
-      <w:pPr>
-        <w:rPr>
-          <w:lang w:val="it-IT"/>
-        </w:rPr>
-      </w:pPr>
-      <w:r>
-        <w:rPr>
-          <w:lang w:val="it-IT"/>
-        </w:rPr>
-        <w:t>Migliorie o estensioni che possono essere sviluppate sul prodotto.</w:t>
-      </w:r>
-    </w:p>
-    <w:p>
-      <w:pPr>
-        <w:pStyle w:val="Titolo2"/>
-      </w:pPr>
-      <w:bookmarkStart w:id="60" w:name="_Toc461179230"/>
-      <w:bookmarkStart w:id="61" w:name="_Toc94790467"/>
-      <w:bookmarkStart w:id="62" w:name="_Toc189853875"/>
-      <w:r>
-        <w:t>Considerazioni personali</w:t>
-      </w:r>
       <w:bookmarkEnd w:id="60"/>
       <w:bookmarkEnd w:id="61"/>
+    </w:p>
+    <w:p>
+      <w:pPr>
+        <w:rPr>
+          <w:lang w:val="it-IT"/>
+        </w:rPr>
+      </w:pPr>
+      <w:r>
+        <w:rPr>
+          <w:lang w:val="it-IT"/>
+        </w:rPr>
+        <w:t>Cosa ho imparato in questo progetto? ecc</w:t>
+      </w:r>
+      <w:r>
+        <w:rPr>
+          <w:lang w:val="it-IT"/>
+        </w:rPr>
+        <w:t>.</w:t>
+      </w:r>
+    </w:p>
+    <w:p>
+      <w:pPr>
+        <w:pStyle w:val="Titolo1"/>
+        <w:rPr>
+          <w:lang w:val="it-IT"/>
+        </w:rPr>
+      </w:pPr>
+      <w:bookmarkStart w:id="62" w:name="_Toc94790468"/>
+      <w:bookmarkStart w:id="63" w:name="_Toc189853876"/>
+      <w:bookmarkStart w:id="64" w:name="_Toc461179232"/>
+      <w:r>
+        <w:rPr>
+          <w:lang w:val="it-IT"/>
+        </w:rPr>
+        <w:t>Glossario</w:t>
+      </w:r>
       <w:bookmarkEnd w:id="62"/>
-    </w:p>
-    <w:p>
-      <w:pPr>
-        <w:rPr>
-          <w:lang w:val="it-IT"/>
-        </w:rPr>
-      </w:pPr>
-      <w:r>
-        <w:rPr>
-          <w:lang w:val="it-IT"/>
-        </w:rPr>
-        <w:t>Cosa ho imparato in questo progetto? ecc</w:t>
-      </w:r>
-      <w:r>
-        <w:rPr>
-          <w:lang w:val="it-IT"/>
-        </w:rPr>
-        <w:t>.</w:t>
-      </w:r>
-    </w:p>
-    <w:p>
-      <w:pPr>
-        <w:pStyle w:val="Titolo1"/>
-        <w:rPr>
-          <w:lang w:val="it-IT"/>
-        </w:rPr>
-      </w:pPr>
-      <w:bookmarkStart w:id="63" w:name="_Toc94790468"/>
-      <w:bookmarkStart w:id="64" w:name="_Toc189853876"/>
-      <w:bookmarkStart w:id="65" w:name="_Toc461179232"/>
-      <w:r>
-        <w:rPr>
-          <w:lang w:val="it-IT"/>
-        </w:rPr>
-        <w:t>Glossario</w:t>
-      </w:r>
       <w:bookmarkEnd w:id="63"/>
-      <w:bookmarkEnd w:id="64"/>
     </w:p>
     <w:p>
       <w:pPr>
@@ -13912,7 +15649,7 @@
           <w:lang w:val="it-IT"/>
         </w:rPr>
       </w:pPr>
-      <w:bookmarkStart w:id="66" w:name="_Toc94790469"/>
+      <w:bookmarkStart w:id="65" w:name="_Toc94790469"/>
       <w:r>
         <w:rPr>
           <w:lang w:val="it-IT"/>
@@ -13927,7 +15664,7 @@
           <w:lang w:val="it-IT"/>
         </w:rPr>
       </w:pPr>
-      <w:bookmarkStart w:id="67" w:name="_Toc189853877"/>
+      <w:bookmarkStart w:id="66" w:name="_Toc189853877"/>
       <w:r>
         <w:rPr>
           <w:lang w:val="it-IT"/>
@@ -13935,21 +15672,21 @@
         <w:lastRenderedPageBreak/>
         <w:t>Bibliografia</w:t>
       </w:r>
+      <w:bookmarkEnd w:id="65"/>
       <w:bookmarkEnd w:id="66"/>
+    </w:p>
+    <w:p>
+      <w:pPr>
+        <w:pStyle w:val="Titolo2"/>
+      </w:pPr>
+      <w:bookmarkStart w:id="67" w:name="_Toc94790470"/>
+      <w:bookmarkStart w:id="68" w:name="_Toc189853878"/>
+      <w:r>
+        <w:t>Bibliografia per articoli di riviste:</w:t>
+      </w:r>
+      <w:bookmarkEnd w:id="64"/>
       <w:bookmarkEnd w:id="67"/>
-    </w:p>
-    <w:p>
-      <w:pPr>
-        <w:pStyle w:val="Titolo2"/>
-      </w:pPr>
-      <w:bookmarkStart w:id="68" w:name="_Toc94790470"/>
-      <w:bookmarkStart w:id="69" w:name="_Toc189853878"/>
-      <w:r>
-        <w:t>Bibliografia per articoli di riviste:</w:t>
-      </w:r>
-      <w:bookmarkEnd w:id="65"/>
       <w:bookmarkEnd w:id="68"/>
-      <w:bookmarkEnd w:id="69"/>
     </w:p>
     <w:p>
       <w:pPr>
@@ -14058,15 +15795,15 @@
       <w:pPr>
         <w:pStyle w:val="Titolo2"/>
       </w:pPr>
-      <w:bookmarkStart w:id="70" w:name="_Toc461179233"/>
-      <w:bookmarkStart w:id="71" w:name="_Toc94790471"/>
-      <w:bookmarkStart w:id="72" w:name="_Toc189853879"/>
+      <w:bookmarkStart w:id="69" w:name="_Toc461179233"/>
+      <w:bookmarkStart w:id="70" w:name="_Toc94790471"/>
+      <w:bookmarkStart w:id="71" w:name="_Toc189853879"/>
       <w:r>
         <w:t>Bibliografia per libri</w:t>
       </w:r>
+      <w:bookmarkEnd w:id="69"/>
       <w:bookmarkEnd w:id="70"/>
       <w:bookmarkEnd w:id="71"/>
-      <w:bookmarkEnd w:id="72"/>
     </w:p>
     <w:p>
       <w:pPr>
@@ -14191,20 +15928,20 @@
           <w:lang w:val="it-IT"/>
         </w:rPr>
       </w:pPr>
-      <w:bookmarkStart w:id="73" w:name="_Toc461179234"/>
+      <w:bookmarkStart w:id="72" w:name="_Toc461179234"/>
     </w:p>
     <w:p>
       <w:pPr>
         <w:pStyle w:val="Titolo2"/>
       </w:pPr>
-      <w:bookmarkStart w:id="74" w:name="_Toc94790472"/>
-      <w:bookmarkStart w:id="75" w:name="_Toc189853880"/>
+      <w:bookmarkStart w:id="73" w:name="_Toc94790472"/>
+      <w:bookmarkStart w:id="74" w:name="_Toc189853880"/>
       <w:r>
         <w:t>Sitografia</w:t>
       </w:r>
+      <w:bookmarkEnd w:id="72"/>
       <w:bookmarkEnd w:id="73"/>
       <w:bookmarkEnd w:id="74"/>
-      <w:bookmarkEnd w:id="75"/>
     </w:p>
     <w:p>
       <w:pPr>
@@ -14362,18 +16099,18 @@
           <w:lang w:val="it-IT"/>
         </w:rPr>
       </w:pPr>
-      <w:bookmarkStart w:id="76" w:name="_Toc461179235"/>
-      <w:bookmarkStart w:id="77" w:name="_Toc94790473"/>
-      <w:bookmarkStart w:id="78" w:name="_Toc189853881"/>
+      <w:bookmarkStart w:id="75" w:name="_Toc461179235"/>
+      <w:bookmarkStart w:id="76" w:name="_Toc94790473"/>
+      <w:bookmarkStart w:id="77" w:name="_Toc189853881"/>
       <w:r>
         <w:rPr>
           <w:lang w:val="it-IT"/>
         </w:rPr>
         <w:t>Allegati</w:t>
       </w:r>
+      <w:bookmarkEnd w:id="75"/>
       <w:bookmarkEnd w:id="76"/>
       <w:bookmarkEnd w:id="77"/>
-      <w:bookmarkEnd w:id="78"/>
     </w:p>
     <w:p>
       <w:pPr>
@@ -14546,10 +16283,10 @@
       </w:pPr>
     </w:p>
     <w:sectPr>
-      <w:headerReference w:type="default" r:id="rId24"/>
-      <w:footerReference w:type="default" r:id="rId25"/>
-      <w:headerReference w:type="first" r:id="rId26"/>
-      <w:footerReference w:type="first" r:id="rId27"/>
+      <w:headerReference w:type="default" r:id="rId37"/>
+      <w:footerReference w:type="default" r:id="rId38"/>
+      <w:headerReference w:type="first" r:id="rId39"/>
+      <w:footerReference w:type="first" r:id="rId40"/>
       <w:pgSz w:w="11906" w:h="16838"/>
       <w:pgMar w:top="1985" w:right="1134" w:bottom="1418" w:left="1134" w:header="567" w:footer="567" w:gutter="0"/>
       <w:pgNumType w:start="1"/>
@@ -14561,7 +16298,7 @@
 </file>
 
 <file path=word/endnotes.xml><?xml version="1.0" encoding="utf-8"?>
-<w:endnotes xmlns:wpc="http://schemas.microsoft.com/office/word/2010/wordprocessingCanvas" xmlns:cx="http://schemas.microsoft.com/office/drawing/2014/chartex" xmlns:cx1="http://schemas.microsoft.com/office/drawing/2015/9/8/chartex" xmlns:cx2="http://schemas.microsoft.com/office/drawing/2015/10/21/chartex" xmlns:cx3="http://schemas.microsoft.com/office/drawing/2016/5/9/chartex" xmlns:cx4="http://schemas.microsoft.com/office/drawing/2016/5/10/chartex" xmlns:cx5="http://schemas.microsoft.com/office/drawing/2016/5/11/chartex" xmlns:cx6="http://schemas.microsoft.com/office/drawing/2016/5/12/chartex" xmlns:cx7="http://schemas.microsoft.com/office/drawing/2016/5/13/chartex" xmlns:cx8="http://schemas.microsoft.com/office/drawing/2016/5/14/chartex" xmlns:mc="http://schemas.openxmlformats.org/markup-compatibility/2006" xmlns:aink="http://schemas.microsoft.com/office/drawing/2016/ink" xmlns:am3d="http://schemas.microsoft.com/office/drawing/2017/model3d" xmlns:o="urn:schemas-microsoft-com:office:office" xmlns:r="http://schemas.openxmlformats.org/officeDocument/2006/relationships" xmlns:m="http://schemas.openxmlformats.org/officeDocument/2006/math" xmlns:v="urn:schemas-microsoft-com:vml" xmlns:wp14="http://schemas.microsoft.com/office/word/2010/wordprocessingDrawing" xmlns:wp="http://schemas.openxmlformats.org/drawingml/2006/wordprocessingDrawing" xmlns:w10="urn:schemas-microsoft-com:office:word" xmlns:w="http://schemas.openxmlformats.org/wordprocessingml/2006/main" xmlns:w14="http://schemas.microsoft.com/office/word/2010/wordml" xmlns:w15="http://schemas.microsoft.com/office/word/2012/wordml" xmlns:w16cid="http://schemas.microsoft.com/office/word/2016/wordml/cid" xmlns:w16se="http://schemas.microsoft.com/office/word/2015/wordml/symex" xmlns:wpg="http://schemas.microsoft.com/office/word/2010/wordprocessingGroup" xmlns:wpi="http://schemas.microsoft.com/office/word/2010/wordprocessingInk" xmlns:wne="http://schemas.microsoft.com/office/word/2006/wordml" xmlns:wps="http://schemas.microsoft.com/office/word/2010/wordprocessingShape" mc:Ignorable="w14 w15 w16se w16cid wp14">
+<w:endnotes xmlns:wpc="http://schemas.microsoft.com/office/word/2010/wordprocessingCanvas" xmlns:cx="http://schemas.microsoft.com/office/drawing/2014/chartex" xmlns:cx1="http://schemas.microsoft.com/office/drawing/2015/9/8/chartex" xmlns:cx2="http://schemas.microsoft.com/office/drawing/2015/10/21/chartex" xmlns:cx3="http://schemas.microsoft.com/office/drawing/2016/5/9/chartex" xmlns:cx4="http://schemas.microsoft.com/office/drawing/2016/5/10/chartex" xmlns:cx5="http://schemas.microsoft.com/office/drawing/2016/5/11/chartex" xmlns:cx6="http://schemas.microsoft.com/office/drawing/2016/5/12/chartex" xmlns:cx7="http://schemas.microsoft.com/office/drawing/2016/5/13/chartex" xmlns:cx8="http://schemas.microsoft.com/office/drawing/2016/5/14/chartex" xmlns:mc="http://schemas.openxmlformats.org/markup-compatibility/2006" xmlns:aink="http://schemas.microsoft.com/office/drawing/2016/ink" xmlns:am3d="http://schemas.microsoft.com/office/drawing/2017/model3d" xmlns:o="urn:schemas-microsoft-com:office:office" xmlns:oel="http://schemas.microsoft.com/office/2019/extlst" xmlns:r="http://schemas.openxmlformats.org/officeDocument/2006/relationships" xmlns:m="http://schemas.openxmlformats.org/officeDocument/2006/math" xmlns:v="urn:schemas-microsoft-com:vml" xmlns:wp14="http://schemas.microsoft.com/office/word/2010/wordprocessingDrawing" xmlns:wp="http://schemas.openxmlformats.org/drawingml/2006/wordprocessingDrawing" xmlns:w10="urn:schemas-microsoft-com:office:word" xmlns:w="http://schemas.openxmlformats.org/wordprocessingml/2006/main" xmlns:w14="http://schemas.microsoft.com/office/word/2010/wordml" xmlns:w15="http://schemas.microsoft.com/office/word/2012/wordml" xmlns:w16cex="http://schemas.microsoft.com/office/word/2018/wordml/cex" xmlns:w16cid="http://schemas.microsoft.com/office/word/2016/wordml/cid" xmlns:w16="http://schemas.microsoft.com/office/word/2018/wordml" xmlns:w16du="http://schemas.microsoft.com/office/word/2023/wordml/word16du" xmlns:w16sdtdh="http://schemas.microsoft.com/office/word/2020/wordml/sdtdatahash" xmlns:w16sdtfl="http://schemas.microsoft.com/office/word/2024/wordml/sdtformatlock" xmlns:w16se="http://schemas.microsoft.com/office/word/2015/wordml/symex" xmlns:wpg="http://schemas.microsoft.com/office/word/2010/wordprocessingGroup" xmlns:wpi="http://schemas.microsoft.com/office/word/2010/wordprocessingInk" xmlns:wne="http://schemas.microsoft.com/office/word/2006/wordml" xmlns:wps="http://schemas.microsoft.com/office/word/2010/wordprocessingShape" mc:Ignorable="w14 w15 w16se w16cid w16 w16cex w16sdtdh w16sdtfl w16du wp14">
   <w:endnote w:type="separator" w:id="-1">
     <w:p>
       <w:r>
@@ -14580,7 +16317,7 @@
 </file>
 
 <file path=word/footer1.xml><?xml version="1.0" encoding="utf-8"?>
-<w:ftr xmlns:wpc="http://schemas.microsoft.com/office/word/2010/wordprocessingCanvas" xmlns:cx="http://schemas.microsoft.com/office/drawing/2014/chartex" xmlns:cx1="http://schemas.microsoft.com/office/drawing/2015/9/8/chartex" xmlns:cx2="http://schemas.microsoft.com/office/drawing/2015/10/21/chartex" xmlns:cx3="http://schemas.microsoft.com/office/drawing/2016/5/9/chartex" xmlns:cx4="http://schemas.microsoft.com/office/drawing/2016/5/10/chartex" xmlns:cx5="http://schemas.microsoft.com/office/drawing/2016/5/11/chartex" xmlns:cx6="http://schemas.microsoft.com/office/drawing/2016/5/12/chartex" xmlns:cx7="http://schemas.microsoft.com/office/drawing/2016/5/13/chartex" xmlns:cx8="http://schemas.microsoft.com/office/drawing/2016/5/14/chartex" xmlns:mc="http://schemas.openxmlformats.org/markup-compatibility/2006" xmlns:aink="http://schemas.microsoft.com/office/drawing/2016/ink" xmlns:am3d="http://schemas.microsoft.com/office/drawing/2017/model3d" xmlns:o="urn:schemas-microsoft-com:office:office" xmlns:r="http://schemas.openxmlformats.org/officeDocument/2006/relationships" xmlns:m="http://schemas.openxmlformats.org/officeDocument/2006/math" xmlns:v="urn:schemas-microsoft-com:vml" xmlns:wp14="http://schemas.microsoft.com/office/word/2010/wordprocessingDrawing" xmlns:wp="http://schemas.openxmlformats.org/drawingml/2006/wordprocessingDrawing" xmlns:w10="urn:schemas-microsoft-com:office:word" xmlns:w="http://schemas.openxmlformats.org/wordprocessingml/2006/main" xmlns:w14="http://schemas.microsoft.com/office/word/2010/wordml" xmlns:w15="http://schemas.microsoft.com/office/word/2012/wordml" xmlns:w16cid="http://schemas.microsoft.com/office/word/2016/wordml/cid" xmlns:w16se="http://schemas.microsoft.com/office/word/2015/wordml/symex" xmlns:wpg="http://schemas.microsoft.com/office/word/2010/wordprocessingGroup" xmlns:wpi="http://schemas.microsoft.com/office/word/2010/wordprocessingInk" xmlns:wne="http://schemas.microsoft.com/office/word/2006/wordml" xmlns:wps="http://schemas.microsoft.com/office/word/2010/wordprocessingShape" mc:Ignorable="w14 w15 w16se w16cid wp14">
+<w:ftr xmlns:wpc="http://schemas.microsoft.com/office/word/2010/wordprocessingCanvas" xmlns:cx="http://schemas.microsoft.com/office/drawing/2014/chartex" xmlns:cx1="http://schemas.microsoft.com/office/drawing/2015/9/8/chartex" xmlns:cx2="http://schemas.microsoft.com/office/drawing/2015/10/21/chartex" xmlns:cx3="http://schemas.microsoft.com/office/drawing/2016/5/9/chartex" xmlns:cx4="http://schemas.microsoft.com/office/drawing/2016/5/10/chartex" xmlns:cx5="http://schemas.microsoft.com/office/drawing/2016/5/11/chartex" xmlns:cx6="http://schemas.microsoft.com/office/drawing/2016/5/12/chartex" xmlns:cx7="http://schemas.microsoft.com/office/drawing/2016/5/13/chartex" xmlns:cx8="http://schemas.microsoft.com/office/drawing/2016/5/14/chartex" xmlns:mc="http://schemas.openxmlformats.org/markup-compatibility/2006" xmlns:aink="http://schemas.microsoft.com/office/drawing/2016/ink" xmlns:am3d="http://schemas.microsoft.com/office/drawing/2017/model3d" xmlns:o="urn:schemas-microsoft-com:office:office" xmlns:oel="http://schemas.microsoft.com/office/2019/extlst" xmlns:r="http://schemas.openxmlformats.org/officeDocument/2006/relationships" xmlns:m="http://schemas.openxmlformats.org/officeDocument/2006/math" xmlns:v="urn:schemas-microsoft-com:vml" xmlns:wp14="http://schemas.microsoft.com/office/word/2010/wordprocessingDrawing" xmlns:wp="http://schemas.openxmlformats.org/drawingml/2006/wordprocessingDrawing" xmlns:w10="urn:schemas-microsoft-com:office:word" xmlns:w="http://schemas.openxmlformats.org/wordprocessingml/2006/main" xmlns:w14="http://schemas.microsoft.com/office/word/2010/wordml" xmlns:w15="http://schemas.microsoft.com/office/word/2012/wordml" xmlns:w16cex="http://schemas.microsoft.com/office/word/2018/wordml/cex" xmlns:w16cid="http://schemas.microsoft.com/office/word/2016/wordml/cid" xmlns:w16="http://schemas.microsoft.com/office/word/2018/wordml" xmlns:w16du="http://schemas.microsoft.com/office/word/2023/wordml/word16du" xmlns:w16sdtdh="http://schemas.microsoft.com/office/word/2020/wordml/sdtdatahash" xmlns:w16sdtfl="http://schemas.microsoft.com/office/word/2024/wordml/sdtformatlock" xmlns:w16se="http://schemas.microsoft.com/office/word/2015/wordml/symex" xmlns:wpg="http://schemas.microsoft.com/office/word/2010/wordprocessingGroup" xmlns:wpi="http://schemas.microsoft.com/office/word/2010/wordprocessingInk" xmlns:wne="http://schemas.microsoft.com/office/word/2006/wordml" xmlns:wps="http://schemas.microsoft.com/office/word/2010/wordprocessingShape" mc:Ignorable="w14 w15 w16se w16cid w16 w16cex w16sdtdh w16sdtfl w16du wp14">
   <w:p>
     <w:pPr>
       <w:pStyle w:val="Pidipagina"/>
@@ -14684,7 +16421,7 @@
 </file>
 
 <file path=word/footer2.xml><?xml version="1.0" encoding="utf-8"?>
-<w:ftr xmlns:wpc="http://schemas.microsoft.com/office/word/2010/wordprocessingCanvas" xmlns:cx="http://schemas.microsoft.com/office/drawing/2014/chartex" xmlns:cx1="http://schemas.microsoft.com/office/drawing/2015/9/8/chartex" xmlns:cx2="http://schemas.microsoft.com/office/drawing/2015/10/21/chartex" xmlns:cx3="http://schemas.microsoft.com/office/drawing/2016/5/9/chartex" xmlns:cx4="http://schemas.microsoft.com/office/drawing/2016/5/10/chartex" xmlns:cx5="http://schemas.microsoft.com/office/drawing/2016/5/11/chartex" xmlns:cx6="http://schemas.microsoft.com/office/drawing/2016/5/12/chartex" xmlns:cx7="http://schemas.microsoft.com/office/drawing/2016/5/13/chartex" xmlns:cx8="http://schemas.microsoft.com/office/drawing/2016/5/14/chartex" xmlns:mc="http://schemas.openxmlformats.org/markup-compatibility/2006" xmlns:aink="http://schemas.microsoft.com/office/drawing/2016/ink" xmlns:am3d="http://schemas.microsoft.com/office/drawing/2017/model3d" xmlns:o="urn:schemas-microsoft-com:office:office" xmlns:r="http://schemas.openxmlformats.org/officeDocument/2006/relationships" xmlns:m="http://schemas.openxmlformats.org/officeDocument/2006/math" xmlns:v="urn:schemas-microsoft-com:vml" xmlns:wp14="http://schemas.microsoft.com/office/word/2010/wordprocessingDrawing" xmlns:wp="http://schemas.openxmlformats.org/drawingml/2006/wordprocessingDrawing" xmlns:w10="urn:schemas-microsoft-com:office:word" xmlns:w="http://schemas.openxmlformats.org/wordprocessingml/2006/main" xmlns:w14="http://schemas.microsoft.com/office/word/2010/wordml" xmlns:w15="http://schemas.microsoft.com/office/word/2012/wordml" xmlns:w16cid="http://schemas.microsoft.com/office/word/2016/wordml/cid" xmlns:w16se="http://schemas.microsoft.com/office/word/2015/wordml/symex" xmlns:wpg="http://schemas.microsoft.com/office/word/2010/wordprocessingGroup" xmlns:wpi="http://schemas.microsoft.com/office/word/2010/wordprocessingInk" xmlns:wne="http://schemas.microsoft.com/office/word/2006/wordml" xmlns:wps="http://schemas.microsoft.com/office/word/2010/wordprocessingShape" mc:Ignorable="w14 w15 w16se w16cid wp14">
+<w:ftr xmlns:wpc="http://schemas.microsoft.com/office/word/2010/wordprocessingCanvas" xmlns:cx="http://schemas.microsoft.com/office/drawing/2014/chartex" xmlns:cx1="http://schemas.microsoft.com/office/drawing/2015/9/8/chartex" xmlns:cx2="http://schemas.microsoft.com/office/drawing/2015/10/21/chartex" xmlns:cx3="http://schemas.microsoft.com/office/drawing/2016/5/9/chartex" xmlns:cx4="http://schemas.microsoft.com/office/drawing/2016/5/10/chartex" xmlns:cx5="http://schemas.microsoft.com/office/drawing/2016/5/11/chartex" xmlns:cx6="http://schemas.microsoft.com/office/drawing/2016/5/12/chartex" xmlns:cx7="http://schemas.microsoft.com/office/drawing/2016/5/13/chartex" xmlns:cx8="http://schemas.microsoft.com/office/drawing/2016/5/14/chartex" xmlns:mc="http://schemas.openxmlformats.org/markup-compatibility/2006" xmlns:aink="http://schemas.microsoft.com/office/drawing/2016/ink" xmlns:am3d="http://schemas.microsoft.com/office/drawing/2017/model3d" xmlns:o="urn:schemas-microsoft-com:office:office" xmlns:oel="http://schemas.microsoft.com/office/2019/extlst" xmlns:r="http://schemas.openxmlformats.org/officeDocument/2006/relationships" xmlns:m="http://schemas.openxmlformats.org/officeDocument/2006/math" xmlns:v="urn:schemas-microsoft-com:vml" xmlns:wp14="http://schemas.microsoft.com/office/word/2010/wordprocessingDrawing" xmlns:wp="http://schemas.openxmlformats.org/drawingml/2006/wordprocessingDrawing" xmlns:w10="urn:schemas-microsoft-com:office:word" xmlns:w="http://schemas.openxmlformats.org/wordprocessingml/2006/main" xmlns:w14="http://schemas.microsoft.com/office/word/2010/wordml" xmlns:w15="http://schemas.microsoft.com/office/word/2012/wordml" xmlns:w16cex="http://schemas.microsoft.com/office/word/2018/wordml/cex" xmlns:w16cid="http://schemas.microsoft.com/office/word/2016/wordml/cid" xmlns:w16="http://schemas.microsoft.com/office/word/2018/wordml" xmlns:w16du="http://schemas.microsoft.com/office/word/2023/wordml/word16du" xmlns:w16sdtdh="http://schemas.microsoft.com/office/word/2020/wordml/sdtdatahash" xmlns:w16sdtfl="http://schemas.microsoft.com/office/word/2024/wordml/sdtformatlock" xmlns:w16se="http://schemas.microsoft.com/office/word/2015/wordml/symex" xmlns:wpg="http://schemas.microsoft.com/office/word/2010/wordprocessingGroup" xmlns:wpi="http://schemas.microsoft.com/office/word/2010/wordprocessingInk" xmlns:wne="http://schemas.microsoft.com/office/word/2006/wordml" xmlns:wps="http://schemas.microsoft.com/office/word/2010/wordprocessingShape" mc:Ignorable="w14 w15 w16se w16cid w16 w16cex w16sdtdh w16sdtfl w16du wp14">
   <w:tbl>
     <w:tblPr>
       <w:tblW w:w="0" w:type="auto"/>
@@ -14919,7 +16656,7 @@
 </file>
 
 <file path=word/footnotes.xml><?xml version="1.0" encoding="utf-8"?>
-<w:footnotes xmlns:wpc="http://schemas.microsoft.com/office/word/2010/wordprocessingCanvas" xmlns:cx="http://schemas.microsoft.com/office/drawing/2014/chartex" xmlns:cx1="http://schemas.microsoft.com/office/drawing/2015/9/8/chartex" xmlns:cx2="http://schemas.microsoft.com/office/drawing/2015/10/21/chartex" xmlns:cx3="http://schemas.microsoft.com/office/drawing/2016/5/9/chartex" xmlns:cx4="http://schemas.microsoft.com/office/drawing/2016/5/10/chartex" xmlns:cx5="http://schemas.microsoft.com/office/drawing/2016/5/11/chartex" xmlns:cx6="http://schemas.microsoft.com/office/drawing/2016/5/12/chartex" xmlns:cx7="http://schemas.microsoft.com/office/drawing/2016/5/13/chartex" xmlns:cx8="http://schemas.microsoft.com/office/drawing/2016/5/14/chartex" xmlns:mc="http://schemas.openxmlformats.org/markup-compatibility/2006" xmlns:aink="http://schemas.microsoft.com/office/drawing/2016/ink" xmlns:am3d="http://schemas.microsoft.com/office/drawing/2017/model3d" xmlns:o="urn:schemas-microsoft-com:office:office" xmlns:r="http://schemas.openxmlformats.org/officeDocument/2006/relationships" xmlns:m="http://schemas.openxmlformats.org/officeDocument/2006/math" xmlns:v="urn:schemas-microsoft-com:vml" xmlns:wp14="http://schemas.microsoft.com/office/word/2010/wordprocessingDrawing" xmlns:wp="http://schemas.openxmlformats.org/drawingml/2006/wordprocessingDrawing" xmlns:w10="urn:schemas-microsoft-com:office:word" xmlns:w="http://schemas.openxmlformats.org/wordprocessingml/2006/main" xmlns:w14="http://schemas.microsoft.com/office/word/2010/wordml" xmlns:w15="http://schemas.microsoft.com/office/word/2012/wordml" xmlns:w16cid="http://schemas.microsoft.com/office/word/2016/wordml/cid" xmlns:w16se="http://schemas.microsoft.com/office/word/2015/wordml/symex" xmlns:wpg="http://schemas.microsoft.com/office/word/2010/wordprocessingGroup" xmlns:wpi="http://schemas.microsoft.com/office/word/2010/wordprocessingInk" xmlns:wne="http://schemas.microsoft.com/office/word/2006/wordml" xmlns:wps="http://schemas.microsoft.com/office/word/2010/wordprocessingShape" mc:Ignorable="w14 w15 w16se w16cid wp14">
+<w:footnotes xmlns:wpc="http://schemas.microsoft.com/office/word/2010/wordprocessingCanvas" xmlns:cx="http://schemas.microsoft.com/office/drawing/2014/chartex" xmlns:cx1="http://schemas.microsoft.com/office/drawing/2015/9/8/chartex" xmlns:cx2="http://schemas.microsoft.com/office/drawing/2015/10/21/chartex" xmlns:cx3="http://schemas.microsoft.com/office/drawing/2016/5/9/chartex" xmlns:cx4="http://schemas.microsoft.com/office/drawing/2016/5/10/chartex" xmlns:cx5="http://schemas.microsoft.com/office/drawing/2016/5/11/chartex" xmlns:cx6="http://schemas.microsoft.com/office/drawing/2016/5/12/chartex" xmlns:cx7="http://schemas.microsoft.com/office/drawing/2016/5/13/chartex" xmlns:cx8="http://schemas.microsoft.com/office/drawing/2016/5/14/chartex" xmlns:mc="http://schemas.openxmlformats.org/markup-compatibility/2006" xmlns:aink="http://schemas.microsoft.com/office/drawing/2016/ink" xmlns:am3d="http://schemas.microsoft.com/office/drawing/2017/model3d" xmlns:o="urn:schemas-microsoft-com:office:office" xmlns:oel="http://schemas.microsoft.com/office/2019/extlst" xmlns:r="http://schemas.openxmlformats.org/officeDocument/2006/relationships" xmlns:m="http://schemas.openxmlformats.org/officeDocument/2006/math" xmlns:v="urn:schemas-microsoft-com:vml" xmlns:wp14="http://schemas.microsoft.com/office/word/2010/wordprocessingDrawing" xmlns:wp="http://schemas.openxmlformats.org/drawingml/2006/wordprocessingDrawing" xmlns:w10="urn:schemas-microsoft-com:office:word" xmlns:w="http://schemas.openxmlformats.org/wordprocessingml/2006/main" xmlns:w14="http://schemas.microsoft.com/office/word/2010/wordml" xmlns:w15="http://schemas.microsoft.com/office/word/2012/wordml" xmlns:w16cex="http://schemas.microsoft.com/office/word/2018/wordml/cex" xmlns:w16cid="http://schemas.microsoft.com/office/word/2016/wordml/cid" xmlns:w16="http://schemas.microsoft.com/office/word/2018/wordml" xmlns:w16du="http://schemas.microsoft.com/office/word/2023/wordml/word16du" xmlns:w16sdtdh="http://schemas.microsoft.com/office/word/2020/wordml/sdtdatahash" xmlns:w16sdtfl="http://schemas.microsoft.com/office/word/2024/wordml/sdtformatlock" xmlns:w16se="http://schemas.microsoft.com/office/word/2015/wordml/symex" xmlns:wpg="http://schemas.microsoft.com/office/word/2010/wordprocessingGroup" xmlns:wpi="http://schemas.microsoft.com/office/word/2010/wordprocessingInk" xmlns:wne="http://schemas.microsoft.com/office/word/2006/wordml" xmlns:wps="http://schemas.microsoft.com/office/word/2010/wordprocessingShape" mc:Ignorable="w14 w15 w16se w16cid w16 w16cex w16sdtdh w16sdtfl w16du wp14">
   <w:footnote w:type="separator" w:id="-1">
     <w:p>
       <w:r>
@@ -14938,7 +16675,7 @@
 </file>
 
 <file path=word/header1.xml><?xml version="1.0" encoding="utf-8"?>
-<w:hdr xmlns:wpc="http://schemas.microsoft.com/office/word/2010/wordprocessingCanvas" xmlns:cx="http://schemas.microsoft.com/office/drawing/2014/chartex" xmlns:cx1="http://schemas.microsoft.com/office/drawing/2015/9/8/chartex" xmlns:cx2="http://schemas.microsoft.com/office/drawing/2015/10/21/chartex" xmlns:cx3="http://schemas.microsoft.com/office/drawing/2016/5/9/chartex" xmlns:cx4="http://schemas.microsoft.com/office/drawing/2016/5/10/chartex" xmlns:cx5="http://schemas.microsoft.com/office/drawing/2016/5/11/chartex" xmlns:cx6="http://schemas.microsoft.com/office/drawing/2016/5/12/chartex" xmlns:cx7="http://schemas.microsoft.com/office/drawing/2016/5/13/chartex" xmlns:cx8="http://schemas.microsoft.com/office/drawing/2016/5/14/chartex" xmlns:mc="http://schemas.openxmlformats.org/markup-compatibility/2006" xmlns:aink="http://schemas.microsoft.com/office/drawing/2016/ink" xmlns:am3d="http://schemas.microsoft.com/office/drawing/2017/model3d" xmlns:o="urn:schemas-microsoft-com:office:office" xmlns:r="http://schemas.openxmlformats.org/officeDocument/2006/relationships" xmlns:m="http://schemas.openxmlformats.org/officeDocument/2006/math" xmlns:v="urn:schemas-microsoft-com:vml" xmlns:wp14="http://schemas.microsoft.com/office/word/2010/wordprocessingDrawing" xmlns:wp="http://schemas.openxmlformats.org/drawingml/2006/wordprocessingDrawing" xmlns:w10="urn:schemas-microsoft-com:office:word" xmlns:w="http://schemas.openxmlformats.org/wordprocessingml/2006/main" xmlns:w14="http://schemas.microsoft.com/office/word/2010/wordml" xmlns:w15="http://schemas.microsoft.com/office/word/2012/wordml" xmlns:w16cid="http://schemas.microsoft.com/office/word/2016/wordml/cid" xmlns:w16se="http://schemas.microsoft.com/office/word/2015/wordml/symex" xmlns:wpg="http://schemas.microsoft.com/office/word/2010/wordprocessingGroup" xmlns:wpi="http://schemas.microsoft.com/office/word/2010/wordprocessingInk" xmlns:wne="http://schemas.microsoft.com/office/word/2006/wordml" xmlns:wps="http://schemas.microsoft.com/office/word/2010/wordprocessingShape" mc:Ignorable="w14 w15 w16se w16cid wp14">
+<w:hdr xmlns:wpc="http://schemas.microsoft.com/office/word/2010/wordprocessingCanvas" xmlns:cx="http://schemas.microsoft.com/office/drawing/2014/chartex" xmlns:cx1="http://schemas.microsoft.com/office/drawing/2015/9/8/chartex" xmlns:cx2="http://schemas.microsoft.com/office/drawing/2015/10/21/chartex" xmlns:cx3="http://schemas.microsoft.com/office/drawing/2016/5/9/chartex" xmlns:cx4="http://schemas.microsoft.com/office/drawing/2016/5/10/chartex" xmlns:cx5="http://schemas.microsoft.com/office/drawing/2016/5/11/chartex" xmlns:cx6="http://schemas.microsoft.com/office/drawing/2016/5/12/chartex" xmlns:cx7="http://schemas.microsoft.com/office/drawing/2016/5/13/chartex" xmlns:cx8="http://schemas.microsoft.com/office/drawing/2016/5/14/chartex" xmlns:mc="http://schemas.openxmlformats.org/markup-compatibility/2006" xmlns:aink="http://schemas.microsoft.com/office/drawing/2016/ink" xmlns:am3d="http://schemas.microsoft.com/office/drawing/2017/model3d" xmlns:o="urn:schemas-microsoft-com:office:office" xmlns:oel="http://schemas.microsoft.com/office/2019/extlst" xmlns:r="http://schemas.openxmlformats.org/officeDocument/2006/relationships" xmlns:m="http://schemas.openxmlformats.org/officeDocument/2006/math" xmlns:v="urn:schemas-microsoft-com:vml" xmlns:wp14="http://schemas.microsoft.com/office/word/2010/wordprocessingDrawing" xmlns:wp="http://schemas.openxmlformats.org/drawingml/2006/wordprocessingDrawing" xmlns:w10="urn:schemas-microsoft-com:office:word" xmlns:w="http://schemas.openxmlformats.org/wordprocessingml/2006/main" xmlns:w14="http://schemas.microsoft.com/office/word/2010/wordml" xmlns:w15="http://schemas.microsoft.com/office/word/2012/wordml" xmlns:w16cex="http://schemas.microsoft.com/office/word/2018/wordml/cex" xmlns:w16cid="http://schemas.microsoft.com/office/word/2016/wordml/cid" xmlns:w16="http://schemas.microsoft.com/office/word/2018/wordml" xmlns:w16du="http://schemas.microsoft.com/office/word/2023/wordml/word16du" xmlns:w16sdtdh="http://schemas.microsoft.com/office/word/2020/wordml/sdtdatahash" xmlns:w16sdtfl="http://schemas.microsoft.com/office/word/2024/wordml/sdtformatlock" xmlns:w16se="http://schemas.microsoft.com/office/word/2015/wordml/symex" xmlns:wpg="http://schemas.microsoft.com/office/word/2010/wordprocessingGroup" xmlns:wpi="http://schemas.microsoft.com/office/word/2010/wordprocessingInk" xmlns:wne="http://schemas.microsoft.com/office/word/2006/wordml" xmlns:wps="http://schemas.microsoft.com/office/word/2010/wordprocessingShape" mc:Ignorable="w14 w15 w16se w16cid w16 w16cex w16sdtdh w16sdtfl w16du wp14">
   <w:tbl>
     <w:tblPr>
       <w:tblW w:w="9639" w:type="dxa"/>
@@ -15309,7 +17046,7 @@
 </file>
 
 <file path=word/header2.xml><?xml version="1.0" encoding="utf-8"?>
-<w:hdr xmlns:wpc="http://schemas.microsoft.com/office/word/2010/wordprocessingCanvas" xmlns:cx="http://schemas.microsoft.com/office/drawing/2014/chartex" xmlns:cx1="http://schemas.microsoft.com/office/drawing/2015/9/8/chartex" xmlns:cx2="http://schemas.microsoft.com/office/drawing/2015/10/21/chartex" xmlns:cx3="http://schemas.microsoft.com/office/drawing/2016/5/9/chartex" xmlns:cx4="http://schemas.microsoft.com/office/drawing/2016/5/10/chartex" xmlns:cx5="http://schemas.microsoft.com/office/drawing/2016/5/11/chartex" xmlns:cx6="http://schemas.microsoft.com/office/drawing/2016/5/12/chartex" xmlns:cx7="http://schemas.microsoft.com/office/drawing/2016/5/13/chartex" xmlns:cx8="http://schemas.microsoft.com/office/drawing/2016/5/14/chartex" xmlns:mc="http://schemas.openxmlformats.org/markup-compatibility/2006" xmlns:aink="http://schemas.microsoft.com/office/drawing/2016/ink" xmlns:am3d="http://schemas.microsoft.com/office/drawing/2017/model3d" xmlns:o="urn:schemas-microsoft-com:office:office" xmlns:r="http://schemas.openxmlformats.org/officeDocument/2006/relationships" xmlns:m="http://schemas.openxmlformats.org/officeDocument/2006/math" xmlns:v="urn:schemas-microsoft-com:vml" xmlns:wp14="http://schemas.microsoft.com/office/word/2010/wordprocessingDrawing" xmlns:wp="http://schemas.openxmlformats.org/drawingml/2006/wordprocessingDrawing" xmlns:w10="urn:schemas-microsoft-com:office:word" xmlns:w="http://schemas.openxmlformats.org/wordprocessingml/2006/main" xmlns:w14="http://schemas.microsoft.com/office/word/2010/wordml" xmlns:w15="http://schemas.microsoft.com/office/word/2012/wordml" xmlns:w16cid="http://schemas.microsoft.com/office/word/2016/wordml/cid" xmlns:w16se="http://schemas.microsoft.com/office/word/2015/wordml/symex" xmlns:wpg="http://schemas.microsoft.com/office/word/2010/wordprocessingGroup" xmlns:wpi="http://schemas.microsoft.com/office/word/2010/wordprocessingInk" xmlns:wne="http://schemas.microsoft.com/office/word/2006/wordml" xmlns:wps="http://schemas.microsoft.com/office/word/2010/wordprocessingShape" mc:Ignorable="w14 w15 w16se w16cid wp14">
+<w:hdr xmlns:wpc="http://schemas.microsoft.com/office/word/2010/wordprocessingCanvas" xmlns:cx="http://schemas.microsoft.com/office/drawing/2014/chartex" xmlns:cx1="http://schemas.microsoft.com/office/drawing/2015/9/8/chartex" xmlns:cx2="http://schemas.microsoft.com/office/drawing/2015/10/21/chartex" xmlns:cx3="http://schemas.microsoft.com/office/drawing/2016/5/9/chartex" xmlns:cx4="http://schemas.microsoft.com/office/drawing/2016/5/10/chartex" xmlns:cx5="http://schemas.microsoft.com/office/drawing/2016/5/11/chartex" xmlns:cx6="http://schemas.microsoft.com/office/drawing/2016/5/12/chartex" xmlns:cx7="http://schemas.microsoft.com/office/drawing/2016/5/13/chartex" xmlns:cx8="http://schemas.microsoft.com/office/drawing/2016/5/14/chartex" xmlns:mc="http://schemas.openxmlformats.org/markup-compatibility/2006" xmlns:aink="http://schemas.microsoft.com/office/drawing/2016/ink" xmlns:am3d="http://schemas.microsoft.com/office/drawing/2017/model3d" xmlns:o="urn:schemas-microsoft-com:office:office" xmlns:oel="http://schemas.microsoft.com/office/2019/extlst" xmlns:r="http://schemas.openxmlformats.org/officeDocument/2006/relationships" xmlns:m="http://schemas.openxmlformats.org/officeDocument/2006/math" xmlns:v="urn:schemas-microsoft-com:vml" xmlns:wp14="http://schemas.microsoft.com/office/word/2010/wordprocessingDrawing" xmlns:wp="http://schemas.openxmlformats.org/drawingml/2006/wordprocessingDrawing" xmlns:w10="urn:schemas-microsoft-com:office:word" xmlns:w="http://schemas.openxmlformats.org/wordprocessingml/2006/main" xmlns:w14="http://schemas.microsoft.com/office/word/2010/wordml" xmlns:w15="http://schemas.microsoft.com/office/word/2012/wordml" xmlns:w16cex="http://schemas.microsoft.com/office/word/2018/wordml/cex" xmlns:w16cid="http://schemas.microsoft.com/office/word/2016/wordml/cid" xmlns:w16="http://schemas.microsoft.com/office/word/2018/wordml" xmlns:w16du="http://schemas.microsoft.com/office/word/2023/wordml/word16du" xmlns:w16sdtdh="http://schemas.microsoft.com/office/word/2020/wordml/sdtdatahash" xmlns:w16sdtfl="http://schemas.microsoft.com/office/word/2024/wordml/sdtformatlock" xmlns:w16se="http://schemas.microsoft.com/office/word/2015/wordml/symex" xmlns:wpg="http://schemas.microsoft.com/office/word/2010/wordprocessingGroup" xmlns:wpi="http://schemas.microsoft.com/office/word/2010/wordprocessingInk" xmlns:wne="http://schemas.microsoft.com/office/word/2006/wordml" xmlns:wps="http://schemas.microsoft.com/office/word/2010/wordprocessingShape" mc:Ignorable="w14 w15 w16se w16cid w16 w16cex w16sdtdh w16sdtfl w16du wp14">
   <w:tbl>
     <w:tblPr>
       <w:tblW w:w="9644" w:type="dxa"/>
@@ -15532,7 +17269,7 @@
 </file>
 
 <file path=word/numbering.xml><?xml version="1.0" encoding="utf-8"?>
-<w:numbering xmlns:wpc="http://schemas.microsoft.com/office/word/2010/wordprocessingCanvas" xmlns:cx="http://schemas.microsoft.com/office/drawing/2014/chartex" xmlns:cx1="http://schemas.microsoft.com/office/drawing/2015/9/8/chartex" xmlns:cx2="http://schemas.microsoft.com/office/drawing/2015/10/21/chartex" xmlns:cx3="http://schemas.microsoft.com/office/drawing/2016/5/9/chartex" xmlns:cx4="http://schemas.microsoft.com/office/drawing/2016/5/10/chartex" xmlns:cx5="http://schemas.microsoft.com/office/drawing/2016/5/11/chartex" xmlns:cx6="http://schemas.microsoft.com/office/drawing/2016/5/12/chartex" xmlns:cx7="http://schemas.microsoft.com/office/drawing/2016/5/13/chartex" xmlns:cx8="http://schemas.microsoft.com/office/drawing/2016/5/14/chartex" xmlns:mc="http://schemas.openxmlformats.org/markup-compatibility/2006" xmlns:aink="http://schemas.microsoft.com/office/drawing/2016/ink" xmlns:am3d="http://schemas.microsoft.com/office/drawing/2017/model3d" xmlns:o="urn:schemas-microsoft-com:office:office" xmlns:r="http://schemas.openxmlformats.org/officeDocument/2006/relationships" xmlns:m="http://schemas.openxmlformats.org/officeDocument/2006/math" xmlns:v="urn:schemas-microsoft-com:vml" xmlns:wp14="http://schemas.microsoft.com/office/word/2010/wordprocessingDrawing" xmlns:wp="http://schemas.openxmlformats.org/drawingml/2006/wordprocessingDrawing" xmlns:w10="urn:schemas-microsoft-com:office:word" xmlns:w="http://schemas.openxmlformats.org/wordprocessingml/2006/main" xmlns:w14="http://schemas.microsoft.com/office/word/2010/wordml" xmlns:w15="http://schemas.microsoft.com/office/word/2012/wordml" xmlns:w16cid="http://schemas.microsoft.com/office/word/2016/wordml/cid" xmlns:w16se="http://schemas.microsoft.com/office/word/2015/wordml/symex" xmlns:wpg="http://schemas.microsoft.com/office/word/2010/wordprocessingGroup" xmlns:wpi="http://schemas.microsoft.com/office/word/2010/wordprocessingInk" xmlns:wne="http://schemas.microsoft.com/office/word/2006/wordml" xmlns:wps="http://schemas.microsoft.com/office/word/2010/wordprocessingShape" mc:Ignorable="w14 w15 w16se w16cid wp14">
+<w:numbering xmlns:wpc="http://schemas.microsoft.com/office/word/2010/wordprocessingCanvas" xmlns:cx="http://schemas.microsoft.com/office/drawing/2014/chartex" xmlns:cx1="http://schemas.microsoft.com/office/drawing/2015/9/8/chartex" xmlns:cx2="http://schemas.microsoft.com/office/drawing/2015/10/21/chartex" xmlns:cx3="http://schemas.microsoft.com/office/drawing/2016/5/9/chartex" xmlns:cx4="http://schemas.microsoft.com/office/drawing/2016/5/10/chartex" xmlns:cx5="http://schemas.microsoft.com/office/drawing/2016/5/11/chartex" xmlns:cx6="http://schemas.microsoft.com/office/drawing/2016/5/12/chartex" xmlns:cx7="http://schemas.microsoft.com/office/drawing/2016/5/13/chartex" xmlns:cx8="http://schemas.microsoft.com/office/drawing/2016/5/14/chartex" xmlns:mc="http://schemas.openxmlformats.org/markup-compatibility/2006" xmlns:aink="http://schemas.microsoft.com/office/drawing/2016/ink" xmlns:am3d="http://schemas.microsoft.com/office/drawing/2017/model3d" xmlns:o="urn:schemas-microsoft-com:office:office" xmlns:oel="http://schemas.microsoft.com/office/2019/extlst" xmlns:r="http://schemas.openxmlformats.org/officeDocument/2006/relationships" xmlns:m="http://schemas.openxmlformats.org/officeDocument/2006/math" xmlns:v="urn:schemas-microsoft-com:vml" xmlns:wp14="http://schemas.microsoft.com/office/word/2010/wordprocessingDrawing" xmlns:wp="http://schemas.openxmlformats.org/drawingml/2006/wordprocessingDrawing" xmlns:w10="urn:schemas-microsoft-com:office:word" xmlns:w="http://schemas.openxmlformats.org/wordprocessingml/2006/main" xmlns:w14="http://schemas.microsoft.com/office/word/2010/wordml" xmlns:w15="http://schemas.microsoft.com/office/word/2012/wordml" xmlns:w16cex="http://schemas.microsoft.com/office/word/2018/wordml/cex" xmlns:w16cid="http://schemas.microsoft.com/office/word/2016/wordml/cid" xmlns:w16="http://schemas.microsoft.com/office/word/2018/wordml" xmlns:w16du="http://schemas.microsoft.com/office/word/2023/wordml/word16du" xmlns:w16sdtdh="http://schemas.microsoft.com/office/word/2020/wordml/sdtdatahash" xmlns:w16sdtfl="http://schemas.microsoft.com/office/word/2024/wordml/sdtformatlock" xmlns:w16se="http://schemas.microsoft.com/office/word/2015/wordml/symex" xmlns:wpg="http://schemas.microsoft.com/office/word/2010/wordprocessingGroup" xmlns:wpi="http://schemas.microsoft.com/office/word/2010/wordprocessingInk" xmlns:wne="http://schemas.microsoft.com/office/word/2006/wordml" xmlns:wps="http://schemas.microsoft.com/office/word/2010/wordprocessingShape" mc:Ignorable="w14 w15 w16se w16cid w16 w16cex w16sdtdh w16sdtfl w16du wp14">
   <w:abstractNum w:abstractNumId="0" w15:restartNumberingAfterBreak="0">
     <w:nsid w:val="0801489A"/>
     <w:multiLevelType w:val="hybridMultilevel"/>
@@ -18398,82 +20135,82 @@
       </w:rPr>
     </w:lvl>
   </w:abstractNum>
-  <w:num w:numId="1">
+  <w:num w:numId="1" w16cid:durableId="1918245856">
     <w:abstractNumId w:val="12"/>
   </w:num>
-  <w:num w:numId="2">
+  <w:num w:numId="2" w16cid:durableId="1702583502">
     <w:abstractNumId w:val="3"/>
   </w:num>
-  <w:num w:numId="3">
+  <w:num w:numId="3" w16cid:durableId="277026334">
     <w:abstractNumId w:val="7"/>
   </w:num>
-  <w:num w:numId="4">
+  <w:num w:numId="4" w16cid:durableId="1242837316">
     <w:abstractNumId w:val="1"/>
   </w:num>
-  <w:num w:numId="5">
+  <w:num w:numId="5" w16cid:durableId="371655948">
     <w:abstractNumId w:val="4"/>
   </w:num>
-  <w:num w:numId="6">
+  <w:num w:numId="6" w16cid:durableId="1959287837">
     <w:abstractNumId w:val="14"/>
   </w:num>
-  <w:num w:numId="7">
+  <w:num w:numId="7" w16cid:durableId="609822067">
     <w:abstractNumId w:val="8"/>
   </w:num>
-  <w:num w:numId="8">
+  <w:num w:numId="8" w16cid:durableId="1817069421">
     <w:abstractNumId w:val="15"/>
   </w:num>
-  <w:num w:numId="9">
+  <w:num w:numId="9" w16cid:durableId="2132900702">
     <w:abstractNumId w:val="0"/>
   </w:num>
-  <w:num w:numId="10">
+  <w:num w:numId="10" w16cid:durableId="1745836711">
     <w:abstractNumId w:val="17"/>
   </w:num>
-  <w:num w:numId="11">
+  <w:num w:numId="11" w16cid:durableId="446581746">
     <w:abstractNumId w:val="20"/>
   </w:num>
-  <w:num w:numId="12">
+  <w:num w:numId="12" w16cid:durableId="727068887">
     <w:abstractNumId w:val="5"/>
   </w:num>
-  <w:num w:numId="13">
+  <w:num w:numId="13" w16cid:durableId="1992754877">
     <w:abstractNumId w:val="2"/>
   </w:num>
-  <w:num w:numId="14">
+  <w:num w:numId="14" w16cid:durableId="1858689313">
     <w:abstractNumId w:val="21"/>
   </w:num>
-  <w:num w:numId="15">
+  <w:num w:numId="15" w16cid:durableId="1603226133">
     <w:abstractNumId w:val="6"/>
   </w:num>
-  <w:num w:numId="16">
+  <w:num w:numId="16" w16cid:durableId="764158570">
     <w:abstractNumId w:val="12"/>
   </w:num>
-  <w:num w:numId="17">
+  <w:num w:numId="17" w16cid:durableId="92240964">
     <w:abstractNumId w:val="16"/>
   </w:num>
-  <w:num w:numId="18">
+  <w:num w:numId="18" w16cid:durableId="154995472">
     <w:abstractNumId w:val="12"/>
   </w:num>
-  <w:num w:numId="19">
+  <w:num w:numId="19" w16cid:durableId="1810634208">
     <w:abstractNumId w:val="12"/>
   </w:num>
-  <w:num w:numId="20">
+  <w:num w:numId="20" w16cid:durableId="1145775257">
     <w:abstractNumId w:val="12"/>
   </w:num>
-  <w:num w:numId="21">
+  <w:num w:numId="21" w16cid:durableId="1458256722">
     <w:abstractNumId w:val="12"/>
   </w:num>
-  <w:num w:numId="22">
+  <w:num w:numId="22" w16cid:durableId="568729599">
     <w:abstractNumId w:val="12"/>
   </w:num>
-  <w:num w:numId="23">
+  <w:num w:numId="23" w16cid:durableId="485826221">
     <w:abstractNumId w:val="13"/>
   </w:num>
-  <w:num w:numId="24">
+  <w:num w:numId="24" w16cid:durableId="403796699">
     <w:abstractNumId w:val="12"/>
   </w:num>
-  <w:num w:numId="25">
+  <w:num w:numId="25" w16cid:durableId="1943226066">
     <w:abstractNumId w:val="12"/>
   </w:num>
-  <w:num w:numId="26">
+  <w:num w:numId="26" w16cid:durableId="1844658039">
     <w:abstractNumId w:val="12"/>
     <w:lvlOverride w:ilvl="0">
       <w:startOverride w:val="2"/>
@@ -18482,22 +20219,22 @@
       <w:startOverride w:val="3"/>
     </w:lvlOverride>
   </w:num>
-  <w:num w:numId="27">
+  <w:num w:numId="27" w16cid:durableId="182137840">
     <w:abstractNumId w:val="18"/>
   </w:num>
-  <w:num w:numId="28">
+  <w:num w:numId="28" w16cid:durableId="1592395874">
     <w:abstractNumId w:val="10"/>
   </w:num>
-  <w:num w:numId="29">
+  <w:num w:numId="29" w16cid:durableId="1266689899">
     <w:abstractNumId w:val="11"/>
   </w:num>
-  <w:num w:numId="30">
+  <w:num w:numId="30" w16cid:durableId="409934579">
     <w:abstractNumId w:val="9"/>
   </w:num>
-  <w:num w:numId="31">
+  <w:num w:numId="31" w16cid:durableId="2046980024">
     <w:abstractNumId w:val="19"/>
   </w:num>
-  <w:num w:numId="32">
+  <w:num w:numId="32" w16cid:durableId="920261766">
     <w:abstractNumId w:val="22"/>
   </w:num>
   <w:numIdMacAtCleanup w:val="14"/>
@@ -18505,7 +20242,7 @@
 </file>
 
 <file path=word/styles.xml><?xml version="1.0" encoding="utf-8"?>
-<w:styles xmlns:mc="http://schemas.openxmlformats.org/markup-compatibility/2006" xmlns:r="http://schemas.openxmlformats.org/officeDocument/2006/relationships" xmlns:w="http://schemas.openxmlformats.org/wordprocessingml/2006/main" xmlns:w14="http://schemas.microsoft.com/office/word/2010/wordml" xmlns:w15="http://schemas.microsoft.com/office/word/2012/wordml" xmlns:w16cid="http://schemas.microsoft.com/office/word/2016/wordml/cid" xmlns:w16se="http://schemas.microsoft.com/office/word/2015/wordml/symex" mc:Ignorable="w14 w15 w16se w16cid">
+<w:styles xmlns:mc="http://schemas.openxmlformats.org/markup-compatibility/2006" xmlns:r="http://schemas.openxmlformats.org/officeDocument/2006/relationships" xmlns:w="http://schemas.openxmlformats.org/wordprocessingml/2006/main" xmlns:w14="http://schemas.microsoft.com/office/word/2010/wordml" xmlns:w15="http://schemas.microsoft.com/office/word/2012/wordml" xmlns:w16cex="http://schemas.microsoft.com/office/word/2018/wordml/cex" xmlns:w16cid="http://schemas.microsoft.com/office/word/2016/wordml/cid" xmlns:w16="http://schemas.microsoft.com/office/word/2018/wordml" xmlns:w16du="http://schemas.microsoft.com/office/word/2023/wordml/word16du" xmlns:w16sdtdh="http://schemas.microsoft.com/office/word/2020/wordml/sdtdatahash" xmlns:w16sdtfl="http://schemas.microsoft.com/office/word/2024/wordml/sdtformatlock" xmlns:w16se="http://schemas.microsoft.com/office/word/2015/wordml/symex" mc:Ignorable="w14 w15 w16se w16cid w16 w16cex w16sdtdh w16sdtfl w16du">
   <w:docDefaults>
     <w:rPrDefault>
       <w:rPr>
@@ -18515,7 +20252,7 @@
     </w:rPrDefault>
     <w:pPrDefault/>
   </w:docDefaults>
-  <w:latentStyles w:defLockedState="0" w:defUIPriority="99" w:defSemiHidden="0" w:defUnhideWhenUsed="0" w:defQFormat="0" w:count="375">
+  <w:latentStyles w:defLockedState="0" w:defUIPriority="99" w:defSemiHidden="0" w:defUnhideWhenUsed="0" w:defQFormat="0" w:count="376">
     <w:lsdException w:name="Normal" w:uiPriority="0" w:qFormat="1"/>
     <w:lsdException w:name="heading 1" w:uiPriority="0" w:qFormat="1"/>
     <w:lsdException w:name="heading 2" w:uiPriority="0" w:qFormat="1"/>
@@ -18891,6 +20628,7 @@
     <w:lsdException w:name="Smart Hyperlink" w:semiHidden="1" w:unhideWhenUsed="1"/>
     <w:lsdException w:name="Hashtag" w:semiHidden="1" w:unhideWhenUsed="1"/>
     <w:lsdException w:name="Unresolved Mention" w:semiHidden="1" w:unhideWhenUsed="1"/>
+    <w:lsdException w:name="Smart Link" w:semiHidden="1" w:unhideWhenUsed="1"/>
   </w:latentStyles>
   <w:style w:type="paragraph" w:default="1" w:styleId="Normale">
     <w:name w:val="Normal"/>

</xml_diff>

<commit_message>
Risolto problema immagini, migliorato stile immagini catalogo, aggiunta relazione tabella user/user_roles, modificata la migration e aggiunto il middleware dell'admin
</commit_message>
<xml_diff>
--- a/3_Documentazione/DocumentazioneFyt.docx
+++ b/3_Documentazione/DocumentazioneFyt.docx
@@ -1,6 +1,6 @@
 
 <file path=word/document.xml><?xml version="1.0" encoding="utf-8"?>
-<w:document xmlns:wpc="http://schemas.microsoft.com/office/word/2010/wordprocessingCanvas" xmlns:cx="http://schemas.microsoft.com/office/drawing/2014/chartex" xmlns:cx1="http://schemas.microsoft.com/office/drawing/2015/9/8/chartex" xmlns:cx2="http://schemas.microsoft.com/office/drawing/2015/10/21/chartex" xmlns:cx3="http://schemas.microsoft.com/office/drawing/2016/5/9/chartex" xmlns:cx4="http://schemas.microsoft.com/office/drawing/2016/5/10/chartex" xmlns:cx5="http://schemas.microsoft.com/office/drawing/2016/5/11/chartex" xmlns:cx6="http://schemas.microsoft.com/office/drawing/2016/5/12/chartex" xmlns:cx7="http://schemas.microsoft.com/office/drawing/2016/5/13/chartex" xmlns:cx8="http://schemas.microsoft.com/office/drawing/2016/5/14/chartex" xmlns:mc="http://schemas.openxmlformats.org/markup-compatibility/2006" xmlns:aink="http://schemas.microsoft.com/office/drawing/2016/ink" xmlns:am3d="http://schemas.microsoft.com/office/drawing/2017/model3d" xmlns:o="urn:schemas-microsoft-com:office:office" xmlns:r="http://schemas.openxmlformats.org/officeDocument/2006/relationships" xmlns:m="http://schemas.openxmlformats.org/officeDocument/2006/math" xmlns:v="urn:schemas-microsoft-com:vml" xmlns:wp14="http://schemas.microsoft.com/office/word/2010/wordprocessingDrawing" xmlns:wp="http://schemas.openxmlformats.org/drawingml/2006/wordprocessingDrawing" xmlns:w10="urn:schemas-microsoft-com:office:word" xmlns:w="http://schemas.openxmlformats.org/wordprocessingml/2006/main" xmlns:w14="http://schemas.microsoft.com/office/word/2010/wordml" xmlns:w15="http://schemas.microsoft.com/office/word/2012/wordml" xmlns:w16cid="http://schemas.microsoft.com/office/word/2016/wordml/cid" xmlns:w16se="http://schemas.microsoft.com/office/word/2015/wordml/symex" xmlns:wpg="http://schemas.microsoft.com/office/word/2010/wordprocessingGroup" xmlns:wpi="http://schemas.microsoft.com/office/word/2010/wordprocessingInk" xmlns:wne="http://schemas.microsoft.com/office/word/2006/wordml" xmlns:wps="http://schemas.microsoft.com/office/word/2010/wordprocessingShape" mc:Ignorable="w14 w15 w16se w16cid wp14">
+<w:document xmlns:wpc="http://schemas.microsoft.com/office/word/2010/wordprocessingCanvas" xmlns:cx="http://schemas.microsoft.com/office/drawing/2014/chartex" xmlns:cx1="http://schemas.microsoft.com/office/drawing/2015/9/8/chartex" xmlns:cx2="http://schemas.microsoft.com/office/drawing/2015/10/21/chartex" xmlns:cx3="http://schemas.microsoft.com/office/drawing/2016/5/9/chartex" xmlns:cx4="http://schemas.microsoft.com/office/drawing/2016/5/10/chartex" xmlns:cx5="http://schemas.microsoft.com/office/drawing/2016/5/11/chartex" xmlns:cx6="http://schemas.microsoft.com/office/drawing/2016/5/12/chartex" xmlns:cx7="http://schemas.microsoft.com/office/drawing/2016/5/13/chartex" xmlns:cx8="http://schemas.microsoft.com/office/drawing/2016/5/14/chartex" xmlns:mc="http://schemas.openxmlformats.org/markup-compatibility/2006" xmlns:aink="http://schemas.microsoft.com/office/drawing/2016/ink" xmlns:am3d="http://schemas.microsoft.com/office/drawing/2017/model3d" xmlns:o="urn:schemas-microsoft-com:office:office" xmlns:oel="http://schemas.microsoft.com/office/2019/extlst" xmlns:r="http://schemas.openxmlformats.org/officeDocument/2006/relationships" xmlns:m="http://schemas.openxmlformats.org/officeDocument/2006/math" xmlns:v="urn:schemas-microsoft-com:vml" xmlns:wp14="http://schemas.microsoft.com/office/word/2010/wordprocessingDrawing" xmlns:wp="http://schemas.openxmlformats.org/drawingml/2006/wordprocessingDrawing" xmlns:w10="urn:schemas-microsoft-com:office:word" xmlns:w="http://schemas.openxmlformats.org/wordprocessingml/2006/main" xmlns:w14="http://schemas.microsoft.com/office/word/2010/wordml" xmlns:w15="http://schemas.microsoft.com/office/word/2012/wordml" xmlns:w16cex="http://schemas.microsoft.com/office/word/2018/wordml/cex" xmlns:w16cid="http://schemas.microsoft.com/office/word/2016/wordml/cid" xmlns:w16="http://schemas.microsoft.com/office/word/2018/wordml" xmlns:w16du="http://schemas.microsoft.com/office/word/2023/wordml/word16du" xmlns:w16sdtdh="http://schemas.microsoft.com/office/word/2020/wordml/sdtdatahash" xmlns:w16sdtfl="http://schemas.microsoft.com/office/word/2024/wordml/sdtformatlock" xmlns:w16se="http://schemas.microsoft.com/office/word/2015/wordml/symex" xmlns:wpg="http://schemas.microsoft.com/office/word/2010/wordprocessingGroup" xmlns:wpi="http://schemas.microsoft.com/office/word/2010/wordprocessingInk" xmlns:wne="http://schemas.microsoft.com/office/word/2006/wordml" xmlns:wps="http://schemas.microsoft.com/office/word/2010/wordprocessingShape" mc:Ignorable="w14 w15 w16se w16cid w16 w16cex w16sdtdh w16sdtfl w16du wp14">
   <w:body>
     <w:p>
       <w:pPr>
@@ -13796,7 +13796,7 @@
         </w:rPr>
         <w:lastRenderedPageBreak/>
         <w:drawing>
-          <wp:inline distT="0" distB="0" distL="0" distR="0" wp14:anchorId="3D9AB3F7" wp14:editId="7CEA3A59">
+          <wp:inline distT="0" distB="0" distL="0" distR="0" wp14:anchorId="3D9AB3F7" wp14:editId="582D2D94">
             <wp:extent cx="5984757" cy="6562725"/>
             <wp:effectExtent l="114300" t="133350" r="111760" b="123825"/>
             <wp:docPr id="1020921113" name="Immagine 15"/>
@@ -14163,13 +14163,7 @@
               <w:t>à</w:t>
             </w:r>
             <w:r>
-              <w:t xml:space="preserve"> </w:t>
-            </w:r>
-            <w:r>
-              <w:t xml:space="preserve">già </w:t>
-            </w:r>
-            <w:r>
-              <w:t>pronte</w:t>
+              <w:t xml:space="preserve"> già pronte</w:t>
             </w:r>
           </w:p>
           <w:p>
@@ -14185,10 +14179,7 @@
               </w:rPr>
             </w:pPr>
             <w:r>
-              <w:t xml:space="preserve">Documentazione e </w:t>
-            </w:r>
-            <w:r>
-              <w:t>Community ampia</w:t>
+              <w:t>Documentazione e Community ampia</w:t>
             </w:r>
           </w:p>
         </w:tc>
@@ -14213,19 +14204,7 @@
               <w:rPr>
                 <w:lang w:val="it-IT"/>
               </w:rPr>
-              <w:t>Richiede conoscenza</w:t>
-            </w:r>
-            <w:r>
-              <w:rPr>
-                <w:lang w:val="it-IT"/>
-              </w:rPr>
-              <w:t xml:space="preserve"> </w:t>
-            </w:r>
-            <w:r>
-              <w:rPr>
-                <w:lang w:val="it-IT"/>
-              </w:rPr>
-              <w:t>Laravel</w:t>
+              <w:t>Richiede conoscenza Laravel</w:t>
             </w:r>
           </w:p>
           <w:p>
@@ -14292,14 +14271,12 @@
                 <w:lang w:val="it-IT"/>
               </w:rPr>
             </w:pPr>
-            <w:proofErr w:type="spellStart"/>
             <w:r>
               <w:rPr>
                 <w:lang w:val="it-IT"/>
               </w:rPr>
               <w:t>Python</w:t>
             </w:r>
-            <w:proofErr w:type="spellEnd"/>
           </w:p>
         </w:tc>
         <w:tc>
@@ -14380,33 +14357,7 @@
               <w:rPr>
                 <w:lang w:val="it-IT"/>
               </w:rPr>
-              <w:t xml:space="preserve">Curva di apprendimento </w:t>
-            </w:r>
-            <w:r>
-              <w:rPr>
-                <w:lang w:val="it-IT"/>
-              </w:rPr>
-              <w:t xml:space="preserve">elevata </w:t>
-            </w:r>
-            <w:r>
-              <w:rPr>
-                <w:lang w:val="it-IT"/>
-              </w:rPr>
-              <w:t xml:space="preserve">per </w:t>
-            </w:r>
-            <w:proofErr w:type="spellStart"/>
-            <w:r>
-              <w:rPr>
-                <w:lang w:val="it-IT"/>
-              </w:rPr>
-              <w:t>Python</w:t>
-            </w:r>
-            <w:proofErr w:type="spellEnd"/>
-            <w:r>
-              <w:rPr>
-                <w:lang w:val="it-IT"/>
-              </w:rPr>
-              <w:t xml:space="preserve">/Django </w:t>
+              <w:t xml:space="preserve">Curva di apprendimento elevata per Python/Django </w:t>
             </w:r>
           </w:p>
           <w:p>
@@ -14522,15 +14473,7 @@
             </w:r>
             <w:proofErr w:type="spellEnd"/>
             <w:r>
-              <w:t xml:space="preserve"> (</w:t>
-            </w:r>
-            <w:proofErr w:type="spellStart"/>
-            <w:r>
-              <w:t>Azure</w:t>
-            </w:r>
-            <w:proofErr w:type="spellEnd"/>
-            <w:r>
-              <w:t>, SQL Server)</w:t>
+              <w:t xml:space="preserve"> (Azure, SQL Server)</w:t>
             </w:r>
           </w:p>
           <w:p>
@@ -14595,13 +14538,7 @@
               </w:rPr>
             </w:pPr>
             <w:r>
-              <w:t xml:space="preserve">Community </w:t>
-            </w:r>
-            <w:r>
-              <w:t xml:space="preserve">e documentazione </w:t>
-            </w:r>
-            <w:r>
-              <w:t>pi</w:t>
+              <w:t>Community e documentazione pi</w:t>
             </w:r>
             <w:r>
               <w:rPr>
@@ -15062,19 +14999,11 @@
                 <w:lang w:val="fr-CH"/>
               </w:rPr>
             </w:pPr>
-            <w:proofErr w:type="gramStart"/>
             <w:r>
               <w:rPr>
                 <w:lang w:val="fr-CH"/>
               </w:rPr>
-              <w:t>public</w:t>
-            </w:r>
-            <w:proofErr w:type="gramEnd"/>
-            <w:r>
-              <w:rPr>
-                <w:lang w:val="fr-CH"/>
-              </w:rPr>
-              <w:t>/</w:t>
+              <w:t>public/</w:t>
             </w:r>
           </w:p>
         </w:tc>
@@ -15095,15 +15024,7 @@
               <w:t>, i</w:t>
             </w:r>
             <w:r>
-              <w:t xml:space="preserve">mmagini, </w:t>
-            </w:r>
-            <w:proofErr w:type="spellStart"/>
-            <w:r>
-              <w:t>assets</w:t>
-            </w:r>
-            <w:proofErr w:type="spellEnd"/>
-            <w:r>
-              <w:t>)</w:t>
+              <w:t>mmagini, assets)</w:t>
             </w:r>
           </w:p>
         </w:tc>
@@ -15177,19 +15098,11 @@
                 <w:lang w:val="fr-CH"/>
               </w:rPr>
             </w:pPr>
-            <w:proofErr w:type="gramStart"/>
             <w:r>
               <w:rPr>
                 <w:lang w:val="fr-CH"/>
               </w:rPr>
-              <w:t>routes</w:t>
-            </w:r>
-            <w:proofErr w:type="gramEnd"/>
-            <w:r>
-              <w:rPr>
-                <w:lang w:val="fr-CH"/>
-              </w:rPr>
-              <w:t>/</w:t>
+              <w:t>routes/</w:t>
             </w:r>
           </w:p>
         </w:tc>
@@ -15240,7 +15153,6 @@
               </w:rPr>
             </w:pPr>
             <w:proofErr w:type="spellStart"/>
-            <w:proofErr w:type="gramStart"/>
             <w:r>
               <w:rPr>
                 <w:lang w:val="fr-CH"/>
@@ -15248,7 +15160,6 @@
               <w:t>storage</w:t>
             </w:r>
             <w:proofErr w:type="spellEnd"/>
-            <w:proofErr w:type="gramEnd"/>
             <w:r>
               <w:rPr>
                 <w:lang w:val="fr-CH"/>
@@ -15310,19 +15221,11 @@
                 <w:lang w:val="fr-CH"/>
               </w:rPr>
             </w:pPr>
-            <w:proofErr w:type="gramStart"/>
             <w:r>
               <w:rPr>
                 <w:lang w:val="fr-CH"/>
               </w:rPr>
-              <w:t>tests</w:t>
-            </w:r>
-            <w:proofErr w:type="gramEnd"/>
-            <w:r>
-              <w:rPr>
-                <w:lang w:val="fr-CH"/>
-              </w:rPr>
-              <w:t>/</w:t>
+              <w:t>tests/</w:t>
             </w:r>
           </w:p>
         </w:tc>
@@ -15348,7 +15251,6 @@
                 <w:lang w:val="fr-CH"/>
               </w:rPr>
             </w:pPr>
-            <w:proofErr w:type="gramStart"/>
             <w:r>
               <w:rPr>
                 <w:lang w:val="fr-CH"/>
@@ -15363,7 +15265,6 @@
               <w:t>env</w:t>
             </w:r>
             <w:proofErr w:type="spellEnd"/>
-            <w:proofErr w:type="gramEnd"/>
           </w:p>
         </w:tc>
         <w:tc>
@@ -15402,8 +15303,6 @@
       <w:pPr>
         <w:pStyle w:val="Titolo2"/>
       </w:pPr>
-      <w:bookmarkStart w:id="38" w:name="_GoBack"/>
-      <w:bookmarkEnd w:id="38"/>
       <w:r>
         <w:lastRenderedPageBreak/>
         <w:t>Configurazione database</w:t>
@@ -15472,7 +15371,6 @@
           <w:b/>
         </w:rPr>
       </w:pPr>
-      <w:proofErr w:type="gramStart"/>
       <w:r>
         <w:rPr>
           <w:b/>
@@ -15483,14 +15381,7 @@
         <w:rPr>
           <w:b/>
         </w:rPr>
-        <w:t>(</w:t>
-      </w:r>
-      <w:proofErr w:type="gramEnd"/>
-      <w:r>
-        <w:rPr>
-          <w:b/>
-        </w:rPr>
-        <w:t>)</w:t>
+        <w:t>()</w:t>
       </w:r>
       <w:r>
         <w:rPr>
@@ -15652,7 +15543,6 @@
           <w:lang w:val="it-IT"/>
         </w:rPr>
       </w:pPr>
-      <w:proofErr w:type="gramStart"/>
       <w:r>
         <w:rPr>
           <w:b/>
@@ -15672,15 +15562,7 @@
           <w:b/>
           <w:lang w:val="it-IT"/>
         </w:rPr>
-        <w:t>(</w:t>
-      </w:r>
-      <w:proofErr w:type="gramEnd"/>
-      <w:r>
-        <w:rPr>
-          <w:b/>
-          <w:lang w:val="it-IT"/>
-        </w:rPr>
-        <w:t xml:space="preserve">): </w:t>
+        <w:t xml:space="preserve">(): </w:t>
       </w:r>
       <w:r>
         <w:rPr>
@@ -15891,10 +15773,7 @@
       </w:r>
       <w:proofErr w:type="spellEnd"/>
       <w:r>
-        <w:t>, ovvero una libreria PHP integrata in Laravel)</w:t>
-      </w:r>
-      <w:r>
-        <w:t>. Questi sono u</w:t>
+        <w:t>, ovvero una libreria PHP integrata in Laravel). Questi sono u</w:t>
       </w:r>
       <w:r>
         <w:t>tili per testing o popola</w:t>
@@ -16856,13 +16735,8 @@
           </w:tcPr>
           <w:p>
             <w:r>
-              <w:t xml:space="preserve">Generare dati </w:t>
-            </w:r>
-            <w:proofErr w:type="spellStart"/>
-            <w:r>
-              <w:t>fake</w:t>
-            </w:r>
-            <w:proofErr w:type="spellEnd"/>
+              <w:t>Generare dati fake</w:t>
+            </w:r>
           </w:p>
         </w:tc>
         <w:tc>
@@ -17044,7 +16918,6 @@
           <w:lang w:val="fr-CH"/>
         </w:rPr>
       </w:pPr>
-      <w:proofErr w:type="gramStart"/>
       <w:r>
         <w:rPr>
           <w:noProof w:val="0"/>
@@ -17055,7 +16928,6 @@
         <w:t>Route::</w:t>
       </w:r>
       <w:proofErr w:type="spellStart"/>
-      <w:proofErr w:type="gramEnd"/>
       <w:r>
         <w:rPr>
           <w:noProof w:val="0"/>
@@ -17145,7 +17017,6 @@
           <w:lang w:val="it-CH"/>
         </w:rPr>
       </w:pPr>
-      <w:proofErr w:type="gramStart"/>
       <w:r>
         <w:rPr>
           <w:noProof w:val="0"/>
@@ -17153,17 +17024,7 @@
           <w:szCs w:val="16"/>
           <w:lang w:val="it-CH"/>
         </w:rPr>
-        <w:t>})-</w:t>
-      </w:r>
-      <w:proofErr w:type="gramEnd"/>
-      <w:r>
-        <w:rPr>
-          <w:noProof w:val="0"/>
-          <w:sz w:val="16"/>
-          <w:szCs w:val="16"/>
-          <w:lang w:val="it-CH"/>
-        </w:rPr>
-        <w:t>&gt;name('home');</w:t>
+        <w:t>})-&gt;name('home');</w:t>
       </w:r>
     </w:p>
     <w:p>
@@ -17178,7 +17039,6 @@
         </w:rPr>
       </w:pPr>
       <w:proofErr w:type="spellStart"/>
-      <w:proofErr w:type="gramStart"/>
       <w:r>
         <w:rPr>
           <w:rFonts w:asciiTheme="minorHAnsi" w:eastAsiaTheme="minorHAnsi" w:hAnsiTheme="minorHAnsi" w:cstheme="minorBidi"/>
@@ -17201,7 +17061,6 @@
         <w:t>::</w:t>
       </w:r>
       <w:proofErr w:type="spellStart"/>
-      <w:proofErr w:type="gramEnd"/>
       <w:r>
         <w:rPr>
           <w:rFonts w:asciiTheme="minorHAnsi" w:eastAsiaTheme="minorHAnsi" w:hAnsiTheme="minorHAnsi" w:cstheme="minorBidi"/>
@@ -17302,7 +17161,47 @@
           <w:szCs w:val="22"/>
           <w:lang w:eastAsia="en-US"/>
         </w:rPr>
-        <w:t>estituisce la vista chiamata 'home' (resources/views/</w:t>
+        <w:t>estituisce la vista chiamata 'home' (</w:t>
+      </w:r>
+      <w:proofErr w:type="spellStart"/>
+      <w:r>
+        <w:rPr>
+          <w:rFonts w:asciiTheme="minorHAnsi" w:eastAsiaTheme="minorHAnsi" w:hAnsiTheme="minorHAnsi" w:cstheme="minorBidi"/>
+          <w:sz w:val="22"/>
+          <w:szCs w:val="22"/>
+          <w:lang w:eastAsia="en-US"/>
+        </w:rPr>
+        <w:t>resources</w:t>
+      </w:r>
+      <w:proofErr w:type="spellEnd"/>
+      <w:r>
+        <w:rPr>
+          <w:rFonts w:asciiTheme="minorHAnsi" w:eastAsiaTheme="minorHAnsi" w:hAnsiTheme="minorHAnsi" w:cstheme="minorBidi"/>
+          <w:sz w:val="22"/>
+          <w:szCs w:val="22"/>
+          <w:lang w:eastAsia="en-US"/>
+        </w:rPr>
+        <w:t>/</w:t>
+      </w:r>
+      <w:proofErr w:type="spellStart"/>
+      <w:r>
+        <w:rPr>
+          <w:rFonts w:asciiTheme="minorHAnsi" w:eastAsiaTheme="minorHAnsi" w:hAnsiTheme="minorHAnsi" w:cstheme="minorBidi"/>
+          <w:sz w:val="22"/>
+          <w:szCs w:val="22"/>
+          <w:lang w:eastAsia="en-US"/>
+        </w:rPr>
+        <w:t>views</w:t>
+      </w:r>
+      <w:proofErr w:type="spellEnd"/>
+      <w:r>
+        <w:rPr>
+          <w:rFonts w:asciiTheme="minorHAnsi" w:eastAsiaTheme="minorHAnsi" w:hAnsiTheme="minorHAnsi" w:cstheme="minorBidi"/>
+          <w:sz w:val="22"/>
+          <w:szCs w:val="22"/>
+          <w:lang w:eastAsia="en-US"/>
+        </w:rPr>
+        <w:t>/</w:t>
       </w:r>
       <w:proofErr w:type="spellStart"/>
       <w:r>
@@ -17459,7 +17358,23 @@
           <w:rFonts w:eastAsiaTheme="minorHAnsi"/>
           <w:lang w:val="it-IT" w:eastAsia="en-US"/>
         </w:rPr>
-        <w:t xml:space="preserve">La seguente rotta è un esempio di reindirizzamento alla pagina vendor (sfruttando il </w:t>
+        <w:t xml:space="preserve">La seguente rotta è un esempio di reindirizzamento alla pagina </w:t>
+      </w:r>
+      <w:proofErr w:type="spellStart"/>
+      <w:r>
+        <w:rPr>
+          <w:rFonts w:eastAsiaTheme="minorHAnsi"/>
+          <w:lang w:val="it-IT" w:eastAsia="en-US"/>
+        </w:rPr>
+        <w:t>vendor</w:t>
+      </w:r>
+      <w:proofErr w:type="spellEnd"/>
+      <w:r>
+        <w:rPr>
+          <w:rFonts w:eastAsiaTheme="minorHAnsi"/>
+          <w:lang w:val="it-IT" w:eastAsia="en-US"/>
+        </w:rPr>
+        <w:t xml:space="preserve"> (sfruttando il </w:t>
       </w:r>
       <w:proofErr w:type="spellStart"/>
       <w:r>
@@ -17494,7 +17409,6 @@
         </w:rPr>
       </w:pPr>
       <w:proofErr w:type="spellStart"/>
-      <w:proofErr w:type="gramStart"/>
       <w:r>
         <w:rPr>
           <w:noProof w:val="0"/>
@@ -17515,7 +17429,6 @@
         <w:t>::</w:t>
       </w:r>
       <w:proofErr w:type="spellStart"/>
-      <w:proofErr w:type="gramEnd"/>
       <w:r>
         <w:rPr>
           <w:noProof w:val="0"/>
@@ -17533,7 +17446,7 @@
           <w:szCs w:val="16"/>
           <w:lang w:val="it-CH"/>
         </w:rPr>
-        <w:t>('/vendor', [</w:t>
+        <w:t>('/</w:t>
       </w:r>
       <w:proofErr w:type="spellStart"/>
       <w:r>
@@ -17543,7 +17456,7 @@
           <w:szCs w:val="16"/>
           <w:lang w:val="it-CH"/>
         </w:rPr>
-        <w:t>VendorController</w:t>
+        <w:t>vendor</w:t>
       </w:r>
       <w:proofErr w:type="spellEnd"/>
       <w:r>
@@ -17553,7 +17466,7 @@
           <w:szCs w:val="16"/>
           <w:lang w:val="it-CH"/>
         </w:rPr>
-        <w:t>::class, '</w:t>
+        <w:t>', [</w:t>
       </w:r>
       <w:proofErr w:type="spellStart"/>
       <w:r>
@@ -17563,7 +17476,7 @@
           <w:szCs w:val="16"/>
           <w:lang w:val="it-CH"/>
         </w:rPr>
-        <w:t>index</w:t>
+        <w:t>VendorController</w:t>
       </w:r>
       <w:proofErr w:type="spellEnd"/>
       <w:r>
@@ -17573,7 +17486,7 @@
           <w:szCs w:val="16"/>
           <w:lang w:val="it-CH"/>
         </w:rPr>
-        <w:t>'])</w:t>
+        <w:t>::class, 'index'])</w:t>
       </w:r>
     </w:p>
     <w:p>
@@ -17598,9 +17511,9 @@
           <w:szCs w:val="16"/>
           <w:lang w:val="it-CH"/>
         </w:rPr>
-        <w:t xml:space="preserve">    -&gt;</w:t>
-      </w:r>
-      <w:proofErr w:type="gramStart"/>
+        <w:t xml:space="preserve">    -&gt;middleware(['</w:t>
+      </w:r>
+      <w:proofErr w:type="spellStart"/>
       <w:r>
         <w:rPr>
           <w:noProof w:val="0"/>
@@ -17608,9 +17521,9 @@
           <w:szCs w:val="16"/>
           <w:lang w:val="it-CH"/>
         </w:rPr>
-        <w:t>middleware(</w:t>
-      </w:r>
-      <w:proofErr w:type="gramEnd"/>
+        <w:t>auth</w:t>
+      </w:r>
+      <w:proofErr w:type="spellEnd"/>
       <w:r>
         <w:rPr>
           <w:noProof w:val="0"/>
@@ -17618,7 +17531,7 @@
           <w:szCs w:val="16"/>
           <w:lang w:val="it-CH"/>
         </w:rPr>
-        <w:t>['</w:t>
+        <w:t>', '</w:t>
       </w:r>
       <w:proofErr w:type="spellStart"/>
       <w:r>
@@ -17628,7 +17541,7 @@
           <w:szCs w:val="16"/>
           <w:lang w:val="it-CH"/>
         </w:rPr>
-        <w:t>auth</w:t>
+        <w:t>verified</w:t>
       </w:r>
       <w:proofErr w:type="spellEnd"/>
       <w:r>
@@ -17648,7 +17561,7 @@
           <w:szCs w:val="16"/>
           <w:lang w:val="it-CH"/>
         </w:rPr>
-        <w:t>verified</w:t>
+        <w:t>vendor</w:t>
       </w:r>
       <w:proofErr w:type="spellEnd"/>
       <w:r>
@@ -17658,7 +17571,7 @@
           <w:szCs w:val="16"/>
           <w:lang w:val="it-CH"/>
         </w:rPr>
-        <w:t>', 'vendor'])</w:t>
+        <w:t>'])</w:t>
       </w:r>
     </w:p>
     <w:p>
@@ -17698,7 +17611,6 @@
         </w:rPr>
       </w:pPr>
       <w:proofErr w:type="spellStart"/>
-      <w:proofErr w:type="gramStart"/>
       <w:r>
         <w:rPr>
           <w:rFonts w:asciiTheme="minorHAnsi" w:eastAsiaTheme="minorHAnsi" w:hAnsiTheme="minorHAnsi" w:cstheme="minorBidi"/>
@@ -17721,7 +17633,6 @@
         <w:t>::</w:t>
       </w:r>
       <w:proofErr w:type="spellStart"/>
-      <w:proofErr w:type="gramEnd"/>
       <w:r>
         <w:rPr>
           <w:rFonts w:asciiTheme="minorHAnsi" w:eastAsiaTheme="minorHAnsi" w:hAnsiTheme="minorHAnsi" w:cstheme="minorBidi"/>
@@ -17741,7 +17652,29 @@
           <w:szCs w:val="22"/>
           <w:lang w:eastAsia="en-US"/>
         </w:rPr>
-        <w:t>('/vendor')</w:t>
+        <w:t>('/</w:t>
+      </w:r>
+      <w:proofErr w:type="spellStart"/>
+      <w:r>
+        <w:rPr>
+          <w:rFonts w:asciiTheme="minorHAnsi" w:eastAsiaTheme="minorHAnsi" w:hAnsiTheme="minorHAnsi" w:cstheme="minorBidi"/>
+          <w:b/>
+          <w:sz w:val="22"/>
+          <w:szCs w:val="22"/>
+          <w:lang w:eastAsia="en-US"/>
+        </w:rPr>
+        <w:t>vendor</w:t>
+      </w:r>
+      <w:proofErr w:type="spellEnd"/>
+      <w:r>
+        <w:rPr>
+          <w:rFonts w:asciiTheme="minorHAnsi" w:eastAsiaTheme="minorHAnsi" w:hAnsiTheme="minorHAnsi" w:cstheme="minorBidi"/>
+          <w:b/>
+          <w:sz w:val="22"/>
+          <w:szCs w:val="22"/>
+          <w:lang w:eastAsia="en-US"/>
+        </w:rPr>
+        <w:t>')</w:t>
       </w:r>
     </w:p>
     <w:p>
@@ -17791,7 +17724,6 @@
         <w:t>[</w:t>
       </w:r>
       <w:proofErr w:type="spellStart"/>
-      <w:proofErr w:type="gramStart"/>
       <w:r>
         <w:rPr>
           <w:rFonts w:asciiTheme="minorHAnsi" w:eastAsiaTheme="minorHAnsi" w:hAnsiTheme="minorHAnsi" w:cstheme="minorBidi"/>
@@ -17811,40 +17743,7 @@
           <w:szCs w:val="22"/>
           <w:lang w:eastAsia="en-US"/>
         </w:rPr>
-        <w:t>::</w:t>
-      </w:r>
-      <w:proofErr w:type="gramEnd"/>
-      <w:r>
-        <w:rPr>
-          <w:rFonts w:asciiTheme="minorHAnsi" w:eastAsiaTheme="minorHAnsi" w:hAnsiTheme="minorHAnsi" w:cstheme="minorBidi"/>
-          <w:b/>
-          <w:sz w:val="22"/>
-          <w:szCs w:val="22"/>
-          <w:lang w:eastAsia="en-US"/>
-        </w:rPr>
-        <w:t>class, '</w:t>
-      </w:r>
-      <w:proofErr w:type="spellStart"/>
-      <w:r>
-        <w:rPr>
-          <w:rFonts w:asciiTheme="minorHAnsi" w:eastAsiaTheme="minorHAnsi" w:hAnsiTheme="minorHAnsi" w:cstheme="minorBidi"/>
-          <w:b/>
-          <w:sz w:val="22"/>
-          <w:szCs w:val="22"/>
-          <w:lang w:eastAsia="en-US"/>
-        </w:rPr>
-        <w:t>index</w:t>
-      </w:r>
-      <w:proofErr w:type="spellEnd"/>
-      <w:r>
-        <w:rPr>
-          <w:rFonts w:asciiTheme="minorHAnsi" w:eastAsiaTheme="minorHAnsi" w:hAnsiTheme="minorHAnsi" w:cstheme="minorBidi"/>
-          <w:b/>
-          <w:sz w:val="22"/>
-          <w:szCs w:val="22"/>
-          <w:lang w:eastAsia="en-US"/>
-        </w:rPr>
-        <w:t>']</w:t>
+        <w:t>::class, 'index']</w:t>
       </w:r>
     </w:p>
     <w:p>
@@ -17869,10 +17768,9 @@
           <w:szCs w:val="22"/>
           <w:lang w:eastAsia="en-US"/>
         </w:rPr>
-        <w:t xml:space="preserve">Questa rotta è gestita da un Controller, specifica che il metodo </w:t>
+        <w:t xml:space="preserve">Questa rotta è gestita da un Controller, specifica che il metodo index() della classe </w:t>
       </w:r>
       <w:proofErr w:type="spellStart"/>
-      <w:proofErr w:type="gramStart"/>
       <w:r>
         <w:rPr>
           <w:rFonts w:asciiTheme="minorHAnsi" w:eastAsiaTheme="minorHAnsi" w:hAnsiTheme="minorHAnsi" w:cstheme="minorBidi"/>
@@ -17880,7 +17778,7 @@
           <w:szCs w:val="22"/>
           <w:lang w:eastAsia="en-US"/>
         </w:rPr>
-        <w:t>index</w:t>
+        <w:t>VendorController</w:t>
       </w:r>
       <w:proofErr w:type="spellEnd"/>
       <w:r>
@@ -17890,9 +17788,9 @@
           <w:szCs w:val="22"/>
           <w:lang w:eastAsia="en-US"/>
         </w:rPr>
-        <w:t>(</w:t>
-      </w:r>
-      <w:proofErr w:type="gramEnd"/>
+        <w:t xml:space="preserve"> sarà eseguito quando la rotta viene chiamata. Da notare, che la view viene ritornata direttamente dalla classe </w:t>
+      </w:r>
+      <w:proofErr w:type="spellStart"/>
       <w:r>
         <w:rPr>
           <w:rFonts w:asciiTheme="minorHAnsi" w:eastAsiaTheme="minorHAnsi" w:hAnsiTheme="minorHAnsi" w:cstheme="minorBidi"/>
@@ -17900,9 +17798,9 @@
           <w:szCs w:val="22"/>
           <w:lang w:eastAsia="en-US"/>
         </w:rPr>
-        <w:t xml:space="preserve">) della classe </w:t>
-      </w:r>
-      <w:proofErr w:type="spellStart"/>
+        <w:t>VendorController</w:t>
+      </w:r>
+      <w:proofErr w:type="spellEnd"/>
       <w:r>
         <w:rPr>
           <w:rFonts w:asciiTheme="minorHAnsi" w:eastAsiaTheme="minorHAnsi" w:hAnsiTheme="minorHAnsi" w:cstheme="minorBidi"/>
@@ -17910,9 +17808,8 @@
           <w:szCs w:val="22"/>
           <w:lang w:eastAsia="en-US"/>
         </w:rPr>
-        <w:t>VendorController</w:t>
-      </w:r>
-      <w:proofErr w:type="spellEnd"/>
+        <w:t xml:space="preserve"> </w:t>
+      </w:r>
       <w:r>
         <w:rPr>
           <w:rFonts w:asciiTheme="minorHAnsi" w:eastAsiaTheme="minorHAnsi" w:hAnsiTheme="minorHAnsi" w:cstheme="minorBidi"/>
@@ -17920,9 +17817,8 @@
           <w:szCs w:val="22"/>
           <w:lang w:eastAsia="en-US"/>
         </w:rPr>
-        <w:t xml:space="preserve"> sarà eseguito quando la rotta viene chiamata. Da notare, che la view viene ritornata direttamente dalla classe </w:t>
-      </w:r>
-      <w:proofErr w:type="spellStart"/>
+        <w:t>(all’interno</w:t>
+      </w:r>
       <w:r>
         <w:rPr>
           <w:rFonts w:asciiTheme="minorHAnsi" w:eastAsiaTheme="minorHAnsi" w:hAnsiTheme="minorHAnsi" w:cstheme="minorBidi"/>
@@ -17930,66 +17826,7 @@
           <w:szCs w:val="22"/>
           <w:lang w:eastAsia="en-US"/>
         </w:rPr>
-        <w:t>VendorController</w:t>
-      </w:r>
-      <w:proofErr w:type="spellEnd"/>
-      <w:r>
-        <w:rPr>
-          <w:rFonts w:asciiTheme="minorHAnsi" w:eastAsiaTheme="minorHAnsi" w:hAnsiTheme="minorHAnsi" w:cstheme="minorBidi"/>
-          <w:sz w:val="22"/>
-          <w:szCs w:val="22"/>
-          <w:lang w:eastAsia="en-US"/>
-        </w:rPr>
-        <w:t xml:space="preserve"> </w:t>
-      </w:r>
-      <w:r>
-        <w:rPr>
-          <w:rFonts w:asciiTheme="minorHAnsi" w:eastAsiaTheme="minorHAnsi" w:hAnsiTheme="minorHAnsi" w:cstheme="minorBidi"/>
-          <w:sz w:val="22"/>
-          <w:szCs w:val="22"/>
-          <w:lang w:eastAsia="en-US"/>
-        </w:rPr>
-        <w:t>(all’interno</w:t>
-      </w:r>
-      <w:r>
-        <w:rPr>
-          <w:rFonts w:asciiTheme="minorHAnsi" w:eastAsiaTheme="minorHAnsi" w:hAnsiTheme="minorHAnsi" w:cstheme="minorBidi"/>
-          <w:sz w:val="22"/>
-          <w:szCs w:val="22"/>
-          <w:lang w:eastAsia="en-US"/>
-        </w:rPr>
-        <w:t xml:space="preserve"> del metodo </w:t>
-      </w:r>
-      <w:proofErr w:type="spellStart"/>
-      <w:proofErr w:type="gramStart"/>
-      <w:r>
-        <w:rPr>
-          <w:rFonts w:asciiTheme="minorHAnsi" w:eastAsiaTheme="minorHAnsi" w:hAnsiTheme="minorHAnsi" w:cstheme="minorBidi"/>
-          <w:sz w:val="22"/>
-          <w:szCs w:val="22"/>
-          <w:lang w:eastAsia="en-US"/>
-        </w:rPr>
-        <w:t>index</w:t>
-      </w:r>
-      <w:proofErr w:type="spellEnd"/>
-      <w:r>
-        <w:rPr>
-          <w:rFonts w:asciiTheme="minorHAnsi" w:eastAsiaTheme="minorHAnsi" w:hAnsiTheme="minorHAnsi" w:cstheme="minorBidi"/>
-          <w:sz w:val="22"/>
-          <w:szCs w:val="22"/>
-          <w:lang w:eastAsia="en-US"/>
-        </w:rPr>
-        <w:t>(</w:t>
-      </w:r>
-      <w:proofErr w:type="gramEnd"/>
-      <w:r>
-        <w:rPr>
-          <w:rFonts w:asciiTheme="minorHAnsi" w:eastAsiaTheme="minorHAnsi" w:hAnsiTheme="minorHAnsi" w:cstheme="minorBidi"/>
-          <w:sz w:val="22"/>
-          <w:szCs w:val="22"/>
-          <w:lang w:eastAsia="en-US"/>
-        </w:rPr>
-        <w:t>))</w:t>
+        <w:t xml:space="preserve"> del metodo index())</w:t>
       </w:r>
     </w:p>
     <w:p>
@@ -18081,7 +17918,29 @@
           <w:szCs w:val="22"/>
           <w:lang w:eastAsia="en-US"/>
         </w:rPr>
-        <w:t>', 'vendor'])</w:t>
+        <w:t>', '</w:t>
+      </w:r>
+      <w:proofErr w:type="spellStart"/>
+      <w:r>
+        <w:rPr>
+          <w:rFonts w:asciiTheme="minorHAnsi" w:eastAsiaTheme="minorHAnsi" w:hAnsiTheme="minorHAnsi" w:cstheme="minorBidi"/>
+          <w:b/>
+          <w:sz w:val="22"/>
+          <w:szCs w:val="22"/>
+          <w:lang w:eastAsia="en-US"/>
+        </w:rPr>
+        <w:t>vendor</w:t>
+      </w:r>
+      <w:proofErr w:type="spellEnd"/>
+      <w:r>
+        <w:rPr>
+          <w:rFonts w:asciiTheme="minorHAnsi" w:eastAsiaTheme="minorHAnsi" w:hAnsiTheme="minorHAnsi" w:cstheme="minorBidi"/>
+          <w:b/>
+          <w:sz w:val="22"/>
+          <w:szCs w:val="22"/>
+          <w:lang w:eastAsia="en-US"/>
+        </w:rPr>
+        <w:t>'])</w:t>
       </w:r>
     </w:p>
     <w:p>
@@ -18273,13 +18132,10 @@
           <w:szCs w:val="22"/>
           <w:lang w:eastAsia="en-US"/>
         </w:rPr>
-        <w:t>auth:</w:t>
+        <w:t>auth</w:t>
       </w:r>
       <w:proofErr w:type="spellEnd"/>
-    </w:p>
-    <w:p>
-      <w:pPr>
-        <w:spacing w:after="160" w:line="259" w:lineRule="auto"/>
+      <w:r>
         <w:rPr>
           <w:rFonts w:asciiTheme="minorHAnsi" w:eastAsiaTheme="minorHAnsi" w:hAnsiTheme="minorHAnsi" w:cstheme="minorBidi"/>
           <w:b/>
@@ -18287,20 +18143,12 @@
           <w:szCs w:val="22"/>
           <w:lang w:eastAsia="en-US"/>
         </w:rPr>
-      </w:pPr>
-      <w:r>
-        <w:rPr>
-          <w:rFonts w:asciiTheme="minorHAnsi" w:eastAsiaTheme="minorHAnsi" w:hAnsiTheme="minorHAnsi" w:cstheme="minorBidi"/>
-          <w:sz w:val="22"/>
-          <w:szCs w:val="22"/>
-          <w:lang w:eastAsia="en-US"/>
-        </w:rPr>
-        <w:t>Verifica che l'utente sia loggato. Se non lo è, viene reindirizzato alla pagina di login</w:t>
-      </w:r>
-    </w:p>
-    <w:p>
-      <w:pPr>
-        <w:spacing w:line="259" w:lineRule="auto"/>
+        <w:t>:</w:t>
+      </w:r>
+    </w:p>
+    <w:p>
+      <w:pPr>
+        <w:spacing w:after="160" w:line="259" w:lineRule="auto"/>
         <w:rPr>
           <w:rFonts w:asciiTheme="minorHAnsi" w:eastAsiaTheme="minorHAnsi" w:hAnsiTheme="minorHAnsi" w:cstheme="minorBidi"/>
           <w:b/>
@@ -18309,8 +18157,19 @@
           <w:lang w:eastAsia="en-US"/>
         </w:rPr>
       </w:pPr>
-      <w:proofErr w:type="spellStart"/>
-      <w:r>
+      <w:r>
+        <w:rPr>
+          <w:rFonts w:asciiTheme="minorHAnsi" w:eastAsiaTheme="minorHAnsi" w:hAnsiTheme="minorHAnsi" w:cstheme="minorBidi"/>
+          <w:sz w:val="22"/>
+          <w:szCs w:val="22"/>
+          <w:lang w:eastAsia="en-US"/>
+        </w:rPr>
+        <w:t>Verifica che l'utente sia loggato. Se non lo è, viene reindirizzato alla pagina di login</w:t>
+      </w:r>
+    </w:p>
+    <w:p>
+      <w:pPr>
+        <w:spacing w:line="259" w:lineRule="auto"/>
         <w:rPr>
           <w:rFonts w:asciiTheme="minorHAnsi" w:eastAsiaTheme="minorHAnsi" w:hAnsiTheme="minorHAnsi" w:cstheme="minorBidi"/>
           <w:b/>
@@ -18318,9 +18177,8 @@
           <w:szCs w:val="22"/>
           <w:lang w:eastAsia="en-US"/>
         </w:rPr>
-        <w:t>verified</w:t>
-      </w:r>
-      <w:proofErr w:type="spellEnd"/>
+      </w:pPr>
+      <w:proofErr w:type="spellStart"/>
       <w:r>
         <w:rPr>
           <w:rFonts w:asciiTheme="minorHAnsi" w:eastAsiaTheme="minorHAnsi" w:hAnsiTheme="minorHAnsi" w:cstheme="minorBidi"/>
@@ -18329,13 +18187,10 @@
           <w:szCs w:val="22"/>
           <w:lang w:eastAsia="en-US"/>
         </w:rPr>
-        <w:t>:</w:t>
-      </w:r>
-    </w:p>
-    <w:p>
-      <w:pPr>
-        <w:spacing w:before="240" w:after="160" w:line="259" w:lineRule="auto"/>
-        <w:contextualSpacing/>
+        <w:t>verified</w:t>
+      </w:r>
+      <w:proofErr w:type="spellEnd"/>
+      <w:r>
         <w:rPr>
           <w:rFonts w:asciiTheme="minorHAnsi" w:eastAsiaTheme="minorHAnsi" w:hAnsiTheme="minorHAnsi" w:cstheme="minorBidi"/>
           <w:b/>
@@ -18343,20 +18198,13 @@
           <w:szCs w:val="22"/>
           <w:lang w:eastAsia="en-US"/>
         </w:rPr>
-      </w:pPr>
-      <w:r>
-        <w:rPr>
-          <w:rFonts w:asciiTheme="minorHAnsi" w:eastAsiaTheme="minorHAnsi" w:hAnsiTheme="minorHAnsi" w:cstheme="minorBidi"/>
-          <w:sz w:val="22"/>
-          <w:szCs w:val="22"/>
-          <w:lang w:eastAsia="en-US"/>
-        </w:rPr>
-        <w:t>Assicura che l'utente abbia verificato l'email.</w:t>
-      </w:r>
-    </w:p>
-    <w:p>
-      <w:pPr>
-        <w:spacing w:before="240" w:line="259" w:lineRule="auto"/>
+        <w:t>:</w:t>
+      </w:r>
+    </w:p>
+    <w:p>
+      <w:pPr>
+        <w:spacing w:before="240" w:after="160" w:line="259" w:lineRule="auto"/>
+        <w:contextualSpacing/>
         <w:rPr>
           <w:rFonts w:asciiTheme="minorHAnsi" w:eastAsiaTheme="minorHAnsi" w:hAnsiTheme="minorHAnsi" w:cstheme="minorBidi"/>
           <w:b/>
@@ -18368,18 +18216,16 @@
       <w:r>
         <w:rPr>
           <w:rFonts w:asciiTheme="minorHAnsi" w:eastAsiaTheme="minorHAnsi" w:hAnsiTheme="minorHAnsi" w:cstheme="minorBidi"/>
-          <w:b/>
           <w:sz w:val="22"/>
           <w:szCs w:val="22"/>
           <w:lang w:eastAsia="en-US"/>
         </w:rPr>
-        <w:t>vendor:</w:t>
-      </w:r>
-    </w:p>
-    <w:p>
-      <w:pPr>
-        <w:spacing w:line="259" w:lineRule="auto"/>
-        <w:contextualSpacing/>
+        <w:t>Assicura che l'utente abbia verificato l'email.</w:t>
+      </w:r>
+    </w:p>
+    <w:p>
+      <w:pPr>
+        <w:spacing w:before="240" w:line="259" w:lineRule="auto"/>
         <w:rPr>
           <w:rFonts w:asciiTheme="minorHAnsi" w:eastAsiaTheme="minorHAnsi" w:hAnsiTheme="minorHAnsi" w:cstheme="minorBidi"/>
           <w:b/>
@@ -18391,12 +18237,95 @@
       <w:r>
         <w:rPr>
           <w:rFonts w:asciiTheme="minorHAnsi" w:eastAsiaTheme="minorHAnsi" w:hAnsiTheme="minorHAnsi" w:cstheme="minorBidi"/>
+          <w:b/>
           <w:sz w:val="22"/>
           <w:szCs w:val="22"/>
           <w:lang w:eastAsia="en-US"/>
         </w:rPr>
-        <w:t>Un middleware personalizzato che verifica che l'utente abbia il ruolo di "vendor"</w:t>
-      </w:r>
+        <w:t>vendor:</w:t>
+      </w:r>
+    </w:p>
+    <w:p>
+      <w:pPr>
+        <w:spacing w:line="259" w:lineRule="auto"/>
+        <w:contextualSpacing/>
+        <w:rPr>
+          <w:rFonts w:asciiTheme="minorHAnsi" w:eastAsiaTheme="minorHAnsi" w:hAnsiTheme="minorHAnsi" w:cstheme="minorBidi"/>
+          <w:b/>
+          <w:sz w:val="22"/>
+          <w:szCs w:val="22"/>
+          <w:lang w:eastAsia="en-US"/>
+        </w:rPr>
+      </w:pPr>
+      <w:r>
+        <w:rPr>
+          <w:rFonts w:asciiTheme="minorHAnsi" w:eastAsiaTheme="minorHAnsi" w:hAnsiTheme="minorHAnsi" w:cstheme="minorBidi"/>
+          <w:sz w:val="22"/>
+          <w:szCs w:val="22"/>
+          <w:lang w:eastAsia="en-US"/>
+        </w:rPr>
+        <w:t>Un middleware personalizzato che verifica che l'utente abbia il ruolo di "</w:t>
+      </w:r>
+      <w:proofErr w:type="spellStart"/>
+      <w:r>
+        <w:rPr>
+          <w:rFonts w:asciiTheme="minorHAnsi" w:eastAsiaTheme="minorHAnsi" w:hAnsiTheme="minorHAnsi" w:cstheme="minorBidi"/>
+          <w:sz w:val="22"/>
+          <w:szCs w:val="22"/>
+          <w:lang w:eastAsia="en-US"/>
+        </w:rPr>
+        <w:t>vendor</w:t>
+      </w:r>
+      <w:proofErr w:type="spellEnd"/>
+      <w:r>
+        <w:rPr>
+          <w:rFonts w:asciiTheme="minorHAnsi" w:eastAsiaTheme="minorHAnsi" w:hAnsiTheme="minorHAnsi" w:cstheme="minorBidi"/>
+          <w:sz w:val="22"/>
+          <w:szCs w:val="22"/>
+          <w:lang w:eastAsia="en-US"/>
+        </w:rPr>
+        <w:t>"</w:t>
+      </w:r>
+      <w:r>
+        <w:rPr>
+          <w:rFonts w:asciiTheme="minorHAnsi" w:eastAsiaTheme="minorHAnsi" w:hAnsiTheme="minorHAnsi" w:cstheme="minorBidi"/>
+          <w:sz w:val="22"/>
+          <w:szCs w:val="22"/>
+          <w:lang w:eastAsia="en-US"/>
+        </w:rPr>
+        <w:t xml:space="preserve">, il nome del middleware è stato associato al controller di sicurezza ed è stato aggiunto all’interno del file </w:t>
+      </w:r>
+      <w:proofErr w:type="spellStart"/>
+      <w:r>
+        <w:rPr>
+          <w:rFonts w:asciiTheme="minorHAnsi" w:eastAsiaTheme="minorHAnsi" w:hAnsiTheme="minorHAnsi" w:cstheme="minorBidi"/>
+          <w:sz w:val="22"/>
+          <w:szCs w:val="22"/>
+          <w:lang w:eastAsia="en-US"/>
+        </w:rPr>
+        <w:t>boostrap</w:t>
+      </w:r>
+      <w:proofErr w:type="spellEnd"/>
+      <w:r>
+        <w:rPr>
+          <w:rFonts w:asciiTheme="minorHAnsi" w:eastAsiaTheme="minorHAnsi" w:hAnsiTheme="minorHAnsi" w:cstheme="minorBidi"/>
+          <w:sz w:val="22"/>
+          <w:szCs w:val="22"/>
+          <w:lang w:eastAsia="en-US"/>
+        </w:rPr>
+        <w:t>/</w:t>
+      </w:r>
+      <w:proofErr w:type="spellStart"/>
+      <w:r>
+        <w:rPr>
+          <w:rFonts w:asciiTheme="minorHAnsi" w:eastAsiaTheme="minorHAnsi" w:hAnsiTheme="minorHAnsi" w:cstheme="minorBidi"/>
+          <w:sz w:val="22"/>
+          <w:szCs w:val="22"/>
+          <w:lang w:eastAsia="en-US"/>
+        </w:rPr>
+        <w:t>app.php</w:t>
+      </w:r>
+      <w:proofErr w:type="spellEnd"/>
     </w:p>
     <w:p>
       <w:pPr>
@@ -19057,15 +18986,7 @@
         <w:spacing w:after="240"/>
       </w:pPr>
       <w:r>
-        <w:t>Breeze crea i seguenti controller in app/Http/</w:t>
-      </w:r>
-      <w:proofErr w:type="spellStart"/>
-      <w:r>
-        <w:t>Controllers</w:t>
-      </w:r>
-      <w:proofErr w:type="spellEnd"/>
-      <w:r>
-        <w:t>/</w:t>
+        <w:t>Breeze crea i seguenti controller in app/Http/Controllers/</w:t>
       </w:r>
       <w:proofErr w:type="spellStart"/>
       <w:r>
@@ -19526,9 +19447,9 @@
           <w:lang w:val="it-IT"/>
         </w:rPr>
       </w:pPr>
-      <w:bookmarkStart w:id="39" w:name="_Toc461179223"/>
-      <w:bookmarkStart w:id="40" w:name="_Toc94790460"/>
-      <w:bookmarkStart w:id="41" w:name="_Toc189853868"/>
+      <w:bookmarkStart w:id="38" w:name="_Toc461179223"/>
+      <w:bookmarkStart w:id="39" w:name="_Toc94790460"/>
+      <w:bookmarkStart w:id="40" w:name="_Toc189853868"/>
       <w:r>
         <w:rPr>
           <w:lang w:val="it-IT"/>
@@ -19536,23 +19457,23 @@
         <w:lastRenderedPageBreak/>
         <w:t>Test</w:t>
       </w:r>
+      <w:bookmarkEnd w:id="38"/>
       <w:bookmarkEnd w:id="39"/>
       <w:bookmarkEnd w:id="40"/>
+    </w:p>
+    <w:p>
+      <w:pPr>
+        <w:pStyle w:val="Titolo2"/>
+      </w:pPr>
+      <w:bookmarkStart w:id="41" w:name="_Toc461179224"/>
+      <w:bookmarkStart w:id="42" w:name="_Toc94790461"/>
+      <w:bookmarkStart w:id="43" w:name="_Toc189853869"/>
+      <w:r>
+        <w:t>Protocollo di test</w:t>
+      </w:r>
       <w:bookmarkEnd w:id="41"/>
-    </w:p>
-    <w:p>
-      <w:pPr>
-        <w:pStyle w:val="Titolo2"/>
-      </w:pPr>
-      <w:bookmarkStart w:id="42" w:name="_Toc461179224"/>
-      <w:bookmarkStart w:id="43" w:name="_Toc94790461"/>
-      <w:bookmarkStart w:id="44" w:name="_Toc189853869"/>
-      <w:r>
-        <w:t>Protocollo di test</w:t>
-      </w:r>
       <w:bookmarkEnd w:id="42"/>
       <w:bookmarkEnd w:id="43"/>
-      <w:bookmarkEnd w:id="44"/>
     </w:p>
     <w:p>
       <w:pPr>
@@ -20589,7 +20510,7 @@
           <w:lang w:val="fr-CH"/>
         </w:rPr>
       </w:pPr>
-      <w:bookmarkStart w:id="45" w:name="_Toc461179225"/>
+      <w:bookmarkStart w:id="44" w:name="_Toc461179225"/>
       <w:r>
         <w:rPr>
           <w:lang w:val="fr-CH"/>
@@ -20601,313 +20522,313 @@
       <w:pPr>
         <w:pStyle w:val="Titolo2"/>
       </w:pPr>
-      <w:bookmarkStart w:id="46" w:name="_Toc94790462"/>
-      <w:bookmarkStart w:id="47" w:name="_Toc189853870"/>
+      <w:bookmarkStart w:id="45" w:name="_Toc94790462"/>
+      <w:bookmarkStart w:id="46" w:name="_Toc189853870"/>
       <w:r>
         <w:lastRenderedPageBreak/>
         <w:t>Risultati test</w:t>
       </w:r>
+      <w:bookmarkEnd w:id="44"/>
       <w:bookmarkEnd w:id="45"/>
       <w:bookmarkEnd w:id="46"/>
+    </w:p>
+    <w:p>
+      <w:pPr>
+        <w:rPr>
+          <w:lang w:val="it-IT"/>
+        </w:rPr>
+      </w:pPr>
+      <w:r>
+        <w:rPr>
+          <w:lang w:val="it-IT"/>
+        </w:rPr>
+        <w:t>Tabella riassuntiva in cui si inseriscono i test riusciti e non del prodotto finale. Se un test non riesce e viene corretto l’errore, questo dovrà risultare nel documento finale come riuscito (la procedura della correzione apparirà nel diario), altrimenti dovrà essere descritto l’errore con eventuali ipotesi di correzione.</w:t>
+      </w:r>
+    </w:p>
+    <w:p>
+      <w:pPr>
+        <w:pStyle w:val="Titolo2"/>
+      </w:pPr>
+      <w:bookmarkStart w:id="47" w:name="_Toc461179226"/>
+      <w:bookmarkStart w:id="48" w:name="_Toc94790463"/>
+      <w:bookmarkStart w:id="49" w:name="_Toc189853871"/>
+      <w:r>
+        <w:t>Mancanze</w:t>
+      </w:r>
+      <w:r>
+        <w:t>/limitazioni conosciute</w:t>
+      </w:r>
       <w:bookmarkEnd w:id="47"/>
-    </w:p>
-    <w:p>
-      <w:pPr>
-        <w:rPr>
-          <w:lang w:val="it-IT"/>
-        </w:rPr>
-      </w:pPr>
-      <w:r>
-        <w:rPr>
-          <w:lang w:val="it-IT"/>
-        </w:rPr>
-        <w:t>Tabella riassuntiva in cui si inseriscono i test riusciti e non del prodotto finale. Se un test non riesce e viene corretto l’errore, questo dovrà risultare nel documento finale come riuscito (la procedura della correzione apparirà nel diario), altrimenti dovrà essere descritto l’errore con eventuali ipotesi di correzione.</w:t>
-      </w:r>
-    </w:p>
-    <w:p>
-      <w:pPr>
-        <w:pStyle w:val="Titolo2"/>
-      </w:pPr>
-      <w:bookmarkStart w:id="48" w:name="_Toc461179226"/>
-      <w:bookmarkStart w:id="49" w:name="_Toc94790463"/>
-      <w:bookmarkStart w:id="50" w:name="_Toc189853871"/>
-      <w:r>
-        <w:t>Mancanze</w:t>
-      </w:r>
-      <w:r>
-        <w:t>/limitazioni conosciute</w:t>
-      </w:r>
       <w:bookmarkEnd w:id="48"/>
       <w:bookmarkEnd w:id="49"/>
+    </w:p>
+    <w:p>
+      <w:pPr>
+        <w:rPr>
+          <w:lang w:val="it-IT"/>
+        </w:rPr>
+      </w:pPr>
+      <w:r>
+        <w:rPr>
+          <w:lang w:val="it-IT"/>
+        </w:rPr>
+        <w:t>Descrizione con motivazione di eventuali elementi mancanti o non completamente implementati, al di fuori dei test case. Non devono essere riportati gli errori e i problemi riscontrati e poi risolti durante il progetto.</w:t>
+      </w:r>
+    </w:p>
+    <w:p>
+      <w:pPr>
+        <w:pStyle w:val="Titolo1"/>
+        <w:rPr>
+          <w:lang w:val="it-IT"/>
+        </w:rPr>
+      </w:pPr>
+      <w:bookmarkStart w:id="50" w:name="_Toc461179227"/>
+      <w:bookmarkStart w:id="51" w:name="_Toc94790464"/>
+      <w:bookmarkStart w:id="52" w:name="_Toc189853872"/>
+      <w:r>
+        <w:rPr>
+          <w:lang w:val="it-IT"/>
+        </w:rPr>
+        <w:t>Consuntivo</w:t>
+      </w:r>
       <w:bookmarkEnd w:id="50"/>
-    </w:p>
-    <w:p>
-      <w:pPr>
-        <w:rPr>
-          <w:lang w:val="it-IT"/>
-        </w:rPr>
-      </w:pPr>
-      <w:r>
-        <w:rPr>
-          <w:lang w:val="it-IT"/>
-        </w:rPr>
-        <w:t>Descrizione con motivazione di eventuali elementi mancanti o non completamente implementati, al di fuori dei test case. Non devono essere riportati gli errori e i problemi riscontrati e poi risolti durante il progetto.</w:t>
-      </w:r>
-    </w:p>
-    <w:p>
-      <w:pPr>
-        <w:pStyle w:val="Titolo1"/>
-        <w:rPr>
-          <w:lang w:val="it-IT"/>
-        </w:rPr>
-      </w:pPr>
-      <w:bookmarkStart w:id="51" w:name="_Toc461179227"/>
-      <w:bookmarkStart w:id="52" w:name="_Toc94790464"/>
-      <w:bookmarkStart w:id="53" w:name="_Toc189853872"/>
-      <w:r>
-        <w:rPr>
-          <w:lang w:val="it-IT"/>
-        </w:rPr>
-        <w:t>Consuntivo</w:t>
-      </w:r>
       <w:bookmarkEnd w:id="51"/>
       <w:bookmarkEnd w:id="52"/>
+    </w:p>
+    <w:p>
+      <w:pPr>
+        <w:rPr>
+          <w:lang w:val="it-IT"/>
+        </w:rPr>
+      </w:pPr>
+      <w:r>
+        <w:rPr>
+          <w:lang w:val="it-IT"/>
+        </w:rPr>
+        <w:t>Consuntivo del tempo di lavoro effettivo e considerazioni riguardo le differenze rispetto alla pianificazione (cap</w:t>
+      </w:r>
+      <w:r>
+        <w:rPr>
+          <w:lang w:val="it-IT"/>
+        </w:rPr>
+        <w:t>.</w:t>
+      </w:r>
+      <w:r>
+        <w:rPr>
+          <w:lang w:val="it-IT"/>
+        </w:rPr>
+        <w:t xml:space="preserve"> 1.7) (ad esempio </w:t>
+      </w:r>
+      <w:proofErr w:type="spellStart"/>
+      <w:r>
+        <w:rPr>
+          <w:lang w:val="it-IT"/>
+        </w:rPr>
+        <w:t>Gan</w:t>
+      </w:r>
+      <w:r>
+        <w:rPr>
+          <w:lang w:val="it-IT"/>
+        </w:rPr>
+        <w:t>t</w:t>
+      </w:r>
+      <w:r>
+        <w:rPr>
+          <w:lang w:val="it-IT"/>
+        </w:rPr>
+        <w:t>t</w:t>
+      </w:r>
+      <w:proofErr w:type="spellEnd"/>
+      <w:r>
+        <w:rPr>
+          <w:lang w:val="it-IT"/>
+        </w:rPr>
+        <w:t xml:space="preserve"> consuntivo).</w:t>
+      </w:r>
+    </w:p>
+    <w:p>
+      <w:pPr>
+        <w:pStyle w:val="Titolo1"/>
+        <w:rPr>
+          <w:lang w:val="it-IT"/>
+        </w:rPr>
+      </w:pPr>
+      <w:bookmarkStart w:id="53" w:name="_Toc461179228"/>
+      <w:bookmarkStart w:id="54" w:name="_Toc94790465"/>
+      <w:bookmarkStart w:id="55" w:name="_Toc189853873"/>
+      <w:r>
+        <w:rPr>
+          <w:lang w:val="it-IT"/>
+        </w:rPr>
+        <w:t>Conclusioni</w:t>
+      </w:r>
       <w:bookmarkEnd w:id="53"/>
-    </w:p>
-    <w:p>
-      <w:pPr>
-        <w:rPr>
-          <w:lang w:val="it-IT"/>
-        </w:rPr>
-      </w:pPr>
-      <w:r>
-        <w:rPr>
-          <w:lang w:val="it-IT"/>
-        </w:rPr>
-        <w:t>Consuntivo del tempo di lavoro effettivo e considerazioni riguardo le differenze rispetto alla pianificazione (cap</w:t>
-      </w:r>
-      <w:r>
-        <w:rPr>
-          <w:lang w:val="it-IT"/>
-        </w:rPr>
-        <w:t>.</w:t>
-      </w:r>
-      <w:r>
-        <w:rPr>
-          <w:lang w:val="it-IT"/>
-        </w:rPr>
-        <w:t xml:space="preserve"> 1.7) (ad esempio </w:t>
-      </w:r>
-      <w:proofErr w:type="spellStart"/>
-      <w:r>
-        <w:rPr>
-          <w:lang w:val="it-IT"/>
-        </w:rPr>
-        <w:t>Gan</w:t>
-      </w:r>
-      <w:r>
-        <w:rPr>
-          <w:lang w:val="it-IT"/>
-        </w:rPr>
-        <w:t>t</w:t>
-      </w:r>
-      <w:r>
-        <w:rPr>
-          <w:lang w:val="it-IT"/>
-        </w:rPr>
-        <w:t>t</w:t>
-      </w:r>
-      <w:proofErr w:type="spellEnd"/>
-      <w:r>
-        <w:rPr>
-          <w:lang w:val="it-IT"/>
-        </w:rPr>
-        <w:t xml:space="preserve"> consuntivo).</w:t>
-      </w:r>
-    </w:p>
-    <w:p>
-      <w:pPr>
-        <w:pStyle w:val="Titolo1"/>
-        <w:rPr>
-          <w:lang w:val="it-IT"/>
-        </w:rPr>
-      </w:pPr>
-      <w:bookmarkStart w:id="54" w:name="_Toc461179228"/>
-      <w:bookmarkStart w:id="55" w:name="_Toc94790465"/>
-      <w:bookmarkStart w:id="56" w:name="_Toc189853873"/>
-      <w:r>
-        <w:rPr>
-          <w:lang w:val="it-IT"/>
-        </w:rPr>
-        <w:t>Conclusioni</w:t>
-      </w:r>
       <w:bookmarkEnd w:id="54"/>
       <w:bookmarkEnd w:id="55"/>
+    </w:p>
+    <w:p>
+      <w:pPr>
+        <w:rPr>
+          <w:lang w:val="it-IT"/>
+        </w:rPr>
+      </w:pPr>
+      <w:r>
+        <w:rPr>
+          <w:lang w:val="it-IT"/>
+        </w:rPr>
+        <w:t>Quali sono le implicazioni della mia soluzione? Che impatto avrà?</w:t>
+      </w:r>
+      <w:r>
+        <w:rPr>
+          <w:lang w:val="it-IT"/>
+        </w:rPr>
+        <w:t xml:space="preserve"> Cambierà il mondo? È un successo importante? È </w:t>
+      </w:r>
+      <w:r>
+        <w:rPr>
+          <w:lang w:val="it-IT"/>
+        </w:rPr>
+        <w:t>solo un</w:t>
+      </w:r>
+      <w:r>
+        <w:rPr>
+          <w:lang w:val="it-IT"/>
+        </w:rPr>
+        <w:t>’</w:t>
+      </w:r>
+      <w:r>
+        <w:rPr>
+          <w:lang w:val="it-IT"/>
+        </w:rPr>
+        <w:t>aggiunta</w:t>
+      </w:r>
+      <w:r>
+        <w:rPr>
+          <w:lang w:val="it-IT"/>
+        </w:rPr>
+        <w:t xml:space="preserve"> marginale o</w:t>
+      </w:r>
+      <w:r>
+        <w:rPr>
+          <w:lang w:val="it-IT"/>
+        </w:rPr>
+        <w:t xml:space="preserve"> è semplicemente servita per scoprire che questo percorso è</w:t>
+      </w:r>
+      <w:r>
+        <w:rPr>
+          <w:lang w:val="it-IT"/>
+        </w:rPr>
+        <w:t xml:space="preserve"> stato</w:t>
+      </w:r>
+      <w:r>
+        <w:rPr>
+          <w:lang w:val="it-IT"/>
+        </w:rPr>
+        <w:t xml:space="preserve"> una perdita di tempo? I ris</w:t>
+      </w:r>
+      <w:r>
+        <w:rPr>
+          <w:lang w:val="it-IT"/>
+        </w:rPr>
+        <w:t xml:space="preserve">ultati ottenuti sono generali, </w:t>
+      </w:r>
+      <w:r>
+        <w:rPr>
+          <w:lang w:val="it-IT"/>
+        </w:rPr>
+        <w:t>facilmente generalizzabili o sono specifici di un caso particolare?</w:t>
+      </w:r>
+      <w:r>
+        <w:rPr>
+          <w:lang w:val="it-IT"/>
+        </w:rPr>
+        <w:t xml:space="preserve"> ecc</w:t>
+      </w:r>
+      <w:r>
+        <w:rPr>
+          <w:lang w:val="it-IT"/>
+        </w:rPr>
+        <w:t>.</w:t>
+      </w:r>
+    </w:p>
+    <w:p>
+      <w:pPr>
+        <w:pStyle w:val="Titolo2"/>
+      </w:pPr>
+      <w:bookmarkStart w:id="56" w:name="_Toc461179229"/>
+      <w:bookmarkStart w:id="57" w:name="_Toc94790466"/>
+      <w:bookmarkStart w:id="58" w:name="_Toc189853874"/>
+      <w:r>
+        <w:t>Sviluppi futuri</w:t>
+      </w:r>
       <w:bookmarkEnd w:id="56"/>
-    </w:p>
-    <w:p>
-      <w:pPr>
-        <w:rPr>
-          <w:lang w:val="it-IT"/>
-        </w:rPr>
-      </w:pPr>
-      <w:r>
-        <w:rPr>
-          <w:lang w:val="it-IT"/>
-        </w:rPr>
-        <w:t>Quali sono le implicazioni della mia soluzione? Che impatto avrà?</w:t>
-      </w:r>
-      <w:r>
-        <w:rPr>
-          <w:lang w:val="it-IT"/>
-        </w:rPr>
-        <w:t xml:space="preserve"> Cambierà il mondo? È un successo importante? È </w:t>
-      </w:r>
-      <w:r>
-        <w:rPr>
-          <w:lang w:val="it-IT"/>
-        </w:rPr>
-        <w:t>solo un</w:t>
-      </w:r>
-      <w:r>
-        <w:rPr>
-          <w:lang w:val="it-IT"/>
-        </w:rPr>
-        <w:t>’</w:t>
-      </w:r>
-      <w:r>
-        <w:rPr>
-          <w:lang w:val="it-IT"/>
-        </w:rPr>
-        <w:t>aggiunta</w:t>
-      </w:r>
-      <w:r>
-        <w:rPr>
-          <w:lang w:val="it-IT"/>
-        </w:rPr>
-        <w:t xml:space="preserve"> marginale o</w:t>
-      </w:r>
-      <w:r>
-        <w:rPr>
-          <w:lang w:val="it-IT"/>
-        </w:rPr>
-        <w:t xml:space="preserve"> è semplicemente servita per scoprire che questo percorso è</w:t>
-      </w:r>
-      <w:r>
-        <w:rPr>
-          <w:lang w:val="it-IT"/>
-        </w:rPr>
-        <w:t xml:space="preserve"> stato</w:t>
-      </w:r>
-      <w:r>
-        <w:rPr>
-          <w:lang w:val="it-IT"/>
-        </w:rPr>
-        <w:t xml:space="preserve"> una perdita di tempo? I ris</w:t>
-      </w:r>
-      <w:r>
-        <w:rPr>
-          <w:lang w:val="it-IT"/>
-        </w:rPr>
-        <w:t xml:space="preserve">ultati ottenuti sono generali, </w:t>
-      </w:r>
-      <w:r>
-        <w:rPr>
-          <w:lang w:val="it-IT"/>
-        </w:rPr>
-        <w:t>facilmente generalizzabili o sono specifici di un caso particolare?</w:t>
-      </w:r>
-      <w:r>
-        <w:rPr>
-          <w:lang w:val="it-IT"/>
-        </w:rPr>
-        <w:t xml:space="preserve"> ecc</w:t>
-      </w:r>
-      <w:r>
-        <w:rPr>
-          <w:lang w:val="it-IT"/>
-        </w:rPr>
-        <w:t>.</w:t>
-      </w:r>
-    </w:p>
-    <w:p>
-      <w:pPr>
-        <w:pStyle w:val="Titolo2"/>
-      </w:pPr>
-      <w:bookmarkStart w:id="57" w:name="_Toc461179229"/>
-      <w:bookmarkStart w:id="58" w:name="_Toc94790466"/>
-      <w:bookmarkStart w:id="59" w:name="_Toc189853874"/>
-      <w:r>
-        <w:t>Sviluppi futuri</w:t>
-      </w:r>
       <w:bookmarkEnd w:id="57"/>
       <w:bookmarkEnd w:id="58"/>
+    </w:p>
+    <w:p>
+      <w:pPr>
+        <w:rPr>
+          <w:lang w:val="it-IT"/>
+        </w:rPr>
+      </w:pPr>
+      <w:r>
+        <w:rPr>
+          <w:lang w:val="it-IT"/>
+        </w:rPr>
+        <w:t>Migliorie o estensioni che possono essere sviluppate sul prodotto.</w:t>
+      </w:r>
+    </w:p>
+    <w:p>
+      <w:pPr>
+        <w:pStyle w:val="Titolo2"/>
+      </w:pPr>
+      <w:bookmarkStart w:id="59" w:name="_Toc461179230"/>
+      <w:bookmarkStart w:id="60" w:name="_Toc94790467"/>
+      <w:bookmarkStart w:id="61" w:name="_Toc189853875"/>
+      <w:r>
+        <w:t>Considerazioni personali</w:t>
+      </w:r>
       <w:bookmarkEnd w:id="59"/>
-    </w:p>
-    <w:p>
-      <w:pPr>
-        <w:rPr>
-          <w:lang w:val="it-IT"/>
-        </w:rPr>
-      </w:pPr>
-      <w:r>
-        <w:rPr>
-          <w:lang w:val="it-IT"/>
-        </w:rPr>
-        <w:t>Migliorie o estensioni che possono essere sviluppate sul prodotto.</w:t>
-      </w:r>
-    </w:p>
-    <w:p>
-      <w:pPr>
-        <w:pStyle w:val="Titolo2"/>
-      </w:pPr>
-      <w:bookmarkStart w:id="60" w:name="_Toc461179230"/>
-      <w:bookmarkStart w:id="61" w:name="_Toc94790467"/>
-      <w:bookmarkStart w:id="62" w:name="_Toc189853875"/>
-      <w:r>
-        <w:t>Considerazioni personali</w:t>
-      </w:r>
       <w:bookmarkEnd w:id="60"/>
       <w:bookmarkEnd w:id="61"/>
+    </w:p>
+    <w:p>
+      <w:pPr>
+        <w:rPr>
+          <w:lang w:val="it-IT"/>
+        </w:rPr>
+      </w:pPr>
+      <w:r>
+        <w:rPr>
+          <w:lang w:val="it-IT"/>
+        </w:rPr>
+        <w:t>Cosa ho imparato in questo progetto? ecc</w:t>
+      </w:r>
+      <w:r>
+        <w:rPr>
+          <w:lang w:val="it-IT"/>
+        </w:rPr>
+        <w:t>.</w:t>
+      </w:r>
+    </w:p>
+    <w:p>
+      <w:pPr>
+        <w:pStyle w:val="Titolo1"/>
+        <w:rPr>
+          <w:lang w:val="it-IT"/>
+        </w:rPr>
+      </w:pPr>
+      <w:bookmarkStart w:id="62" w:name="_Toc94790468"/>
+      <w:bookmarkStart w:id="63" w:name="_Toc189853876"/>
+      <w:bookmarkStart w:id="64" w:name="_Toc461179232"/>
+      <w:r>
+        <w:rPr>
+          <w:lang w:val="it-IT"/>
+        </w:rPr>
+        <w:t>Glossario</w:t>
+      </w:r>
       <w:bookmarkEnd w:id="62"/>
-    </w:p>
-    <w:p>
-      <w:pPr>
-        <w:rPr>
-          <w:lang w:val="it-IT"/>
-        </w:rPr>
-      </w:pPr>
-      <w:r>
-        <w:rPr>
-          <w:lang w:val="it-IT"/>
-        </w:rPr>
-        <w:t>Cosa ho imparato in questo progetto? ecc</w:t>
-      </w:r>
-      <w:r>
-        <w:rPr>
-          <w:lang w:val="it-IT"/>
-        </w:rPr>
-        <w:t>.</w:t>
-      </w:r>
-    </w:p>
-    <w:p>
-      <w:pPr>
-        <w:pStyle w:val="Titolo1"/>
-        <w:rPr>
-          <w:lang w:val="it-IT"/>
-        </w:rPr>
-      </w:pPr>
-      <w:bookmarkStart w:id="63" w:name="_Toc94790468"/>
-      <w:bookmarkStart w:id="64" w:name="_Toc189853876"/>
-      <w:bookmarkStart w:id="65" w:name="_Toc461179232"/>
-      <w:r>
-        <w:rPr>
-          <w:lang w:val="it-IT"/>
-        </w:rPr>
-        <w:t>Glossario</w:t>
-      </w:r>
       <w:bookmarkEnd w:id="63"/>
-      <w:bookmarkEnd w:id="64"/>
     </w:p>
     <w:p>
       <w:pPr>
@@ -21133,7 +21054,7 @@
           <w:lang w:val="it-IT"/>
         </w:rPr>
       </w:pPr>
-      <w:bookmarkStart w:id="66" w:name="_Toc94790469"/>
+      <w:bookmarkStart w:id="65" w:name="_Toc94790469"/>
       <w:r>
         <w:rPr>
           <w:lang w:val="it-IT"/>
@@ -21148,7 +21069,7 @@
           <w:lang w:val="it-IT"/>
         </w:rPr>
       </w:pPr>
-      <w:bookmarkStart w:id="67" w:name="_Toc189853877"/>
+      <w:bookmarkStart w:id="66" w:name="_Toc189853877"/>
       <w:r>
         <w:rPr>
           <w:lang w:val="it-IT"/>
@@ -21156,21 +21077,21 @@
         <w:lastRenderedPageBreak/>
         <w:t>Bibliografia</w:t>
       </w:r>
+      <w:bookmarkEnd w:id="65"/>
       <w:bookmarkEnd w:id="66"/>
+    </w:p>
+    <w:p>
+      <w:pPr>
+        <w:pStyle w:val="Titolo2"/>
+      </w:pPr>
+      <w:bookmarkStart w:id="67" w:name="_Toc94790470"/>
+      <w:bookmarkStart w:id="68" w:name="_Toc189853878"/>
+      <w:r>
+        <w:t>Bibliografia per articoli di riviste:</w:t>
+      </w:r>
+      <w:bookmarkEnd w:id="64"/>
       <w:bookmarkEnd w:id="67"/>
-    </w:p>
-    <w:p>
-      <w:pPr>
-        <w:pStyle w:val="Titolo2"/>
-      </w:pPr>
-      <w:bookmarkStart w:id="68" w:name="_Toc94790470"/>
-      <w:bookmarkStart w:id="69" w:name="_Toc189853878"/>
-      <w:r>
-        <w:t>Bibliografia per articoli di riviste:</w:t>
-      </w:r>
-      <w:bookmarkEnd w:id="65"/>
       <w:bookmarkEnd w:id="68"/>
-      <w:bookmarkEnd w:id="69"/>
     </w:p>
     <w:p>
       <w:pPr>
@@ -21279,15 +21200,15 @@
       <w:pPr>
         <w:pStyle w:val="Titolo2"/>
       </w:pPr>
-      <w:bookmarkStart w:id="70" w:name="_Toc461179233"/>
-      <w:bookmarkStart w:id="71" w:name="_Toc94790471"/>
-      <w:bookmarkStart w:id="72" w:name="_Toc189853879"/>
+      <w:bookmarkStart w:id="69" w:name="_Toc461179233"/>
+      <w:bookmarkStart w:id="70" w:name="_Toc94790471"/>
+      <w:bookmarkStart w:id="71" w:name="_Toc189853879"/>
       <w:r>
         <w:t>Bibliografia per libri</w:t>
       </w:r>
+      <w:bookmarkEnd w:id="69"/>
       <w:bookmarkEnd w:id="70"/>
       <w:bookmarkEnd w:id="71"/>
-      <w:bookmarkEnd w:id="72"/>
     </w:p>
     <w:p>
       <w:pPr>
@@ -21412,20 +21333,20 @@
           <w:lang w:val="it-IT"/>
         </w:rPr>
       </w:pPr>
-      <w:bookmarkStart w:id="73" w:name="_Toc461179234"/>
+      <w:bookmarkStart w:id="72" w:name="_Toc461179234"/>
     </w:p>
     <w:p>
       <w:pPr>
         <w:pStyle w:val="Titolo2"/>
       </w:pPr>
-      <w:bookmarkStart w:id="74" w:name="_Toc94790472"/>
-      <w:bookmarkStart w:id="75" w:name="_Toc189853880"/>
+      <w:bookmarkStart w:id="73" w:name="_Toc94790472"/>
+      <w:bookmarkStart w:id="74" w:name="_Toc189853880"/>
       <w:r>
         <w:t>Sitografia</w:t>
       </w:r>
+      <w:bookmarkEnd w:id="72"/>
       <w:bookmarkEnd w:id="73"/>
       <w:bookmarkEnd w:id="74"/>
-      <w:bookmarkEnd w:id="75"/>
     </w:p>
     <w:p>
       <w:pPr>
@@ -21583,18 +21504,18 @@
           <w:lang w:val="it-IT"/>
         </w:rPr>
       </w:pPr>
-      <w:bookmarkStart w:id="76" w:name="_Toc461179235"/>
-      <w:bookmarkStart w:id="77" w:name="_Toc94790473"/>
-      <w:bookmarkStart w:id="78" w:name="_Toc189853881"/>
+      <w:bookmarkStart w:id="75" w:name="_Toc461179235"/>
+      <w:bookmarkStart w:id="76" w:name="_Toc94790473"/>
+      <w:bookmarkStart w:id="77" w:name="_Toc189853881"/>
       <w:r>
         <w:rPr>
           <w:lang w:val="it-IT"/>
         </w:rPr>
         <w:t>Allegati</w:t>
       </w:r>
+      <w:bookmarkEnd w:id="75"/>
       <w:bookmarkEnd w:id="76"/>
       <w:bookmarkEnd w:id="77"/>
-      <w:bookmarkEnd w:id="78"/>
     </w:p>
     <w:p>
       <w:pPr>
@@ -21782,7 +21703,7 @@
 </file>
 
 <file path=word/endnotes.xml><?xml version="1.0" encoding="utf-8"?>
-<w:endnotes xmlns:wpc="http://schemas.microsoft.com/office/word/2010/wordprocessingCanvas" xmlns:cx="http://schemas.microsoft.com/office/drawing/2014/chartex" xmlns:cx1="http://schemas.microsoft.com/office/drawing/2015/9/8/chartex" xmlns:cx2="http://schemas.microsoft.com/office/drawing/2015/10/21/chartex" xmlns:cx3="http://schemas.microsoft.com/office/drawing/2016/5/9/chartex" xmlns:cx4="http://schemas.microsoft.com/office/drawing/2016/5/10/chartex" xmlns:cx5="http://schemas.microsoft.com/office/drawing/2016/5/11/chartex" xmlns:cx6="http://schemas.microsoft.com/office/drawing/2016/5/12/chartex" xmlns:cx7="http://schemas.microsoft.com/office/drawing/2016/5/13/chartex" xmlns:cx8="http://schemas.microsoft.com/office/drawing/2016/5/14/chartex" xmlns:mc="http://schemas.openxmlformats.org/markup-compatibility/2006" xmlns:aink="http://schemas.microsoft.com/office/drawing/2016/ink" xmlns:am3d="http://schemas.microsoft.com/office/drawing/2017/model3d" xmlns:o="urn:schemas-microsoft-com:office:office" xmlns:r="http://schemas.openxmlformats.org/officeDocument/2006/relationships" xmlns:m="http://schemas.openxmlformats.org/officeDocument/2006/math" xmlns:v="urn:schemas-microsoft-com:vml" xmlns:wp14="http://schemas.microsoft.com/office/word/2010/wordprocessingDrawing" xmlns:wp="http://schemas.openxmlformats.org/drawingml/2006/wordprocessingDrawing" xmlns:w10="urn:schemas-microsoft-com:office:word" xmlns:w="http://schemas.openxmlformats.org/wordprocessingml/2006/main" xmlns:w14="http://schemas.microsoft.com/office/word/2010/wordml" xmlns:w15="http://schemas.microsoft.com/office/word/2012/wordml" xmlns:w16cid="http://schemas.microsoft.com/office/word/2016/wordml/cid" xmlns:w16se="http://schemas.microsoft.com/office/word/2015/wordml/symex" xmlns:wpg="http://schemas.microsoft.com/office/word/2010/wordprocessingGroup" xmlns:wpi="http://schemas.microsoft.com/office/word/2010/wordprocessingInk" xmlns:wne="http://schemas.microsoft.com/office/word/2006/wordml" xmlns:wps="http://schemas.microsoft.com/office/word/2010/wordprocessingShape" mc:Ignorable="w14 w15 w16se w16cid wp14">
+<w:endnotes xmlns:wpc="http://schemas.microsoft.com/office/word/2010/wordprocessingCanvas" xmlns:cx="http://schemas.microsoft.com/office/drawing/2014/chartex" xmlns:cx1="http://schemas.microsoft.com/office/drawing/2015/9/8/chartex" xmlns:cx2="http://schemas.microsoft.com/office/drawing/2015/10/21/chartex" xmlns:cx3="http://schemas.microsoft.com/office/drawing/2016/5/9/chartex" xmlns:cx4="http://schemas.microsoft.com/office/drawing/2016/5/10/chartex" xmlns:cx5="http://schemas.microsoft.com/office/drawing/2016/5/11/chartex" xmlns:cx6="http://schemas.microsoft.com/office/drawing/2016/5/12/chartex" xmlns:cx7="http://schemas.microsoft.com/office/drawing/2016/5/13/chartex" xmlns:cx8="http://schemas.microsoft.com/office/drawing/2016/5/14/chartex" xmlns:mc="http://schemas.openxmlformats.org/markup-compatibility/2006" xmlns:aink="http://schemas.microsoft.com/office/drawing/2016/ink" xmlns:am3d="http://schemas.microsoft.com/office/drawing/2017/model3d" xmlns:o="urn:schemas-microsoft-com:office:office" xmlns:oel="http://schemas.microsoft.com/office/2019/extlst" xmlns:r="http://schemas.openxmlformats.org/officeDocument/2006/relationships" xmlns:m="http://schemas.openxmlformats.org/officeDocument/2006/math" xmlns:v="urn:schemas-microsoft-com:vml" xmlns:wp14="http://schemas.microsoft.com/office/word/2010/wordprocessingDrawing" xmlns:wp="http://schemas.openxmlformats.org/drawingml/2006/wordprocessingDrawing" xmlns:w10="urn:schemas-microsoft-com:office:word" xmlns:w="http://schemas.openxmlformats.org/wordprocessingml/2006/main" xmlns:w14="http://schemas.microsoft.com/office/word/2010/wordml" xmlns:w15="http://schemas.microsoft.com/office/word/2012/wordml" xmlns:w16cex="http://schemas.microsoft.com/office/word/2018/wordml/cex" xmlns:w16cid="http://schemas.microsoft.com/office/word/2016/wordml/cid" xmlns:w16="http://schemas.microsoft.com/office/word/2018/wordml" xmlns:w16du="http://schemas.microsoft.com/office/word/2023/wordml/word16du" xmlns:w16sdtdh="http://schemas.microsoft.com/office/word/2020/wordml/sdtdatahash" xmlns:w16sdtfl="http://schemas.microsoft.com/office/word/2024/wordml/sdtformatlock" xmlns:w16se="http://schemas.microsoft.com/office/word/2015/wordml/symex" xmlns:wpg="http://schemas.microsoft.com/office/word/2010/wordprocessingGroup" xmlns:wpi="http://schemas.microsoft.com/office/word/2010/wordprocessingInk" xmlns:wne="http://schemas.microsoft.com/office/word/2006/wordml" xmlns:wps="http://schemas.microsoft.com/office/word/2010/wordprocessingShape" mc:Ignorable="w14 w15 w16se w16cid w16 w16cex w16sdtdh w16sdtfl w16du wp14">
   <w:endnote w:type="separator" w:id="-1">
     <w:p>
       <w:r>
@@ -21801,7 +21722,7 @@
 </file>
 
 <file path=word/footer1.xml><?xml version="1.0" encoding="utf-8"?>
-<w:ftr xmlns:wpc="http://schemas.microsoft.com/office/word/2010/wordprocessingCanvas" xmlns:cx="http://schemas.microsoft.com/office/drawing/2014/chartex" xmlns:cx1="http://schemas.microsoft.com/office/drawing/2015/9/8/chartex" xmlns:cx2="http://schemas.microsoft.com/office/drawing/2015/10/21/chartex" xmlns:cx3="http://schemas.microsoft.com/office/drawing/2016/5/9/chartex" xmlns:cx4="http://schemas.microsoft.com/office/drawing/2016/5/10/chartex" xmlns:cx5="http://schemas.microsoft.com/office/drawing/2016/5/11/chartex" xmlns:cx6="http://schemas.microsoft.com/office/drawing/2016/5/12/chartex" xmlns:cx7="http://schemas.microsoft.com/office/drawing/2016/5/13/chartex" xmlns:cx8="http://schemas.microsoft.com/office/drawing/2016/5/14/chartex" xmlns:mc="http://schemas.openxmlformats.org/markup-compatibility/2006" xmlns:aink="http://schemas.microsoft.com/office/drawing/2016/ink" xmlns:am3d="http://schemas.microsoft.com/office/drawing/2017/model3d" xmlns:o="urn:schemas-microsoft-com:office:office" xmlns:r="http://schemas.openxmlformats.org/officeDocument/2006/relationships" xmlns:m="http://schemas.openxmlformats.org/officeDocument/2006/math" xmlns:v="urn:schemas-microsoft-com:vml" xmlns:wp14="http://schemas.microsoft.com/office/word/2010/wordprocessingDrawing" xmlns:wp="http://schemas.openxmlformats.org/drawingml/2006/wordprocessingDrawing" xmlns:w10="urn:schemas-microsoft-com:office:word" xmlns:w="http://schemas.openxmlformats.org/wordprocessingml/2006/main" xmlns:w14="http://schemas.microsoft.com/office/word/2010/wordml" xmlns:w15="http://schemas.microsoft.com/office/word/2012/wordml" xmlns:w16cid="http://schemas.microsoft.com/office/word/2016/wordml/cid" xmlns:w16se="http://schemas.microsoft.com/office/word/2015/wordml/symex" xmlns:wpg="http://schemas.microsoft.com/office/word/2010/wordprocessingGroup" xmlns:wpi="http://schemas.microsoft.com/office/word/2010/wordprocessingInk" xmlns:wne="http://schemas.microsoft.com/office/word/2006/wordml" xmlns:wps="http://schemas.microsoft.com/office/word/2010/wordprocessingShape" mc:Ignorable="w14 w15 w16se w16cid wp14">
+<w:ftr xmlns:wpc="http://schemas.microsoft.com/office/word/2010/wordprocessingCanvas" xmlns:cx="http://schemas.microsoft.com/office/drawing/2014/chartex" xmlns:cx1="http://schemas.microsoft.com/office/drawing/2015/9/8/chartex" xmlns:cx2="http://schemas.microsoft.com/office/drawing/2015/10/21/chartex" xmlns:cx3="http://schemas.microsoft.com/office/drawing/2016/5/9/chartex" xmlns:cx4="http://schemas.microsoft.com/office/drawing/2016/5/10/chartex" xmlns:cx5="http://schemas.microsoft.com/office/drawing/2016/5/11/chartex" xmlns:cx6="http://schemas.microsoft.com/office/drawing/2016/5/12/chartex" xmlns:cx7="http://schemas.microsoft.com/office/drawing/2016/5/13/chartex" xmlns:cx8="http://schemas.microsoft.com/office/drawing/2016/5/14/chartex" xmlns:mc="http://schemas.openxmlformats.org/markup-compatibility/2006" xmlns:aink="http://schemas.microsoft.com/office/drawing/2016/ink" xmlns:am3d="http://schemas.microsoft.com/office/drawing/2017/model3d" xmlns:o="urn:schemas-microsoft-com:office:office" xmlns:oel="http://schemas.microsoft.com/office/2019/extlst" xmlns:r="http://schemas.openxmlformats.org/officeDocument/2006/relationships" xmlns:m="http://schemas.openxmlformats.org/officeDocument/2006/math" xmlns:v="urn:schemas-microsoft-com:vml" xmlns:wp14="http://schemas.microsoft.com/office/word/2010/wordprocessingDrawing" xmlns:wp="http://schemas.openxmlformats.org/drawingml/2006/wordprocessingDrawing" xmlns:w10="urn:schemas-microsoft-com:office:word" xmlns:w="http://schemas.openxmlformats.org/wordprocessingml/2006/main" xmlns:w14="http://schemas.microsoft.com/office/word/2010/wordml" xmlns:w15="http://schemas.microsoft.com/office/word/2012/wordml" xmlns:w16cex="http://schemas.microsoft.com/office/word/2018/wordml/cex" xmlns:w16cid="http://schemas.microsoft.com/office/word/2016/wordml/cid" xmlns:w16="http://schemas.microsoft.com/office/word/2018/wordml" xmlns:w16du="http://schemas.microsoft.com/office/word/2023/wordml/word16du" xmlns:w16sdtdh="http://schemas.microsoft.com/office/word/2020/wordml/sdtdatahash" xmlns:w16sdtfl="http://schemas.microsoft.com/office/word/2024/wordml/sdtformatlock" xmlns:w16se="http://schemas.microsoft.com/office/word/2015/wordml/symex" xmlns:wpg="http://schemas.microsoft.com/office/word/2010/wordprocessingGroup" xmlns:wpi="http://schemas.microsoft.com/office/word/2010/wordprocessingInk" xmlns:wne="http://schemas.microsoft.com/office/word/2006/wordml" xmlns:wps="http://schemas.microsoft.com/office/word/2010/wordprocessingShape" mc:Ignorable="w14 w15 w16se w16cid w16 w16cex w16sdtdh w16sdtfl w16du wp14">
   <w:p>
     <w:pPr>
       <w:pStyle w:val="Pidipagina"/>
@@ -21855,7 +21776,6 @@
       <w:tab/>
     </w:r>
     <w:proofErr w:type="spellStart"/>
-    <w:proofErr w:type="gramStart"/>
     <w:r>
       <w:rPr>
         <w:lang w:val="fr-CH"/>
@@ -21867,14 +21787,7 @@
       <w:rPr>
         <w:lang w:val="fr-CH"/>
       </w:rPr>
-      <w:t>:</w:t>
-    </w:r>
-    <w:proofErr w:type="gramEnd"/>
-    <w:r>
-      <w:rPr>
-        <w:lang w:val="fr-CH"/>
-      </w:rPr>
-      <w:t xml:space="preserve"> </w:t>
+      <w:t xml:space="preserve">: </w:t>
     </w:r>
     <w:r>
       <w:rPr>
@@ -21905,7 +21818,7 @@
 </file>
 
 <file path=word/footer2.xml><?xml version="1.0" encoding="utf-8"?>
-<w:ftr xmlns:wpc="http://schemas.microsoft.com/office/word/2010/wordprocessingCanvas" xmlns:cx="http://schemas.microsoft.com/office/drawing/2014/chartex" xmlns:cx1="http://schemas.microsoft.com/office/drawing/2015/9/8/chartex" xmlns:cx2="http://schemas.microsoft.com/office/drawing/2015/10/21/chartex" xmlns:cx3="http://schemas.microsoft.com/office/drawing/2016/5/9/chartex" xmlns:cx4="http://schemas.microsoft.com/office/drawing/2016/5/10/chartex" xmlns:cx5="http://schemas.microsoft.com/office/drawing/2016/5/11/chartex" xmlns:cx6="http://schemas.microsoft.com/office/drawing/2016/5/12/chartex" xmlns:cx7="http://schemas.microsoft.com/office/drawing/2016/5/13/chartex" xmlns:cx8="http://schemas.microsoft.com/office/drawing/2016/5/14/chartex" xmlns:mc="http://schemas.openxmlformats.org/markup-compatibility/2006" xmlns:aink="http://schemas.microsoft.com/office/drawing/2016/ink" xmlns:am3d="http://schemas.microsoft.com/office/drawing/2017/model3d" xmlns:o="urn:schemas-microsoft-com:office:office" xmlns:r="http://schemas.openxmlformats.org/officeDocument/2006/relationships" xmlns:m="http://schemas.openxmlformats.org/officeDocument/2006/math" xmlns:v="urn:schemas-microsoft-com:vml" xmlns:wp14="http://schemas.microsoft.com/office/word/2010/wordprocessingDrawing" xmlns:wp="http://schemas.openxmlformats.org/drawingml/2006/wordprocessingDrawing" xmlns:w10="urn:schemas-microsoft-com:office:word" xmlns:w="http://schemas.openxmlformats.org/wordprocessingml/2006/main" xmlns:w14="http://schemas.microsoft.com/office/word/2010/wordml" xmlns:w15="http://schemas.microsoft.com/office/word/2012/wordml" xmlns:w16cid="http://schemas.microsoft.com/office/word/2016/wordml/cid" xmlns:w16se="http://schemas.microsoft.com/office/word/2015/wordml/symex" xmlns:wpg="http://schemas.microsoft.com/office/word/2010/wordprocessingGroup" xmlns:wpi="http://schemas.microsoft.com/office/word/2010/wordprocessingInk" xmlns:wne="http://schemas.microsoft.com/office/word/2006/wordml" xmlns:wps="http://schemas.microsoft.com/office/word/2010/wordprocessingShape" mc:Ignorable="w14 w15 w16se w16cid wp14">
+<w:ftr xmlns:wpc="http://schemas.microsoft.com/office/word/2010/wordprocessingCanvas" xmlns:cx="http://schemas.microsoft.com/office/drawing/2014/chartex" xmlns:cx1="http://schemas.microsoft.com/office/drawing/2015/9/8/chartex" xmlns:cx2="http://schemas.microsoft.com/office/drawing/2015/10/21/chartex" xmlns:cx3="http://schemas.microsoft.com/office/drawing/2016/5/9/chartex" xmlns:cx4="http://schemas.microsoft.com/office/drawing/2016/5/10/chartex" xmlns:cx5="http://schemas.microsoft.com/office/drawing/2016/5/11/chartex" xmlns:cx6="http://schemas.microsoft.com/office/drawing/2016/5/12/chartex" xmlns:cx7="http://schemas.microsoft.com/office/drawing/2016/5/13/chartex" xmlns:cx8="http://schemas.microsoft.com/office/drawing/2016/5/14/chartex" xmlns:mc="http://schemas.openxmlformats.org/markup-compatibility/2006" xmlns:aink="http://schemas.microsoft.com/office/drawing/2016/ink" xmlns:am3d="http://schemas.microsoft.com/office/drawing/2017/model3d" xmlns:o="urn:schemas-microsoft-com:office:office" xmlns:oel="http://schemas.microsoft.com/office/2019/extlst" xmlns:r="http://schemas.openxmlformats.org/officeDocument/2006/relationships" xmlns:m="http://schemas.openxmlformats.org/officeDocument/2006/math" xmlns:v="urn:schemas-microsoft-com:vml" xmlns:wp14="http://schemas.microsoft.com/office/word/2010/wordprocessingDrawing" xmlns:wp="http://schemas.openxmlformats.org/drawingml/2006/wordprocessingDrawing" xmlns:w10="urn:schemas-microsoft-com:office:word" xmlns:w="http://schemas.openxmlformats.org/wordprocessingml/2006/main" xmlns:w14="http://schemas.microsoft.com/office/word/2010/wordml" xmlns:w15="http://schemas.microsoft.com/office/word/2012/wordml" xmlns:w16cex="http://schemas.microsoft.com/office/word/2018/wordml/cex" xmlns:w16cid="http://schemas.microsoft.com/office/word/2016/wordml/cid" xmlns:w16="http://schemas.microsoft.com/office/word/2018/wordml" xmlns:w16du="http://schemas.microsoft.com/office/word/2023/wordml/word16du" xmlns:w16sdtdh="http://schemas.microsoft.com/office/word/2020/wordml/sdtdatahash" xmlns:w16sdtfl="http://schemas.microsoft.com/office/word/2024/wordml/sdtformatlock" xmlns:w16se="http://schemas.microsoft.com/office/word/2015/wordml/symex" xmlns:wpg="http://schemas.microsoft.com/office/word/2010/wordprocessingGroup" xmlns:wpi="http://schemas.microsoft.com/office/word/2010/wordprocessingInk" xmlns:wne="http://schemas.microsoft.com/office/word/2006/wordml" xmlns:wps="http://schemas.microsoft.com/office/word/2010/wordprocessingShape" mc:Ignorable="w14 w15 w16se w16cid w16 w16cex w16sdtdh w16sdtfl w16du wp14">
   <w:tbl>
     <w:tblPr>
       <w:tblW w:w="0" w:type="auto"/>
@@ -22140,7 +22053,7 @@
 </file>
 
 <file path=word/footnotes.xml><?xml version="1.0" encoding="utf-8"?>
-<w:footnotes xmlns:wpc="http://schemas.microsoft.com/office/word/2010/wordprocessingCanvas" xmlns:cx="http://schemas.microsoft.com/office/drawing/2014/chartex" xmlns:cx1="http://schemas.microsoft.com/office/drawing/2015/9/8/chartex" xmlns:cx2="http://schemas.microsoft.com/office/drawing/2015/10/21/chartex" xmlns:cx3="http://schemas.microsoft.com/office/drawing/2016/5/9/chartex" xmlns:cx4="http://schemas.microsoft.com/office/drawing/2016/5/10/chartex" xmlns:cx5="http://schemas.microsoft.com/office/drawing/2016/5/11/chartex" xmlns:cx6="http://schemas.microsoft.com/office/drawing/2016/5/12/chartex" xmlns:cx7="http://schemas.microsoft.com/office/drawing/2016/5/13/chartex" xmlns:cx8="http://schemas.microsoft.com/office/drawing/2016/5/14/chartex" xmlns:mc="http://schemas.openxmlformats.org/markup-compatibility/2006" xmlns:aink="http://schemas.microsoft.com/office/drawing/2016/ink" xmlns:am3d="http://schemas.microsoft.com/office/drawing/2017/model3d" xmlns:o="urn:schemas-microsoft-com:office:office" xmlns:r="http://schemas.openxmlformats.org/officeDocument/2006/relationships" xmlns:m="http://schemas.openxmlformats.org/officeDocument/2006/math" xmlns:v="urn:schemas-microsoft-com:vml" xmlns:wp14="http://schemas.microsoft.com/office/word/2010/wordprocessingDrawing" xmlns:wp="http://schemas.openxmlformats.org/drawingml/2006/wordprocessingDrawing" xmlns:w10="urn:schemas-microsoft-com:office:word" xmlns:w="http://schemas.openxmlformats.org/wordprocessingml/2006/main" xmlns:w14="http://schemas.microsoft.com/office/word/2010/wordml" xmlns:w15="http://schemas.microsoft.com/office/word/2012/wordml" xmlns:w16cid="http://schemas.microsoft.com/office/word/2016/wordml/cid" xmlns:w16se="http://schemas.microsoft.com/office/word/2015/wordml/symex" xmlns:wpg="http://schemas.microsoft.com/office/word/2010/wordprocessingGroup" xmlns:wpi="http://schemas.microsoft.com/office/word/2010/wordprocessingInk" xmlns:wne="http://schemas.microsoft.com/office/word/2006/wordml" xmlns:wps="http://schemas.microsoft.com/office/word/2010/wordprocessingShape" mc:Ignorable="w14 w15 w16se w16cid wp14">
+<w:footnotes xmlns:wpc="http://schemas.microsoft.com/office/word/2010/wordprocessingCanvas" xmlns:cx="http://schemas.microsoft.com/office/drawing/2014/chartex" xmlns:cx1="http://schemas.microsoft.com/office/drawing/2015/9/8/chartex" xmlns:cx2="http://schemas.microsoft.com/office/drawing/2015/10/21/chartex" xmlns:cx3="http://schemas.microsoft.com/office/drawing/2016/5/9/chartex" xmlns:cx4="http://schemas.microsoft.com/office/drawing/2016/5/10/chartex" xmlns:cx5="http://schemas.microsoft.com/office/drawing/2016/5/11/chartex" xmlns:cx6="http://schemas.microsoft.com/office/drawing/2016/5/12/chartex" xmlns:cx7="http://schemas.microsoft.com/office/drawing/2016/5/13/chartex" xmlns:cx8="http://schemas.microsoft.com/office/drawing/2016/5/14/chartex" xmlns:mc="http://schemas.openxmlformats.org/markup-compatibility/2006" xmlns:aink="http://schemas.microsoft.com/office/drawing/2016/ink" xmlns:am3d="http://schemas.microsoft.com/office/drawing/2017/model3d" xmlns:o="urn:schemas-microsoft-com:office:office" xmlns:oel="http://schemas.microsoft.com/office/2019/extlst" xmlns:r="http://schemas.openxmlformats.org/officeDocument/2006/relationships" xmlns:m="http://schemas.openxmlformats.org/officeDocument/2006/math" xmlns:v="urn:schemas-microsoft-com:vml" xmlns:wp14="http://schemas.microsoft.com/office/word/2010/wordprocessingDrawing" xmlns:wp="http://schemas.openxmlformats.org/drawingml/2006/wordprocessingDrawing" xmlns:w10="urn:schemas-microsoft-com:office:word" xmlns:w="http://schemas.openxmlformats.org/wordprocessingml/2006/main" xmlns:w14="http://schemas.microsoft.com/office/word/2010/wordml" xmlns:w15="http://schemas.microsoft.com/office/word/2012/wordml" xmlns:w16cex="http://schemas.microsoft.com/office/word/2018/wordml/cex" xmlns:w16cid="http://schemas.microsoft.com/office/word/2016/wordml/cid" xmlns:w16="http://schemas.microsoft.com/office/word/2018/wordml" xmlns:w16du="http://schemas.microsoft.com/office/word/2023/wordml/word16du" xmlns:w16sdtdh="http://schemas.microsoft.com/office/word/2020/wordml/sdtdatahash" xmlns:w16sdtfl="http://schemas.microsoft.com/office/word/2024/wordml/sdtformatlock" xmlns:w16se="http://schemas.microsoft.com/office/word/2015/wordml/symex" xmlns:wpg="http://schemas.microsoft.com/office/word/2010/wordprocessingGroup" xmlns:wpi="http://schemas.microsoft.com/office/word/2010/wordprocessingInk" xmlns:wne="http://schemas.microsoft.com/office/word/2006/wordml" xmlns:wps="http://schemas.microsoft.com/office/word/2010/wordprocessingShape" mc:Ignorable="w14 w15 w16se w16cid w16 w16cex w16sdtdh w16sdtfl w16du wp14">
   <w:footnote w:type="separator" w:id="-1">
     <w:p>
       <w:r>
@@ -22159,7 +22072,7 @@
 </file>
 
 <file path=word/header1.xml><?xml version="1.0" encoding="utf-8"?>
-<w:hdr xmlns:wpc="http://schemas.microsoft.com/office/word/2010/wordprocessingCanvas" xmlns:cx="http://schemas.microsoft.com/office/drawing/2014/chartex" xmlns:cx1="http://schemas.microsoft.com/office/drawing/2015/9/8/chartex" xmlns:cx2="http://schemas.microsoft.com/office/drawing/2015/10/21/chartex" xmlns:cx3="http://schemas.microsoft.com/office/drawing/2016/5/9/chartex" xmlns:cx4="http://schemas.microsoft.com/office/drawing/2016/5/10/chartex" xmlns:cx5="http://schemas.microsoft.com/office/drawing/2016/5/11/chartex" xmlns:cx6="http://schemas.microsoft.com/office/drawing/2016/5/12/chartex" xmlns:cx7="http://schemas.microsoft.com/office/drawing/2016/5/13/chartex" xmlns:cx8="http://schemas.microsoft.com/office/drawing/2016/5/14/chartex" xmlns:mc="http://schemas.openxmlformats.org/markup-compatibility/2006" xmlns:aink="http://schemas.microsoft.com/office/drawing/2016/ink" xmlns:am3d="http://schemas.microsoft.com/office/drawing/2017/model3d" xmlns:o="urn:schemas-microsoft-com:office:office" xmlns:r="http://schemas.openxmlformats.org/officeDocument/2006/relationships" xmlns:m="http://schemas.openxmlformats.org/officeDocument/2006/math" xmlns:v="urn:schemas-microsoft-com:vml" xmlns:wp14="http://schemas.microsoft.com/office/word/2010/wordprocessingDrawing" xmlns:wp="http://schemas.openxmlformats.org/drawingml/2006/wordprocessingDrawing" xmlns:w10="urn:schemas-microsoft-com:office:word" xmlns:w="http://schemas.openxmlformats.org/wordprocessingml/2006/main" xmlns:w14="http://schemas.microsoft.com/office/word/2010/wordml" xmlns:w15="http://schemas.microsoft.com/office/word/2012/wordml" xmlns:w16cid="http://schemas.microsoft.com/office/word/2016/wordml/cid" xmlns:w16se="http://schemas.microsoft.com/office/word/2015/wordml/symex" xmlns:wpg="http://schemas.microsoft.com/office/word/2010/wordprocessingGroup" xmlns:wpi="http://schemas.microsoft.com/office/word/2010/wordprocessingInk" xmlns:wne="http://schemas.microsoft.com/office/word/2006/wordml" xmlns:wps="http://schemas.microsoft.com/office/word/2010/wordprocessingShape" mc:Ignorable="w14 w15 w16se w16cid wp14">
+<w:hdr xmlns:wpc="http://schemas.microsoft.com/office/word/2010/wordprocessingCanvas" xmlns:cx="http://schemas.microsoft.com/office/drawing/2014/chartex" xmlns:cx1="http://schemas.microsoft.com/office/drawing/2015/9/8/chartex" xmlns:cx2="http://schemas.microsoft.com/office/drawing/2015/10/21/chartex" xmlns:cx3="http://schemas.microsoft.com/office/drawing/2016/5/9/chartex" xmlns:cx4="http://schemas.microsoft.com/office/drawing/2016/5/10/chartex" xmlns:cx5="http://schemas.microsoft.com/office/drawing/2016/5/11/chartex" xmlns:cx6="http://schemas.microsoft.com/office/drawing/2016/5/12/chartex" xmlns:cx7="http://schemas.microsoft.com/office/drawing/2016/5/13/chartex" xmlns:cx8="http://schemas.microsoft.com/office/drawing/2016/5/14/chartex" xmlns:mc="http://schemas.openxmlformats.org/markup-compatibility/2006" xmlns:aink="http://schemas.microsoft.com/office/drawing/2016/ink" xmlns:am3d="http://schemas.microsoft.com/office/drawing/2017/model3d" xmlns:o="urn:schemas-microsoft-com:office:office" xmlns:oel="http://schemas.microsoft.com/office/2019/extlst" xmlns:r="http://schemas.openxmlformats.org/officeDocument/2006/relationships" xmlns:m="http://schemas.openxmlformats.org/officeDocument/2006/math" xmlns:v="urn:schemas-microsoft-com:vml" xmlns:wp14="http://schemas.microsoft.com/office/word/2010/wordprocessingDrawing" xmlns:wp="http://schemas.openxmlformats.org/drawingml/2006/wordprocessingDrawing" xmlns:w10="urn:schemas-microsoft-com:office:word" xmlns:w="http://schemas.openxmlformats.org/wordprocessingml/2006/main" xmlns:w14="http://schemas.microsoft.com/office/word/2010/wordml" xmlns:w15="http://schemas.microsoft.com/office/word/2012/wordml" xmlns:w16cex="http://schemas.microsoft.com/office/word/2018/wordml/cex" xmlns:w16cid="http://schemas.microsoft.com/office/word/2016/wordml/cid" xmlns:w16="http://schemas.microsoft.com/office/word/2018/wordml" xmlns:w16du="http://schemas.microsoft.com/office/word/2023/wordml/word16du" xmlns:w16sdtdh="http://schemas.microsoft.com/office/word/2020/wordml/sdtdatahash" xmlns:w16sdtfl="http://schemas.microsoft.com/office/word/2024/wordml/sdtformatlock" xmlns:w16se="http://schemas.microsoft.com/office/word/2015/wordml/symex" xmlns:wpg="http://schemas.microsoft.com/office/word/2010/wordprocessingGroup" xmlns:wpi="http://schemas.microsoft.com/office/word/2010/wordprocessingInk" xmlns:wne="http://schemas.microsoft.com/office/word/2006/wordml" xmlns:wps="http://schemas.microsoft.com/office/word/2010/wordprocessingShape" mc:Ignorable="w14 w15 w16se w16cid w16 w16cex w16sdtdh w16sdtfl w16du wp14">
   <w:tbl>
     <w:tblPr>
       <w:tblW w:w="9639" w:type="dxa"/>
@@ -22530,7 +22443,7 @@
 </file>
 
 <file path=word/header2.xml><?xml version="1.0" encoding="utf-8"?>
-<w:hdr xmlns:wpc="http://schemas.microsoft.com/office/word/2010/wordprocessingCanvas" xmlns:cx="http://schemas.microsoft.com/office/drawing/2014/chartex" xmlns:cx1="http://schemas.microsoft.com/office/drawing/2015/9/8/chartex" xmlns:cx2="http://schemas.microsoft.com/office/drawing/2015/10/21/chartex" xmlns:cx3="http://schemas.microsoft.com/office/drawing/2016/5/9/chartex" xmlns:cx4="http://schemas.microsoft.com/office/drawing/2016/5/10/chartex" xmlns:cx5="http://schemas.microsoft.com/office/drawing/2016/5/11/chartex" xmlns:cx6="http://schemas.microsoft.com/office/drawing/2016/5/12/chartex" xmlns:cx7="http://schemas.microsoft.com/office/drawing/2016/5/13/chartex" xmlns:cx8="http://schemas.microsoft.com/office/drawing/2016/5/14/chartex" xmlns:mc="http://schemas.openxmlformats.org/markup-compatibility/2006" xmlns:aink="http://schemas.microsoft.com/office/drawing/2016/ink" xmlns:am3d="http://schemas.microsoft.com/office/drawing/2017/model3d" xmlns:o="urn:schemas-microsoft-com:office:office" xmlns:r="http://schemas.openxmlformats.org/officeDocument/2006/relationships" xmlns:m="http://schemas.openxmlformats.org/officeDocument/2006/math" xmlns:v="urn:schemas-microsoft-com:vml" xmlns:wp14="http://schemas.microsoft.com/office/word/2010/wordprocessingDrawing" xmlns:wp="http://schemas.openxmlformats.org/drawingml/2006/wordprocessingDrawing" xmlns:w10="urn:schemas-microsoft-com:office:word" xmlns:w="http://schemas.openxmlformats.org/wordprocessingml/2006/main" xmlns:w14="http://schemas.microsoft.com/office/word/2010/wordml" xmlns:w15="http://schemas.microsoft.com/office/word/2012/wordml" xmlns:w16cid="http://schemas.microsoft.com/office/word/2016/wordml/cid" xmlns:w16se="http://schemas.microsoft.com/office/word/2015/wordml/symex" xmlns:wpg="http://schemas.microsoft.com/office/word/2010/wordprocessingGroup" xmlns:wpi="http://schemas.microsoft.com/office/word/2010/wordprocessingInk" xmlns:wne="http://schemas.microsoft.com/office/word/2006/wordml" xmlns:wps="http://schemas.microsoft.com/office/word/2010/wordprocessingShape" mc:Ignorable="w14 w15 w16se w16cid wp14">
+<w:hdr xmlns:wpc="http://schemas.microsoft.com/office/word/2010/wordprocessingCanvas" xmlns:cx="http://schemas.microsoft.com/office/drawing/2014/chartex" xmlns:cx1="http://schemas.microsoft.com/office/drawing/2015/9/8/chartex" xmlns:cx2="http://schemas.microsoft.com/office/drawing/2015/10/21/chartex" xmlns:cx3="http://schemas.microsoft.com/office/drawing/2016/5/9/chartex" xmlns:cx4="http://schemas.microsoft.com/office/drawing/2016/5/10/chartex" xmlns:cx5="http://schemas.microsoft.com/office/drawing/2016/5/11/chartex" xmlns:cx6="http://schemas.microsoft.com/office/drawing/2016/5/12/chartex" xmlns:cx7="http://schemas.microsoft.com/office/drawing/2016/5/13/chartex" xmlns:cx8="http://schemas.microsoft.com/office/drawing/2016/5/14/chartex" xmlns:mc="http://schemas.openxmlformats.org/markup-compatibility/2006" xmlns:aink="http://schemas.microsoft.com/office/drawing/2016/ink" xmlns:am3d="http://schemas.microsoft.com/office/drawing/2017/model3d" xmlns:o="urn:schemas-microsoft-com:office:office" xmlns:oel="http://schemas.microsoft.com/office/2019/extlst" xmlns:r="http://schemas.openxmlformats.org/officeDocument/2006/relationships" xmlns:m="http://schemas.openxmlformats.org/officeDocument/2006/math" xmlns:v="urn:schemas-microsoft-com:vml" xmlns:wp14="http://schemas.microsoft.com/office/word/2010/wordprocessingDrawing" xmlns:wp="http://schemas.openxmlformats.org/drawingml/2006/wordprocessingDrawing" xmlns:w10="urn:schemas-microsoft-com:office:word" xmlns:w="http://schemas.openxmlformats.org/wordprocessingml/2006/main" xmlns:w14="http://schemas.microsoft.com/office/word/2010/wordml" xmlns:w15="http://schemas.microsoft.com/office/word/2012/wordml" xmlns:w16cex="http://schemas.microsoft.com/office/word/2018/wordml/cex" xmlns:w16cid="http://schemas.microsoft.com/office/word/2016/wordml/cid" xmlns:w16="http://schemas.microsoft.com/office/word/2018/wordml" xmlns:w16du="http://schemas.microsoft.com/office/word/2023/wordml/word16du" xmlns:w16sdtdh="http://schemas.microsoft.com/office/word/2020/wordml/sdtdatahash" xmlns:w16sdtfl="http://schemas.microsoft.com/office/word/2024/wordml/sdtformatlock" xmlns:w16se="http://schemas.microsoft.com/office/word/2015/wordml/symex" xmlns:wpg="http://schemas.microsoft.com/office/word/2010/wordprocessingGroup" xmlns:wpi="http://schemas.microsoft.com/office/word/2010/wordprocessingInk" xmlns:wne="http://schemas.microsoft.com/office/word/2006/wordml" xmlns:wps="http://schemas.microsoft.com/office/word/2010/wordprocessingShape" mc:Ignorable="w14 w15 w16se w16cid w16 w16cex w16sdtdh w16sdtfl w16du wp14">
   <w:tbl>
     <w:tblPr>
       <w:tblW w:w="9644" w:type="dxa"/>
@@ -22753,7 +22666,7 @@
 </file>
 
 <file path=word/numbering.xml><?xml version="1.0" encoding="utf-8"?>
-<w:numbering xmlns:wpc="http://schemas.microsoft.com/office/word/2010/wordprocessingCanvas" xmlns:cx="http://schemas.microsoft.com/office/drawing/2014/chartex" xmlns:cx1="http://schemas.microsoft.com/office/drawing/2015/9/8/chartex" xmlns:cx2="http://schemas.microsoft.com/office/drawing/2015/10/21/chartex" xmlns:cx3="http://schemas.microsoft.com/office/drawing/2016/5/9/chartex" xmlns:cx4="http://schemas.microsoft.com/office/drawing/2016/5/10/chartex" xmlns:cx5="http://schemas.microsoft.com/office/drawing/2016/5/11/chartex" xmlns:cx6="http://schemas.microsoft.com/office/drawing/2016/5/12/chartex" xmlns:cx7="http://schemas.microsoft.com/office/drawing/2016/5/13/chartex" xmlns:cx8="http://schemas.microsoft.com/office/drawing/2016/5/14/chartex" xmlns:mc="http://schemas.openxmlformats.org/markup-compatibility/2006" xmlns:aink="http://schemas.microsoft.com/office/drawing/2016/ink" xmlns:am3d="http://schemas.microsoft.com/office/drawing/2017/model3d" xmlns:o="urn:schemas-microsoft-com:office:office" xmlns:r="http://schemas.openxmlformats.org/officeDocument/2006/relationships" xmlns:m="http://schemas.openxmlformats.org/officeDocument/2006/math" xmlns:v="urn:schemas-microsoft-com:vml" xmlns:wp14="http://schemas.microsoft.com/office/word/2010/wordprocessingDrawing" xmlns:wp="http://schemas.openxmlformats.org/drawingml/2006/wordprocessingDrawing" xmlns:w10="urn:schemas-microsoft-com:office:word" xmlns:w="http://schemas.openxmlformats.org/wordprocessingml/2006/main" xmlns:w14="http://schemas.microsoft.com/office/word/2010/wordml" xmlns:w15="http://schemas.microsoft.com/office/word/2012/wordml" xmlns:w16cid="http://schemas.microsoft.com/office/word/2016/wordml/cid" xmlns:w16se="http://schemas.microsoft.com/office/word/2015/wordml/symex" xmlns:wpg="http://schemas.microsoft.com/office/word/2010/wordprocessingGroup" xmlns:wpi="http://schemas.microsoft.com/office/word/2010/wordprocessingInk" xmlns:wne="http://schemas.microsoft.com/office/word/2006/wordml" xmlns:wps="http://schemas.microsoft.com/office/word/2010/wordprocessingShape" mc:Ignorable="w14 w15 w16se w16cid wp14">
+<w:numbering xmlns:wpc="http://schemas.microsoft.com/office/word/2010/wordprocessingCanvas" xmlns:cx="http://schemas.microsoft.com/office/drawing/2014/chartex" xmlns:cx1="http://schemas.microsoft.com/office/drawing/2015/9/8/chartex" xmlns:cx2="http://schemas.microsoft.com/office/drawing/2015/10/21/chartex" xmlns:cx3="http://schemas.microsoft.com/office/drawing/2016/5/9/chartex" xmlns:cx4="http://schemas.microsoft.com/office/drawing/2016/5/10/chartex" xmlns:cx5="http://schemas.microsoft.com/office/drawing/2016/5/11/chartex" xmlns:cx6="http://schemas.microsoft.com/office/drawing/2016/5/12/chartex" xmlns:cx7="http://schemas.microsoft.com/office/drawing/2016/5/13/chartex" xmlns:cx8="http://schemas.microsoft.com/office/drawing/2016/5/14/chartex" xmlns:mc="http://schemas.openxmlformats.org/markup-compatibility/2006" xmlns:aink="http://schemas.microsoft.com/office/drawing/2016/ink" xmlns:am3d="http://schemas.microsoft.com/office/drawing/2017/model3d" xmlns:o="urn:schemas-microsoft-com:office:office" xmlns:oel="http://schemas.microsoft.com/office/2019/extlst" xmlns:r="http://schemas.openxmlformats.org/officeDocument/2006/relationships" xmlns:m="http://schemas.openxmlformats.org/officeDocument/2006/math" xmlns:v="urn:schemas-microsoft-com:vml" xmlns:wp14="http://schemas.microsoft.com/office/word/2010/wordprocessingDrawing" xmlns:wp="http://schemas.openxmlformats.org/drawingml/2006/wordprocessingDrawing" xmlns:w10="urn:schemas-microsoft-com:office:word" xmlns:w="http://schemas.openxmlformats.org/wordprocessingml/2006/main" xmlns:w14="http://schemas.microsoft.com/office/word/2010/wordml" xmlns:w15="http://schemas.microsoft.com/office/word/2012/wordml" xmlns:w16cex="http://schemas.microsoft.com/office/word/2018/wordml/cex" xmlns:w16cid="http://schemas.microsoft.com/office/word/2016/wordml/cid" xmlns:w16="http://schemas.microsoft.com/office/word/2018/wordml" xmlns:w16du="http://schemas.microsoft.com/office/word/2023/wordml/word16du" xmlns:w16sdtdh="http://schemas.microsoft.com/office/word/2020/wordml/sdtdatahash" xmlns:w16sdtfl="http://schemas.microsoft.com/office/word/2024/wordml/sdtformatlock" xmlns:w16se="http://schemas.microsoft.com/office/word/2015/wordml/symex" xmlns:wpg="http://schemas.microsoft.com/office/word/2010/wordprocessingGroup" xmlns:wpi="http://schemas.microsoft.com/office/word/2010/wordprocessingInk" xmlns:wne="http://schemas.microsoft.com/office/word/2006/wordml" xmlns:wps="http://schemas.microsoft.com/office/word/2010/wordprocessingShape" mc:Ignorable="w14 w15 w16se w16cid w16 w16cex w16sdtdh w16sdtfl w16du wp14">
   <w:abstractNum w:abstractNumId="0" w15:restartNumberingAfterBreak="0">
     <w:nsid w:val="0801489A"/>
     <w:multiLevelType w:val="hybridMultilevel"/>
@@ -26297,82 +26210,82 @@
       </w:rPr>
     </w:lvl>
   </w:abstractNum>
-  <w:num w:numId="1">
+  <w:num w:numId="1" w16cid:durableId="741563866">
     <w:abstractNumId w:val="14"/>
   </w:num>
-  <w:num w:numId="2">
+  <w:num w:numId="2" w16cid:durableId="1085347065">
     <w:abstractNumId w:val="3"/>
   </w:num>
-  <w:num w:numId="3">
+  <w:num w:numId="3" w16cid:durableId="1442646058">
     <w:abstractNumId w:val="7"/>
   </w:num>
-  <w:num w:numId="4">
+  <w:num w:numId="4" w16cid:durableId="837236820">
     <w:abstractNumId w:val="1"/>
   </w:num>
-  <w:num w:numId="5">
+  <w:num w:numId="5" w16cid:durableId="1834254077">
     <w:abstractNumId w:val="4"/>
   </w:num>
-  <w:num w:numId="6">
+  <w:num w:numId="6" w16cid:durableId="1995911668">
     <w:abstractNumId w:val="17"/>
   </w:num>
-  <w:num w:numId="7">
+  <w:num w:numId="7" w16cid:durableId="616837475">
     <w:abstractNumId w:val="8"/>
   </w:num>
-  <w:num w:numId="8">
+  <w:num w:numId="8" w16cid:durableId="304698427">
     <w:abstractNumId w:val="18"/>
   </w:num>
-  <w:num w:numId="9">
+  <w:num w:numId="9" w16cid:durableId="1707674954">
     <w:abstractNumId w:val="0"/>
   </w:num>
-  <w:num w:numId="10">
+  <w:num w:numId="10" w16cid:durableId="1995178989">
     <w:abstractNumId w:val="22"/>
   </w:num>
-  <w:num w:numId="11">
+  <w:num w:numId="11" w16cid:durableId="1145927113">
     <w:abstractNumId w:val="26"/>
   </w:num>
-  <w:num w:numId="12">
+  <w:num w:numId="12" w16cid:durableId="92752750">
     <w:abstractNumId w:val="5"/>
   </w:num>
-  <w:num w:numId="13">
+  <w:num w:numId="13" w16cid:durableId="1110901304">
     <w:abstractNumId w:val="2"/>
   </w:num>
-  <w:num w:numId="14">
+  <w:num w:numId="14" w16cid:durableId="1877893020">
     <w:abstractNumId w:val="27"/>
   </w:num>
-  <w:num w:numId="15">
+  <w:num w:numId="15" w16cid:durableId="1437366414">
     <w:abstractNumId w:val="6"/>
   </w:num>
-  <w:num w:numId="16">
+  <w:num w:numId="16" w16cid:durableId="1806585553">
     <w:abstractNumId w:val="14"/>
   </w:num>
-  <w:num w:numId="17">
+  <w:num w:numId="17" w16cid:durableId="2084373464">
     <w:abstractNumId w:val="20"/>
   </w:num>
-  <w:num w:numId="18">
+  <w:num w:numId="18" w16cid:durableId="1772973508">
     <w:abstractNumId w:val="14"/>
   </w:num>
-  <w:num w:numId="19">
+  <w:num w:numId="19" w16cid:durableId="1091463072">
     <w:abstractNumId w:val="14"/>
   </w:num>
-  <w:num w:numId="20">
+  <w:num w:numId="20" w16cid:durableId="625814123">
     <w:abstractNumId w:val="14"/>
   </w:num>
-  <w:num w:numId="21">
+  <w:num w:numId="21" w16cid:durableId="145779919">
     <w:abstractNumId w:val="14"/>
   </w:num>
-  <w:num w:numId="22">
+  <w:num w:numId="22" w16cid:durableId="833187225">
     <w:abstractNumId w:val="14"/>
   </w:num>
-  <w:num w:numId="23">
+  <w:num w:numId="23" w16cid:durableId="2067683231">
     <w:abstractNumId w:val="16"/>
   </w:num>
-  <w:num w:numId="24">
+  <w:num w:numId="24" w16cid:durableId="1749231478">
     <w:abstractNumId w:val="14"/>
   </w:num>
-  <w:num w:numId="25">
+  <w:num w:numId="25" w16cid:durableId="970288093">
     <w:abstractNumId w:val="14"/>
   </w:num>
-  <w:num w:numId="26">
+  <w:num w:numId="26" w16cid:durableId="1824659287">
     <w:abstractNumId w:val="14"/>
     <w:lvlOverride w:ilvl="0">
       <w:startOverride w:val="2"/>
@@ -26381,40 +26294,40 @@
       <w:startOverride w:val="3"/>
     </w:lvlOverride>
   </w:num>
-  <w:num w:numId="27">
+  <w:num w:numId="27" w16cid:durableId="994185022">
     <w:abstractNumId w:val="24"/>
   </w:num>
-  <w:num w:numId="28">
+  <w:num w:numId="28" w16cid:durableId="1091318549">
     <w:abstractNumId w:val="10"/>
   </w:num>
-  <w:num w:numId="29">
+  <w:num w:numId="29" w16cid:durableId="1848864455">
     <w:abstractNumId w:val="12"/>
   </w:num>
-  <w:num w:numId="30">
+  <w:num w:numId="30" w16cid:durableId="532419569">
     <w:abstractNumId w:val="9"/>
   </w:num>
-  <w:num w:numId="31">
+  <w:num w:numId="31" w16cid:durableId="748428170">
     <w:abstractNumId w:val="25"/>
   </w:num>
-  <w:num w:numId="32">
+  <w:num w:numId="32" w16cid:durableId="1200628805">
     <w:abstractNumId w:val="28"/>
   </w:num>
-  <w:num w:numId="33">
+  <w:num w:numId="33" w16cid:durableId="847523253">
     <w:abstractNumId w:val="19"/>
   </w:num>
-  <w:num w:numId="34">
+  <w:num w:numId="34" w16cid:durableId="538010434">
     <w:abstractNumId w:val="13"/>
   </w:num>
-  <w:num w:numId="35">
+  <w:num w:numId="35" w16cid:durableId="2016835497">
     <w:abstractNumId w:val="23"/>
   </w:num>
-  <w:num w:numId="36">
+  <w:num w:numId="36" w16cid:durableId="952908841">
     <w:abstractNumId w:val="21"/>
   </w:num>
-  <w:num w:numId="37">
+  <w:num w:numId="37" w16cid:durableId="1794713787">
     <w:abstractNumId w:val="15"/>
   </w:num>
-  <w:num w:numId="38">
+  <w:num w:numId="38" w16cid:durableId="114449448">
     <w:abstractNumId w:val="11"/>
   </w:num>
   <w:numIdMacAtCleanup w:val="14"/>
@@ -26422,7 +26335,7 @@
 </file>
 
 <file path=word/styles.xml><?xml version="1.0" encoding="utf-8"?>
-<w:styles xmlns:mc="http://schemas.openxmlformats.org/markup-compatibility/2006" xmlns:r="http://schemas.openxmlformats.org/officeDocument/2006/relationships" xmlns:w="http://schemas.openxmlformats.org/wordprocessingml/2006/main" xmlns:w14="http://schemas.microsoft.com/office/word/2010/wordml" xmlns:w15="http://schemas.microsoft.com/office/word/2012/wordml" xmlns:w16cid="http://schemas.microsoft.com/office/word/2016/wordml/cid" xmlns:w16se="http://schemas.microsoft.com/office/word/2015/wordml/symex" mc:Ignorable="w14 w15 w16se w16cid">
+<w:styles xmlns:mc="http://schemas.openxmlformats.org/markup-compatibility/2006" xmlns:r="http://schemas.openxmlformats.org/officeDocument/2006/relationships" xmlns:w="http://schemas.openxmlformats.org/wordprocessingml/2006/main" xmlns:w14="http://schemas.microsoft.com/office/word/2010/wordml" xmlns:w15="http://schemas.microsoft.com/office/word/2012/wordml" xmlns:w16cex="http://schemas.microsoft.com/office/word/2018/wordml/cex" xmlns:w16cid="http://schemas.microsoft.com/office/word/2016/wordml/cid" xmlns:w16="http://schemas.microsoft.com/office/word/2018/wordml" xmlns:w16du="http://schemas.microsoft.com/office/word/2023/wordml/word16du" xmlns:w16sdtdh="http://schemas.microsoft.com/office/word/2020/wordml/sdtdatahash" xmlns:w16sdtfl="http://schemas.microsoft.com/office/word/2024/wordml/sdtformatlock" xmlns:w16se="http://schemas.microsoft.com/office/word/2015/wordml/symex" mc:Ignorable="w14 w15 w16se w16cid w16 w16cex w16sdtdh w16sdtfl w16du">
   <w:docDefaults>
     <w:rPrDefault>
       <w:rPr>
@@ -26432,7 +26345,7 @@
     </w:rPrDefault>
     <w:pPrDefault/>
   </w:docDefaults>
-  <w:latentStyles w:defLockedState="0" w:defUIPriority="99" w:defSemiHidden="0" w:defUnhideWhenUsed="0" w:defQFormat="0" w:count="375">
+  <w:latentStyles w:defLockedState="0" w:defUIPriority="99" w:defSemiHidden="0" w:defUnhideWhenUsed="0" w:defQFormat="0" w:count="376">
     <w:lsdException w:name="Normal" w:uiPriority="0" w:qFormat="1"/>
     <w:lsdException w:name="heading 1" w:uiPriority="0" w:qFormat="1"/>
     <w:lsdException w:name="heading 2" w:uiPriority="0" w:qFormat="1"/>
@@ -26808,6 +26721,7 @@
     <w:lsdException w:name="Smart Hyperlink" w:semiHidden="1" w:unhideWhenUsed="1"/>
     <w:lsdException w:name="Hashtag" w:semiHidden="1" w:unhideWhenUsed="1"/>
     <w:lsdException w:name="Unresolved Mention" w:semiHidden="1" w:unhideWhenUsed="1"/>
+    <w:lsdException w:name="Smart Link" w:semiHidden="1" w:unhideWhenUsed="1"/>
   </w:latentStyles>
   <w:style w:type="paragraph" w:default="1" w:styleId="Normale">
     <w:name w:val="Normal"/>

</xml_diff>

<commit_message>
Documentazione e fix al controler (addOtherImages)
</commit_message>
<xml_diff>
--- a/3_Documentazione/DocumentazioneFyt.docx
+++ b/3_Documentazione/DocumentazioneFyt.docx
@@ -1,6 +1,6 @@
 
 <file path=word/document.xml><?xml version="1.0" encoding="utf-8"?>
-<w:document xmlns:wpc="http://schemas.microsoft.com/office/word/2010/wordprocessingCanvas" xmlns:cx="http://schemas.microsoft.com/office/drawing/2014/chartex" xmlns:cx1="http://schemas.microsoft.com/office/drawing/2015/9/8/chartex" xmlns:cx2="http://schemas.microsoft.com/office/drawing/2015/10/21/chartex" xmlns:cx3="http://schemas.microsoft.com/office/drawing/2016/5/9/chartex" xmlns:cx4="http://schemas.microsoft.com/office/drawing/2016/5/10/chartex" xmlns:cx5="http://schemas.microsoft.com/office/drawing/2016/5/11/chartex" xmlns:cx6="http://schemas.microsoft.com/office/drawing/2016/5/12/chartex" xmlns:cx7="http://schemas.microsoft.com/office/drawing/2016/5/13/chartex" xmlns:cx8="http://schemas.microsoft.com/office/drawing/2016/5/14/chartex" xmlns:mc="http://schemas.openxmlformats.org/markup-compatibility/2006" xmlns:aink="http://schemas.microsoft.com/office/drawing/2016/ink" xmlns:am3d="http://schemas.microsoft.com/office/drawing/2017/model3d" xmlns:o="urn:schemas-microsoft-com:office:office" xmlns:oel="http://schemas.microsoft.com/office/2019/extlst" xmlns:r="http://schemas.openxmlformats.org/officeDocument/2006/relationships" xmlns:m="http://schemas.openxmlformats.org/officeDocument/2006/math" xmlns:v="urn:schemas-microsoft-com:vml" xmlns:wp14="http://schemas.microsoft.com/office/word/2010/wordprocessingDrawing" xmlns:wp="http://schemas.openxmlformats.org/drawingml/2006/wordprocessingDrawing" xmlns:w10="urn:schemas-microsoft-com:office:word" xmlns:w="http://schemas.openxmlformats.org/wordprocessingml/2006/main" xmlns:w14="http://schemas.microsoft.com/office/word/2010/wordml" xmlns:w15="http://schemas.microsoft.com/office/word/2012/wordml" xmlns:w16cex="http://schemas.microsoft.com/office/word/2018/wordml/cex" xmlns:w16cid="http://schemas.microsoft.com/office/word/2016/wordml/cid" xmlns:w16="http://schemas.microsoft.com/office/word/2018/wordml" xmlns:w16du="http://schemas.microsoft.com/office/word/2023/wordml/word16du" xmlns:w16sdtdh="http://schemas.microsoft.com/office/word/2020/wordml/sdtdatahash" xmlns:w16sdtfl="http://schemas.microsoft.com/office/word/2024/wordml/sdtformatlock" xmlns:w16se="http://schemas.microsoft.com/office/word/2015/wordml/symex" xmlns:wpg="http://schemas.microsoft.com/office/word/2010/wordprocessingGroup" xmlns:wpi="http://schemas.microsoft.com/office/word/2010/wordprocessingInk" xmlns:wne="http://schemas.microsoft.com/office/word/2006/wordml" xmlns:wps="http://schemas.microsoft.com/office/word/2010/wordprocessingShape" mc:Ignorable="w14 w15 w16se w16cid w16 w16cex w16sdtdh w16sdtfl w16du wp14">
+<w:document xmlns:wpc="http://schemas.microsoft.com/office/word/2010/wordprocessingCanvas" xmlns:cx="http://schemas.microsoft.com/office/drawing/2014/chartex" xmlns:cx1="http://schemas.microsoft.com/office/drawing/2015/9/8/chartex" xmlns:cx2="http://schemas.microsoft.com/office/drawing/2015/10/21/chartex" xmlns:cx3="http://schemas.microsoft.com/office/drawing/2016/5/9/chartex" xmlns:cx4="http://schemas.microsoft.com/office/drawing/2016/5/10/chartex" xmlns:cx5="http://schemas.microsoft.com/office/drawing/2016/5/11/chartex" xmlns:cx6="http://schemas.microsoft.com/office/drawing/2016/5/12/chartex" xmlns:cx7="http://schemas.microsoft.com/office/drawing/2016/5/13/chartex" xmlns:cx8="http://schemas.microsoft.com/office/drawing/2016/5/14/chartex" xmlns:mc="http://schemas.openxmlformats.org/markup-compatibility/2006" xmlns:aink="http://schemas.microsoft.com/office/drawing/2016/ink" xmlns:am3d="http://schemas.microsoft.com/office/drawing/2017/model3d" xmlns:o="urn:schemas-microsoft-com:office:office" xmlns:r="http://schemas.openxmlformats.org/officeDocument/2006/relationships" xmlns:m="http://schemas.openxmlformats.org/officeDocument/2006/math" xmlns:v="urn:schemas-microsoft-com:vml" xmlns:wp14="http://schemas.microsoft.com/office/word/2010/wordprocessingDrawing" xmlns:wp="http://schemas.openxmlformats.org/drawingml/2006/wordprocessingDrawing" xmlns:w10="urn:schemas-microsoft-com:office:word" xmlns:w="http://schemas.openxmlformats.org/wordprocessingml/2006/main" xmlns:w14="http://schemas.microsoft.com/office/word/2010/wordml" xmlns:w15="http://schemas.microsoft.com/office/word/2012/wordml" xmlns:w16cid="http://schemas.microsoft.com/office/word/2016/wordml/cid" xmlns:w16se="http://schemas.microsoft.com/office/word/2015/wordml/symex" xmlns:wpg="http://schemas.microsoft.com/office/word/2010/wordprocessingGroup" xmlns:wpi="http://schemas.microsoft.com/office/word/2010/wordprocessingInk" xmlns:wne="http://schemas.microsoft.com/office/word/2006/wordml" xmlns:wps="http://schemas.microsoft.com/office/word/2010/wordprocessingShape" mc:Ignorable="w14 w15 w16se w16cid wp14">
   <w:body>
     <w:p>
       <w:pPr>
@@ -18,11 +18,9 @@
       <w:pPr>
         <w:pStyle w:val="TitoloPagina1"/>
       </w:pPr>
-      <w:proofErr w:type="spellStart"/>
       <w:r>
         <w:t>Fyt</w:t>
       </w:r>
-      <w:proofErr w:type="spellEnd"/>
     </w:p>
     <w:p>
       <w:pPr>
@@ -14473,7 +14471,15 @@
             </w:r>
             <w:proofErr w:type="spellEnd"/>
             <w:r>
-              <w:t xml:space="preserve"> (Azure, SQL Server)</w:t>
+              <w:t xml:space="preserve"> (</w:t>
+            </w:r>
+            <w:proofErr w:type="spellStart"/>
+            <w:r>
+              <w:t>Azure</w:t>
+            </w:r>
+            <w:proofErr w:type="spellEnd"/>
+            <w:r>
+              <w:t>, SQL Server)</w:t>
             </w:r>
           </w:p>
           <w:p>
@@ -15024,7 +15030,15 @@
               <w:t>, i</w:t>
             </w:r>
             <w:r>
-              <w:t>mmagini, assets)</w:t>
+              <w:t xml:space="preserve">mmagini, </w:t>
+            </w:r>
+            <w:proofErr w:type="spellStart"/>
+            <w:r>
+              <w:t>assets</w:t>
+            </w:r>
+            <w:proofErr w:type="spellEnd"/>
+            <w:r>
+              <w:t>)</w:t>
             </w:r>
           </w:p>
         </w:tc>
@@ -15251,6 +15265,7 @@
                 <w:lang w:val="fr-CH"/>
               </w:rPr>
             </w:pPr>
+            <w:proofErr w:type="gramStart"/>
             <w:r>
               <w:rPr>
                 <w:lang w:val="fr-CH"/>
@@ -15265,6 +15280,7 @@
               <w:t>env</w:t>
             </w:r>
             <w:proofErr w:type="spellEnd"/>
+            <w:proofErr w:type="gramEnd"/>
           </w:p>
         </w:tc>
         <w:tc>
@@ -15371,6 +15387,7 @@
           <w:b/>
         </w:rPr>
       </w:pPr>
+      <w:proofErr w:type="gramStart"/>
       <w:r>
         <w:rPr>
           <w:b/>
@@ -15381,7 +15398,14 @@
         <w:rPr>
           <w:b/>
         </w:rPr>
-        <w:t>()</w:t>
+        <w:t>(</w:t>
+      </w:r>
+      <w:proofErr w:type="gramEnd"/>
+      <w:r>
+        <w:rPr>
+          <w:b/>
+        </w:rPr>
+        <w:t>)</w:t>
       </w:r>
       <w:r>
         <w:rPr>
@@ -15466,7 +15490,7 @@
         <w:rPr>
           <w:sz w:val="16"/>
           <w:szCs w:val="16"/>
-          <w:lang w:val="fr-CH"/>
+          <w:lang w:val="it-CH"/>
         </w:rPr>
       </w:pPr>
       <w:r>
@@ -15475,7 +15499,123 @@
           <w:szCs w:val="16"/>
           <w:lang w:val="fr-CH"/>
         </w:rPr>
-        <w:t xml:space="preserve">        $table-&gt;id();</w:t>
+        <w:t xml:space="preserve">        </w:t>
+      </w:r>
+      <w:r>
+        <w:rPr>
+          <w:sz w:val="16"/>
+          <w:szCs w:val="16"/>
+          <w:lang w:val="it-CH"/>
+        </w:rPr>
+        <w:t>$table-&gt;id();</w:t>
+      </w:r>
+    </w:p>
+    <w:p>
+      <w:pPr>
+        <w:pStyle w:val="Code"/>
+        <w:ind w:left="360"/>
+        <w:rPr>
+          <w:sz w:val="16"/>
+          <w:szCs w:val="16"/>
+          <w:lang w:val="it-CH"/>
+        </w:rPr>
+      </w:pPr>
+      <w:r>
+        <w:rPr>
+          <w:sz w:val="16"/>
+          <w:szCs w:val="16"/>
+          <w:lang w:val="it-CH"/>
+        </w:rPr>
+        <w:t xml:space="preserve">        $table-&gt;string('name');</w:t>
+      </w:r>
+    </w:p>
+    <w:p>
+      <w:pPr>
+        <w:pStyle w:val="Code"/>
+        <w:ind w:left="360"/>
+        <w:rPr>
+          <w:sz w:val="16"/>
+          <w:szCs w:val="16"/>
+          <w:lang w:val="it-CH"/>
+        </w:rPr>
+      </w:pPr>
+      <w:r>
+        <w:rPr>
+          <w:sz w:val="16"/>
+          <w:szCs w:val="16"/>
+          <w:lang w:val="it-CH"/>
+        </w:rPr>
+        <w:t xml:space="preserve">    });</w:t>
+      </w:r>
+    </w:p>
+    <w:p>
+      <w:pPr>
+        <w:pStyle w:val="Code"/>
+        <w:ind w:left="360"/>
+        <w:rPr>
+          <w:sz w:val="16"/>
+          <w:szCs w:val="16"/>
+          <w:lang w:val="it-CH"/>
+        </w:rPr>
+      </w:pPr>
+      <w:r>
+        <w:rPr>
+          <w:sz w:val="16"/>
+          <w:szCs w:val="16"/>
+          <w:lang w:val="it-CH"/>
+        </w:rPr>
+        <w:t>}</w:t>
+      </w:r>
+    </w:p>
+    <w:p>
+      <w:pPr>
+        <w:spacing w:before="240" w:after="240"/>
+        <w:rPr>
+          <w:b/>
+          <w:lang w:val="it-IT"/>
+        </w:rPr>
+      </w:pPr>
+      <w:proofErr w:type="gramStart"/>
+      <w:r>
+        <w:rPr>
+          <w:b/>
+          <w:lang w:val="it-IT"/>
+        </w:rPr>
+        <w:t>d</w:t>
+      </w:r>
+      <w:r>
+        <w:rPr>
+          <w:b/>
+          <w:lang w:val="it-IT"/>
+        </w:rPr>
+        <w:t>own</w:t>
+      </w:r>
+      <w:r>
+        <w:rPr>
+          <w:b/>
+          <w:lang w:val="it-IT"/>
+        </w:rPr>
+        <w:t>(</w:t>
+      </w:r>
+      <w:proofErr w:type="gramEnd"/>
+      <w:r>
+        <w:rPr>
+          <w:b/>
+          <w:lang w:val="it-IT"/>
+        </w:rPr>
+        <w:t xml:space="preserve">): </w:t>
+      </w:r>
+      <w:r>
+        <w:rPr>
+          <w:lang w:val="it-IT"/>
+        </w:rPr>
+        <w:t>Si occupa di eliminare lo schema se già esistente</w:t>
+      </w:r>
+      <w:r>
+        <w:rPr>
+          <w:lang w:val="it-IT"/>
+        </w:rPr>
+        <w:t>.</w:t>
       </w:r>
     </w:p>
     <w:p>
@@ -15494,7 +15634,7 @@
           <w:szCs w:val="16"/>
           <w:lang w:val="fr-CH"/>
         </w:rPr>
-        <w:t xml:space="preserve">        $table-&gt;string('name');</w:t>
+        <w:t>public function down(): void</w:t>
       </w:r>
     </w:p>
     <w:p>
@@ -15513,7 +15653,7 @@
           <w:szCs w:val="16"/>
           <w:lang w:val="fr-CH"/>
         </w:rPr>
-        <w:t xml:space="preserve">    });</w:t>
+        <w:t>{</w:t>
       </w:r>
     </w:p>
     <w:p>
@@ -15532,49 +15672,72 @@
           <w:szCs w:val="16"/>
           <w:lang w:val="fr-CH"/>
         </w:rPr>
+        <w:t xml:space="preserve">    Schema::dropIfExists('user_roles');</w:t>
+      </w:r>
+    </w:p>
+    <w:p>
+      <w:pPr>
+        <w:pStyle w:val="Code"/>
+        <w:ind w:left="360"/>
+        <w:rPr>
+          <w:sz w:val="16"/>
+          <w:szCs w:val="16"/>
+          <w:lang w:val="it-CH"/>
+        </w:rPr>
+      </w:pPr>
+      <w:r>
+        <w:rPr>
+          <w:sz w:val="16"/>
+          <w:szCs w:val="16"/>
+          <w:lang w:val="it-CH"/>
+        </w:rPr>
         <w:t>}</w:t>
       </w:r>
     </w:p>
     <w:p>
       <w:pPr>
         <w:spacing w:before="240" w:after="240"/>
-        <w:rPr>
-          <w:b/>
-          <w:lang w:val="it-IT"/>
-        </w:rPr>
-      </w:pPr>
-      <w:r>
-        <w:rPr>
-          <w:b/>
-          <w:lang w:val="it-IT"/>
-        </w:rPr>
-        <w:t>d</w:t>
-      </w:r>
-      <w:r>
-        <w:rPr>
-          <w:b/>
-          <w:lang w:val="it-IT"/>
-        </w:rPr>
-        <w:t>own</w:t>
-      </w:r>
-      <w:r>
-        <w:rPr>
-          <w:b/>
-          <w:lang w:val="it-IT"/>
-        </w:rPr>
-        <w:t xml:space="preserve">(): </w:t>
-      </w:r>
-      <w:r>
-        <w:rPr>
-          <w:lang w:val="it-IT"/>
-        </w:rPr>
-        <w:t>Si occupa di eliminare lo schema se già esistente</w:t>
-      </w:r>
-      <w:r>
-        <w:rPr>
-          <w:lang w:val="it-IT"/>
-        </w:rPr>
-        <w:t>.</w:t>
+      </w:pPr>
+      <w:r>
+        <w:t>Comando per eseguire le migrazioni:</w:t>
+      </w:r>
+    </w:p>
+    <w:p>
+      <w:pPr>
+        <w:pStyle w:val="Code"/>
+        <w:ind w:left="360"/>
+        <w:rPr>
+          <w:sz w:val="16"/>
+          <w:szCs w:val="16"/>
+        </w:rPr>
+      </w:pPr>
+      <w:r>
+        <w:rPr>
+          <w:sz w:val="16"/>
+          <w:szCs w:val="16"/>
+        </w:rPr>
+        <w:t>php artisan migrat</w:t>
+      </w:r>
+      <w:r>
+        <w:rPr>
+          <w:sz w:val="16"/>
+          <w:szCs w:val="16"/>
+        </w:rPr>
+        <w:t>e</w:t>
+      </w:r>
+    </w:p>
+    <w:p>
+      <w:pPr>
+        <w:spacing w:before="240" w:after="240"/>
+        <w:rPr>
+          <w:lang w:val="it-IT"/>
+        </w:rPr>
+      </w:pPr>
+      <w:r>
+        <w:rPr>
+          <w:lang w:val="it-IT"/>
+        </w:rPr>
+        <w:t>Nel caso che si voglia eseguire una migrazione specifica di un file si può eseguire il seguente comando:</w:t>
       </w:r>
     </w:p>
     <w:p>
@@ -15593,7 +15756,105 @@
           <w:szCs w:val="16"/>
           <w:lang w:val="fr-CH"/>
         </w:rPr>
-        <w:t>public function down(): void</w:t>
+        <w:t>php artisan migrate --path=database/migrations/2025_03_12_120246_user_roles.php</w:t>
+      </w:r>
+    </w:p>
+    <w:p>
+      <w:pPr>
+        <w:rPr>
+          <w:b/>
+          <w:lang w:val="fr-CH"/>
+        </w:rPr>
+      </w:pPr>
+      <w:r>
+        <w:rPr>
+          <w:lang w:val="fr-CH"/>
+        </w:rPr>
+        <w:br w:type="page"/>
+      </w:r>
+    </w:p>
+    <w:p>
+      <w:pPr>
+        <w:pStyle w:val="Titolo3"/>
+      </w:pPr>
+      <w:proofErr w:type="spellStart"/>
+      <w:r>
+        <w:lastRenderedPageBreak/>
+        <w:t>Factories</w:t>
+      </w:r>
+      <w:proofErr w:type="spellEnd"/>
+    </w:p>
+    <w:p>
+      <w:r>
+        <w:t xml:space="preserve">Le </w:t>
+      </w:r>
+      <w:proofErr w:type="spellStart"/>
+      <w:r>
+        <w:t>factories</w:t>
+      </w:r>
+      <w:proofErr w:type="spellEnd"/>
+      <w:r>
+        <w:t xml:space="preserve"> sono classi PHP che generano </w:t>
+      </w:r>
+      <w:r>
+        <w:rPr>
+          <w:bCs/>
+        </w:rPr>
+        <w:t>dati fittizi</w:t>
+      </w:r>
+      <w:r>
+        <w:t xml:space="preserve"> per i </w:t>
+      </w:r>
+      <w:r>
+        <w:t xml:space="preserve">model (con l’ausilio di </w:t>
+      </w:r>
+      <w:proofErr w:type="spellStart"/>
+      <w:r>
+        <w:t>Faker</w:t>
+      </w:r>
+      <w:proofErr w:type="spellEnd"/>
+      <w:r>
+        <w:t>, ovvero una libreria PHP integrata in Laravel). Questi sono u</w:t>
+      </w:r>
+      <w:r>
+        <w:t>tili per testing o popola</w:t>
+      </w:r>
+      <w:r>
+        <w:t>zione</w:t>
+      </w:r>
+      <w:r>
+        <w:t xml:space="preserve"> il database con dati di </w:t>
+      </w:r>
+      <w:r>
+        <w:t>prova</w:t>
+      </w:r>
+      <w:r>
+        <w:t>.</w:t>
+      </w:r>
+      <w:r>
+        <w:t xml:space="preserve"> Esse hanno già dei metodi predefiniti che permetto, ad esempio di d</w:t>
+      </w:r>
+      <w:r>
+        <w:t>efinire campi casuali ma realistici (nomi, email, date)</w:t>
+      </w:r>
+      <w:r>
+        <w:t>.</w:t>
+      </w:r>
+    </w:p>
+    <w:p>
+      <w:pPr>
+        <w:spacing w:before="240" w:after="240"/>
+      </w:pPr>
+      <w:r>
+        <w:t xml:space="preserve">Ad esempio, la </w:t>
+      </w:r>
+      <w:proofErr w:type="spellStart"/>
+      <w:r>
+        <w:t>factory</w:t>
+      </w:r>
+      <w:proofErr w:type="spellEnd"/>
+      <w:r>
+        <w:t xml:space="preserve"> per popolare un utente con dati fittizi, sarebbe la seguente:</w:t>
       </w:r>
     </w:p>
     <w:p>
@@ -15612,7 +15873,7 @@
           <w:szCs w:val="16"/>
           <w:lang w:val="fr-CH"/>
         </w:rPr>
-        <w:t>{</w:t>
+        <w:t>public function definition(): array</w:t>
       </w:r>
     </w:p>
     <w:p>
@@ -15631,72 +15892,7 @@
           <w:szCs w:val="16"/>
           <w:lang w:val="fr-CH"/>
         </w:rPr>
-        <w:t xml:space="preserve">    Schema::dropIfExists('user_roles');</w:t>
-      </w:r>
-    </w:p>
-    <w:p>
-      <w:pPr>
-        <w:pStyle w:val="Code"/>
-        <w:ind w:left="360"/>
-        <w:rPr>
-          <w:sz w:val="16"/>
-          <w:szCs w:val="16"/>
-          <w:lang w:val="it-CH"/>
-        </w:rPr>
-      </w:pPr>
-      <w:r>
-        <w:rPr>
-          <w:sz w:val="16"/>
-          <w:szCs w:val="16"/>
-          <w:lang w:val="it-CH"/>
-        </w:rPr>
-        <w:t>}</w:t>
-      </w:r>
-    </w:p>
-    <w:p>
-      <w:pPr>
-        <w:spacing w:before="240" w:after="240"/>
-      </w:pPr>
-      <w:r>
-        <w:t>Comando per eseguire le migrazioni:</w:t>
-      </w:r>
-    </w:p>
-    <w:p>
-      <w:pPr>
-        <w:pStyle w:val="Code"/>
-        <w:ind w:left="360"/>
-        <w:rPr>
-          <w:sz w:val="16"/>
-          <w:szCs w:val="16"/>
-        </w:rPr>
-      </w:pPr>
-      <w:r>
-        <w:rPr>
-          <w:sz w:val="16"/>
-          <w:szCs w:val="16"/>
-        </w:rPr>
-        <w:t>php artisan migrat</w:t>
-      </w:r>
-      <w:r>
-        <w:rPr>
-          <w:sz w:val="16"/>
-          <w:szCs w:val="16"/>
-        </w:rPr>
-        <w:t>e</w:t>
-      </w:r>
-    </w:p>
-    <w:p>
-      <w:pPr>
-        <w:spacing w:before="240" w:after="240"/>
-        <w:rPr>
-          <w:lang w:val="it-IT"/>
-        </w:rPr>
-      </w:pPr>
-      <w:r>
-        <w:rPr>
-          <w:lang w:val="it-IT"/>
-        </w:rPr>
-        <w:t>Nel caso che si voglia eseguire una migrazione specifica di un file si può eseguire il seguente comando:</w:t>
+        <w:t>{</w:t>
       </w:r>
     </w:p>
     <w:p>
@@ -15715,324 +15911,175 @@
           <w:szCs w:val="16"/>
           <w:lang w:val="fr-CH"/>
         </w:rPr>
-        <w:t>php artisan migrate --path=database/migrations/2025_03_12_120246_user_roles.php</w:t>
-      </w:r>
-    </w:p>
-    <w:p>
-      <w:pPr>
-        <w:rPr>
-          <w:b/>
-          <w:lang w:val="fr-CH"/>
-        </w:rPr>
-      </w:pPr>
-      <w:r>
-        <w:rPr>
-          <w:lang w:val="fr-CH"/>
-        </w:rPr>
-        <w:br w:type="page"/>
-      </w:r>
-    </w:p>
-    <w:p>
-      <w:pPr>
-        <w:pStyle w:val="Titolo3"/>
-      </w:pPr>
-      <w:proofErr w:type="spellStart"/>
-      <w:r>
-        <w:lastRenderedPageBreak/>
-        <w:t>Factories</w:t>
-      </w:r>
-      <w:proofErr w:type="spellEnd"/>
-    </w:p>
-    <w:p>
-      <w:r>
-        <w:t xml:space="preserve">Le </w:t>
-      </w:r>
-      <w:proofErr w:type="spellStart"/>
-      <w:r>
-        <w:t>factories</w:t>
-      </w:r>
-      <w:proofErr w:type="spellEnd"/>
-      <w:r>
-        <w:t xml:space="preserve"> sono classi PHP che generano </w:t>
-      </w:r>
-      <w:r>
-        <w:rPr>
-          <w:bCs/>
-        </w:rPr>
-        <w:t>dati fittizi</w:t>
-      </w:r>
-      <w:r>
-        <w:t xml:space="preserve"> per i </w:t>
-      </w:r>
-      <w:r>
-        <w:t xml:space="preserve">model (con l’ausilio di </w:t>
-      </w:r>
-      <w:proofErr w:type="spellStart"/>
-      <w:r>
-        <w:t>Faker</w:t>
-      </w:r>
-      <w:proofErr w:type="spellEnd"/>
-      <w:r>
-        <w:t>, ovvero una libreria PHP integrata in Laravel). Questi sono u</w:t>
-      </w:r>
-      <w:r>
-        <w:t>tili per testing o popola</w:t>
-      </w:r>
-      <w:r>
-        <w:t>zione</w:t>
-      </w:r>
-      <w:r>
-        <w:t xml:space="preserve"> il database con dati di </w:t>
-      </w:r>
-      <w:r>
-        <w:t>prova</w:t>
-      </w:r>
-      <w:r>
-        <w:t>.</w:t>
-      </w:r>
-      <w:r>
-        <w:t xml:space="preserve"> Esse hanno già dei metodi predefiniti che permetto, ad esempio di d</w:t>
-      </w:r>
-      <w:r>
-        <w:t>efinire campi casuali ma realistici (nomi, email, date)</w:t>
-      </w:r>
-      <w:r>
-        <w:t>.</w:t>
-      </w:r>
-    </w:p>
-    <w:p>
-      <w:pPr>
-        <w:spacing w:before="240" w:after="240"/>
-      </w:pPr>
-      <w:r>
-        <w:t xml:space="preserve">Ad esempio, la </w:t>
-      </w:r>
-      <w:proofErr w:type="spellStart"/>
-      <w:r>
-        <w:t>factory</w:t>
-      </w:r>
-      <w:proofErr w:type="spellEnd"/>
-      <w:r>
-        <w:t xml:space="preserve"> per popolare un utente con dati fittizi, sarebbe la seguente:</w:t>
+        <w:t xml:space="preserve">    return [</w:t>
       </w:r>
     </w:p>
     <w:p>
       <w:pPr>
         <w:pStyle w:val="Code"/>
         <w:ind w:left="360"/>
+        <w:rPr>
+          <w:sz w:val="16"/>
+          <w:szCs w:val="16"/>
+          <w:lang w:val="de-CH"/>
+        </w:rPr>
+      </w:pPr>
+      <w:r>
         <w:rPr>
           <w:sz w:val="16"/>
           <w:szCs w:val="16"/>
           <w:lang w:val="fr-CH"/>
         </w:rPr>
-      </w:pPr>
-      <w:r>
+        <w:t xml:space="preserve">        </w:t>
+      </w:r>
+      <w:r>
+        <w:rPr>
+          <w:sz w:val="16"/>
+          <w:szCs w:val="16"/>
+          <w:lang w:val="de-CH"/>
+        </w:rPr>
+        <w:t>'name' =&gt; fake()-&gt;name(),</w:t>
+      </w:r>
+    </w:p>
+    <w:p>
+      <w:pPr>
+        <w:pStyle w:val="Code"/>
+        <w:ind w:left="360"/>
+        <w:rPr>
+          <w:sz w:val="16"/>
+          <w:szCs w:val="16"/>
+          <w:lang w:val="de-CH"/>
+        </w:rPr>
+      </w:pPr>
+      <w:r>
+        <w:rPr>
+          <w:sz w:val="16"/>
+          <w:szCs w:val="16"/>
+          <w:lang w:val="de-CH"/>
+        </w:rPr>
+        <w:t xml:space="preserve">        'surname' =&gt; fake()-&gt;lastName(),</w:t>
+      </w:r>
+    </w:p>
+    <w:p>
+      <w:pPr>
+        <w:pStyle w:val="Code"/>
+        <w:ind w:left="360"/>
+        <w:rPr>
+          <w:sz w:val="16"/>
+          <w:szCs w:val="16"/>
+          <w:lang w:val="de-CH"/>
+        </w:rPr>
+      </w:pPr>
+      <w:r>
+        <w:rPr>
+          <w:sz w:val="16"/>
+          <w:szCs w:val="16"/>
+          <w:lang w:val="de-CH"/>
+        </w:rPr>
+        <w:t xml:space="preserve">        'username' =&gt; fake()-&gt;userName(),</w:t>
+      </w:r>
+    </w:p>
+    <w:p>
+      <w:pPr>
+        <w:pStyle w:val="Code"/>
+        <w:ind w:left="360"/>
+        <w:rPr>
+          <w:sz w:val="16"/>
+          <w:szCs w:val="16"/>
+          <w:lang w:val="de-CH"/>
+        </w:rPr>
+      </w:pPr>
+      <w:r>
+        <w:rPr>
+          <w:sz w:val="16"/>
+          <w:szCs w:val="16"/>
+          <w:lang w:val="de-CH"/>
+        </w:rPr>
+        <w:t xml:space="preserve">        'born_date' =&gt; fake()-&gt;dateTimeBetween('-100 years', '-18 years')-&gt;format('Y-m-d'),</w:t>
+      </w:r>
+    </w:p>
+    <w:p>
+      <w:pPr>
+        <w:pStyle w:val="Code"/>
+        <w:ind w:left="360"/>
+        <w:rPr>
+          <w:sz w:val="16"/>
+          <w:szCs w:val="16"/>
+          <w:lang w:val="de-CH"/>
+        </w:rPr>
+      </w:pPr>
+      <w:r>
+        <w:rPr>
+          <w:sz w:val="16"/>
+          <w:szCs w:val="16"/>
+          <w:lang w:val="de-CH"/>
+        </w:rPr>
+        <w:t xml:space="preserve">        'address' =&gt; fake()-&gt;address(),</w:t>
+      </w:r>
+    </w:p>
+    <w:p>
+      <w:pPr>
+        <w:pStyle w:val="Code"/>
+        <w:ind w:left="360"/>
+        <w:rPr>
+          <w:sz w:val="16"/>
+          <w:szCs w:val="16"/>
+          <w:lang w:val="de-CH"/>
+        </w:rPr>
+      </w:pPr>
+      <w:r>
+        <w:rPr>
+          <w:sz w:val="16"/>
+          <w:szCs w:val="16"/>
+          <w:lang w:val="de-CH"/>
+        </w:rPr>
+        <w:t xml:space="preserve">        'postcode' =&gt; preg_replace('/[^0-9]/', '', fake()-&gt;postcode()),</w:t>
+      </w:r>
+    </w:p>
+    <w:p>
+      <w:pPr>
+        <w:pStyle w:val="Code"/>
+        <w:ind w:left="360"/>
+        <w:rPr>
+          <w:sz w:val="16"/>
+          <w:szCs w:val="16"/>
+          <w:lang w:val="de-CH"/>
+        </w:rPr>
+      </w:pPr>
+      <w:r>
+        <w:rPr>
+          <w:sz w:val="16"/>
+          <w:szCs w:val="16"/>
+          <w:lang w:val="de-CH"/>
+        </w:rPr>
+        <w:t xml:space="preserve">        'city' =&gt; fake()-&gt;city(),</w:t>
+      </w:r>
+    </w:p>
+    <w:p>
+      <w:pPr>
+        <w:pStyle w:val="Code"/>
+        <w:ind w:left="360"/>
         <w:rPr>
           <w:sz w:val="16"/>
           <w:szCs w:val="16"/>
           <w:lang w:val="fr-CH"/>
         </w:rPr>
-        <w:t>public function definition(): array</w:t>
-      </w:r>
-    </w:p>
-    <w:p>
-      <w:pPr>
-        <w:pStyle w:val="Code"/>
-        <w:ind w:left="360"/>
+      </w:pPr>
+      <w:r>
         <w:rPr>
           <w:sz w:val="16"/>
           <w:szCs w:val="16"/>
-          <w:lang w:val="it-CH"/>
-        </w:rPr>
-      </w:pPr>
-      <w:r>
-        <w:rPr>
-          <w:sz w:val="16"/>
-          <w:szCs w:val="16"/>
-          <w:lang w:val="it-CH"/>
-        </w:rPr>
-        <w:t>{</w:t>
-      </w:r>
-    </w:p>
-    <w:p>
-      <w:pPr>
-        <w:pStyle w:val="Code"/>
-        <w:ind w:left="360"/>
-        <w:rPr>
-          <w:sz w:val="16"/>
-          <w:szCs w:val="16"/>
-          <w:lang w:val="it-CH"/>
-        </w:rPr>
-      </w:pPr>
-      <w:r>
-        <w:rPr>
-          <w:sz w:val="16"/>
-          <w:szCs w:val="16"/>
-          <w:lang w:val="it-CH"/>
-        </w:rPr>
-        <w:t xml:space="preserve">    return [</w:t>
-      </w:r>
-    </w:p>
-    <w:p>
-      <w:pPr>
-        <w:pStyle w:val="Code"/>
-        <w:ind w:left="360"/>
-        <w:rPr>
-          <w:sz w:val="16"/>
-          <w:szCs w:val="16"/>
-        </w:rPr>
-      </w:pPr>
-      <w:r>
-        <w:rPr>
-          <w:sz w:val="16"/>
-          <w:szCs w:val="16"/>
-          <w:lang w:val="it-CH"/>
+          <w:lang w:val="de-CH"/>
         </w:rPr>
         <w:t xml:space="preserve">        </w:t>
       </w:r>
       <w:r>
-        <w:rPr>
-          <w:sz w:val="16"/>
-          <w:szCs w:val="16"/>
-        </w:rPr>
-        <w:t>'name' =&gt; fake()-&gt;name(),</w:t>
-      </w:r>
-    </w:p>
-    <w:p>
-      <w:pPr>
-        <w:pStyle w:val="Code"/>
-        <w:ind w:left="360"/>
-        <w:rPr>
-          <w:sz w:val="16"/>
-          <w:szCs w:val="16"/>
-        </w:rPr>
-      </w:pPr>
-      <w:r>
-        <w:rPr>
-          <w:sz w:val="16"/>
-          <w:szCs w:val="16"/>
-        </w:rPr>
-        <w:t xml:space="preserve">        'surname' =&gt; fake()-&gt;lastName(),</w:t>
-      </w:r>
-    </w:p>
-    <w:p>
-      <w:pPr>
-        <w:pStyle w:val="Code"/>
-        <w:ind w:left="360"/>
-        <w:rPr>
-          <w:sz w:val="16"/>
-          <w:szCs w:val="16"/>
-        </w:rPr>
-      </w:pPr>
-      <w:r>
-        <w:rPr>
-          <w:sz w:val="16"/>
-          <w:szCs w:val="16"/>
-        </w:rPr>
-        <w:t xml:space="preserve">        'username' =&gt; fake()-&gt;userName(),</w:t>
-      </w:r>
-    </w:p>
-    <w:p>
-      <w:pPr>
-        <w:pStyle w:val="Code"/>
-        <w:ind w:left="360"/>
         <w:rPr>
           <w:sz w:val="16"/>
           <w:szCs w:val="16"/>
           <w:lang w:val="fr-CH"/>
         </w:rPr>
-      </w:pPr>
-      <w:r>
-        <w:rPr>
-          <w:sz w:val="16"/>
-          <w:szCs w:val="16"/>
-          <w:lang w:val="fr-CH"/>
-        </w:rPr>
-        <w:t xml:space="preserve">        'born_date' =&gt; fake()-&gt;dateTimeBetween('-100 years', '-18 years')-&gt;format('Y-m-d'),</w:t>
-      </w:r>
-    </w:p>
-    <w:p>
-      <w:pPr>
-        <w:pStyle w:val="Code"/>
-        <w:ind w:left="360"/>
-        <w:rPr>
-          <w:sz w:val="16"/>
-          <w:szCs w:val="16"/>
-          <w:lang w:val="fr-CH"/>
-        </w:rPr>
-      </w:pPr>
-      <w:r>
-        <w:rPr>
-          <w:sz w:val="16"/>
-          <w:szCs w:val="16"/>
-          <w:lang w:val="fr-CH"/>
-        </w:rPr>
-        <w:t xml:space="preserve">        </w:t>
-      </w:r>
-      <w:r>
-        <w:rPr>
-          <w:sz w:val="16"/>
-          <w:szCs w:val="16"/>
-          <w:lang w:val="fr-CH"/>
-        </w:rPr>
-        <w:t>'address' =&gt; fake()-&gt;address(),</w:t>
-      </w:r>
-    </w:p>
-    <w:p>
-      <w:pPr>
-        <w:pStyle w:val="Code"/>
-        <w:ind w:left="360"/>
-        <w:rPr>
-          <w:sz w:val="16"/>
-          <w:szCs w:val="16"/>
-          <w:lang w:val="fr-CH"/>
-        </w:rPr>
-      </w:pPr>
-      <w:r>
-        <w:rPr>
-          <w:sz w:val="16"/>
-          <w:szCs w:val="16"/>
-          <w:lang w:val="fr-CH"/>
-        </w:rPr>
-        <w:t xml:space="preserve">        'postcode' =&gt; preg_replace('/[^0-9]/', '', fake()-&gt;postcode()),</w:t>
-      </w:r>
-    </w:p>
-    <w:p>
-      <w:pPr>
-        <w:pStyle w:val="Code"/>
-        <w:ind w:left="360"/>
-        <w:rPr>
-          <w:sz w:val="16"/>
-          <w:szCs w:val="16"/>
-          <w:lang w:val="fr-CH"/>
-        </w:rPr>
-      </w:pPr>
-      <w:r>
-        <w:rPr>
-          <w:sz w:val="16"/>
-          <w:szCs w:val="16"/>
-          <w:lang w:val="fr-CH"/>
-        </w:rPr>
-        <w:t xml:space="preserve">        'city' =&gt; fake()-&gt;city(),</w:t>
-      </w:r>
-    </w:p>
-    <w:p>
-      <w:pPr>
-        <w:pStyle w:val="Code"/>
-        <w:ind w:left="360"/>
-        <w:rPr>
-          <w:sz w:val="16"/>
-          <w:szCs w:val="16"/>
-          <w:lang w:val="fr-CH"/>
-        </w:rPr>
-      </w:pPr>
-      <w:r>
-        <w:rPr>
-          <w:sz w:val="16"/>
-          <w:szCs w:val="16"/>
-          <w:lang w:val="fr-CH"/>
-        </w:rPr>
-        <w:t xml:space="preserve">        'country' =&gt; fake()-&gt;country(),</w:t>
+        <w:t>'country' =&gt; fake()-&gt;country(),</w:t>
       </w:r>
     </w:p>
     <w:p>
@@ -16918,6 +16965,7 @@
           <w:lang w:val="fr-CH"/>
         </w:rPr>
       </w:pPr>
+      <w:proofErr w:type="gramStart"/>
       <w:r>
         <w:rPr>
           <w:noProof w:val="0"/>
@@ -16928,6 +16976,7 @@
         <w:t>Route::</w:t>
       </w:r>
       <w:proofErr w:type="spellStart"/>
+      <w:proofErr w:type="gramEnd"/>
       <w:r>
         <w:rPr>
           <w:noProof w:val="0"/>
@@ -16980,7 +17029,7 @@
           <w:noProof w:val="0"/>
           <w:sz w:val="16"/>
           <w:szCs w:val="16"/>
-          <w:lang w:val="it-CH"/>
+          <w:lang w:val="fr-CH"/>
         </w:rPr>
       </w:pPr>
       <w:r>
@@ -16997,10 +17046,41 @@
           <w:noProof w:val="0"/>
           <w:sz w:val="16"/>
           <w:szCs w:val="16"/>
-          <w:lang w:val="it-CH"/>
-        </w:rPr>
-        <w:t>return view('home');</w:t>
-      </w:r>
+          <w:lang w:val="fr-CH"/>
+        </w:rPr>
+        <w:t xml:space="preserve">return </w:t>
+      </w:r>
+      <w:proofErr w:type="spellStart"/>
+      <w:r>
+        <w:rPr>
+          <w:noProof w:val="0"/>
+          <w:sz w:val="16"/>
+          <w:szCs w:val="16"/>
+          <w:lang w:val="fr-CH"/>
+        </w:rPr>
+        <w:t>view</w:t>
+      </w:r>
+      <w:proofErr w:type="spellEnd"/>
+      <w:r>
+        <w:rPr>
+          <w:noProof w:val="0"/>
+          <w:sz w:val="16"/>
+          <w:szCs w:val="16"/>
+          <w:lang w:val="fr-CH"/>
+        </w:rPr>
+        <w:t>('home'</w:t>
+      </w:r>
+      <w:proofErr w:type="gramStart"/>
+      <w:r>
+        <w:rPr>
+          <w:noProof w:val="0"/>
+          <w:sz w:val="16"/>
+          <w:szCs w:val="16"/>
+          <w:lang w:val="fr-CH"/>
+        </w:rPr>
+        <w:t>);</w:t>
+      </w:r>
+      <w:proofErr w:type="gramEnd"/>
     </w:p>
     <w:p>
       <w:pPr>
@@ -17014,17 +17094,48 @@
           <w:noProof w:val="0"/>
           <w:sz w:val="16"/>
           <w:szCs w:val="16"/>
-          <w:lang w:val="it-CH"/>
-        </w:rPr>
-      </w:pPr>
+          <w:lang w:val="fr-CH"/>
+        </w:rPr>
+      </w:pPr>
+      <w:proofErr w:type="gramStart"/>
       <w:r>
         <w:rPr>
           <w:noProof w:val="0"/>
           <w:sz w:val="16"/>
           <w:szCs w:val="16"/>
-          <w:lang w:val="it-CH"/>
-        </w:rPr>
-        <w:t>})-&gt;name('home');</w:t>
+          <w:lang w:val="fr-CH"/>
+        </w:rPr>
+        <w:t>})-</w:t>
+      </w:r>
+      <w:proofErr w:type="gramEnd"/>
+      <w:r>
+        <w:rPr>
+          <w:noProof w:val="0"/>
+          <w:sz w:val="16"/>
+          <w:szCs w:val="16"/>
+          <w:lang w:val="fr-CH"/>
+        </w:rPr>
+        <w:t>&gt;</w:t>
+      </w:r>
+      <w:proofErr w:type="spellStart"/>
+      <w:r>
+        <w:rPr>
+          <w:noProof w:val="0"/>
+          <w:sz w:val="16"/>
+          <w:szCs w:val="16"/>
+          <w:lang w:val="fr-CH"/>
+        </w:rPr>
+        <w:t>name</w:t>
+      </w:r>
+      <w:proofErr w:type="spellEnd"/>
+      <w:r>
+        <w:rPr>
+          <w:noProof w:val="0"/>
+          <w:sz w:val="16"/>
+          <w:szCs w:val="16"/>
+          <w:lang w:val="fr-CH"/>
+        </w:rPr>
+        <w:t>('home');</w:t>
       </w:r>
     </w:p>
     <w:p>
@@ -17039,6 +17150,7 @@
         </w:rPr>
       </w:pPr>
       <w:proofErr w:type="spellStart"/>
+      <w:proofErr w:type="gramStart"/>
       <w:r>
         <w:rPr>
           <w:rFonts w:asciiTheme="minorHAnsi" w:eastAsiaTheme="minorHAnsi" w:hAnsiTheme="minorHAnsi" w:cstheme="minorBidi"/>
@@ -17061,6 +17173,7 @@
         <w:t>::</w:t>
       </w:r>
       <w:proofErr w:type="spellStart"/>
+      <w:proofErr w:type="gramEnd"/>
       <w:r>
         <w:rPr>
           <w:rFonts w:asciiTheme="minorHAnsi" w:eastAsiaTheme="minorHAnsi" w:hAnsiTheme="minorHAnsi" w:cstheme="minorBidi"/>
@@ -17161,47 +17274,7 @@
           <w:szCs w:val="22"/>
           <w:lang w:eastAsia="en-US"/>
         </w:rPr>
-        <w:t>estituisce la vista chiamata 'home' (</w:t>
-      </w:r>
-      <w:proofErr w:type="spellStart"/>
-      <w:r>
-        <w:rPr>
-          <w:rFonts w:asciiTheme="minorHAnsi" w:eastAsiaTheme="minorHAnsi" w:hAnsiTheme="minorHAnsi" w:cstheme="minorBidi"/>
-          <w:sz w:val="22"/>
-          <w:szCs w:val="22"/>
-          <w:lang w:eastAsia="en-US"/>
-        </w:rPr>
-        <w:t>resources</w:t>
-      </w:r>
-      <w:proofErr w:type="spellEnd"/>
-      <w:r>
-        <w:rPr>
-          <w:rFonts w:asciiTheme="minorHAnsi" w:eastAsiaTheme="minorHAnsi" w:hAnsiTheme="minorHAnsi" w:cstheme="minorBidi"/>
-          <w:sz w:val="22"/>
-          <w:szCs w:val="22"/>
-          <w:lang w:eastAsia="en-US"/>
-        </w:rPr>
-        <w:t>/</w:t>
-      </w:r>
-      <w:proofErr w:type="spellStart"/>
-      <w:r>
-        <w:rPr>
-          <w:rFonts w:asciiTheme="minorHAnsi" w:eastAsiaTheme="minorHAnsi" w:hAnsiTheme="minorHAnsi" w:cstheme="minorBidi"/>
-          <w:sz w:val="22"/>
-          <w:szCs w:val="22"/>
-          <w:lang w:eastAsia="en-US"/>
-        </w:rPr>
-        <w:t>views</w:t>
-      </w:r>
-      <w:proofErr w:type="spellEnd"/>
-      <w:r>
-        <w:rPr>
-          <w:rFonts w:asciiTheme="minorHAnsi" w:eastAsiaTheme="minorHAnsi" w:hAnsiTheme="minorHAnsi" w:cstheme="minorBidi"/>
-          <w:sz w:val="22"/>
-          <w:szCs w:val="22"/>
-          <w:lang w:eastAsia="en-US"/>
-        </w:rPr>
-        <w:t>/</w:t>
+        <w:t>estituisce la vista chiamata 'home' (resources/views/</w:t>
       </w:r>
       <w:proofErr w:type="spellStart"/>
       <w:r>
@@ -17358,23 +17431,7 @@
           <w:rFonts w:eastAsiaTheme="minorHAnsi"/>
           <w:lang w:val="it-IT" w:eastAsia="en-US"/>
         </w:rPr>
-        <w:t xml:space="preserve">La seguente rotta è un esempio di reindirizzamento alla pagina </w:t>
-      </w:r>
-      <w:proofErr w:type="spellStart"/>
-      <w:r>
-        <w:rPr>
-          <w:rFonts w:eastAsiaTheme="minorHAnsi"/>
-          <w:lang w:val="it-IT" w:eastAsia="en-US"/>
-        </w:rPr>
-        <w:t>vendor</w:t>
-      </w:r>
-      <w:proofErr w:type="spellEnd"/>
-      <w:r>
-        <w:rPr>
-          <w:rFonts w:eastAsiaTheme="minorHAnsi"/>
-          <w:lang w:val="it-IT" w:eastAsia="en-US"/>
-        </w:rPr>
-        <w:t xml:space="preserve"> (sfruttando il </w:t>
+        <w:t xml:space="preserve">La seguente rotta è un esempio di reindirizzamento alla pagina vendor (sfruttando il </w:t>
       </w:r>
       <w:proofErr w:type="spellStart"/>
       <w:r>
@@ -17409,6 +17466,7 @@
         </w:rPr>
       </w:pPr>
       <w:proofErr w:type="spellStart"/>
+      <w:proofErr w:type="gramStart"/>
       <w:r>
         <w:rPr>
           <w:noProof w:val="0"/>
@@ -17429,6 +17487,7 @@
         <w:t>::</w:t>
       </w:r>
       <w:proofErr w:type="spellStart"/>
+      <w:proofErr w:type="gramEnd"/>
       <w:r>
         <w:rPr>
           <w:noProof w:val="0"/>
@@ -17446,7 +17505,7 @@
           <w:szCs w:val="16"/>
           <w:lang w:val="it-CH"/>
         </w:rPr>
-        <w:t>('/</w:t>
+        <w:t>('/vendor', [</w:t>
       </w:r>
       <w:proofErr w:type="spellStart"/>
       <w:r>
@@ -17456,7 +17515,7 @@
           <w:szCs w:val="16"/>
           <w:lang w:val="it-CH"/>
         </w:rPr>
-        <w:t>vendor</w:t>
+        <w:t>VendorController</w:t>
       </w:r>
       <w:proofErr w:type="spellEnd"/>
       <w:r>
@@ -17466,7 +17525,7 @@
           <w:szCs w:val="16"/>
           <w:lang w:val="it-CH"/>
         </w:rPr>
-        <w:t>', [</w:t>
+        <w:t>::class, '</w:t>
       </w:r>
       <w:proofErr w:type="spellStart"/>
       <w:r>
@@ -17476,7 +17535,7 @@
           <w:szCs w:val="16"/>
           <w:lang w:val="it-CH"/>
         </w:rPr>
-        <w:t>VendorController</w:t>
+        <w:t>index</w:t>
       </w:r>
       <w:proofErr w:type="spellEnd"/>
       <w:r>
@@ -17486,7 +17545,7 @@
           <w:szCs w:val="16"/>
           <w:lang w:val="it-CH"/>
         </w:rPr>
-        <w:t>::class, 'index'])</w:t>
+        <w:t>'])</w:t>
       </w:r>
     </w:p>
     <w:p>
@@ -17511,9 +17570,9 @@
           <w:szCs w:val="16"/>
           <w:lang w:val="it-CH"/>
         </w:rPr>
-        <w:t xml:space="preserve">    -&gt;middleware(['</w:t>
-      </w:r>
-      <w:proofErr w:type="spellStart"/>
+        <w:t xml:space="preserve">    -&gt;</w:t>
+      </w:r>
+      <w:proofErr w:type="gramStart"/>
       <w:r>
         <w:rPr>
           <w:noProof w:val="0"/>
@@ -17521,9 +17580,9 @@
           <w:szCs w:val="16"/>
           <w:lang w:val="it-CH"/>
         </w:rPr>
-        <w:t>auth</w:t>
-      </w:r>
-      <w:proofErr w:type="spellEnd"/>
+        <w:t>middleware(</w:t>
+      </w:r>
+      <w:proofErr w:type="gramEnd"/>
       <w:r>
         <w:rPr>
           <w:noProof w:val="0"/>
@@ -17531,7 +17590,7 @@
           <w:szCs w:val="16"/>
           <w:lang w:val="it-CH"/>
         </w:rPr>
-        <w:t>', '</w:t>
+        <w:t>['</w:t>
       </w:r>
       <w:proofErr w:type="spellStart"/>
       <w:r>
@@ -17541,7 +17600,7 @@
           <w:szCs w:val="16"/>
           <w:lang w:val="it-CH"/>
         </w:rPr>
-        <w:t>verified</w:t>
+        <w:t>auth</w:t>
       </w:r>
       <w:proofErr w:type="spellEnd"/>
       <w:r>
@@ -17561,7 +17620,7 @@
           <w:szCs w:val="16"/>
           <w:lang w:val="it-CH"/>
         </w:rPr>
-        <w:t>vendor</w:t>
+        <w:t>verified</w:t>
       </w:r>
       <w:proofErr w:type="spellEnd"/>
       <w:r>
@@ -17571,7 +17630,7 @@
           <w:szCs w:val="16"/>
           <w:lang w:val="it-CH"/>
         </w:rPr>
-        <w:t>'])</w:t>
+        <w:t>', 'vendor'])</w:t>
       </w:r>
     </w:p>
     <w:p>
@@ -17586,7 +17645,7 @@
           <w:noProof w:val="0"/>
           <w:sz w:val="16"/>
           <w:szCs w:val="16"/>
-          <w:lang w:val="it-CH"/>
+          <w:lang w:val="fr-CH"/>
         </w:rPr>
       </w:pPr>
       <w:r>
@@ -17596,8 +17655,68 @@
           <w:szCs w:val="16"/>
           <w:lang w:val="it-CH"/>
         </w:rPr>
-        <w:t xml:space="preserve">    -&gt;name('vendor');</w:t>
-      </w:r>
+        <w:t xml:space="preserve">    </w:t>
+      </w:r>
+      <w:r>
+        <w:rPr>
+          <w:noProof w:val="0"/>
+          <w:sz w:val="16"/>
+          <w:szCs w:val="16"/>
+          <w:lang w:val="fr-CH"/>
+        </w:rPr>
+        <w:t>-&gt;</w:t>
+      </w:r>
+      <w:proofErr w:type="spellStart"/>
+      <w:r>
+        <w:rPr>
+          <w:noProof w:val="0"/>
+          <w:sz w:val="16"/>
+          <w:szCs w:val="16"/>
+          <w:lang w:val="fr-CH"/>
+        </w:rPr>
+        <w:t>name</w:t>
+      </w:r>
+      <w:proofErr w:type="spellEnd"/>
+      <w:r>
+        <w:rPr>
+          <w:noProof w:val="0"/>
+          <w:sz w:val="16"/>
+          <w:szCs w:val="16"/>
+          <w:lang w:val="fr-CH"/>
+        </w:rPr>
+        <w:t>('</w:t>
+      </w:r>
+      <w:proofErr w:type="spellStart"/>
+      <w:r>
+        <w:rPr>
+          <w:noProof w:val="0"/>
+          <w:sz w:val="16"/>
+          <w:szCs w:val="16"/>
+          <w:lang w:val="fr-CH"/>
+        </w:rPr>
+        <w:t>vendor</w:t>
+      </w:r>
+      <w:proofErr w:type="spellEnd"/>
+      <w:r>
+        <w:rPr>
+          <w:noProof w:val="0"/>
+          <w:sz w:val="16"/>
+          <w:szCs w:val="16"/>
+          <w:lang w:val="fr-CH"/>
+        </w:rPr>
+        <w:t>'</w:t>
+      </w:r>
+      <w:proofErr w:type="gramStart"/>
+      <w:r>
+        <w:rPr>
+          <w:noProof w:val="0"/>
+          <w:sz w:val="16"/>
+          <w:szCs w:val="16"/>
+          <w:lang w:val="fr-CH"/>
+        </w:rPr>
+        <w:t>);</w:t>
+      </w:r>
+      <w:proofErr w:type="gramEnd"/>
     </w:p>
     <w:p>
       <w:pPr>
@@ -17607,72 +17726,62 @@
           <w:b/>
           <w:sz w:val="22"/>
           <w:szCs w:val="22"/>
-          <w:lang w:eastAsia="en-US"/>
-        </w:rPr>
-      </w:pPr>
-      <w:proofErr w:type="spellStart"/>
+          <w:lang w:val="fr-CH" w:eastAsia="en-US"/>
+        </w:rPr>
+      </w:pPr>
+      <w:proofErr w:type="gramStart"/>
       <w:r>
         <w:rPr>
           <w:rFonts w:asciiTheme="minorHAnsi" w:eastAsiaTheme="minorHAnsi" w:hAnsiTheme="minorHAnsi" w:cstheme="minorBidi"/>
           <w:b/>
           <w:sz w:val="22"/>
           <w:szCs w:val="22"/>
-          <w:lang w:eastAsia="en-US"/>
-        </w:rPr>
-        <w:t>Route</w:t>
-      </w:r>
-      <w:proofErr w:type="spellEnd"/>
+          <w:lang w:val="fr-CH" w:eastAsia="en-US"/>
+        </w:rPr>
+        <w:t>Route::</w:t>
+      </w:r>
+      <w:proofErr w:type="spellStart"/>
+      <w:proofErr w:type="gramEnd"/>
       <w:r>
         <w:rPr>
           <w:rFonts w:asciiTheme="minorHAnsi" w:eastAsiaTheme="minorHAnsi" w:hAnsiTheme="minorHAnsi" w:cstheme="minorBidi"/>
           <w:b/>
           <w:sz w:val="22"/>
           <w:szCs w:val="22"/>
-          <w:lang w:eastAsia="en-US"/>
-        </w:rPr>
-        <w:t>::</w:t>
-      </w:r>
-      <w:proofErr w:type="spellStart"/>
+          <w:lang w:val="fr-CH" w:eastAsia="en-US"/>
+        </w:rPr>
+        <w:t>get</w:t>
+      </w:r>
+      <w:proofErr w:type="spellEnd"/>
       <w:r>
         <w:rPr>
           <w:rFonts w:asciiTheme="minorHAnsi" w:eastAsiaTheme="minorHAnsi" w:hAnsiTheme="minorHAnsi" w:cstheme="minorBidi"/>
           <w:b/>
           <w:sz w:val="22"/>
           <w:szCs w:val="22"/>
-          <w:lang w:eastAsia="en-US"/>
-        </w:rPr>
-        <w:t>get</w:t>
-      </w:r>
-      <w:proofErr w:type="spellEnd"/>
+          <w:lang w:val="fr-CH" w:eastAsia="en-US"/>
+        </w:rPr>
+        <w:t>('/</w:t>
+      </w:r>
+      <w:proofErr w:type="spellStart"/>
       <w:r>
         <w:rPr>
           <w:rFonts w:asciiTheme="minorHAnsi" w:eastAsiaTheme="minorHAnsi" w:hAnsiTheme="minorHAnsi" w:cstheme="minorBidi"/>
           <w:b/>
           <w:sz w:val="22"/>
           <w:szCs w:val="22"/>
-          <w:lang w:eastAsia="en-US"/>
-        </w:rPr>
-        <w:t>('/</w:t>
-      </w:r>
-      <w:proofErr w:type="spellStart"/>
+          <w:lang w:val="fr-CH" w:eastAsia="en-US"/>
+        </w:rPr>
+        <w:t>vendor</w:t>
+      </w:r>
+      <w:proofErr w:type="spellEnd"/>
       <w:r>
         <w:rPr>
           <w:rFonts w:asciiTheme="minorHAnsi" w:eastAsiaTheme="minorHAnsi" w:hAnsiTheme="minorHAnsi" w:cstheme="minorBidi"/>
           <w:b/>
           <w:sz w:val="22"/>
           <w:szCs w:val="22"/>
-          <w:lang w:eastAsia="en-US"/>
-        </w:rPr>
-        <w:t>vendor</w:t>
-      </w:r>
-      <w:proofErr w:type="spellEnd"/>
-      <w:r>
-        <w:rPr>
-          <w:rFonts w:asciiTheme="minorHAnsi" w:eastAsiaTheme="minorHAnsi" w:hAnsiTheme="minorHAnsi" w:cstheme="minorBidi"/>
-          <w:b/>
-          <w:sz w:val="22"/>
-          <w:szCs w:val="22"/>
-          <w:lang w:eastAsia="en-US"/>
+          <w:lang w:val="fr-CH" w:eastAsia="en-US"/>
         </w:rPr>
         <w:t>')</w:t>
       </w:r>
@@ -17724,6 +17833,7 @@
         <w:t>[</w:t>
       </w:r>
       <w:proofErr w:type="spellStart"/>
+      <w:proofErr w:type="gramStart"/>
       <w:r>
         <w:rPr>
           <w:rFonts w:asciiTheme="minorHAnsi" w:eastAsiaTheme="minorHAnsi" w:hAnsiTheme="minorHAnsi" w:cstheme="minorBidi"/>
@@ -17743,7 +17853,40 @@
           <w:szCs w:val="22"/>
           <w:lang w:eastAsia="en-US"/>
         </w:rPr>
-        <w:t>::class, 'index']</w:t>
+        <w:t>::</w:t>
+      </w:r>
+      <w:proofErr w:type="gramEnd"/>
+      <w:r>
+        <w:rPr>
+          <w:rFonts w:asciiTheme="minorHAnsi" w:eastAsiaTheme="minorHAnsi" w:hAnsiTheme="minorHAnsi" w:cstheme="minorBidi"/>
+          <w:b/>
+          <w:sz w:val="22"/>
+          <w:szCs w:val="22"/>
+          <w:lang w:eastAsia="en-US"/>
+        </w:rPr>
+        <w:t>class, '</w:t>
+      </w:r>
+      <w:proofErr w:type="spellStart"/>
+      <w:r>
+        <w:rPr>
+          <w:rFonts w:asciiTheme="minorHAnsi" w:eastAsiaTheme="minorHAnsi" w:hAnsiTheme="minorHAnsi" w:cstheme="minorBidi"/>
+          <w:b/>
+          <w:sz w:val="22"/>
+          <w:szCs w:val="22"/>
+          <w:lang w:eastAsia="en-US"/>
+        </w:rPr>
+        <w:t>index</w:t>
+      </w:r>
+      <w:proofErr w:type="spellEnd"/>
+      <w:r>
+        <w:rPr>
+          <w:rFonts w:asciiTheme="minorHAnsi" w:eastAsiaTheme="minorHAnsi" w:hAnsiTheme="minorHAnsi" w:cstheme="minorBidi"/>
+          <w:b/>
+          <w:sz w:val="22"/>
+          <w:szCs w:val="22"/>
+          <w:lang w:eastAsia="en-US"/>
+        </w:rPr>
+        <w:t>']</w:t>
       </w:r>
     </w:p>
     <w:p>
@@ -17768,9 +17911,10 @@
           <w:szCs w:val="22"/>
           <w:lang w:eastAsia="en-US"/>
         </w:rPr>
-        <w:t xml:space="preserve">Questa rotta è gestita da un Controller, specifica che il metodo index() della classe </w:t>
+        <w:t xml:space="preserve">Questa rotta è gestita da un Controller, specifica che il metodo </w:t>
       </w:r>
       <w:proofErr w:type="spellStart"/>
+      <w:proofErr w:type="gramStart"/>
       <w:r>
         <w:rPr>
           <w:rFonts w:asciiTheme="minorHAnsi" w:eastAsiaTheme="minorHAnsi" w:hAnsiTheme="minorHAnsi" w:cstheme="minorBidi"/>
@@ -17778,7 +17922,7 @@
           <w:szCs w:val="22"/>
           <w:lang w:eastAsia="en-US"/>
         </w:rPr>
-        <w:t>VendorController</w:t>
+        <w:t>index</w:t>
       </w:r>
       <w:proofErr w:type="spellEnd"/>
       <w:r>
@@ -17788,9 +17932,9 @@
           <w:szCs w:val="22"/>
           <w:lang w:eastAsia="en-US"/>
         </w:rPr>
-        <w:t xml:space="preserve"> sarà eseguito quando la rotta viene chiamata. Da notare, che la view viene ritornata direttamente dalla classe </w:t>
-      </w:r>
-      <w:proofErr w:type="spellStart"/>
+        <w:t>(</w:t>
+      </w:r>
+      <w:proofErr w:type="gramEnd"/>
       <w:r>
         <w:rPr>
           <w:rFonts w:asciiTheme="minorHAnsi" w:eastAsiaTheme="minorHAnsi" w:hAnsiTheme="minorHAnsi" w:cstheme="minorBidi"/>
@@ -17798,9 +17942,9 @@
           <w:szCs w:val="22"/>
           <w:lang w:eastAsia="en-US"/>
         </w:rPr>
-        <w:t>VendorController</w:t>
-      </w:r>
-      <w:proofErr w:type="spellEnd"/>
+        <w:t xml:space="preserve">) della classe </w:t>
+      </w:r>
+      <w:proofErr w:type="spellStart"/>
       <w:r>
         <w:rPr>
           <w:rFonts w:asciiTheme="minorHAnsi" w:eastAsiaTheme="minorHAnsi" w:hAnsiTheme="minorHAnsi" w:cstheme="minorBidi"/>
@@ -17808,8 +17952,9 @@
           <w:szCs w:val="22"/>
           <w:lang w:eastAsia="en-US"/>
         </w:rPr>
-        <w:t xml:space="preserve"> </w:t>
-      </w:r>
+        <w:t>VendorController</w:t>
+      </w:r>
+      <w:proofErr w:type="spellEnd"/>
       <w:r>
         <w:rPr>
           <w:rFonts w:asciiTheme="minorHAnsi" w:eastAsiaTheme="minorHAnsi" w:hAnsiTheme="minorHAnsi" w:cstheme="minorBidi"/>
@@ -17817,8 +17962,9 @@
           <w:szCs w:val="22"/>
           <w:lang w:eastAsia="en-US"/>
         </w:rPr>
-        <w:t>(all’interno</w:t>
-      </w:r>
+        <w:t xml:space="preserve"> sarà eseguito quando la rotta viene chiamata. Da notare, che la view viene ritornata direttamente dalla classe </w:t>
+      </w:r>
+      <w:proofErr w:type="spellStart"/>
       <w:r>
         <w:rPr>
           <w:rFonts w:asciiTheme="minorHAnsi" w:eastAsiaTheme="minorHAnsi" w:hAnsiTheme="minorHAnsi" w:cstheme="minorBidi"/>
@@ -17826,7 +17972,55 @@
           <w:szCs w:val="22"/>
           <w:lang w:eastAsia="en-US"/>
         </w:rPr>
-        <w:t xml:space="preserve"> del metodo index())</w:t>
+        <w:t>VendorController</w:t>
+      </w:r>
+      <w:proofErr w:type="spellEnd"/>
+      <w:r>
+        <w:rPr>
+          <w:rFonts w:asciiTheme="minorHAnsi" w:eastAsiaTheme="minorHAnsi" w:hAnsiTheme="minorHAnsi" w:cstheme="minorBidi"/>
+          <w:sz w:val="22"/>
+          <w:szCs w:val="22"/>
+          <w:lang w:eastAsia="en-US"/>
+        </w:rPr>
+        <w:t xml:space="preserve"> </w:t>
+      </w:r>
+      <w:r>
+        <w:rPr>
+          <w:rFonts w:asciiTheme="minorHAnsi" w:eastAsiaTheme="minorHAnsi" w:hAnsiTheme="minorHAnsi" w:cstheme="minorBidi"/>
+          <w:sz w:val="22"/>
+          <w:szCs w:val="22"/>
+          <w:lang w:eastAsia="en-US"/>
+        </w:rPr>
+        <w:t>(all’interno</w:t>
+      </w:r>
+      <w:r>
+        <w:rPr>
+          <w:rFonts w:asciiTheme="minorHAnsi" w:eastAsiaTheme="minorHAnsi" w:hAnsiTheme="minorHAnsi" w:cstheme="minorBidi"/>
+          <w:sz w:val="22"/>
+          <w:szCs w:val="22"/>
+          <w:lang w:eastAsia="en-US"/>
+        </w:rPr>
+        <w:t xml:space="preserve"> del metodo </w:t>
+      </w:r>
+      <w:proofErr w:type="gramStart"/>
+      <w:r>
+        <w:rPr>
+          <w:rFonts w:asciiTheme="minorHAnsi" w:eastAsiaTheme="minorHAnsi" w:hAnsiTheme="minorHAnsi" w:cstheme="minorBidi"/>
+          <w:sz w:val="22"/>
+          <w:szCs w:val="22"/>
+          <w:lang w:eastAsia="en-US"/>
+        </w:rPr>
+        <w:t>index(</w:t>
+      </w:r>
+      <w:proofErr w:type="gramEnd"/>
+      <w:r>
+        <w:rPr>
+          <w:rFonts w:asciiTheme="minorHAnsi" w:eastAsiaTheme="minorHAnsi" w:hAnsiTheme="minorHAnsi" w:cstheme="minorBidi"/>
+          <w:sz w:val="22"/>
+          <w:szCs w:val="22"/>
+          <w:lang w:eastAsia="en-US"/>
+        </w:rPr>
+        <w:t>))</w:t>
       </w:r>
     </w:p>
     <w:p>
@@ -17918,29 +18112,7 @@
           <w:szCs w:val="22"/>
           <w:lang w:eastAsia="en-US"/>
         </w:rPr>
-        <w:t>', '</w:t>
-      </w:r>
-      <w:proofErr w:type="spellStart"/>
-      <w:r>
-        <w:rPr>
-          <w:rFonts w:asciiTheme="minorHAnsi" w:eastAsiaTheme="minorHAnsi" w:hAnsiTheme="minorHAnsi" w:cstheme="minorBidi"/>
-          <w:b/>
-          <w:sz w:val="22"/>
-          <w:szCs w:val="22"/>
-          <w:lang w:eastAsia="en-US"/>
-        </w:rPr>
-        <w:t>vendor</w:t>
-      </w:r>
-      <w:proofErr w:type="spellEnd"/>
-      <w:r>
-        <w:rPr>
-          <w:rFonts w:asciiTheme="minorHAnsi" w:eastAsiaTheme="minorHAnsi" w:hAnsiTheme="minorHAnsi" w:cstheme="minorBidi"/>
-          <w:b/>
-          <w:sz w:val="22"/>
-          <w:szCs w:val="22"/>
-          <w:lang w:eastAsia="en-US"/>
-        </w:rPr>
-        <w:t>'])</w:t>
+        <w:t>', 'vendor'])</w:t>
       </w:r>
     </w:p>
     <w:p>
@@ -18264,27 +18436,7 @@
           <w:szCs w:val="22"/>
           <w:lang w:eastAsia="en-US"/>
         </w:rPr>
-        <w:t>Un middleware personalizzato che verifica che l'utente abbia il ruolo di "</w:t>
-      </w:r>
-      <w:proofErr w:type="spellStart"/>
-      <w:r>
-        <w:rPr>
-          <w:rFonts w:asciiTheme="minorHAnsi" w:eastAsiaTheme="minorHAnsi" w:hAnsiTheme="minorHAnsi" w:cstheme="minorBidi"/>
-          <w:sz w:val="22"/>
-          <w:szCs w:val="22"/>
-          <w:lang w:eastAsia="en-US"/>
-        </w:rPr>
-        <w:t>vendor</w:t>
-      </w:r>
-      <w:proofErr w:type="spellEnd"/>
-      <w:r>
-        <w:rPr>
-          <w:rFonts w:asciiTheme="minorHAnsi" w:eastAsiaTheme="minorHAnsi" w:hAnsiTheme="minorHAnsi" w:cstheme="minorBidi"/>
-          <w:sz w:val="22"/>
-          <w:szCs w:val="22"/>
-          <w:lang w:eastAsia="en-US"/>
-        </w:rPr>
-        <w:t>"</w:t>
+        <w:t>Un middleware personalizzato che verifica che l'utente abbia il ruolo di "vendor"</w:t>
       </w:r>
       <w:r>
         <w:rPr>
@@ -18986,7 +19138,15 @@
         <w:spacing w:after="240"/>
       </w:pPr>
       <w:r>
-        <w:t>Breeze crea i seguenti controller in app/Http/Controllers/</w:t>
+        <w:t>Breeze crea i seguenti controller in app/Http/</w:t>
+      </w:r>
+      <w:proofErr w:type="spellStart"/>
+      <w:r>
+        <w:t>Controllers</w:t>
+      </w:r>
+      <w:proofErr w:type="spellEnd"/>
+      <w:r>
+        <w:t>/</w:t>
       </w:r>
       <w:proofErr w:type="spellStart"/>
       <w:r>
@@ -19429,14 +19589,278 @@
     </w:p>
     <w:p>
       <w:pPr>
+        <w:rPr>
+          <w:lang w:val="it-IT"/>
+        </w:rPr>
+      </w:pPr>
+      <w:r>
+        <w:rPr>
+          <w:lang w:val="it-IT"/>
+        </w:rPr>
+        <w:br w:type="page"/>
+      </w:r>
+    </w:p>
+    <w:p>
+      <w:pPr>
         <w:pStyle w:val="Titolo2"/>
       </w:pPr>
       <w:r>
+        <w:lastRenderedPageBreak/>
         <w:t>Aggiunta Prodotti</w:t>
       </w:r>
     </w:p>
     <w:p>
       <w:r>
+        <w:t xml:space="preserve">Per </w:t>
+      </w:r>
+      <w:r>
+        <w:t>l’aggiunta di un prodotto</w:t>
+      </w:r>
+      <w:r>
+        <w:t xml:space="preserve"> bisogna accedere alla pagina “</w:t>
+      </w:r>
+      <w:proofErr w:type="spellStart"/>
+      <w:r>
+        <w:t>add</w:t>
+      </w:r>
+      <w:proofErr w:type="spellEnd"/>
+      <w:r>
+        <w:t>”,</w:t>
+      </w:r>
+      <w:r>
+        <w:t xml:space="preserve"> contenente un </w:t>
+      </w:r>
+      <w:proofErr w:type="spellStart"/>
+      <w:r>
+        <w:t>form</w:t>
+      </w:r>
+      <w:proofErr w:type="spellEnd"/>
+      <w:r>
+        <w:t xml:space="preserve"> </w:t>
+      </w:r>
+      <w:r>
+        <w:t>che richiede</w:t>
+      </w:r>
+      <w:r>
+        <w:t xml:space="preserve"> l’inserimento</w:t>
+      </w:r>
+      <w:r>
+        <w:t xml:space="preserve"> di informazioni</w:t>
+      </w:r>
+      <w:r>
+        <w:t xml:space="preserve"> e immagini del prodotto. Una volta inviati i dati, questi vengono passati tramite POST al metodo </w:t>
+      </w:r>
+      <w:proofErr w:type="gramStart"/>
+      <w:r>
+        <w:t>upload(</w:t>
+      </w:r>
+      <w:proofErr w:type="gramEnd"/>
+      <w:r>
+        <w:t xml:space="preserve">) del </w:t>
+      </w:r>
+      <w:proofErr w:type="spellStart"/>
+      <w:r>
+        <w:t>VendorController</w:t>
+      </w:r>
+      <w:proofErr w:type="spellEnd"/>
+      <w:r>
+        <w:t>.</w:t>
+      </w:r>
+    </w:p>
+    <w:p>
+      <w:r>
+        <w:t>Il sistema crea un nuovo record nella tabella products, e se sono presenti immagini:</w:t>
+      </w:r>
+    </w:p>
+    <w:p>
+      <w:pPr>
+        <w:numPr>
+          <w:ilvl w:val="0"/>
+          <w:numId w:val="39"/>
+        </w:numPr>
+        <w:spacing w:line="259" w:lineRule="auto"/>
+      </w:pPr>
+      <w:r>
+        <w:t>Vengono rinominate con un codice univoco.</w:t>
+      </w:r>
+    </w:p>
+    <w:p>
+      <w:pPr>
+        <w:numPr>
+          <w:ilvl w:val="0"/>
+          <w:numId w:val="39"/>
+        </w:numPr>
+        <w:spacing w:line="259" w:lineRule="auto"/>
+      </w:pPr>
+      <w:r>
+        <w:t>Salvate nella cartella public/</w:t>
+      </w:r>
+      <w:proofErr w:type="spellStart"/>
+      <w:r>
+        <w:t>productImages</w:t>
+      </w:r>
+      <w:proofErr w:type="spellEnd"/>
+      <w:r>
+        <w:t>/</w:t>
+      </w:r>
+      <w:r>
+        <w:t xml:space="preserve"> (tramite metodo</w:t>
+      </w:r>
+      <w:r>
+        <w:t xml:space="preserve"> “</w:t>
+      </w:r>
+      <w:r>
+        <w:t>store</w:t>
+      </w:r>
+      <w:r>
+        <w:t>”</w:t>
+      </w:r>
+      <w:r>
+        <w:t>)</w:t>
+      </w:r>
+      <w:r>
+        <w:t>.</w:t>
+      </w:r>
+    </w:p>
+    <w:p>
+      <w:pPr>
+        <w:numPr>
+          <w:ilvl w:val="0"/>
+          <w:numId w:val="39"/>
+        </w:numPr>
+        <w:spacing w:line="259" w:lineRule="auto"/>
+      </w:pPr>
+      <w:r>
+        <w:t>Il percorso relativo dell’immagine viene memorizzato nel database nella tabella images.</w:t>
+      </w:r>
+    </w:p>
+    <w:p>
+      <w:r>
+        <w:t>Se l’operazione va a buon fine, il vendor viene reindirizzato alla pagina precedente con un messaggio di conferma</w:t>
+      </w:r>
+      <w:r>
+        <w:t>, altrimenti uno di errore</w:t>
+      </w:r>
+      <w:r>
+        <w:t>.</w:t>
+      </w:r>
+    </w:p>
+    <w:p>
+      <w:pPr>
+        <w:pStyle w:val="Titolo2"/>
+      </w:pPr>
+      <w:r>
+        <w:t>Impiego di transazioni</w:t>
+      </w:r>
+    </w:p>
+    <w:p>
+      <w:pPr>
+        <w:rPr>
+          <w:lang w:val="it-IT"/>
+        </w:rPr>
+      </w:pPr>
+      <w:r>
+        <w:t>Per l’aggiunta di un prodotto sono state utilizzate le transazioni, che applicano le modifiche solo al termine di un blocco di codice. In caso di errore, tutte le operazioni possono essere annullate, garantendo una gestione semplice, sicura e pulita dei dati.</w:t>
+      </w:r>
+    </w:p>
+    <w:p>
+      <w:pPr>
+        <w:pStyle w:val="Titolo2"/>
+      </w:pPr>
+      <w:r>
+        <w:t>Gestione errori</w:t>
+      </w:r>
+    </w:p>
+    <w:p>
+      <w:pPr>
+        <w:rPr>
+          <w:lang w:val="it-IT"/>
+        </w:rPr>
+      </w:pPr>
+      <w:r>
+        <w:rPr>
+          <w:lang w:val="it-IT"/>
+        </w:rPr>
+        <w:t>Gli errori vengono gestiti principalmente dalle classi "</w:t>
+      </w:r>
+      <w:proofErr w:type="spellStart"/>
+      <w:r>
+        <w:rPr>
+          <w:lang w:val="it-IT"/>
+        </w:rPr>
+        <w:t>Request</w:t>
+      </w:r>
+      <w:proofErr w:type="spellEnd"/>
+      <w:r>
+        <w:rPr>
+          <w:lang w:val="it-IT"/>
+        </w:rPr>
+        <w:t xml:space="preserve">", all'interno delle quali sono definiti i vincoli per i campi del </w:t>
+      </w:r>
+      <w:proofErr w:type="spellStart"/>
+      <w:r>
+        <w:rPr>
+          <w:lang w:val="it-IT"/>
+        </w:rPr>
+        <w:t>form</w:t>
+      </w:r>
+      <w:proofErr w:type="spellEnd"/>
+      <w:r>
+        <w:rPr>
+          <w:lang w:val="it-IT"/>
+        </w:rPr>
+        <w:t xml:space="preserve">, le regole di validazione e i messaggi di errore personalizzati. In caso di errore, </w:t>
+      </w:r>
+      <w:proofErr w:type="spellStart"/>
+      <w:r>
+        <w:rPr>
+          <w:lang w:val="it-IT"/>
+        </w:rPr>
+        <w:t>Laravel</w:t>
+      </w:r>
+      <w:proofErr w:type="spellEnd"/>
+      <w:r>
+        <w:rPr>
+          <w:lang w:val="it-IT"/>
+        </w:rPr>
+        <w:t xml:space="preserve"> restituisce automaticamente i messaggi associati, semplificando la gestione lato controller.</w:t>
+      </w:r>
+      <w:bookmarkStart w:id="38" w:name="_GoBack"/>
+      <w:bookmarkEnd w:id="38"/>
+    </w:p>
+    <w:p>
+      <w:pPr>
+        <w:pStyle w:val="Titolo2"/>
+      </w:pPr>
+      <w:r>
+        <w:t>Gestione utenti</w:t>
+      </w:r>
+    </w:p>
+    <w:p>
+      <w:pPr>
+        <w:rPr>
+          <w:lang w:val="it-IT"/>
+        </w:rPr>
+      </w:pPr>
+    </w:p>
+    <w:p>
+      <w:pPr>
+        <w:pStyle w:val="Titolo2"/>
+      </w:pPr>
+      <w:r>
+        <w:t>Gestione prodotti</w:t>
+      </w:r>
+    </w:p>
+    <w:p>
+      <w:pPr>
+        <w:rPr>
+          <w:lang w:val="it-IT"/>
+        </w:rPr>
+      </w:pPr>
+    </w:p>
+    <w:p/>
+    <w:p>
+      <w:r>
         <w:br w:type="page"/>
       </w:r>
     </w:p>
@@ -19447,9 +19871,9 @@
           <w:lang w:val="it-IT"/>
         </w:rPr>
       </w:pPr>
-      <w:bookmarkStart w:id="38" w:name="_Toc461179223"/>
-      <w:bookmarkStart w:id="39" w:name="_Toc94790460"/>
-      <w:bookmarkStart w:id="40" w:name="_Toc189853868"/>
+      <w:bookmarkStart w:id="39" w:name="_Toc461179223"/>
+      <w:bookmarkStart w:id="40" w:name="_Toc94790460"/>
+      <w:bookmarkStart w:id="41" w:name="_Toc189853868"/>
       <w:r>
         <w:rPr>
           <w:lang w:val="it-IT"/>
@@ -19457,23 +19881,23 @@
         <w:lastRenderedPageBreak/>
         <w:t>Test</w:t>
       </w:r>
-      <w:bookmarkEnd w:id="38"/>
       <w:bookmarkEnd w:id="39"/>
       <w:bookmarkEnd w:id="40"/>
+      <w:bookmarkEnd w:id="41"/>
     </w:p>
     <w:p>
       <w:pPr>
         <w:pStyle w:val="Titolo2"/>
       </w:pPr>
-      <w:bookmarkStart w:id="41" w:name="_Toc461179224"/>
-      <w:bookmarkStart w:id="42" w:name="_Toc94790461"/>
-      <w:bookmarkStart w:id="43" w:name="_Toc189853869"/>
+      <w:bookmarkStart w:id="42" w:name="_Toc461179224"/>
+      <w:bookmarkStart w:id="43" w:name="_Toc94790461"/>
+      <w:bookmarkStart w:id="44" w:name="_Toc189853869"/>
       <w:r>
         <w:t>Protocollo di test</w:t>
       </w:r>
-      <w:bookmarkEnd w:id="41"/>
       <w:bookmarkEnd w:id="42"/>
       <w:bookmarkEnd w:id="43"/>
+      <w:bookmarkEnd w:id="44"/>
     </w:p>
     <w:p>
       <w:pPr>
@@ -20510,7 +20934,7 @@
           <w:lang w:val="fr-CH"/>
         </w:rPr>
       </w:pPr>
-      <w:bookmarkStart w:id="44" w:name="_Toc461179225"/>
+      <w:bookmarkStart w:id="45" w:name="_Toc461179225"/>
       <w:r>
         <w:rPr>
           <w:lang w:val="fr-CH"/>
@@ -20522,15 +20946,15 @@
       <w:pPr>
         <w:pStyle w:val="Titolo2"/>
       </w:pPr>
-      <w:bookmarkStart w:id="45" w:name="_Toc94790462"/>
-      <w:bookmarkStart w:id="46" w:name="_Toc189853870"/>
+      <w:bookmarkStart w:id="46" w:name="_Toc94790462"/>
+      <w:bookmarkStart w:id="47" w:name="_Toc189853870"/>
       <w:r>
         <w:lastRenderedPageBreak/>
         <w:t>Risultati test</w:t>
       </w:r>
-      <w:bookmarkEnd w:id="44"/>
       <w:bookmarkEnd w:id="45"/>
       <w:bookmarkEnd w:id="46"/>
+      <w:bookmarkEnd w:id="47"/>
     </w:p>
     <w:p>
       <w:pPr>
@@ -20549,18 +20973,18 @@
       <w:pPr>
         <w:pStyle w:val="Titolo2"/>
       </w:pPr>
-      <w:bookmarkStart w:id="47" w:name="_Toc461179226"/>
-      <w:bookmarkStart w:id="48" w:name="_Toc94790463"/>
-      <w:bookmarkStart w:id="49" w:name="_Toc189853871"/>
+      <w:bookmarkStart w:id="48" w:name="_Toc461179226"/>
+      <w:bookmarkStart w:id="49" w:name="_Toc94790463"/>
+      <w:bookmarkStart w:id="50" w:name="_Toc189853871"/>
       <w:r>
         <w:t>Mancanze</w:t>
       </w:r>
       <w:r>
         <w:t>/limitazioni conosciute</w:t>
       </w:r>
-      <w:bookmarkEnd w:id="47"/>
       <w:bookmarkEnd w:id="48"/>
       <w:bookmarkEnd w:id="49"/>
+      <w:bookmarkEnd w:id="50"/>
     </w:p>
     <w:p>
       <w:pPr>
@@ -20582,18 +21006,18 @@
           <w:lang w:val="it-IT"/>
         </w:rPr>
       </w:pPr>
-      <w:bookmarkStart w:id="50" w:name="_Toc461179227"/>
-      <w:bookmarkStart w:id="51" w:name="_Toc94790464"/>
-      <w:bookmarkStart w:id="52" w:name="_Toc189853872"/>
+      <w:bookmarkStart w:id="51" w:name="_Toc461179227"/>
+      <w:bookmarkStart w:id="52" w:name="_Toc94790464"/>
+      <w:bookmarkStart w:id="53" w:name="_Toc189853872"/>
       <w:r>
         <w:rPr>
           <w:lang w:val="it-IT"/>
         </w:rPr>
         <w:t>Consuntivo</w:t>
       </w:r>
-      <w:bookmarkEnd w:id="50"/>
       <w:bookmarkEnd w:id="51"/>
       <w:bookmarkEnd w:id="52"/>
+      <w:bookmarkEnd w:id="53"/>
     </w:p>
     <w:p>
       <w:pPr>
@@ -20617,14 +21041,7 @@
         <w:rPr>
           <w:lang w:val="it-IT"/>
         </w:rPr>
-        <w:t xml:space="preserve"> 1.7) (ad esempio </w:t>
-      </w:r>
-      <w:proofErr w:type="spellStart"/>
-      <w:r>
-        <w:rPr>
-          <w:lang w:val="it-IT"/>
-        </w:rPr>
-        <w:t>Gan</w:t>
+        <w:t xml:space="preserve"> 1.7) (ad esempio Gan</w:t>
       </w:r>
       <w:r>
         <w:rPr>
@@ -20636,14 +21053,7 @@
         <w:rPr>
           <w:lang w:val="it-IT"/>
         </w:rPr>
-        <w:t>t</w:t>
-      </w:r>
-      <w:proofErr w:type="spellEnd"/>
-      <w:r>
-        <w:rPr>
-          <w:lang w:val="it-IT"/>
-        </w:rPr>
-        <w:t xml:space="preserve"> consuntivo).</w:t>
+        <w:t>t consuntivo).</w:t>
       </w:r>
     </w:p>
     <w:p>
@@ -20653,18 +21063,18 @@
           <w:lang w:val="it-IT"/>
         </w:rPr>
       </w:pPr>
-      <w:bookmarkStart w:id="53" w:name="_Toc461179228"/>
-      <w:bookmarkStart w:id="54" w:name="_Toc94790465"/>
-      <w:bookmarkStart w:id="55" w:name="_Toc189853873"/>
+      <w:bookmarkStart w:id="54" w:name="_Toc461179228"/>
+      <w:bookmarkStart w:id="55" w:name="_Toc94790465"/>
+      <w:bookmarkStart w:id="56" w:name="_Toc189853873"/>
       <w:r>
         <w:rPr>
           <w:lang w:val="it-IT"/>
         </w:rPr>
         <w:t>Conclusioni</w:t>
       </w:r>
-      <w:bookmarkEnd w:id="53"/>
       <w:bookmarkEnd w:id="54"/>
       <w:bookmarkEnd w:id="55"/>
+      <w:bookmarkEnd w:id="56"/>
     </w:p>
     <w:p>
       <w:pPr>
@@ -20755,15 +21165,15 @@
       <w:pPr>
         <w:pStyle w:val="Titolo2"/>
       </w:pPr>
-      <w:bookmarkStart w:id="56" w:name="_Toc461179229"/>
-      <w:bookmarkStart w:id="57" w:name="_Toc94790466"/>
-      <w:bookmarkStart w:id="58" w:name="_Toc189853874"/>
+      <w:bookmarkStart w:id="57" w:name="_Toc461179229"/>
+      <w:bookmarkStart w:id="58" w:name="_Toc94790466"/>
+      <w:bookmarkStart w:id="59" w:name="_Toc189853874"/>
       <w:r>
         <w:t>Sviluppi futuri</w:t>
       </w:r>
-      <w:bookmarkEnd w:id="56"/>
       <w:bookmarkEnd w:id="57"/>
       <w:bookmarkEnd w:id="58"/>
+      <w:bookmarkEnd w:id="59"/>
     </w:p>
     <w:p>
       <w:pPr>
@@ -20782,15 +21192,15 @@
       <w:pPr>
         <w:pStyle w:val="Titolo2"/>
       </w:pPr>
-      <w:bookmarkStart w:id="59" w:name="_Toc461179230"/>
-      <w:bookmarkStart w:id="60" w:name="_Toc94790467"/>
-      <w:bookmarkStart w:id="61" w:name="_Toc189853875"/>
+      <w:bookmarkStart w:id="60" w:name="_Toc461179230"/>
+      <w:bookmarkStart w:id="61" w:name="_Toc94790467"/>
+      <w:bookmarkStart w:id="62" w:name="_Toc189853875"/>
       <w:r>
         <w:t>Considerazioni personali</w:t>
       </w:r>
-      <w:bookmarkEnd w:id="59"/>
       <w:bookmarkEnd w:id="60"/>
       <w:bookmarkEnd w:id="61"/>
+      <w:bookmarkEnd w:id="62"/>
     </w:p>
     <w:p>
       <w:pPr>
@@ -20818,17 +21228,17 @@
           <w:lang w:val="it-IT"/>
         </w:rPr>
       </w:pPr>
-      <w:bookmarkStart w:id="62" w:name="_Toc94790468"/>
-      <w:bookmarkStart w:id="63" w:name="_Toc189853876"/>
-      <w:bookmarkStart w:id="64" w:name="_Toc461179232"/>
+      <w:bookmarkStart w:id="63" w:name="_Toc94790468"/>
+      <w:bookmarkStart w:id="64" w:name="_Toc189853876"/>
+      <w:bookmarkStart w:id="65" w:name="_Toc461179232"/>
       <w:r>
         <w:rPr>
           <w:lang w:val="it-IT"/>
         </w:rPr>
         <w:t>Glossario</w:t>
       </w:r>
-      <w:bookmarkEnd w:id="62"/>
       <w:bookmarkEnd w:id="63"/>
+      <w:bookmarkEnd w:id="64"/>
     </w:p>
     <w:p>
       <w:pPr>
@@ -21054,7 +21464,7 @@
           <w:lang w:val="it-IT"/>
         </w:rPr>
       </w:pPr>
-      <w:bookmarkStart w:id="65" w:name="_Toc94790469"/>
+      <w:bookmarkStart w:id="66" w:name="_Toc94790469"/>
       <w:r>
         <w:rPr>
           <w:lang w:val="it-IT"/>
@@ -21069,7 +21479,7 @@
           <w:lang w:val="it-IT"/>
         </w:rPr>
       </w:pPr>
-      <w:bookmarkStart w:id="66" w:name="_Toc189853877"/>
+      <w:bookmarkStart w:id="67" w:name="_Toc189853877"/>
       <w:r>
         <w:rPr>
           <w:lang w:val="it-IT"/>
@@ -21077,21 +21487,21 @@
         <w:lastRenderedPageBreak/>
         <w:t>Bibliografia</w:t>
       </w:r>
+      <w:bookmarkEnd w:id="66"/>
+      <w:bookmarkEnd w:id="67"/>
+    </w:p>
+    <w:p>
+      <w:pPr>
+        <w:pStyle w:val="Titolo2"/>
+      </w:pPr>
+      <w:bookmarkStart w:id="68" w:name="_Toc94790470"/>
+      <w:bookmarkStart w:id="69" w:name="_Toc189853878"/>
+      <w:r>
+        <w:t>Bibliografia per articoli di riviste:</w:t>
+      </w:r>
       <w:bookmarkEnd w:id="65"/>
-      <w:bookmarkEnd w:id="66"/>
-    </w:p>
-    <w:p>
-      <w:pPr>
-        <w:pStyle w:val="Titolo2"/>
-      </w:pPr>
-      <w:bookmarkStart w:id="67" w:name="_Toc94790470"/>
-      <w:bookmarkStart w:id="68" w:name="_Toc189853878"/>
-      <w:r>
-        <w:t>Bibliografia per articoli di riviste:</w:t>
-      </w:r>
-      <w:bookmarkEnd w:id="64"/>
-      <w:bookmarkEnd w:id="67"/>
       <w:bookmarkEnd w:id="68"/>
+      <w:bookmarkEnd w:id="69"/>
     </w:p>
     <w:p>
       <w:pPr>
@@ -21200,15 +21610,15 @@
       <w:pPr>
         <w:pStyle w:val="Titolo2"/>
       </w:pPr>
-      <w:bookmarkStart w:id="69" w:name="_Toc461179233"/>
-      <w:bookmarkStart w:id="70" w:name="_Toc94790471"/>
-      <w:bookmarkStart w:id="71" w:name="_Toc189853879"/>
+      <w:bookmarkStart w:id="70" w:name="_Toc461179233"/>
+      <w:bookmarkStart w:id="71" w:name="_Toc94790471"/>
+      <w:bookmarkStart w:id="72" w:name="_Toc189853879"/>
       <w:r>
         <w:t>Bibliografia per libri</w:t>
       </w:r>
-      <w:bookmarkEnd w:id="69"/>
       <w:bookmarkEnd w:id="70"/>
       <w:bookmarkEnd w:id="71"/>
+      <w:bookmarkEnd w:id="72"/>
     </w:p>
     <w:p>
       <w:pPr>
@@ -21333,20 +21743,20 @@
           <w:lang w:val="it-IT"/>
         </w:rPr>
       </w:pPr>
-      <w:bookmarkStart w:id="72" w:name="_Toc461179234"/>
+      <w:bookmarkStart w:id="73" w:name="_Toc461179234"/>
     </w:p>
     <w:p>
       <w:pPr>
         <w:pStyle w:val="Titolo2"/>
       </w:pPr>
-      <w:bookmarkStart w:id="73" w:name="_Toc94790472"/>
-      <w:bookmarkStart w:id="74" w:name="_Toc189853880"/>
+      <w:bookmarkStart w:id="74" w:name="_Toc94790472"/>
+      <w:bookmarkStart w:id="75" w:name="_Toc189853880"/>
       <w:r>
         <w:t>Sitografia</w:t>
       </w:r>
-      <w:bookmarkEnd w:id="72"/>
       <w:bookmarkEnd w:id="73"/>
       <w:bookmarkEnd w:id="74"/>
+      <w:bookmarkEnd w:id="75"/>
     </w:p>
     <w:p>
       <w:pPr>
@@ -21504,18 +21914,18 @@
           <w:lang w:val="it-IT"/>
         </w:rPr>
       </w:pPr>
-      <w:bookmarkStart w:id="75" w:name="_Toc461179235"/>
-      <w:bookmarkStart w:id="76" w:name="_Toc94790473"/>
-      <w:bookmarkStart w:id="77" w:name="_Toc189853881"/>
+      <w:bookmarkStart w:id="76" w:name="_Toc461179235"/>
+      <w:bookmarkStart w:id="77" w:name="_Toc94790473"/>
+      <w:bookmarkStart w:id="78" w:name="_Toc189853881"/>
       <w:r>
         <w:rPr>
           <w:lang w:val="it-IT"/>
         </w:rPr>
         <w:t>Allegati</w:t>
       </w:r>
-      <w:bookmarkEnd w:id="75"/>
       <w:bookmarkEnd w:id="76"/>
       <w:bookmarkEnd w:id="77"/>
+      <w:bookmarkEnd w:id="78"/>
     </w:p>
     <w:p>
       <w:pPr>
@@ -21703,7 +22113,7 @@
 </file>
 
 <file path=word/endnotes.xml><?xml version="1.0" encoding="utf-8"?>
-<w:endnotes xmlns:wpc="http://schemas.microsoft.com/office/word/2010/wordprocessingCanvas" xmlns:cx="http://schemas.microsoft.com/office/drawing/2014/chartex" xmlns:cx1="http://schemas.microsoft.com/office/drawing/2015/9/8/chartex" xmlns:cx2="http://schemas.microsoft.com/office/drawing/2015/10/21/chartex" xmlns:cx3="http://schemas.microsoft.com/office/drawing/2016/5/9/chartex" xmlns:cx4="http://schemas.microsoft.com/office/drawing/2016/5/10/chartex" xmlns:cx5="http://schemas.microsoft.com/office/drawing/2016/5/11/chartex" xmlns:cx6="http://schemas.microsoft.com/office/drawing/2016/5/12/chartex" xmlns:cx7="http://schemas.microsoft.com/office/drawing/2016/5/13/chartex" xmlns:cx8="http://schemas.microsoft.com/office/drawing/2016/5/14/chartex" xmlns:mc="http://schemas.openxmlformats.org/markup-compatibility/2006" xmlns:aink="http://schemas.microsoft.com/office/drawing/2016/ink" xmlns:am3d="http://schemas.microsoft.com/office/drawing/2017/model3d" xmlns:o="urn:schemas-microsoft-com:office:office" xmlns:oel="http://schemas.microsoft.com/office/2019/extlst" xmlns:r="http://schemas.openxmlformats.org/officeDocument/2006/relationships" xmlns:m="http://schemas.openxmlformats.org/officeDocument/2006/math" xmlns:v="urn:schemas-microsoft-com:vml" xmlns:wp14="http://schemas.microsoft.com/office/word/2010/wordprocessingDrawing" xmlns:wp="http://schemas.openxmlformats.org/drawingml/2006/wordprocessingDrawing" xmlns:w10="urn:schemas-microsoft-com:office:word" xmlns:w="http://schemas.openxmlformats.org/wordprocessingml/2006/main" xmlns:w14="http://schemas.microsoft.com/office/word/2010/wordml" xmlns:w15="http://schemas.microsoft.com/office/word/2012/wordml" xmlns:w16cex="http://schemas.microsoft.com/office/word/2018/wordml/cex" xmlns:w16cid="http://schemas.microsoft.com/office/word/2016/wordml/cid" xmlns:w16="http://schemas.microsoft.com/office/word/2018/wordml" xmlns:w16du="http://schemas.microsoft.com/office/word/2023/wordml/word16du" xmlns:w16sdtdh="http://schemas.microsoft.com/office/word/2020/wordml/sdtdatahash" xmlns:w16sdtfl="http://schemas.microsoft.com/office/word/2024/wordml/sdtformatlock" xmlns:w16se="http://schemas.microsoft.com/office/word/2015/wordml/symex" xmlns:wpg="http://schemas.microsoft.com/office/word/2010/wordprocessingGroup" xmlns:wpi="http://schemas.microsoft.com/office/word/2010/wordprocessingInk" xmlns:wne="http://schemas.microsoft.com/office/word/2006/wordml" xmlns:wps="http://schemas.microsoft.com/office/word/2010/wordprocessingShape" mc:Ignorable="w14 w15 w16se w16cid w16 w16cex w16sdtdh w16sdtfl w16du wp14">
+<w:endnotes xmlns:wpc="http://schemas.microsoft.com/office/word/2010/wordprocessingCanvas" xmlns:cx="http://schemas.microsoft.com/office/drawing/2014/chartex" xmlns:cx1="http://schemas.microsoft.com/office/drawing/2015/9/8/chartex" xmlns:cx2="http://schemas.microsoft.com/office/drawing/2015/10/21/chartex" xmlns:cx3="http://schemas.microsoft.com/office/drawing/2016/5/9/chartex" xmlns:cx4="http://schemas.microsoft.com/office/drawing/2016/5/10/chartex" xmlns:cx5="http://schemas.microsoft.com/office/drawing/2016/5/11/chartex" xmlns:cx6="http://schemas.microsoft.com/office/drawing/2016/5/12/chartex" xmlns:cx7="http://schemas.microsoft.com/office/drawing/2016/5/13/chartex" xmlns:cx8="http://schemas.microsoft.com/office/drawing/2016/5/14/chartex" xmlns:mc="http://schemas.openxmlformats.org/markup-compatibility/2006" xmlns:aink="http://schemas.microsoft.com/office/drawing/2016/ink" xmlns:am3d="http://schemas.microsoft.com/office/drawing/2017/model3d" xmlns:o="urn:schemas-microsoft-com:office:office" xmlns:r="http://schemas.openxmlformats.org/officeDocument/2006/relationships" xmlns:m="http://schemas.openxmlformats.org/officeDocument/2006/math" xmlns:v="urn:schemas-microsoft-com:vml" xmlns:wp14="http://schemas.microsoft.com/office/word/2010/wordprocessingDrawing" xmlns:wp="http://schemas.openxmlformats.org/drawingml/2006/wordprocessingDrawing" xmlns:w10="urn:schemas-microsoft-com:office:word" xmlns:w="http://schemas.openxmlformats.org/wordprocessingml/2006/main" xmlns:w14="http://schemas.microsoft.com/office/word/2010/wordml" xmlns:w15="http://schemas.microsoft.com/office/word/2012/wordml" xmlns:w16cid="http://schemas.microsoft.com/office/word/2016/wordml/cid" xmlns:w16se="http://schemas.microsoft.com/office/word/2015/wordml/symex" xmlns:wpg="http://schemas.microsoft.com/office/word/2010/wordprocessingGroup" xmlns:wpi="http://schemas.microsoft.com/office/word/2010/wordprocessingInk" xmlns:wne="http://schemas.microsoft.com/office/word/2006/wordml" xmlns:wps="http://schemas.microsoft.com/office/word/2010/wordprocessingShape" mc:Ignorable="w14 w15 w16se w16cid wp14">
   <w:endnote w:type="separator" w:id="-1">
     <w:p>
       <w:r>
@@ -21722,7 +22132,7 @@
 </file>
 
 <file path=word/footer1.xml><?xml version="1.0" encoding="utf-8"?>
-<w:ftr xmlns:wpc="http://schemas.microsoft.com/office/word/2010/wordprocessingCanvas" xmlns:cx="http://schemas.microsoft.com/office/drawing/2014/chartex" xmlns:cx1="http://schemas.microsoft.com/office/drawing/2015/9/8/chartex" xmlns:cx2="http://schemas.microsoft.com/office/drawing/2015/10/21/chartex" xmlns:cx3="http://schemas.microsoft.com/office/drawing/2016/5/9/chartex" xmlns:cx4="http://schemas.microsoft.com/office/drawing/2016/5/10/chartex" xmlns:cx5="http://schemas.microsoft.com/office/drawing/2016/5/11/chartex" xmlns:cx6="http://schemas.microsoft.com/office/drawing/2016/5/12/chartex" xmlns:cx7="http://schemas.microsoft.com/office/drawing/2016/5/13/chartex" xmlns:cx8="http://schemas.microsoft.com/office/drawing/2016/5/14/chartex" xmlns:mc="http://schemas.openxmlformats.org/markup-compatibility/2006" xmlns:aink="http://schemas.microsoft.com/office/drawing/2016/ink" xmlns:am3d="http://schemas.microsoft.com/office/drawing/2017/model3d" xmlns:o="urn:schemas-microsoft-com:office:office" xmlns:oel="http://schemas.microsoft.com/office/2019/extlst" xmlns:r="http://schemas.openxmlformats.org/officeDocument/2006/relationships" xmlns:m="http://schemas.openxmlformats.org/officeDocument/2006/math" xmlns:v="urn:schemas-microsoft-com:vml" xmlns:wp14="http://schemas.microsoft.com/office/word/2010/wordprocessingDrawing" xmlns:wp="http://schemas.openxmlformats.org/drawingml/2006/wordprocessingDrawing" xmlns:w10="urn:schemas-microsoft-com:office:word" xmlns:w="http://schemas.openxmlformats.org/wordprocessingml/2006/main" xmlns:w14="http://schemas.microsoft.com/office/word/2010/wordml" xmlns:w15="http://schemas.microsoft.com/office/word/2012/wordml" xmlns:w16cex="http://schemas.microsoft.com/office/word/2018/wordml/cex" xmlns:w16cid="http://schemas.microsoft.com/office/word/2016/wordml/cid" xmlns:w16="http://schemas.microsoft.com/office/word/2018/wordml" xmlns:w16du="http://schemas.microsoft.com/office/word/2023/wordml/word16du" xmlns:w16sdtdh="http://schemas.microsoft.com/office/word/2020/wordml/sdtdatahash" xmlns:w16sdtfl="http://schemas.microsoft.com/office/word/2024/wordml/sdtformatlock" xmlns:w16se="http://schemas.microsoft.com/office/word/2015/wordml/symex" xmlns:wpg="http://schemas.microsoft.com/office/word/2010/wordprocessingGroup" xmlns:wpi="http://schemas.microsoft.com/office/word/2010/wordprocessingInk" xmlns:wne="http://schemas.microsoft.com/office/word/2006/wordml" xmlns:wps="http://schemas.microsoft.com/office/word/2010/wordprocessingShape" mc:Ignorable="w14 w15 w16se w16cid w16 w16cex w16sdtdh w16sdtfl w16du wp14">
+<w:ftr xmlns:wpc="http://schemas.microsoft.com/office/word/2010/wordprocessingCanvas" xmlns:cx="http://schemas.microsoft.com/office/drawing/2014/chartex" xmlns:cx1="http://schemas.microsoft.com/office/drawing/2015/9/8/chartex" xmlns:cx2="http://schemas.microsoft.com/office/drawing/2015/10/21/chartex" xmlns:cx3="http://schemas.microsoft.com/office/drawing/2016/5/9/chartex" xmlns:cx4="http://schemas.microsoft.com/office/drawing/2016/5/10/chartex" xmlns:cx5="http://schemas.microsoft.com/office/drawing/2016/5/11/chartex" xmlns:cx6="http://schemas.microsoft.com/office/drawing/2016/5/12/chartex" xmlns:cx7="http://schemas.microsoft.com/office/drawing/2016/5/13/chartex" xmlns:cx8="http://schemas.microsoft.com/office/drawing/2016/5/14/chartex" xmlns:mc="http://schemas.openxmlformats.org/markup-compatibility/2006" xmlns:aink="http://schemas.microsoft.com/office/drawing/2016/ink" xmlns:am3d="http://schemas.microsoft.com/office/drawing/2017/model3d" xmlns:o="urn:schemas-microsoft-com:office:office" xmlns:r="http://schemas.openxmlformats.org/officeDocument/2006/relationships" xmlns:m="http://schemas.openxmlformats.org/officeDocument/2006/math" xmlns:v="urn:schemas-microsoft-com:vml" xmlns:wp14="http://schemas.microsoft.com/office/word/2010/wordprocessingDrawing" xmlns:wp="http://schemas.openxmlformats.org/drawingml/2006/wordprocessingDrawing" xmlns:w10="urn:schemas-microsoft-com:office:word" xmlns:w="http://schemas.openxmlformats.org/wordprocessingml/2006/main" xmlns:w14="http://schemas.microsoft.com/office/word/2010/wordml" xmlns:w15="http://schemas.microsoft.com/office/word/2012/wordml" xmlns:w16cid="http://schemas.microsoft.com/office/word/2016/wordml/cid" xmlns:w16se="http://schemas.microsoft.com/office/word/2015/wordml/symex" xmlns:wpg="http://schemas.microsoft.com/office/word/2010/wordprocessingGroup" xmlns:wpi="http://schemas.microsoft.com/office/word/2010/wordprocessingInk" xmlns:wne="http://schemas.microsoft.com/office/word/2006/wordml" xmlns:wps="http://schemas.microsoft.com/office/word/2010/wordprocessingShape" mc:Ignorable="w14 w15 w16se w16cid wp14">
   <w:p>
     <w:pPr>
       <w:pStyle w:val="Pidipagina"/>
@@ -21746,21 +22156,7 @@
       <w:rPr>
         <w:lang w:val="fr-CH"/>
       </w:rPr>
-      <w:t xml:space="preserve">, </w:t>
-    </w:r>
-    <w:proofErr w:type="spellStart"/>
-    <w:r>
-      <w:rPr>
-        <w:lang w:val="fr-CH"/>
-      </w:rPr>
-      <w:t>Samuele</w:t>
-    </w:r>
-    <w:proofErr w:type="spellEnd"/>
-    <w:r>
-      <w:rPr>
-        <w:lang w:val="fr-CH"/>
-      </w:rPr>
-      <w:t>, Andrea N.</w:t>
+      <w:t>, Samuele, Andrea N.</w:t>
     </w:r>
     <w:r>
       <w:rPr>
@@ -21776,6 +22172,7 @@
       <w:tab/>
     </w:r>
     <w:proofErr w:type="spellStart"/>
+    <w:proofErr w:type="gramStart"/>
     <w:r>
       <w:rPr>
         <w:lang w:val="fr-CH"/>
@@ -21787,7 +22184,14 @@
       <w:rPr>
         <w:lang w:val="fr-CH"/>
       </w:rPr>
-      <w:t xml:space="preserve">: </w:t>
+      <w:t>:</w:t>
+    </w:r>
+    <w:proofErr w:type="gramEnd"/>
+    <w:r>
+      <w:rPr>
+        <w:lang w:val="fr-CH"/>
+      </w:rPr>
+      <w:t xml:space="preserve"> </w:t>
     </w:r>
     <w:r>
       <w:rPr>
@@ -21818,7 +22222,7 @@
 </file>
 
 <file path=word/footer2.xml><?xml version="1.0" encoding="utf-8"?>
-<w:ftr xmlns:wpc="http://schemas.microsoft.com/office/word/2010/wordprocessingCanvas" xmlns:cx="http://schemas.microsoft.com/office/drawing/2014/chartex" xmlns:cx1="http://schemas.microsoft.com/office/drawing/2015/9/8/chartex" xmlns:cx2="http://schemas.microsoft.com/office/drawing/2015/10/21/chartex" xmlns:cx3="http://schemas.microsoft.com/office/drawing/2016/5/9/chartex" xmlns:cx4="http://schemas.microsoft.com/office/drawing/2016/5/10/chartex" xmlns:cx5="http://schemas.microsoft.com/office/drawing/2016/5/11/chartex" xmlns:cx6="http://schemas.microsoft.com/office/drawing/2016/5/12/chartex" xmlns:cx7="http://schemas.microsoft.com/office/drawing/2016/5/13/chartex" xmlns:cx8="http://schemas.microsoft.com/office/drawing/2016/5/14/chartex" xmlns:mc="http://schemas.openxmlformats.org/markup-compatibility/2006" xmlns:aink="http://schemas.microsoft.com/office/drawing/2016/ink" xmlns:am3d="http://schemas.microsoft.com/office/drawing/2017/model3d" xmlns:o="urn:schemas-microsoft-com:office:office" xmlns:oel="http://schemas.microsoft.com/office/2019/extlst" xmlns:r="http://schemas.openxmlformats.org/officeDocument/2006/relationships" xmlns:m="http://schemas.openxmlformats.org/officeDocument/2006/math" xmlns:v="urn:schemas-microsoft-com:vml" xmlns:wp14="http://schemas.microsoft.com/office/word/2010/wordprocessingDrawing" xmlns:wp="http://schemas.openxmlformats.org/drawingml/2006/wordprocessingDrawing" xmlns:w10="urn:schemas-microsoft-com:office:word" xmlns:w="http://schemas.openxmlformats.org/wordprocessingml/2006/main" xmlns:w14="http://schemas.microsoft.com/office/word/2010/wordml" xmlns:w15="http://schemas.microsoft.com/office/word/2012/wordml" xmlns:w16cex="http://schemas.microsoft.com/office/word/2018/wordml/cex" xmlns:w16cid="http://schemas.microsoft.com/office/word/2016/wordml/cid" xmlns:w16="http://schemas.microsoft.com/office/word/2018/wordml" xmlns:w16du="http://schemas.microsoft.com/office/word/2023/wordml/word16du" xmlns:w16sdtdh="http://schemas.microsoft.com/office/word/2020/wordml/sdtdatahash" xmlns:w16sdtfl="http://schemas.microsoft.com/office/word/2024/wordml/sdtformatlock" xmlns:w16se="http://schemas.microsoft.com/office/word/2015/wordml/symex" xmlns:wpg="http://schemas.microsoft.com/office/word/2010/wordprocessingGroup" xmlns:wpi="http://schemas.microsoft.com/office/word/2010/wordprocessingInk" xmlns:wne="http://schemas.microsoft.com/office/word/2006/wordml" xmlns:wps="http://schemas.microsoft.com/office/word/2010/wordprocessingShape" mc:Ignorable="w14 w15 w16se w16cid w16 w16cex w16sdtdh w16sdtfl w16du wp14">
+<w:ftr xmlns:wpc="http://schemas.microsoft.com/office/word/2010/wordprocessingCanvas" xmlns:cx="http://schemas.microsoft.com/office/drawing/2014/chartex" xmlns:cx1="http://schemas.microsoft.com/office/drawing/2015/9/8/chartex" xmlns:cx2="http://schemas.microsoft.com/office/drawing/2015/10/21/chartex" xmlns:cx3="http://schemas.microsoft.com/office/drawing/2016/5/9/chartex" xmlns:cx4="http://schemas.microsoft.com/office/drawing/2016/5/10/chartex" xmlns:cx5="http://schemas.microsoft.com/office/drawing/2016/5/11/chartex" xmlns:cx6="http://schemas.microsoft.com/office/drawing/2016/5/12/chartex" xmlns:cx7="http://schemas.microsoft.com/office/drawing/2016/5/13/chartex" xmlns:cx8="http://schemas.microsoft.com/office/drawing/2016/5/14/chartex" xmlns:mc="http://schemas.openxmlformats.org/markup-compatibility/2006" xmlns:aink="http://schemas.microsoft.com/office/drawing/2016/ink" xmlns:am3d="http://schemas.microsoft.com/office/drawing/2017/model3d" xmlns:o="urn:schemas-microsoft-com:office:office" xmlns:r="http://schemas.openxmlformats.org/officeDocument/2006/relationships" xmlns:m="http://schemas.openxmlformats.org/officeDocument/2006/math" xmlns:v="urn:schemas-microsoft-com:vml" xmlns:wp14="http://schemas.microsoft.com/office/word/2010/wordprocessingDrawing" xmlns:wp="http://schemas.openxmlformats.org/drawingml/2006/wordprocessingDrawing" xmlns:w10="urn:schemas-microsoft-com:office:word" xmlns:w="http://schemas.openxmlformats.org/wordprocessingml/2006/main" xmlns:w14="http://schemas.microsoft.com/office/word/2010/wordml" xmlns:w15="http://schemas.microsoft.com/office/word/2012/wordml" xmlns:w16cid="http://schemas.microsoft.com/office/word/2016/wordml/cid" xmlns:w16se="http://schemas.microsoft.com/office/word/2015/wordml/symex" xmlns:wpg="http://schemas.microsoft.com/office/word/2010/wordprocessingGroup" xmlns:wpi="http://schemas.microsoft.com/office/word/2010/wordprocessingInk" xmlns:wne="http://schemas.microsoft.com/office/word/2006/wordml" xmlns:wps="http://schemas.microsoft.com/office/word/2010/wordprocessingShape" mc:Ignorable="w14 w15 w16se w16cid wp14">
   <w:tbl>
     <w:tblPr>
       <w:tblW w:w="0" w:type="auto"/>
@@ -21861,14 +22265,12 @@
               <w:lang w:val="it-IT"/>
             </w:rPr>
           </w:pPr>
-          <w:proofErr w:type="spellStart"/>
           <w:r>
             <w:rPr>
               <w:lang w:val="it-IT"/>
             </w:rPr>
             <w:t>Fyt</w:t>
           </w:r>
-          <w:proofErr w:type="spellEnd"/>
         </w:p>
       </w:tc>
     </w:tr>
@@ -22053,7 +22455,7 @@
 </file>
 
 <file path=word/footnotes.xml><?xml version="1.0" encoding="utf-8"?>
-<w:footnotes xmlns:wpc="http://schemas.microsoft.com/office/word/2010/wordprocessingCanvas" xmlns:cx="http://schemas.microsoft.com/office/drawing/2014/chartex" xmlns:cx1="http://schemas.microsoft.com/office/drawing/2015/9/8/chartex" xmlns:cx2="http://schemas.microsoft.com/office/drawing/2015/10/21/chartex" xmlns:cx3="http://schemas.microsoft.com/office/drawing/2016/5/9/chartex" xmlns:cx4="http://schemas.microsoft.com/office/drawing/2016/5/10/chartex" xmlns:cx5="http://schemas.microsoft.com/office/drawing/2016/5/11/chartex" xmlns:cx6="http://schemas.microsoft.com/office/drawing/2016/5/12/chartex" xmlns:cx7="http://schemas.microsoft.com/office/drawing/2016/5/13/chartex" xmlns:cx8="http://schemas.microsoft.com/office/drawing/2016/5/14/chartex" xmlns:mc="http://schemas.openxmlformats.org/markup-compatibility/2006" xmlns:aink="http://schemas.microsoft.com/office/drawing/2016/ink" xmlns:am3d="http://schemas.microsoft.com/office/drawing/2017/model3d" xmlns:o="urn:schemas-microsoft-com:office:office" xmlns:oel="http://schemas.microsoft.com/office/2019/extlst" xmlns:r="http://schemas.openxmlformats.org/officeDocument/2006/relationships" xmlns:m="http://schemas.openxmlformats.org/officeDocument/2006/math" xmlns:v="urn:schemas-microsoft-com:vml" xmlns:wp14="http://schemas.microsoft.com/office/word/2010/wordprocessingDrawing" xmlns:wp="http://schemas.openxmlformats.org/drawingml/2006/wordprocessingDrawing" xmlns:w10="urn:schemas-microsoft-com:office:word" xmlns:w="http://schemas.openxmlformats.org/wordprocessingml/2006/main" xmlns:w14="http://schemas.microsoft.com/office/word/2010/wordml" xmlns:w15="http://schemas.microsoft.com/office/word/2012/wordml" xmlns:w16cex="http://schemas.microsoft.com/office/word/2018/wordml/cex" xmlns:w16cid="http://schemas.microsoft.com/office/word/2016/wordml/cid" xmlns:w16="http://schemas.microsoft.com/office/word/2018/wordml" xmlns:w16du="http://schemas.microsoft.com/office/word/2023/wordml/word16du" xmlns:w16sdtdh="http://schemas.microsoft.com/office/word/2020/wordml/sdtdatahash" xmlns:w16sdtfl="http://schemas.microsoft.com/office/word/2024/wordml/sdtformatlock" xmlns:w16se="http://schemas.microsoft.com/office/word/2015/wordml/symex" xmlns:wpg="http://schemas.microsoft.com/office/word/2010/wordprocessingGroup" xmlns:wpi="http://schemas.microsoft.com/office/word/2010/wordprocessingInk" xmlns:wne="http://schemas.microsoft.com/office/word/2006/wordml" xmlns:wps="http://schemas.microsoft.com/office/word/2010/wordprocessingShape" mc:Ignorable="w14 w15 w16se w16cid w16 w16cex w16sdtdh w16sdtfl w16du wp14">
+<w:footnotes xmlns:wpc="http://schemas.microsoft.com/office/word/2010/wordprocessingCanvas" xmlns:cx="http://schemas.microsoft.com/office/drawing/2014/chartex" xmlns:cx1="http://schemas.microsoft.com/office/drawing/2015/9/8/chartex" xmlns:cx2="http://schemas.microsoft.com/office/drawing/2015/10/21/chartex" xmlns:cx3="http://schemas.microsoft.com/office/drawing/2016/5/9/chartex" xmlns:cx4="http://schemas.microsoft.com/office/drawing/2016/5/10/chartex" xmlns:cx5="http://schemas.microsoft.com/office/drawing/2016/5/11/chartex" xmlns:cx6="http://schemas.microsoft.com/office/drawing/2016/5/12/chartex" xmlns:cx7="http://schemas.microsoft.com/office/drawing/2016/5/13/chartex" xmlns:cx8="http://schemas.microsoft.com/office/drawing/2016/5/14/chartex" xmlns:mc="http://schemas.openxmlformats.org/markup-compatibility/2006" xmlns:aink="http://schemas.microsoft.com/office/drawing/2016/ink" xmlns:am3d="http://schemas.microsoft.com/office/drawing/2017/model3d" xmlns:o="urn:schemas-microsoft-com:office:office" xmlns:r="http://schemas.openxmlformats.org/officeDocument/2006/relationships" xmlns:m="http://schemas.openxmlformats.org/officeDocument/2006/math" xmlns:v="urn:schemas-microsoft-com:vml" xmlns:wp14="http://schemas.microsoft.com/office/word/2010/wordprocessingDrawing" xmlns:wp="http://schemas.openxmlformats.org/drawingml/2006/wordprocessingDrawing" xmlns:w10="urn:schemas-microsoft-com:office:word" xmlns:w="http://schemas.openxmlformats.org/wordprocessingml/2006/main" xmlns:w14="http://schemas.microsoft.com/office/word/2010/wordml" xmlns:w15="http://schemas.microsoft.com/office/word/2012/wordml" xmlns:w16cid="http://schemas.microsoft.com/office/word/2016/wordml/cid" xmlns:w16se="http://schemas.microsoft.com/office/word/2015/wordml/symex" xmlns:wpg="http://schemas.microsoft.com/office/word/2010/wordprocessingGroup" xmlns:wpi="http://schemas.microsoft.com/office/word/2010/wordprocessingInk" xmlns:wne="http://schemas.microsoft.com/office/word/2006/wordml" xmlns:wps="http://schemas.microsoft.com/office/word/2010/wordprocessingShape" mc:Ignorable="w14 w15 w16se w16cid wp14">
   <w:footnote w:type="separator" w:id="-1">
     <w:p>
       <w:r>
@@ -22072,7 +22474,7 @@
 </file>
 
 <file path=word/header1.xml><?xml version="1.0" encoding="utf-8"?>
-<w:hdr xmlns:wpc="http://schemas.microsoft.com/office/word/2010/wordprocessingCanvas" xmlns:cx="http://schemas.microsoft.com/office/drawing/2014/chartex" xmlns:cx1="http://schemas.microsoft.com/office/drawing/2015/9/8/chartex" xmlns:cx2="http://schemas.microsoft.com/office/drawing/2015/10/21/chartex" xmlns:cx3="http://schemas.microsoft.com/office/drawing/2016/5/9/chartex" xmlns:cx4="http://schemas.microsoft.com/office/drawing/2016/5/10/chartex" xmlns:cx5="http://schemas.microsoft.com/office/drawing/2016/5/11/chartex" xmlns:cx6="http://schemas.microsoft.com/office/drawing/2016/5/12/chartex" xmlns:cx7="http://schemas.microsoft.com/office/drawing/2016/5/13/chartex" xmlns:cx8="http://schemas.microsoft.com/office/drawing/2016/5/14/chartex" xmlns:mc="http://schemas.openxmlformats.org/markup-compatibility/2006" xmlns:aink="http://schemas.microsoft.com/office/drawing/2016/ink" xmlns:am3d="http://schemas.microsoft.com/office/drawing/2017/model3d" xmlns:o="urn:schemas-microsoft-com:office:office" xmlns:oel="http://schemas.microsoft.com/office/2019/extlst" xmlns:r="http://schemas.openxmlformats.org/officeDocument/2006/relationships" xmlns:m="http://schemas.openxmlformats.org/officeDocument/2006/math" xmlns:v="urn:schemas-microsoft-com:vml" xmlns:wp14="http://schemas.microsoft.com/office/word/2010/wordprocessingDrawing" xmlns:wp="http://schemas.openxmlformats.org/drawingml/2006/wordprocessingDrawing" xmlns:w10="urn:schemas-microsoft-com:office:word" xmlns:w="http://schemas.openxmlformats.org/wordprocessingml/2006/main" xmlns:w14="http://schemas.microsoft.com/office/word/2010/wordml" xmlns:w15="http://schemas.microsoft.com/office/word/2012/wordml" xmlns:w16cex="http://schemas.microsoft.com/office/word/2018/wordml/cex" xmlns:w16cid="http://schemas.microsoft.com/office/word/2016/wordml/cid" xmlns:w16="http://schemas.microsoft.com/office/word/2018/wordml" xmlns:w16du="http://schemas.microsoft.com/office/word/2023/wordml/word16du" xmlns:w16sdtdh="http://schemas.microsoft.com/office/word/2020/wordml/sdtdatahash" xmlns:w16sdtfl="http://schemas.microsoft.com/office/word/2024/wordml/sdtformatlock" xmlns:w16se="http://schemas.microsoft.com/office/word/2015/wordml/symex" xmlns:wpg="http://schemas.microsoft.com/office/word/2010/wordprocessingGroup" xmlns:wpi="http://schemas.microsoft.com/office/word/2010/wordprocessingInk" xmlns:wne="http://schemas.microsoft.com/office/word/2006/wordml" xmlns:wps="http://schemas.microsoft.com/office/word/2010/wordprocessingShape" mc:Ignorable="w14 w15 w16se w16cid w16 w16cex w16sdtdh w16sdtfl w16du wp14">
+<w:hdr xmlns:wpc="http://schemas.microsoft.com/office/word/2010/wordprocessingCanvas" xmlns:cx="http://schemas.microsoft.com/office/drawing/2014/chartex" xmlns:cx1="http://schemas.microsoft.com/office/drawing/2015/9/8/chartex" xmlns:cx2="http://schemas.microsoft.com/office/drawing/2015/10/21/chartex" xmlns:cx3="http://schemas.microsoft.com/office/drawing/2016/5/9/chartex" xmlns:cx4="http://schemas.microsoft.com/office/drawing/2016/5/10/chartex" xmlns:cx5="http://schemas.microsoft.com/office/drawing/2016/5/11/chartex" xmlns:cx6="http://schemas.microsoft.com/office/drawing/2016/5/12/chartex" xmlns:cx7="http://schemas.microsoft.com/office/drawing/2016/5/13/chartex" xmlns:cx8="http://schemas.microsoft.com/office/drawing/2016/5/14/chartex" xmlns:mc="http://schemas.openxmlformats.org/markup-compatibility/2006" xmlns:aink="http://schemas.microsoft.com/office/drawing/2016/ink" xmlns:am3d="http://schemas.microsoft.com/office/drawing/2017/model3d" xmlns:o="urn:schemas-microsoft-com:office:office" xmlns:r="http://schemas.openxmlformats.org/officeDocument/2006/relationships" xmlns:m="http://schemas.openxmlformats.org/officeDocument/2006/math" xmlns:v="urn:schemas-microsoft-com:vml" xmlns:wp14="http://schemas.microsoft.com/office/word/2010/wordprocessingDrawing" xmlns:wp="http://schemas.openxmlformats.org/drawingml/2006/wordprocessingDrawing" xmlns:w10="urn:schemas-microsoft-com:office:word" xmlns:w="http://schemas.openxmlformats.org/wordprocessingml/2006/main" xmlns:w14="http://schemas.microsoft.com/office/word/2010/wordml" xmlns:w15="http://schemas.microsoft.com/office/word/2012/wordml" xmlns:w16cid="http://schemas.microsoft.com/office/word/2016/wordml/cid" xmlns:w16se="http://schemas.microsoft.com/office/word/2015/wordml/symex" xmlns:wpg="http://schemas.microsoft.com/office/word/2010/wordprocessingGroup" xmlns:wpi="http://schemas.microsoft.com/office/word/2010/wordprocessingInk" xmlns:wne="http://schemas.microsoft.com/office/word/2006/wordml" xmlns:wps="http://schemas.microsoft.com/office/word/2010/wordprocessingShape" mc:Ignorable="w14 w15 w16se w16cid wp14">
   <w:tbl>
     <w:tblPr>
       <w:tblW w:w="9639" w:type="dxa"/>
@@ -22388,7 +22790,6 @@
               <w:szCs w:val="24"/>
             </w:rPr>
           </w:pPr>
-          <w:proofErr w:type="spellStart"/>
           <w:r>
             <w:rPr>
               <w:rFonts w:cs="Arial"/>
@@ -22398,7 +22799,6 @@
             </w:rPr>
             <w:t>Fyt</w:t>
           </w:r>
-          <w:proofErr w:type="spellEnd"/>
         </w:p>
       </w:tc>
       <w:tc>
@@ -22443,7 +22843,7 @@
 </file>
 
 <file path=word/header2.xml><?xml version="1.0" encoding="utf-8"?>
-<w:hdr xmlns:wpc="http://schemas.microsoft.com/office/word/2010/wordprocessingCanvas" xmlns:cx="http://schemas.microsoft.com/office/drawing/2014/chartex" xmlns:cx1="http://schemas.microsoft.com/office/drawing/2015/9/8/chartex" xmlns:cx2="http://schemas.microsoft.com/office/drawing/2015/10/21/chartex" xmlns:cx3="http://schemas.microsoft.com/office/drawing/2016/5/9/chartex" xmlns:cx4="http://schemas.microsoft.com/office/drawing/2016/5/10/chartex" xmlns:cx5="http://schemas.microsoft.com/office/drawing/2016/5/11/chartex" xmlns:cx6="http://schemas.microsoft.com/office/drawing/2016/5/12/chartex" xmlns:cx7="http://schemas.microsoft.com/office/drawing/2016/5/13/chartex" xmlns:cx8="http://schemas.microsoft.com/office/drawing/2016/5/14/chartex" xmlns:mc="http://schemas.openxmlformats.org/markup-compatibility/2006" xmlns:aink="http://schemas.microsoft.com/office/drawing/2016/ink" xmlns:am3d="http://schemas.microsoft.com/office/drawing/2017/model3d" xmlns:o="urn:schemas-microsoft-com:office:office" xmlns:oel="http://schemas.microsoft.com/office/2019/extlst" xmlns:r="http://schemas.openxmlformats.org/officeDocument/2006/relationships" xmlns:m="http://schemas.openxmlformats.org/officeDocument/2006/math" xmlns:v="urn:schemas-microsoft-com:vml" xmlns:wp14="http://schemas.microsoft.com/office/word/2010/wordprocessingDrawing" xmlns:wp="http://schemas.openxmlformats.org/drawingml/2006/wordprocessingDrawing" xmlns:w10="urn:schemas-microsoft-com:office:word" xmlns:w="http://schemas.openxmlformats.org/wordprocessingml/2006/main" xmlns:w14="http://schemas.microsoft.com/office/word/2010/wordml" xmlns:w15="http://schemas.microsoft.com/office/word/2012/wordml" xmlns:w16cex="http://schemas.microsoft.com/office/word/2018/wordml/cex" xmlns:w16cid="http://schemas.microsoft.com/office/word/2016/wordml/cid" xmlns:w16="http://schemas.microsoft.com/office/word/2018/wordml" xmlns:w16du="http://schemas.microsoft.com/office/word/2023/wordml/word16du" xmlns:w16sdtdh="http://schemas.microsoft.com/office/word/2020/wordml/sdtdatahash" xmlns:w16sdtfl="http://schemas.microsoft.com/office/word/2024/wordml/sdtformatlock" xmlns:w16se="http://schemas.microsoft.com/office/word/2015/wordml/symex" xmlns:wpg="http://schemas.microsoft.com/office/word/2010/wordprocessingGroup" xmlns:wpi="http://schemas.microsoft.com/office/word/2010/wordprocessingInk" xmlns:wne="http://schemas.microsoft.com/office/word/2006/wordml" xmlns:wps="http://schemas.microsoft.com/office/word/2010/wordprocessingShape" mc:Ignorable="w14 w15 w16se w16cid w16 w16cex w16sdtdh w16sdtfl w16du wp14">
+<w:hdr xmlns:wpc="http://schemas.microsoft.com/office/word/2010/wordprocessingCanvas" xmlns:cx="http://schemas.microsoft.com/office/drawing/2014/chartex" xmlns:cx1="http://schemas.microsoft.com/office/drawing/2015/9/8/chartex" xmlns:cx2="http://schemas.microsoft.com/office/drawing/2015/10/21/chartex" xmlns:cx3="http://schemas.microsoft.com/office/drawing/2016/5/9/chartex" xmlns:cx4="http://schemas.microsoft.com/office/drawing/2016/5/10/chartex" xmlns:cx5="http://schemas.microsoft.com/office/drawing/2016/5/11/chartex" xmlns:cx6="http://schemas.microsoft.com/office/drawing/2016/5/12/chartex" xmlns:cx7="http://schemas.microsoft.com/office/drawing/2016/5/13/chartex" xmlns:cx8="http://schemas.microsoft.com/office/drawing/2016/5/14/chartex" xmlns:mc="http://schemas.openxmlformats.org/markup-compatibility/2006" xmlns:aink="http://schemas.microsoft.com/office/drawing/2016/ink" xmlns:am3d="http://schemas.microsoft.com/office/drawing/2017/model3d" xmlns:o="urn:schemas-microsoft-com:office:office" xmlns:r="http://schemas.openxmlformats.org/officeDocument/2006/relationships" xmlns:m="http://schemas.openxmlformats.org/officeDocument/2006/math" xmlns:v="urn:schemas-microsoft-com:vml" xmlns:wp14="http://schemas.microsoft.com/office/word/2010/wordprocessingDrawing" xmlns:wp="http://schemas.openxmlformats.org/drawingml/2006/wordprocessingDrawing" xmlns:w10="urn:schemas-microsoft-com:office:word" xmlns:w="http://schemas.openxmlformats.org/wordprocessingml/2006/main" xmlns:w14="http://schemas.microsoft.com/office/word/2010/wordml" xmlns:w15="http://schemas.microsoft.com/office/word/2012/wordml" xmlns:w16cid="http://schemas.microsoft.com/office/word/2016/wordml/cid" xmlns:w16se="http://schemas.microsoft.com/office/word/2015/wordml/symex" xmlns:wpg="http://schemas.microsoft.com/office/word/2010/wordprocessingGroup" xmlns:wpi="http://schemas.microsoft.com/office/word/2010/wordprocessingInk" xmlns:wne="http://schemas.microsoft.com/office/word/2006/wordml" xmlns:wps="http://schemas.microsoft.com/office/word/2010/wordprocessingShape" mc:Ignorable="w14 w15 w16se w16cid wp14">
   <w:tbl>
     <w:tblPr>
       <w:tblW w:w="9644" w:type="dxa"/>
@@ -22666,7 +23066,7 @@
 </file>
 
 <file path=word/numbering.xml><?xml version="1.0" encoding="utf-8"?>
-<w:numbering xmlns:wpc="http://schemas.microsoft.com/office/word/2010/wordprocessingCanvas" xmlns:cx="http://schemas.microsoft.com/office/drawing/2014/chartex" xmlns:cx1="http://schemas.microsoft.com/office/drawing/2015/9/8/chartex" xmlns:cx2="http://schemas.microsoft.com/office/drawing/2015/10/21/chartex" xmlns:cx3="http://schemas.microsoft.com/office/drawing/2016/5/9/chartex" xmlns:cx4="http://schemas.microsoft.com/office/drawing/2016/5/10/chartex" xmlns:cx5="http://schemas.microsoft.com/office/drawing/2016/5/11/chartex" xmlns:cx6="http://schemas.microsoft.com/office/drawing/2016/5/12/chartex" xmlns:cx7="http://schemas.microsoft.com/office/drawing/2016/5/13/chartex" xmlns:cx8="http://schemas.microsoft.com/office/drawing/2016/5/14/chartex" xmlns:mc="http://schemas.openxmlformats.org/markup-compatibility/2006" xmlns:aink="http://schemas.microsoft.com/office/drawing/2016/ink" xmlns:am3d="http://schemas.microsoft.com/office/drawing/2017/model3d" xmlns:o="urn:schemas-microsoft-com:office:office" xmlns:oel="http://schemas.microsoft.com/office/2019/extlst" xmlns:r="http://schemas.openxmlformats.org/officeDocument/2006/relationships" xmlns:m="http://schemas.openxmlformats.org/officeDocument/2006/math" xmlns:v="urn:schemas-microsoft-com:vml" xmlns:wp14="http://schemas.microsoft.com/office/word/2010/wordprocessingDrawing" xmlns:wp="http://schemas.openxmlformats.org/drawingml/2006/wordprocessingDrawing" xmlns:w10="urn:schemas-microsoft-com:office:word" xmlns:w="http://schemas.openxmlformats.org/wordprocessingml/2006/main" xmlns:w14="http://schemas.microsoft.com/office/word/2010/wordml" xmlns:w15="http://schemas.microsoft.com/office/word/2012/wordml" xmlns:w16cex="http://schemas.microsoft.com/office/word/2018/wordml/cex" xmlns:w16cid="http://schemas.microsoft.com/office/word/2016/wordml/cid" xmlns:w16="http://schemas.microsoft.com/office/word/2018/wordml" xmlns:w16du="http://schemas.microsoft.com/office/word/2023/wordml/word16du" xmlns:w16sdtdh="http://schemas.microsoft.com/office/word/2020/wordml/sdtdatahash" xmlns:w16sdtfl="http://schemas.microsoft.com/office/word/2024/wordml/sdtformatlock" xmlns:w16se="http://schemas.microsoft.com/office/word/2015/wordml/symex" xmlns:wpg="http://schemas.microsoft.com/office/word/2010/wordprocessingGroup" xmlns:wpi="http://schemas.microsoft.com/office/word/2010/wordprocessingInk" xmlns:wne="http://schemas.microsoft.com/office/word/2006/wordml" xmlns:wps="http://schemas.microsoft.com/office/word/2010/wordprocessingShape" mc:Ignorable="w14 w15 w16se w16cid w16 w16cex w16sdtdh w16sdtfl w16du wp14">
+<w:numbering xmlns:wpc="http://schemas.microsoft.com/office/word/2010/wordprocessingCanvas" xmlns:cx="http://schemas.microsoft.com/office/drawing/2014/chartex" xmlns:cx1="http://schemas.microsoft.com/office/drawing/2015/9/8/chartex" xmlns:cx2="http://schemas.microsoft.com/office/drawing/2015/10/21/chartex" xmlns:cx3="http://schemas.microsoft.com/office/drawing/2016/5/9/chartex" xmlns:cx4="http://schemas.microsoft.com/office/drawing/2016/5/10/chartex" xmlns:cx5="http://schemas.microsoft.com/office/drawing/2016/5/11/chartex" xmlns:cx6="http://schemas.microsoft.com/office/drawing/2016/5/12/chartex" xmlns:cx7="http://schemas.microsoft.com/office/drawing/2016/5/13/chartex" xmlns:cx8="http://schemas.microsoft.com/office/drawing/2016/5/14/chartex" xmlns:mc="http://schemas.openxmlformats.org/markup-compatibility/2006" xmlns:aink="http://schemas.microsoft.com/office/drawing/2016/ink" xmlns:am3d="http://schemas.microsoft.com/office/drawing/2017/model3d" xmlns:o="urn:schemas-microsoft-com:office:office" xmlns:r="http://schemas.openxmlformats.org/officeDocument/2006/relationships" xmlns:m="http://schemas.openxmlformats.org/officeDocument/2006/math" xmlns:v="urn:schemas-microsoft-com:vml" xmlns:wp14="http://schemas.microsoft.com/office/word/2010/wordprocessingDrawing" xmlns:wp="http://schemas.openxmlformats.org/drawingml/2006/wordprocessingDrawing" xmlns:w10="urn:schemas-microsoft-com:office:word" xmlns:w="http://schemas.openxmlformats.org/wordprocessingml/2006/main" xmlns:w14="http://schemas.microsoft.com/office/word/2010/wordml" xmlns:w15="http://schemas.microsoft.com/office/word/2012/wordml" xmlns:w16cid="http://schemas.microsoft.com/office/word/2016/wordml/cid" xmlns:w16se="http://schemas.microsoft.com/office/word/2015/wordml/symex" xmlns:wpg="http://schemas.microsoft.com/office/word/2010/wordprocessingGroup" xmlns:wpi="http://schemas.microsoft.com/office/word/2010/wordprocessingInk" xmlns:wne="http://schemas.microsoft.com/office/word/2006/wordml" xmlns:wps="http://schemas.microsoft.com/office/word/2010/wordprocessingShape" mc:Ignorable="w14 w15 w16se w16cid wp14">
   <w:abstractNum w:abstractNumId="0" w15:restartNumberingAfterBreak="0">
     <w:nsid w:val="0801489A"/>
     <w:multiLevelType w:val="hybridMultilevel"/>
@@ -23573,6 +23973,155 @@
     </w:lvl>
   </w:abstractNum>
   <w:abstractNum w:abstractNumId="7" w15:restartNumberingAfterBreak="0">
+    <w:nsid w:val="20DD04AA"/>
+    <w:multiLevelType w:val="multilevel"/>
+    <w:tmpl w:val="16BA2774"/>
+    <w:lvl w:ilvl="0">
+      <w:start w:val="1"/>
+      <w:numFmt w:val="bullet"/>
+      <w:lvlText w:val=""/>
+      <w:lvlJc w:val="left"/>
+      <w:pPr>
+        <w:tabs>
+          <w:tab w:val="num" w:pos="720"/>
+        </w:tabs>
+        <w:ind w:left="720" w:hanging="360"/>
+      </w:pPr>
+      <w:rPr>
+        <w:rFonts w:ascii="Symbol" w:hAnsi="Symbol" w:hint="default"/>
+        <w:sz w:val="20"/>
+      </w:rPr>
+    </w:lvl>
+    <w:lvl w:ilvl="1" w:tentative="1">
+      <w:start w:val="1"/>
+      <w:numFmt w:val="bullet"/>
+      <w:lvlText w:val="o"/>
+      <w:lvlJc w:val="left"/>
+      <w:pPr>
+        <w:tabs>
+          <w:tab w:val="num" w:pos="1440"/>
+        </w:tabs>
+        <w:ind w:left="1440" w:hanging="360"/>
+      </w:pPr>
+      <w:rPr>
+        <w:rFonts w:ascii="Courier New" w:hAnsi="Courier New" w:hint="default"/>
+        <w:sz w:val="20"/>
+      </w:rPr>
+    </w:lvl>
+    <w:lvl w:ilvl="2" w:tentative="1">
+      <w:start w:val="1"/>
+      <w:numFmt w:val="bullet"/>
+      <w:lvlText w:val=""/>
+      <w:lvlJc w:val="left"/>
+      <w:pPr>
+        <w:tabs>
+          <w:tab w:val="num" w:pos="2160"/>
+        </w:tabs>
+        <w:ind w:left="2160" w:hanging="360"/>
+      </w:pPr>
+      <w:rPr>
+        <w:rFonts w:ascii="Wingdings" w:hAnsi="Wingdings" w:hint="default"/>
+        <w:sz w:val="20"/>
+      </w:rPr>
+    </w:lvl>
+    <w:lvl w:ilvl="3" w:tentative="1">
+      <w:start w:val="1"/>
+      <w:numFmt w:val="bullet"/>
+      <w:lvlText w:val=""/>
+      <w:lvlJc w:val="left"/>
+      <w:pPr>
+        <w:tabs>
+          <w:tab w:val="num" w:pos="2880"/>
+        </w:tabs>
+        <w:ind w:left="2880" w:hanging="360"/>
+      </w:pPr>
+      <w:rPr>
+        <w:rFonts w:ascii="Wingdings" w:hAnsi="Wingdings" w:hint="default"/>
+        <w:sz w:val="20"/>
+      </w:rPr>
+    </w:lvl>
+    <w:lvl w:ilvl="4" w:tentative="1">
+      <w:start w:val="1"/>
+      <w:numFmt w:val="bullet"/>
+      <w:lvlText w:val=""/>
+      <w:lvlJc w:val="left"/>
+      <w:pPr>
+        <w:tabs>
+          <w:tab w:val="num" w:pos="3600"/>
+        </w:tabs>
+        <w:ind w:left="3600" w:hanging="360"/>
+      </w:pPr>
+      <w:rPr>
+        <w:rFonts w:ascii="Wingdings" w:hAnsi="Wingdings" w:hint="default"/>
+        <w:sz w:val="20"/>
+      </w:rPr>
+    </w:lvl>
+    <w:lvl w:ilvl="5" w:tentative="1">
+      <w:start w:val="1"/>
+      <w:numFmt w:val="bullet"/>
+      <w:lvlText w:val=""/>
+      <w:lvlJc w:val="left"/>
+      <w:pPr>
+        <w:tabs>
+          <w:tab w:val="num" w:pos="4320"/>
+        </w:tabs>
+        <w:ind w:left="4320" w:hanging="360"/>
+      </w:pPr>
+      <w:rPr>
+        <w:rFonts w:ascii="Wingdings" w:hAnsi="Wingdings" w:hint="default"/>
+        <w:sz w:val="20"/>
+      </w:rPr>
+    </w:lvl>
+    <w:lvl w:ilvl="6" w:tentative="1">
+      <w:start w:val="1"/>
+      <w:numFmt w:val="bullet"/>
+      <w:lvlText w:val=""/>
+      <w:lvlJc w:val="left"/>
+      <w:pPr>
+        <w:tabs>
+          <w:tab w:val="num" w:pos="5040"/>
+        </w:tabs>
+        <w:ind w:left="5040" w:hanging="360"/>
+      </w:pPr>
+      <w:rPr>
+        <w:rFonts w:ascii="Wingdings" w:hAnsi="Wingdings" w:hint="default"/>
+        <w:sz w:val="20"/>
+      </w:rPr>
+    </w:lvl>
+    <w:lvl w:ilvl="7" w:tentative="1">
+      <w:start w:val="1"/>
+      <w:numFmt w:val="bullet"/>
+      <w:lvlText w:val=""/>
+      <w:lvlJc w:val="left"/>
+      <w:pPr>
+        <w:tabs>
+          <w:tab w:val="num" w:pos="5760"/>
+        </w:tabs>
+        <w:ind w:left="5760" w:hanging="360"/>
+      </w:pPr>
+      <w:rPr>
+        <w:rFonts w:ascii="Wingdings" w:hAnsi="Wingdings" w:hint="default"/>
+        <w:sz w:val="20"/>
+      </w:rPr>
+    </w:lvl>
+    <w:lvl w:ilvl="8" w:tentative="1">
+      <w:start w:val="1"/>
+      <w:numFmt w:val="bullet"/>
+      <w:lvlText w:val=""/>
+      <w:lvlJc w:val="left"/>
+      <w:pPr>
+        <w:tabs>
+          <w:tab w:val="num" w:pos="6480"/>
+        </w:tabs>
+        <w:ind w:left="6480" w:hanging="360"/>
+      </w:pPr>
+      <w:rPr>
+        <w:rFonts w:ascii="Wingdings" w:hAnsi="Wingdings" w:hint="default"/>
+        <w:sz w:val="20"/>
+      </w:rPr>
+    </w:lvl>
+  </w:abstractNum>
+  <w:abstractNum w:abstractNumId="8" w15:restartNumberingAfterBreak="0">
     <w:nsid w:val="22DC02CA"/>
     <w:multiLevelType w:val="hybridMultilevel"/>
     <w:tmpl w:val="3E6C221C"/>
@@ -23712,7 +24261,7 @@
       </w:rPr>
     </w:lvl>
   </w:abstractNum>
-  <w:abstractNum w:abstractNumId="8" w15:restartNumberingAfterBreak="0">
+  <w:abstractNum w:abstractNumId="9" w15:restartNumberingAfterBreak="0">
     <w:nsid w:val="24A46D31"/>
     <w:multiLevelType w:val="hybridMultilevel"/>
     <w:tmpl w:val="A56221F0"/>
@@ -23825,7 +24374,7 @@
       </w:pPr>
     </w:lvl>
   </w:abstractNum>
-  <w:abstractNum w:abstractNumId="9" w15:restartNumberingAfterBreak="0">
+  <w:abstractNum w:abstractNumId="10" w15:restartNumberingAfterBreak="0">
     <w:nsid w:val="29456697"/>
     <w:multiLevelType w:val="hybridMultilevel"/>
     <w:tmpl w:val="E676C64A"/>
@@ -23938,7 +24487,7 @@
       </w:rPr>
     </w:lvl>
   </w:abstractNum>
-  <w:abstractNum w:abstractNumId="10" w15:restartNumberingAfterBreak="0">
+  <w:abstractNum w:abstractNumId="11" w15:restartNumberingAfterBreak="0">
     <w:nsid w:val="2B9476EC"/>
     <w:multiLevelType w:val="hybridMultilevel"/>
     <w:tmpl w:val="0052BF5C"/>
@@ -24051,7 +24600,7 @@
       </w:rPr>
     </w:lvl>
   </w:abstractNum>
-  <w:abstractNum w:abstractNumId="11" w15:restartNumberingAfterBreak="0">
+  <w:abstractNum w:abstractNumId="12" w15:restartNumberingAfterBreak="0">
     <w:nsid w:val="329D7C3E"/>
     <w:multiLevelType w:val="hybridMultilevel"/>
     <w:tmpl w:val="40BE04F0"/>
@@ -24164,7 +24713,7 @@
       </w:rPr>
     </w:lvl>
   </w:abstractNum>
-  <w:abstractNum w:abstractNumId="12" w15:restartNumberingAfterBreak="0">
+  <w:abstractNum w:abstractNumId="13" w15:restartNumberingAfterBreak="0">
     <w:nsid w:val="3ADC387C"/>
     <w:multiLevelType w:val="hybridMultilevel"/>
     <w:tmpl w:val="32E4A98A"/>
@@ -24276,7 +24825,7 @@
       </w:rPr>
     </w:lvl>
   </w:abstractNum>
-  <w:abstractNum w:abstractNumId="13" w15:restartNumberingAfterBreak="0">
+  <w:abstractNum w:abstractNumId="14" w15:restartNumberingAfterBreak="0">
     <w:nsid w:val="57B45EDA"/>
     <w:multiLevelType w:val="hybridMultilevel"/>
     <w:tmpl w:val="9FF06B16"/>
@@ -24389,7 +24938,7 @@
       </w:rPr>
     </w:lvl>
   </w:abstractNum>
-  <w:abstractNum w:abstractNumId="14" w15:restartNumberingAfterBreak="0">
+  <w:abstractNum w:abstractNumId="15" w15:restartNumberingAfterBreak="0">
     <w:nsid w:val="57C86EE7"/>
     <w:multiLevelType w:val="multilevel"/>
     <w:tmpl w:val="4DE6CDEC"/>
@@ -24538,7 +25087,7 @@
       </w:rPr>
     </w:lvl>
   </w:abstractNum>
-  <w:abstractNum w:abstractNumId="15" w15:restartNumberingAfterBreak="0">
+  <w:abstractNum w:abstractNumId="16" w15:restartNumberingAfterBreak="0">
     <w:nsid w:val="5BF17B39"/>
     <w:multiLevelType w:val="hybridMultilevel"/>
     <w:tmpl w:val="0BAC2BA8"/>
@@ -24651,7 +25200,7 @@
       </w:rPr>
     </w:lvl>
   </w:abstractNum>
-  <w:abstractNum w:abstractNumId="16" w15:restartNumberingAfterBreak="0">
+  <w:abstractNum w:abstractNumId="17" w15:restartNumberingAfterBreak="0">
     <w:nsid w:val="652809B9"/>
     <w:multiLevelType w:val="hybridMultilevel"/>
     <w:tmpl w:val="C10EC632"/>
@@ -24764,7 +25313,7 @@
       </w:rPr>
     </w:lvl>
   </w:abstractNum>
-  <w:abstractNum w:abstractNumId="17" w15:restartNumberingAfterBreak="0">
+  <w:abstractNum w:abstractNumId="18" w15:restartNumberingAfterBreak="0">
     <w:nsid w:val="66871ECE"/>
     <w:multiLevelType w:val="hybridMultilevel"/>
     <w:tmpl w:val="7F74FC56"/>
@@ -24880,7 +25429,7 @@
       </w:pPr>
     </w:lvl>
   </w:abstractNum>
-  <w:abstractNum w:abstractNumId="18" w15:restartNumberingAfterBreak="0">
+  <w:abstractNum w:abstractNumId="19" w15:restartNumberingAfterBreak="0">
     <w:nsid w:val="6ABE5228"/>
     <w:multiLevelType w:val="hybridMultilevel"/>
     <w:tmpl w:val="089EE6D8"/>
@@ -24996,7 +25545,7 @@
       </w:pPr>
     </w:lvl>
   </w:abstractNum>
-  <w:abstractNum w:abstractNumId="19" w15:restartNumberingAfterBreak="0">
+  <w:abstractNum w:abstractNumId="20" w15:restartNumberingAfterBreak="0">
     <w:nsid w:val="6BC235CB"/>
     <w:multiLevelType w:val="hybridMultilevel"/>
     <w:tmpl w:val="E448411A"/>
@@ -25109,7 +25658,7 @@
       </w:rPr>
     </w:lvl>
   </w:abstractNum>
-  <w:abstractNum w:abstractNumId="20" w15:restartNumberingAfterBreak="0">
+  <w:abstractNum w:abstractNumId="21" w15:restartNumberingAfterBreak="0">
     <w:nsid w:val="6C1D7334"/>
     <w:multiLevelType w:val="hybridMultilevel"/>
     <w:tmpl w:val="7F20929C"/>
@@ -25225,7 +25774,7 @@
       </w:pPr>
     </w:lvl>
   </w:abstractNum>
-  <w:abstractNum w:abstractNumId="21" w15:restartNumberingAfterBreak="0">
+  <w:abstractNum w:abstractNumId="22" w15:restartNumberingAfterBreak="0">
     <w:nsid w:val="6C827815"/>
     <w:multiLevelType w:val="hybridMultilevel"/>
     <w:tmpl w:val="61685374"/>
@@ -25338,7 +25887,7 @@
       </w:rPr>
     </w:lvl>
   </w:abstractNum>
-  <w:abstractNum w:abstractNumId="22" w15:restartNumberingAfterBreak="0">
+  <w:abstractNum w:abstractNumId="23" w15:restartNumberingAfterBreak="0">
     <w:nsid w:val="72904C79"/>
     <w:multiLevelType w:val="hybridMultilevel"/>
     <w:tmpl w:val="EB328896"/>
@@ -25478,7 +26027,7 @@
       </w:rPr>
     </w:lvl>
   </w:abstractNum>
-  <w:abstractNum w:abstractNumId="23" w15:restartNumberingAfterBreak="0">
+  <w:abstractNum w:abstractNumId="24" w15:restartNumberingAfterBreak="0">
     <w:nsid w:val="74274153"/>
     <w:multiLevelType w:val="hybridMultilevel"/>
     <w:tmpl w:val="903850E8"/>
@@ -25591,7 +26140,7 @@
       </w:rPr>
     </w:lvl>
   </w:abstractNum>
-  <w:abstractNum w:abstractNumId="24" w15:restartNumberingAfterBreak="0">
+  <w:abstractNum w:abstractNumId="25" w15:restartNumberingAfterBreak="0">
     <w:nsid w:val="76DB06C3"/>
     <w:multiLevelType w:val="hybridMultilevel"/>
     <w:tmpl w:val="31DC0C44"/>
@@ -25704,7 +26253,7 @@
       </w:rPr>
     </w:lvl>
   </w:abstractNum>
-  <w:abstractNum w:abstractNumId="25" w15:restartNumberingAfterBreak="0">
+  <w:abstractNum w:abstractNumId="26" w15:restartNumberingAfterBreak="0">
     <w:nsid w:val="79102060"/>
     <w:multiLevelType w:val="hybridMultilevel"/>
     <w:tmpl w:val="7870C630"/>
@@ -25817,7 +26366,7 @@
       </w:rPr>
     </w:lvl>
   </w:abstractNum>
-  <w:abstractNum w:abstractNumId="26" w15:restartNumberingAfterBreak="0">
+  <w:abstractNum w:abstractNumId="27" w15:restartNumberingAfterBreak="0">
     <w:nsid w:val="7ACC392C"/>
     <w:multiLevelType w:val="hybridMultilevel"/>
     <w:tmpl w:val="F282F7F0"/>
@@ -25957,7 +26506,7 @@
       </w:rPr>
     </w:lvl>
   </w:abstractNum>
-  <w:abstractNum w:abstractNumId="27" w15:restartNumberingAfterBreak="0">
+  <w:abstractNum w:abstractNumId="28" w15:restartNumberingAfterBreak="0">
     <w:nsid w:val="7CD54937"/>
     <w:multiLevelType w:val="hybridMultilevel"/>
     <w:tmpl w:val="1AB0305A"/>
@@ -26097,7 +26646,7 @@
       </w:rPr>
     </w:lvl>
   </w:abstractNum>
-  <w:abstractNum w:abstractNumId="28" w15:restartNumberingAfterBreak="0">
+  <w:abstractNum w:abstractNumId="29" w15:restartNumberingAfterBreak="0">
     <w:nsid w:val="7F593CD8"/>
     <w:multiLevelType w:val="hybridMultilevel"/>
     <w:tmpl w:val="3508C29C"/>
@@ -26210,83 +26759,83 @@
       </w:rPr>
     </w:lvl>
   </w:abstractNum>
-  <w:num w:numId="1" w16cid:durableId="741563866">
-    <w:abstractNumId w:val="14"/>
+  <w:num w:numId="1">
+    <w:abstractNumId w:val="15"/>
   </w:num>
-  <w:num w:numId="2" w16cid:durableId="1085347065">
+  <w:num w:numId="2">
     <w:abstractNumId w:val="3"/>
   </w:num>
-  <w:num w:numId="3" w16cid:durableId="1442646058">
-    <w:abstractNumId w:val="7"/>
+  <w:num w:numId="3">
+    <w:abstractNumId w:val="8"/>
   </w:num>
-  <w:num w:numId="4" w16cid:durableId="837236820">
+  <w:num w:numId="4">
     <w:abstractNumId w:val="1"/>
   </w:num>
-  <w:num w:numId="5" w16cid:durableId="1834254077">
+  <w:num w:numId="5">
     <w:abstractNumId w:val="4"/>
   </w:num>
-  <w:num w:numId="6" w16cid:durableId="1995911668">
+  <w:num w:numId="6">
+    <w:abstractNumId w:val="18"/>
+  </w:num>
+  <w:num w:numId="7">
+    <w:abstractNumId w:val="9"/>
+  </w:num>
+  <w:num w:numId="8">
+    <w:abstractNumId w:val="19"/>
+  </w:num>
+  <w:num w:numId="9">
+    <w:abstractNumId w:val="0"/>
+  </w:num>
+  <w:num w:numId="10">
+    <w:abstractNumId w:val="23"/>
+  </w:num>
+  <w:num w:numId="11">
+    <w:abstractNumId w:val="27"/>
+  </w:num>
+  <w:num w:numId="12">
+    <w:abstractNumId w:val="5"/>
+  </w:num>
+  <w:num w:numId="13">
+    <w:abstractNumId w:val="2"/>
+  </w:num>
+  <w:num w:numId="14">
+    <w:abstractNumId w:val="28"/>
+  </w:num>
+  <w:num w:numId="15">
+    <w:abstractNumId w:val="6"/>
+  </w:num>
+  <w:num w:numId="16">
+    <w:abstractNumId w:val="15"/>
+  </w:num>
+  <w:num w:numId="17">
+    <w:abstractNumId w:val="21"/>
+  </w:num>
+  <w:num w:numId="18">
+    <w:abstractNumId w:val="15"/>
+  </w:num>
+  <w:num w:numId="19">
+    <w:abstractNumId w:val="15"/>
+  </w:num>
+  <w:num w:numId="20">
+    <w:abstractNumId w:val="15"/>
+  </w:num>
+  <w:num w:numId="21">
+    <w:abstractNumId w:val="15"/>
+  </w:num>
+  <w:num w:numId="22">
+    <w:abstractNumId w:val="15"/>
+  </w:num>
+  <w:num w:numId="23">
     <w:abstractNumId w:val="17"/>
   </w:num>
-  <w:num w:numId="7" w16cid:durableId="616837475">
-    <w:abstractNumId w:val="8"/>
+  <w:num w:numId="24">
+    <w:abstractNumId w:val="15"/>
   </w:num>
-  <w:num w:numId="8" w16cid:durableId="304698427">
-    <w:abstractNumId w:val="18"/>
+  <w:num w:numId="25">
+    <w:abstractNumId w:val="15"/>
   </w:num>
-  <w:num w:numId="9" w16cid:durableId="1707674954">
-    <w:abstractNumId w:val="0"/>
-  </w:num>
-  <w:num w:numId="10" w16cid:durableId="1995178989">
-    <w:abstractNumId w:val="22"/>
-  </w:num>
-  <w:num w:numId="11" w16cid:durableId="1145927113">
-    <w:abstractNumId w:val="26"/>
-  </w:num>
-  <w:num w:numId="12" w16cid:durableId="92752750">
-    <w:abstractNumId w:val="5"/>
-  </w:num>
-  <w:num w:numId="13" w16cid:durableId="1110901304">
-    <w:abstractNumId w:val="2"/>
-  </w:num>
-  <w:num w:numId="14" w16cid:durableId="1877893020">
-    <w:abstractNumId w:val="27"/>
-  </w:num>
-  <w:num w:numId="15" w16cid:durableId="1437366414">
-    <w:abstractNumId w:val="6"/>
-  </w:num>
-  <w:num w:numId="16" w16cid:durableId="1806585553">
-    <w:abstractNumId w:val="14"/>
-  </w:num>
-  <w:num w:numId="17" w16cid:durableId="2084373464">
-    <w:abstractNumId w:val="20"/>
-  </w:num>
-  <w:num w:numId="18" w16cid:durableId="1772973508">
-    <w:abstractNumId w:val="14"/>
-  </w:num>
-  <w:num w:numId="19" w16cid:durableId="1091463072">
-    <w:abstractNumId w:val="14"/>
-  </w:num>
-  <w:num w:numId="20" w16cid:durableId="625814123">
-    <w:abstractNumId w:val="14"/>
-  </w:num>
-  <w:num w:numId="21" w16cid:durableId="145779919">
-    <w:abstractNumId w:val="14"/>
-  </w:num>
-  <w:num w:numId="22" w16cid:durableId="833187225">
-    <w:abstractNumId w:val="14"/>
-  </w:num>
-  <w:num w:numId="23" w16cid:durableId="2067683231">
-    <w:abstractNumId w:val="16"/>
-  </w:num>
-  <w:num w:numId="24" w16cid:durableId="1749231478">
-    <w:abstractNumId w:val="14"/>
-  </w:num>
-  <w:num w:numId="25" w16cid:durableId="970288093">
-    <w:abstractNumId w:val="14"/>
-  </w:num>
-  <w:num w:numId="26" w16cid:durableId="1824659287">
-    <w:abstractNumId w:val="14"/>
+  <w:num w:numId="26">
+    <w:abstractNumId w:val="15"/>
     <w:lvlOverride w:ilvl="0">
       <w:startOverride w:val="2"/>
     </w:lvlOverride>
@@ -26294,48 +26843,51 @@
       <w:startOverride w:val="3"/>
     </w:lvlOverride>
   </w:num>
-  <w:num w:numId="27" w16cid:durableId="994185022">
+  <w:num w:numId="27">
+    <w:abstractNumId w:val="25"/>
+  </w:num>
+  <w:num w:numId="28">
+    <w:abstractNumId w:val="11"/>
+  </w:num>
+  <w:num w:numId="29">
+    <w:abstractNumId w:val="13"/>
+  </w:num>
+  <w:num w:numId="30">
+    <w:abstractNumId w:val="10"/>
+  </w:num>
+  <w:num w:numId="31">
+    <w:abstractNumId w:val="26"/>
+  </w:num>
+  <w:num w:numId="32">
+    <w:abstractNumId w:val="29"/>
+  </w:num>
+  <w:num w:numId="33">
+    <w:abstractNumId w:val="20"/>
+  </w:num>
+  <w:num w:numId="34">
+    <w:abstractNumId w:val="14"/>
+  </w:num>
+  <w:num w:numId="35">
     <w:abstractNumId w:val="24"/>
   </w:num>
-  <w:num w:numId="28" w16cid:durableId="1091318549">
-    <w:abstractNumId w:val="10"/>
+  <w:num w:numId="36">
+    <w:abstractNumId w:val="22"/>
   </w:num>
-  <w:num w:numId="29" w16cid:durableId="1848864455">
+  <w:num w:numId="37">
+    <w:abstractNumId w:val="16"/>
+  </w:num>
+  <w:num w:numId="38">
     <w:abstractNumId w:val="12"/>
   </w:num>
-  <w:num w:numId="30" w16cid:durableId="532419569">
-    <w:abstractNumId w:val="9"/>
-  </w:num>
-  <w:num w:numId="31" w16cid:durableId="748428170">
-    <w:abstractNumId w:val="25"/>
-  </w:num>
-  <w:num w:numId="32" w16cid:durableId="1200628805">
-    <w:abstractNumId w:val="28"/>
-  </w:num>
-  <w:num w:numId="33" w16cid:durableId="847523253">
-    <w:abstractNumId w:val="19"/>
-  </w:num>
-  <w:num w:numId="34" w16cid:durableId="538010434">
-    <w:abstractNumId w:val="13"/>
-  </w:num>
-  <w:num w:numId="35" w16cid:durableId="2016835497">
-    <w:abstractNumId w:val="23"/>
-  </w:num>
-  <w:num w:numId="36" w16cid:durableId="952908841">
-    <w:abstractNumId w:val="21"/>
-  </w:num>
-  <w:num w:numId="37" w16cid:durableId="1794713787">
-    <w:abstractNumId w:val="15"/>
-  </w:num>
-  <w:num w:numId="38" w16cid:durableId="114449448">
-    <w:abstractNumId w:val="11"/>
+  <w:num w:numId="39">
+    <w:abstractNumId w:val="7"/>
   </w:num>
   <w:numIdMacAtCleanup w:val="14"/>
 </w:numbering>
 </file>
 
 <file path=word/styles.xml><?xml version="1.0" encoding="utf-8"?>
-<w:styles xmlns:mc="http://schemas.openxmlformats.org/markup-compatibility/2006" xmlns:r="http://schemas.openxmlformats.org/officeDocument/2006/relationships" xmlns:w="http://schemas.openxmlformats.org/wordprocessingml/2006/main" xmlns:w14="http://schemas.microsoft.com/office/word/2010/wordml" xmlns:w15="http://schemas.microsoft.com/office/word/2012/wordml" xmlns:w16cex="http://schemas.microsoft.com/office/word/2018/wordml/cex" xmlns:w16cid="http://schemas.microsoft.com/office/word/2016/wordml/cid" xmlns:w16="http://schemas.microsoft.com/office/word/2018/wordml" xmlns:w16du="http://schemas.microsoft.com/office/word/2023/wordml/word16du" xmlns:w16sdtdh="http://schemas.microsoft.com/office/word/2020/wordml/sdtdatahash" xmlns:w16sdtfl="http://schemas.microsoft.com/office/word/2024/wordml/sdtformatlock" xmlns:w16se="http://schemas.microsoft.com/office/word/2015/wordml/symex" mc:Ignorable="w14 w15 w16se w16cid w16 w16cex w16sdtdh w16sdtfl w16du">
+<w:styles xmlns:mc="http://schemas.openxmlformats.org/markup-compatibility/2006" xmlns:r="http://schemas.openxmlformats.org/officeDocument/2006/relationships" xmlns:w="http://schemas.openxmlformats.org/wordprocessingml/2006/main" xmlns:w14="http://schemas.microsoft.com/office/word/2010/wordml" xmlns:w15="http://schemas.microsoft.com/office/word/2012/wordml" xmlns:w16cid="http://schemas.microsoft.com/office/word/2016/wordml/cid" xmlns:w16se="http://schemas.microsoft.com/office/word/2015/wordml/symex" mc:Ignorable="w14 w15 w16se w16cid">
   <w:docDefaults>
     <w:rPrDefault>
       <w:rPr>
@@ -26345,7 +26897,7 @@
     </w:rPrDefault>
     <w:pPrDefault/>
   </w:docDefaults>
-  <w:latentStyles w:defLockedState="0" w:defUIPriority="99" w:defSemiHidden="0" w:defUnhideWhenUsed="0" w:defQFormat="0" w:count="376">
+  <w:latentStyles w:defLockedState="0" w:defUIPriority="99" w:defSemiHidden="0" w:defUnhideWhenUsed="0" w:defQFormat="0" w:count="375">
     <w:lsdException w:name="Normal" w:uiPriority="0" w:qFormat="1"/>
     <w:lsdException w:name="heading 1" w:uiPriority="0" w:qFormat="1"/>
     <w:lsdException w:name="heading 2" w:uiPriority="0" w:qFormat="1"/>
@@ -26721,7 +27273,6 @@
     <w:lsdException w:name="Smart Hyperlink" w:semiHidden="1" w:unhideWhenUsed="1"/>
     <w:lsdException w:name="Hashtag" w:semiHidden="1" w:unhideWhenUsed="1"/>
     <w:lsdException w:name="Unresolved Mention" w:semiHidden="1" w:unhideWhenUsed="1"/>
-    <w:lsdException w:name="Smart Link" w:semiHidden="1" w:unhideWhenUsed="1"/>
   </w:latentStyles>
   <w:style w:type="paragraph" w:default="1" w:styleId="Normale">
     <w:name w:val="Normal"/>
@@ -27683,7 +28234,7 @@
 </file>
 
 <file path=customXml/itemProps1.xml><?xml version="1.0" encoding="utf-8"?>
-<ds:datastoreItem xmlns:ds="http://schemas.openxmlformats.org/officeDocument/2006/customXml" ds:itemID="{0534ADEA-288E-4A70-8901-FFDC5233A8EC}">
+<ds:datastoreItem xmlns:ds="http://schemas.openxmlformats.org/officeDocument/2006/customXml" ds:itemID="{50D8297A-BA40-460D-BABA-E70736DE7F5B}">
   <ds:schemaRefs>
     <ds:schemaRef ds:uri="http://schemas.openxmlformats.org/officeDocument/2006/bibliography"/>
   </ds:schemaRefs>

</xml_diff>

<commit_message>
Doc finita senza test
</commit_message>
<xml_diff>
--- a/3_Documentazione/DocumentazioneFyt.docx
+++ b/3_Documentazione/DocumentazioneFyt.docx
@@ -25822,11 +25822,132 @@
     </w:p>
     <w:p>
       <w:pPr>
-        <w:rPr>
-          <w:b/>
-          <w:lang w:val="it-IT"/>
-        </w:rPr>
-      </w:pPr>
+        <w:pStyle w:val="Titolo2"/>
+      </w:pPr>
+      <w:r>
+        <w:br w:type="page"/>
+      </w:r>
+      <w:r>
+        <w:lastRenderedPageBreak/>
+        <w:t>Utilizzo dell’AI all’interno</w:t>
+      </w:r>
+    </w:p>
+    <w:p>
+      <w:r>
+        <w:t>Durante lo sviluppo di questo progetto, abbiamo usufruito di strumenti di Intelligenza Artificiale per i seguenti punti:</w:t>
+      </w:r>
+    </w:p>
+    <w:p>
+      <w:pPr>
+        <w:pStyle w:val="Paragrafoelenco"/>
+        <w:numPr>
+          <w:ilvl w:val="0"/>
+          <w:numId w:val="46"/>
+        </w:numPr>
+        <w:spacing w:after="160" w:line="259" w:lineRule="auto"/>
+      </w:pPr>
+      <w:r>
+        <w:t>Stile delle pagine</w:t>
+      </w:r>
+    </w:p>
+    <w:p>
+      <w:pPr>
+        <w:pStyle w:val="Paragrafoelenco"/>
+        <w:numPr>
+          <w:ilvl w:val="0"/>
+          <w:numId w:val="46"/>
+        </w:numPr>
+        <w:spacing w:after="160" w:line="259" w:lineRule="auto"/>
+      </w:pPr>
+      <w:r>
+        <w:t>Query particolarmente complesse</w:t>
+      </w:r>
+    </w:p>
+    <w:p>
+      <w:pPr>
+        <w:pStyle w:val="Paragrafoelenco"/>
+        <w:numPr>
+          <w:ilvl w:val="0"/>
+          <w:numId w:val="46"/>
+        </w:numPr>
+        <w:spacing w:after="160" w:line="259" w:lineRule="auto"/>
+      </w:pPr>
+      <w:r>
+        <w:t>Risoluzione di errori (se restavamo bloccati per troppo tempo su un determinato problema)</w:t>
+      </w:r>
+    </w:p>
+    <w:p>
+      <w:pPr>
+        <w:pStyle w:val="Paragrafoelenco"/>
+        <w:numPr>
+          <w:ilvl w:val="0"/>
+          <w:numId w:val="46"/>
+        </w:numPr>
+        <w:spacing w:after="160" w:line="259" w:lineRule="auto"/>
+      </w:pPr>
+      <w:r>
+        <w:t>Ricerche riguardanti Laravel</w:t>
+      </w:r>
+    </w:p>
+    <w:p/>
+    <w:p>
+      <w:r>
+        <w:t>1.</w:t>
+      </w:r>
+    </w:p>
+    <w:p>
+      <w:r>
+        <w:t>Per le pagine, abbiamo in parte usato strumenti di Intelligenza Artificiale per quanto riguarda gli stili, i layout e le grafiche.</w:t>
+      </w:r>
+    </w:p>
+    <w:p/>
+    <w:p>
+      <w:r>
+        <w:t>2.</w:t>
+      </w:r>
+    </w:p>
+    <w:p>
+      <w:r>
+        <w:t xml:space="preserve">Per alcune </w:t>
+      </w:r>
+      <w:proofErr w:type="spellStart"/>
+      <w:r>
+        <w:t>query</w:t>
+      </w:r>
+      <w:proofErr w:type="spellEnd"/>
+      <w:r>
+        <w:t xml:space="preserve"> che risultavano particolarmente complesse e che non siamo riusciti a realizzare dopo alcune prove, abbiamo usufruito di strumenti di Intelligenza Artificiale.</w:t>
+      </w:r>
+    </w:p>
+    <w:p/>
+    <w:p>
+      <w:r>
+        <w:t>3.</w:t>
+      </w:r>
+    </w:p>
+    <w:p>
+      <w:r>
+        <w:t>Se restavamo fermi per troppo tempo su un determinato problema senza riuscire a trovare una soluzione, per minimizzare i tempi, abbiamo usato strumenti di Intelligenza Artificiale.</w:t>
+      </w:r>
+    </w:p>
+    <w:p/>
+    <w:p>
+      <w:r>
+        <w:t>4.</w:t>
+      </w:r>
+    </w:p>
+    <w:p>
+      <w:r>
+        <w:t>Abbiamo utilizzato strumenti di Intelligenza Artificiale per effettuare determinate ricerche su Laravel, specialmente all’inizio quando ci stavamo documentando (oltre che al sito ufficiale), oppure per cercare determinati metodi o sintassi ben precise.</w:t>
+      </w:r>
+    </w:p>
+    <w:p/>
+    <w:p>
+      <w:r>
+        <w:t>Per ulteriori informazioni su quali AI sono state utilizzate durante il progetto, consultare il capitolo “Sitografia” della documentazione principale.</w:t>
+      </w:r>
+    </w:p>
+    <w:p>
       <w:r>
         <w:br w:type="page"/>
       </w:r>
@@ -27411,7 +27532,176 @@
         <w:rPr>
           <w:lang w:val="it-IT"/>
         </w:rPr>
-        <w:t xml:space="preserve"> </w:t>
+        <w:t>In questo sprint invece abbiamo impiegato molto più te</w:t>
+      </w:r>
+      <w:r>
+        <w:rPr>
+          <w:lang w:val="it-IT"/>
+        </w:rPr>
+        <w:t>mpo per le attività da eseguire. Perché erano attività molto grosse che richiedevano anche dei sotto requisiti.</w:t>
+      </w:r>
+    </w:p>
+    <w:p>
+      <w:pPr>
+        <w:spacing w:after="240"/>
+        <w:jc w:val="center"/>
+        <w:rPr>
+          <w:lang w:val="it-IT"/>
+        </w:rPr>
+      </w:pPr>
+      <w:r>
+        <w:rPr>
+          <w:noProof/>
+        </w:rPr>
+        <w:drawing>
+          <wp:inline distT="0" distB="0" distL="0" distR="0" wp14:anchorId="55DECABA" wp14:editId="184F781A">
+            <wp:extent cx="6120130" cy="664845"/>
+            <wp:effectExtent l="114300" t="76200" r="109220" b="78105"/>
+            <wp:docPr id="36" name="Immagine 36"/>
+            <wp:cNvGraphicFramePr>
+              <a:graphicFrameLocks xmlns:a="http://schemas.openxmlformats.org/drawingml/2006/main" noChangeAspect="1"/>
+            </wp:cNvGraphicFramePr>
+            <a:graphic xmlns:a="http://schemas.openxmlformats.org/drawingml/2006/main">
+              <a:graphicData uri="http://schemas.openxmlformats.org/drawingml/2006/picture">
+                <pic:pic xmlns:pic="http://schemas.openxmlformats.org/drawingml/2006/picture">
+                  <pic:nvPicPr>
+                    <pic:cNvPr id="1" name=""/>
+                    <pic:cNvPicPr/>
+                  </pic:nvPicPr>
+                  <pic:blipFill>
+                    <a:blip r:embed="rId46">
+                      <a:extLst>
+                        <a:ext uri="{28A0092B-C50C-407E-A947-70E740481C1C}">
+                          <a14:useLocalDpi xmlns:a14="http://schemas.microsoft.com/office/drawing/2010/main" val="0"/>
+                        </a:ext>
+                      </a:extLst>
+                    </a:blip>
+                    <a:stretch>
+                      <a:fillRect/>
+                    </a:stretch>
+                  </pic:blipFill>
+                  <pic:spPr>
+                    <a:xfrm>
+                      <a:off x="0" y="0"/>
+                      <a:ext cx="6120130" cy="664845"/>
+                    </a:xfrm>
+                    <a:prstGeom prst="rect">
+                      <a:avLst/>
+                    </a:prstGeom>
+                    <a:effectLst>
+                      <a:outerShdw blurRad="63500" sx="102000" sy="102000" algn="ctr" rotWithShape="0">
+                        <a:prstClr val="black">
+                          <a:alpha val="40000"/>
+                        </a:prstClr>
+                      </a:outerShdw>
+                    </a:effectLst>
+                  </pic:spPr>
+                </pic:pic>
+              </a:graphicData>
+            </a:graphic>
+          </wp:inline>
+        </w:drawing>
+      </w:r>
+    </w:p>
+    <w:p>
+      <w:pPr>
+        <w:rPr>
+          <w:lang w:val="it-IT"/>
+        </w:rPr>
+      </w:pPr>
+      <w:r>
+        <w:rPr>
+          <w:lang w:val="it-IT"/>
+        </w:rPr>
+        <w:br w:type="page"/>
+      </w:r>
+    </w:p>
+    <w:p>
+      <w:pPr>
+        <w:pStyle w:val="Titolo3"/>
+      </w:pPr>
+      <w:r>
+        <w:lastRenderedPageBreak/>
+        <w:t>Quinto</w:t>
+      </w:r>
+      <w:r>
+        <w:t xml:space="preserve"> Sprint</w:t>
+      </w:r>
+    </w:p>
+    <w:p>
+      <w:pPr>
+        <w:spacing w:after="240"/>
+        <w:rPr>
+          <w:lang w:val="it-IT"/>
+        </w:rPr>
+      </w:pPr>
+      <w:r>
+        <w:rPr>
+          <w:lang w:val="it-IT"/>
+        </w:rPr>
+        <w:t>Questo sprint invece è rimasto invariato perché abbiamo eseguito solamente dei test e il tempo richiesto per eseguirli ci è bastato</w:t>
+      </w:r>
+      <w:r>
+        <w:rPr>
+          <w:lang w:val="it-IT"/>
+        </w:rPr>
+        <w:t>.</w:t>
+      </w:r>
+    </w:p>
+    <w:p>
+      <w:pPr>
+        <w:spacing w:after="240"/>
+        <w:jc w:val="center"/>
+        <w:rPr>
+          <w:lang w:val="it-IT"/>
+        </w:rPr>
+      </w:pPr>
+      <w:r>
+        <w:rPr>
+          <w:noProof/>
+        </w:rPr>
+        <w:drawing>
+          <wp:inline distT="0" distB="0" distL="0" distR="0" wp14:anchorId="118F3633" wp14:editId="3FB7C303">
+            <wp:extent cx="4184650" cy="2266866"/>
+            <wp:effectExtent l="95250" t="95250" r="101600" b="95885"/>
+            <wp:docPr id="37" name="Immagine 37"/>
+            <wp:cNvGraphicFramePr>
+              <a:graphicFrameLocks xmlns:a="http://schemas.openxmlformats.org/drawingml/2006/main" noChangeAspect="1"/>
+            </wp:cNvGraphicFramePr>
+            <a:graphic xmlns:a="http://schemas.openxmlformats.org/drawingml/2006/main">
+              <a:graphicData uri="http://schemas.openxmlformats.org/drawingml/2006/picture">
+                <pic:pic xmlns:pic="http://schemas.openxmlformats.org/drawingml/2006/picture">
+                  <pic:nvPicPr>
+                    <pic:cNvPr id="1" name=""/>
+                    <pic:cNvPicPr/>
+                  </pic:nvPicPr>
+                  <pic:blipFill>
+                    <a:blip r:embed="rId47"/>
+                    <a:stretch>
+                      <a:fillRect/>
+                    </a:stretch>
+                  </pic:blipFill>
+                  <pic:spPr>
+                    <a:xfrm>
+                      <a:off x="0" y="0"/>
+                      <a:ext cx="4193528" cy="2271675"/>
+                    </a:xfrm>
+                    <a:prstGeom prst="rect">
+                      <a:avLst/>
+                    </a:prstGeom>
+                    <a:effectLst>
+                      <a:outerShdw blurRad="63500" sx="102000" sy="102000" algn="ctr" rotWithShape="0">
+                        <a:prstClr val="black">
+                          <a:alpha val="40000"/>
+                        </a:prstClr>
+                      </a:outerShdw>
+                    </a:effectLst>
+                  </pic:spPr>
+                </pic:pic>
+              </a:graphicData>
+            </a:graphic>
+          </wp:inline>
+        </w:drawing>
       </w:r>
     </w:p>
     <w:p>
@@ -27797,46 +28087,6 @@
       </w:r>
       <w:bookmarkEnd w:id="66"/>
       <w:bookmarkEnd w:id="67"/>
-    </w:p>
-    <w:p>
-      <w:pPr>
-        <w:rPr>
-          <w:lang w:val="it-IT"/>
-        </w:rPr>
-      </w:pPr>
-      <w:r>
-        <w:rPr>
-          <w:lang w:val="it-IT"/>
-        </w:rPr>
-        <w:t>Inserite una semplice tabella con due colonne che spieghi i termini specifici del progetto (lista dei termini in ordine alfabetico A-Z)</w:t>
-      </w:r>
-    </w:p>
-    <w:p>
-      <w:pPr>
-        <w:rPr>
-          <w:lang w:val="it-IT"/>
-        </w:rPr>
-      </w:pPr>
-    </w:p>
-    <w:p>
-      <w:pPr>
-        <w:rPr>
-          <w:lang w:val="it-IT"/>
-        </w:rPr>
-      </w:pPr>
-      <w:r>
-        <w:rPr>
-          <w:lang w:val="it-IT"/>
-        </w:rPr>
-        <w:t>Esempio:</w:t>
-      </w:r>
-    </w:p>
-    <w:p>
-      <w:pPr>
-        <w:rPr>
-          <w:lang w:val="it-IT"/>
-        </w:rPr>
-      </w:pPr>
     </w:p>
     <w:tbl>
       <w:tblPr>
@@ -27852,19 +28102,13 @@
         <w:tc>
           <w:tcPr>
             <w:tcW w:w="4814" w:type="dxa"/>
-            <w:shd w:val="clear" w:color="auto" w:fill="D9D9D9" w:themeFill="background1" w:themeFillShade="D9"/>
+            <w:vAlign w:val="center"/>
           </w:tcPr>
           <w:p>
-            <w:pPr>
-              <w:rPr>
-                <w:b/>
-                <w:bCs/>
-              </w:rPr>
-            </w:pPr>
-            <w:r>
-              <w:rPr>
-                <w:b/>
-                <w:bCs/>
+            <w:bookmarkStart w:id="68" w:name="_Toc94790469"/>
+            <w:r>
+              <w:rPr>
+                <w:rStyle w:val="Enfasigrassetto"/>
               </w:rPr>
               <w:t>Termine</w:t>
             </w:r>
@@ -27873,19 +28117,12 @@
         <w:tc>
           <w:tcPr>
             <w:tcW w:w="4814" w:type="dxa"/>
-            <w:shd w:val="clear" w:color="auto" w:fill="D9D9D9" w:themeFill="background1" w:themeFillShade="D9"/>
+            <w:vAlign w:val="center"/>
           </w:tcPr>
           <w:p>
-            <w:pPr>
-              <w:rPr>
-                <w:b/>
-                <w:bCs/>
-              </w:rPr>
-            </w:pPr>
-            <w:r>
-              <w:rPr>
-                <w:b/>
-                <w:bCs/>
+            <w:r>
+              <w:rPr>
+                <w:rStyle w:val="Enfasigrassetto"/>
               </w:rPr>
               <w:t>Descrizione</w:t>
             </w:r>
@@ -27896,51 +28133,31 @@
         <w:tc>
           <w:tcPr>
             <w:tcW w:w="4814" w:type="dxa"/>
+            <w:vAlign w:val="center"/>
           </w:tcPr>
           <w:p>
-            <w:pPr>
-              <w:rPr>
-                <w:lang w:val="en-GB"/>
-              </w:rPr>
-            </w:pPr>
-            <w:r>
-              <w:t>AJAX</w:t>
+            <w:r>
+              <w:rPr>
+                <w:rStyle w:val="Enfasigrassetto"/>
+              </w:rPr>
+              <w:t>Apache</w:t>
             </w:r>
           </w:p>
         </w:tc>
         <w:tc>
           <w:tcPr>
             <w:tcW w:w="4814" w:type="dxa"/>
+            <w:vAlign w:val="center"/>
           </w:tcPr>
           <w:p>
-            <w:pPr>
-              <w:jc w:val="both"/>
-            </w:pPr>
+            <w:r>
+              <w:t xml:space="preserve">Web server open-source utilizzato per ospitare siti web. Nella documentazione è utilizzato nella versione 2.4.52 su </w:t>
+            </w:r>
             <w:proofErr w:type="spellStart"/>
             <w:r>
-              <w:rPr>
-                <w:b/>
-                <w:bCs/>
-              </w:rPr>
-              <w:t>Asynchronous</w:t>
+              <w:t>Ubuntu</w:t>
             </w:r>
             <w:proofErr w:type="spellEnd"/>
-            <w:r>
-              <w:rPr>
-                <w:b/>
-                <w:bCs/>
-              </w:rPr>
-              <w:t xml:space="preserve"> JavaScript And XML</w:t>
-            </w:r>
-            <w:r>
-              <w:t>:</w:t>
-            </w:r>
-            <w:r>
-              <w:t xml:space="preserve"> una tecnica che</w:t>
-            </w:r>
-            <w:r>
-              <w:t xml:space="preserve"> permette di eseguire richieste ed ottenere dati da una pagina web in modo asincrono</w:t>
-            </w:r>
             <w:r>
               <w:t>.</w:t>
             </w:r>
@@ -27951,58 +28168,1156 @@
         <w:tc>
           <w:tcPr>
             <w:tcW w:w="4814" w:type="dxa"/>
+            <w:vAlign w:val="center"/>
           </w:tcPr>
           <w:p>
-            <w:r>
-              <w:t>CSS</w:t>
-            </w:r>
+            <w:proofErr w:type="spellStart"/>
+            <w:r>
+              <w:rPr>
+                <w:rStyle w:val="Enfasigrassetto"/>
+              </w:rPr>
+              <w:t>Artisan</w:t>
+            </w:r>
+            <w:proofErr w:type="spellEnd"/>
           </w:p>
         </w:tc>
         <w:tc>
           <w:tcPr>
             <w:tcW w:w="4814" w:type="dxa"/>
+            <w:vAlign w:val="center"/>
           </w:tcPr>
           <w:p>
+            <w:r>
+              <w:t xml:space="preserve">Interfaccia a riga di comando fornita da Laravel per eseguire comandi utili allo sviluppo, come migrazioni, </w:t>
+            </w:r>
+            <w:proofErr w:type="spellStart"/>
+            <w:r>
+              <w:t>seed</w:t>
+            </w:r>
+            <w:proofErr w:type="spellEnd"/>
+            <w:r>
+              <w:t xml:space="preserve"> e gestione cache.</w:t>
+            </w:r>
+          </w:p>
+        </w:tc>
+      </w:tr>
+      <w:tr>
+        <w:tc>
+          <w:tcPr>
+            <w:tcW w:w="4814" w:type="dxa"/>
+            <w:vAlign w:val="center"/>
+          </w:tcPr>
+          <w:p>
+            <w:proofErr w:type="spellStart"/>
+            <w:r>
+              <w:rPr>
+                <w:rStyle w:val="Enfasigrassetto"/>
+              </w:rPr>
+              <w:t>Blade</w:t>
+            </w:r>
+            <w:proofErr w:type="spellEnd"/>
+          </w:p>
+        </w:tc>
+        <w:tc>
+          <w:tcPr>
+            <w:tcW w:w="4814" w:type="dxa"/>
+            <w:vAlign w:val="center"/>
+          </w:tcPr>
+          <w:p>
+            <w:r>
+              <w:t xml:space="preserve">Sistema di </w:t>
+            </w:r>
+            <w:proofErr w:type="spellStart"/>
+            <w:r>
+              <w:t>templating</w:t>
+            </w:r>
+            <w:proofErr w:type="spellEnd"/>
+            <w:r>
+              <w:t xml:space="preserve"> di Laravel che permette di integrare PHP con HTML in modo semplice e strutturato.</w:t>
+            </w:r>
+          </w:p>
+        </w:tc>
+      </w:tr>
+      <w:tr>
+        <w:tc>
+          <w:tcPr>
+            <w:tcW w:w="4814" w:type="dxa"/>
+            <w:vAlign w:val="center"/>
+          </w:tcPr>
+          <w:p>
+            <w:r>
+              <w:rPr>
+                <w:rStyle w:val="Enfasigrassetto"/>
+              </w:rPr>
+              <w:t>Bootstrap</w:t>
+            </w:r>
+          </w:p>
+        </w:tc>
+        <w:tc>
+          <w:tcPr>
+            <w:tcW w:w="4814" w:type="dxa"/>
+            <w:vAlign w:val="center"/>
+          </w:tcPr>
+          <w:p>
+            <w:r>
+              <w:t>Framework CSS per la progettazione di interfacce responsive e moderne. Nel progetto è usata la versione 5.3.3.</w:t>
+            </w:r>
+          </w:p>
+        </w:tc>
+      </w:tr>
+      <w:tr>
+        <w:tc>
+          <w:tcPr>
+            <w:tcW w:w="4814" w:type="dxa"/>
+            <w:vAlign w:val="center"/>
+          </w:tcPr>
+          <w:p>
+            <w:r>
+              <w:rPr>
+                <w:rStyle w:val="Enfasigrassetto"/>
+              </w:rPr>
+              <w:t>Composer</w:t>
+            </w:r>
+          </w:p>
+        </w:tc>
+        <w:tc>
+          <w:tcPr>
+            <w:tcW w:w="4814" w:type="dxa"/>
+            <w:vAlign w:val="center"/>
+          </w:tcPr>
+          <w:p>
+            <w:r>
+              <w:t>Gestore di pacchetti PHP utilizzato per installare dipendenze e librerie, tra cui Laravel. Versione utilizzata: 2.7.8.</w:t>
+            </w:r>
+          </w:p>
+        </w:tc>
+      </w:tr>
+      <w:tr>
+        <w:tc>
+          <w:tcPr>
+            <w:tcW w:w="4814" w:type="dxa"/>
+            <w:vAlign w:val="center"/>
+          </w:tcPr>
+          <w:p>
+            <w:r>
+              <w:rPr>
+                <w:rStyle w:val="Enfasigrassetto"/>
+              </w:rPr>
+              <w:t>Controller</w:t>
+            </w:r>
+          </w:p>
+        </w:tc>
+        <w:tc>
+          <w:tcPr>
+            <w:tcW w:w="4814" w:type="dxa"/>
+            <w:vAlign w:val="center"/>
+          </w:tcPr>
+          <w:p>
+            <w:r>
+              <w:t>Componente del pattern MVC che gestisce la logica applicativa e interagisce con model e view.</w:t>
+            </w:r>
+          </w:p>
+        </w:tc>
+      </w:tr>
+      <w:tr>
+        <w:tc>
+          <w:tcPr>
+            <w:tcW w:w="4814" w:type="dxa"/>
+            <w:vAlign w:val="center"/>
+          </w:tcPr>
+          <w:p>
             <w:pPr>
-              <w:jc w:val="both"/>
-              <w:rPr>
-                <w:b/>
-                <w:bCs/>
+              <w:rPr>
+                <w:lang w:val="fr-CH"/>
               </w:rPr>
             </w:pPr>
+            <w:r>
+              <w:rPr>
+                <w:rStyle w:val="Enfasigrassetto"/>
+                <w:lang w:val="fr-CH"/>
+              </w:rPr>
+              <w:t xml:space="preserve">CSRF (Cross Site </w:t>
+            </w:r>
             <w:proofErr w:type="spellStart"/>
             <w:r>
               <w:rPr>
-                <w:b/>
-                <w:bCs/>
-              </w:rPr>
-              <w:t>Cascading</w:t>
+                <w:rStyle w:val="Enfasigrassetto"/>
+                <w:lang w:val="fr-CH"/>
+              </w:rPr>
+              <w:t>Request</w:t>
             </w:r>
             <w:proofErr w:type="spellEnd"/>
             <w:r>
               <w:rPr>
-                <w:b/>
-                <w:bCs/>
-              </w:rPr>
-              <w:t xml:space="preserve"> Style </w:t>
+                <w:rStyle w:val="Enfasigrassetto"/>
+                <w:lang w:val="fr-CH"/>
+              </w:rPr>
+              <w:t xml:space="preserve"> </w:t>
             </w:r>
             <w:proofErr w:type="spellStart"/>
             <w:r>
               <w:rPr>
-                <w:b/>
-                <w:bCs/>
-              </w:rPr>
-              <w:t>Sheets</w:t>
+                <w:rStyle w:val="Enfasigrassetto"/>
+                <w:lang w:val="fr-CH"/>
+              </w:rPr>
+              <w:t>Forgery</w:t>
             </w:r>
             <w:proofErr w:type="spellEnd"/>
             <w:r>
-              <w:t>: linguaggio che per</w:t>
-            </w:r>
-            <w:r>
-              <w:t>mette di definire il layout e la grafica di una pagina web</w:t>
-            </w:r>
+              <w:rPr>
+                <w:rStyle w:val="Enfasigrassetto"/>
+                <w:lang w:val="fr-CH"/>
+              </w:rPr>
+              <w:t>)</w:t>
+            </w:r>
+          </w:p>
+        </w:tc>
+        <w:tc>
+          <w:tcPr>
+            <w:tcW w:w="4814" w:type="dxa"/>
+            <w:vAlign w:val="center"/>
+          </w:tcPr>
+          <w:p>
+            <w:r>
+              <w:t>Tipo di attacco informatico. Laravel protegge automaticamente i form tramite token CSRF nascosti.</w:t>
+            </w:r>
+          </w:p>
+        </w:tc>
+      </w:tr>
+      <w:tr>
+        <w:tc>
+          <w:tcPr>
+            <w:tcW w:w="4814" w:type="dxa"/>
+            <w:vAlign w:val="center"/>
+          </w:tcPr>
+          <w:p>
+            <w:r>
+              <w:rPr>
+                <w:rStyle w:val="Enfasigrassetto"/>
+              </w:rPr>
+              <w:t>Database Migration</w:t>
+            </w:r>
+          </w:p>
+        </w:tc>
+        <w:tc>
+          <w:tcPr>
+            <w:tcW w:w="4814" w:type="dxa"/>
+            <w:vAlign w:val="center"/>
+          </w:tcPr>
+          <w:p>
+            <w:r>
+              <w:t xml:space="preserve">Funzionalità di Laravel per definire e modificare la struttura del database tramite file PHP </w:t>
+            </w:r>
+            <w:proofErr w:type="spellStart"/>
+            <w:r>
+              <w:t>versionabili</w:t>
+            </w:r>
+            <w:proofErr w:type="spellEnd"/>
             <w:r>
               <w:t>.</w:t>
+            </w:r>
+          </w:p>
+        </w:tc>
+      </w:tr>
+      <w:tr>
+        <w:tc>
+          <w:tcPr>
+            <w:tcW w:w="4814" w:type="dxa"/>
+            <w:vAlign w:val="center"/>
+          </w:tcPr>
+          <w:p>
+            <w:proofErr w:type="spellStart"/>
+            <w:r>
+              <w:rPr>
+                <w:rStyle w:val="Enfasigrassetto"/>
+              </w:rPr>
+              <w:t>Eloquent</w:t>
+            </w:r>
+            <w:proofErr w:type="spellEnd"/>
+            <w:r>
+              <w:rPr>
+                <w:rStyle w:val="Enfasigrassetto"/>
+              </w:rPr>
+              <w:t xml:space="preserve"> ORM</w:t>
+            </w:r>
+          </w:p>
+        </w:tc>
+        <w:tc>
+          <w:tcPr>
+            <w:tcW w:w="4814" w:type="dxa"/>
+            <w:vAlign w:val="center"/>
+          </w:tcPr>
+          <w:p>
+            <w:r>
+              <w:t>Sistema ORM (Object-</w:t>
+            </w:r>
+            <w:proofErr w:type="spellStart"/>
+            <w:r>
+              <w:t>Relational</w:t>
+            </w:r>
+            <w:proofErr w:type="spellEnd"/>
+            <w:r>
+              <w:t xml:space="preserve"> Mapping) di Laravel che permette l’interazione con il database usando oggetti PHP.</w:t>
+            </w:r>
+          </w:p>
+        </w:tc>
+      </w:tr>
+      <w:tr>
+        <w:tc>
+          <w:tcPr>
+            <w:tcW w:w="4814" w:type="dxa"/>
+            <w:vAlign w:val="center"/>
+          </w:tcPr>
+          <w:p>
+            <w:proofErr w:type="spellStart"/>
+            <w:r>
+              <w:rPr>
+                <w:rStyle w:val="Enfasigrassetto"/>
+              </w:rPr>
+              <w:t>Factory</w:t>
+            </w:r>
+            <w:proofErr w:type="spellEnd"/>
+          </w:p>
+        </w:tc>
+        <w:tc>
+          <w:tcPr>
+            <w:tcW w:w="4814" w:type="dxa"/>
+            <w:vAlign w:val="center"/>
+          </w:tcPr>
+          <w:p>
+            <w:r>
+              <w:t>Classe Laravel che genera dati fittizi (</w:t>
+            </w:r>
+            <w:proofErr w:type="spellStart"/>
+            <w:r>
+              <w:t>fake</w:t>
+            </w:r>
+            <w:proofErr w:type="spellEnd"/>
+            <w:r>
+              <w:t xml:space="preserve">) per test e sviluppo, spesso usata con </w:t>
+            </w:r>
+            <w:proofErr w:type="spellStart"/>
+            <w:r>
+              <w:t>Faker</w:t>
+            </w:r>
+            <w:proofErr w:type="spellEnd"/>
+            <w:r>
+              <w:t>.</w:t>
+            </w:r>
+          </w:p>
+        </w:tc>
+      </w:tr>
+      <w:tr>
+        <w:tc>
+          <w:tcPr>
+            <w:tcW w:w="4814" w:type="dxa"/>
+            <w:vAlign w:val="center"/>
+          </w:tcPr>
+          <w:p>
+            <w:proofErr w:type="spellStart"/>
+            <w:r>
+              <w:rPr>
+                <w:rStyle w:val="Enfasigrassetto"/>
+              </w:rPr>
+              <w:t>Faker</w:t>
+            </w:r>
+            <w:proofErr w:type="spellEnd"/>
+          </w:p>
+        </w:tc>
+        <w:tc>
+          <w:tcPr>
+            <w:tcW w:w="4814" w:type="dxa"/>
+            <w:vAlign w:val="center"/>
+          </w:tcPr>
+          <w:p>
+            <w:r>
+              <w:t>Libreria PHP integrata in Laravel per generare dati casuali realistici.</w:t>
+            </w:r>
+          </w:p>
+        </w:tc>
+      </w:tr>
+      <w:tr>
+        <w:tc>
+          <w:tcPr>
+            <w:tcW w:w="4814" w:type="dxa"/>
+            <w:vAlign w:val="center"/>
+          </w:tcPr>
+          <w:p>
+            <w:r>
+              <w:rPr>
+                <w:rStyle w:val="Enfasigrassetto"/>
+              </w:rPr>
+              <w:t>Framework</w:t>
+            </w:r>
+          </w:p>
+        </w:tc>
+        <w:tc>
+          <w:tcPr>
+            <w:tcW w:w="4814" w:type="dxa"/>
+            <w:vAlign w:val="center"/>
+          </w:tcPr>
+          <w:p>
+            <w:r>
+              <w:t>Struttura di sviluppo che semplifica la realizzazione di software. Laravel, Django, ASP.NET Core e Spring Boot sono esempi menzionati.</w:t>
+            </w:r>
+          </w:p>
+        </w:tc>
+      </w:tr>
+      <w:tr>
+        <w:tc>
+          <w:tcPr>
+            <w:tcW w:w="4814" w:type="dxa"/>
+            <w:vAlign w:val="center"/>
+          </w:tcPr>
+          <w:p>
+            <w:r>
+              <w:rPr>
+                <w:rStyle w:val="Enfasigrassetto"/>
+              </w:rPr>
+              <w:t>HTML</w:t>
+            </w:r>
+          </w:p>
+        </w:tc>
+        <w:tc>
+          <w:tcPr>
+            <w:tcW w:w="4814" w:type="dxa"/>
+            <w:vAlign w:val="center"/>
+          </w:tcPr>
+          <w:p>
+            <w:proofErr w:type="spellStart"/>
+            <w:r>
+              <w:t>HyperText</w:t>
+            </w:r>
+            <w:proofErr w:type="spellEnd"/>
+            <w:r>
+              <w:t xml:space="preserve"> Markup Language, linguaggio per strutturare contenuti web.</w:t>
+            </w:r>
+          </w:p>
+        </w:tc>
+      </w:tr>
+      <w:tr>
+        <w:tc>
+          <w:tcPr>
+            <w:tcW w:w="4814" w:type="dxa"/>
+            <w:vAlign w:val="center"/>
+          </w:tcPr>
+          <w:p>
+            <w:r>
+              <w:rPr>
+                <w:rStyle w:val="Enfasigrassetto"/>
+              </w:rPr>
+              <w:t>JavaScript</w:t>
+            </w:r>
+          </w:p>
+        </w:tc>
+        <w:tc>
+          <w:tcPr>
+            <w:tcW w:w="4814" w:type="dxa"/>
+            <w:vAlign w:val="center"/>
+          </w:tcPr>
+          <w:p>
+            <w:r>
+              <w:t>Linguaggio di scripting lato client per rendere interattive le pagine web.</w:t>
+            </w:r>
+          </w:p>
+        </w:tc>
+      </w:tr>
+      <w:tr>
+        <w:tc>
+          <w:tcPr>
+            <w:tcW w:w="4814" w:type="dxa"/>
+            <w:vAlign w:val="center"/>
+          </w:tcPr>
+          <w:p>
+            <w:r>
+              <w:rPr>
+                <w:rStyle w:val="Enfasigrassetto"/>
+              </w:rPr>
+              <w:t>Laravel</w:t>
+            </w:r>
+          </w:p>
+        </w:tc>
+        <w:tc>
+          <w:tcPr>
+            <w:tcW w:w="4814" w:type="dxa"/>
+            <w:vAlign w:val="center"/>
+          </w:tcPr>
+          <w:p>
+            <w:r>
+              <w:t xml:space="preserve">Framework PHP MVC utilizzato per realizzare l’intera applicazione web. Offre sistemi integrati per </w:t>
+            </w:r>
+            <w:proofErr w:type="spellStart"/>
+            <w:r>
+              <w:t>routing</w:t>
+            </w:r>
+            <w:proofErr w:type="spellEnd"/>
+            <w:r>
+              <w:t>, migrazioni, sicurezza e autenticazione.</w:t>
+            </w:r>
+          </w:p>
+        </w:tc>
+      </w:tr>
+      <w:tr>
+        <w:tc>
+          <w:tcPr>
+            <w:tcW w:w="4814" w:type="dxa"/>
+            <w:vAlign w:val="center"/>
+          </w:tcPr>
+          <w:p>
+            <w:r>
+              <w:rPr>
+                <w:rStyle w:val="Enfasigrassetto"/>
+              </w:rPr>
+              <w:t>Middleware</w:t>
+            </w:r>
+          </w:p>
+        </w:tc>
+        <w:tc>
+          <w:tcPr>
+            <w:tcW w:w="4814" w:type="dxa"/>
+            <w:vAlign w:val="center"/>
+          </w:tcPr>
+          <w:p>
+            <w:r>
+              <w:t xml:space="preserve">Componenti che filtrano richieste HTTP in Laravel. Esempi: </w:t>
+            </w:r>
+            <w:proofErr w:type="spellStart"/>
+            <w:r>
+              <w:rPr>
+                <w:rStyle w:val="CodiceHTML"/>
+                <w:rFonts w:eastAsiaTheme="minorHAnsi"/>
+              </w:rPr>
+              <w:t>auth</w:t>
+            </w:r>
+            <w:proofErr w:type="spellEnd"/>
+            <w:r>
+              <w:t xml:space="preserve">, </w:t>
+            </w:r>
+            <w:proofErr w:type="spellStart"/>
+            <w:r>
+              <w:rPr>
+                <w:rStyle w:val="CodiceHTML"/>
+                <w:rFonts w:eastAsiaTheme="minorHAnsi"/>
+              </w:rPr>
+              <w:t>verified</w:t>
+            </w:r>
+            <w:proofErr w:type="spellEnd"/>
+            <w:r>
+              <w:t xml:space="preserve">, </w:t>
+            </w:r>
+            <w:r>
+              <w:rPr>
+                <w:rStyle w:val="CodiceHTML"/>
+                <w:rFonts w:eastAsiaTheme="minorHAnsi"/>
+              </w:rPr>
+              <w:t>vendor</w:t>
+            </w:r>
+            <w:r>
+              <w:t>.</w:t>
+            </w:r>
+          </w:p>
+        </w:tc>
+      </w:tr>
+      <w:tr>
+        <w:tc>
+          <w:tcPr>
+            <w:tcW w:w="4814" w:type="dxa"/>
+            <w:vAlign w:val="center"/>
+          </w:tcPr>
+          <w:p>
+            <w:r>
+              <w:rPr>
+                <w:rStyle w:val="Enfasigrassetto"/>
+              </w:rPr>
+              <w:t>Migration</w:t>
+            </w:r>
+          </w:p>
+        </w:tc>
+        <w:tc>
+          <w:tcPr>
+            <w:tcW w:w="4814" w:type="dxa"/>
+            <w:vAlign w:val="center"/>
+          </w:tcPr>
+          <w:p>
+            <w:r>
+              <w:t>File Laravel che definisce la struttura di una tabella nel database.</w:t>
+            </w:r>
+          </w:p>
+        </w:tc>
+      </w:tr>
+      <w:tr>
+        <w:tc>
+          <w:tcPr>
+            <w:tcW w:w="4814" w:type="dxa"/>
+            <w:vAlign w:val="center"/>
+          </w:tcPr>
+          <w:p>
+            <w:r>
+              <w:rPr>
+                <w:rStyle w:val="Enfasigrassetto"/>
+              </w:rPr>
+              <w:t>MVC (Model View Controller)</w:t>
+            </w:r>
+          </w:p>
+        </w:tc>
+        <w:tc>
+          <w:tcPr>
+            <w:tcW w:w="4814" w:type="dxa"/>
+            <w:vAlign w:val="center"/>
+          </w:tcPr>
+          <w:p>
+            <w:r>
+              <w:t>Architettura software che separa i dati (Model), la presentazione (View) e la logica (Controller).</w:t>
+            </w:r>
+          </w:p>
+        </w:tc>
+      </w:tr>
+      <w:tr>
+        <w:tc>
+          <w:tcPr>
+            <w:tcW w:w="4814" w:type="dxa"/>
+            <w:vAlign w:val="center"/>
+          </w:tcPr>
+          <w:p>
+            <w:r>
+              <w:rPr>
+                <w:rStyle w:val="Enfasigrassetto"/>
+              </w:rPr>
+              <w:t>MySQL</w:t>
+            </w:r>
+          </w:p>
+        </w:tc>
+        <w:tc>
+          <w:tcPr>
+            <w:tcW w:w="4814" w:type="dxa"/>
+            <w:vAlign w:val="center"/>
+          </w:tcPr>
+          <w:p>
+            <w:r>
+              <w:t xml:space="preserve">Sistema di gestione di database relazionali. Laravel può interfacciarsi con esso tramite </w:t>
+            </w:r>
+            <w:proofErr w:type="spellStart"/>
+            <w:r>
+              <w:t>Eloquent</w:t>
+            </w:r>
+            <w:proofErr w:type="spellEnd"/>
+            <w:r>
+              <w:t xml:space="preserve"> o </w:t>
+            </w:r>
+            <w:proofErr w:type="spellStart"/>
+            <w:r>
+              <w:t>query</w:t>
+            </w:r>
+            <w:proofErr w:type="spellEnd"/>
+            <w:r>
+              <w:t xml:space="preserve"> SQL.</w:t>
+            </w:r>
+          </w:p>
+        </w:tc>
+      </w:tr>
+      <w:tr>
+        <w:tc>
+          <w:tcPr>
+            <w:tcW w:w="4814" w:type="dxa"/>
+            <w:vAlign w:val="center"/>
+          </w:tcPr>
+          <w:p>
+            <w:r>
+              <w:rPr>
+                <w:rStyle w:val="Enfasigrassetto"/>
+              </w:rPr>
+              <w:t>PHP</w:t>
+            </w:r>
+          </w:p>
+        </w:tc>
+        <w:tc>
+          <w:tcPr>
+            <w:tcW w:w="4814" w:type="dxa"/>
+            <w:vAlign w:val="center"/>
+          </w:tcPr>
+          <w:p>
+            <w:r>
+              <w:t>Linguaggio di scripting lato server. Laravel è scritto in PHP. Versione usata: 8.4.7.</w:t>
+            </w:r>
+          </w:p>
+        </w:tc>
+      </w:tr>
+      <w:tr>
+        <w:tc>
+          <w:tcPr>
+            <w:tcW w:w="4814" w:type="dxa"/>
+            <w:vAlign w:val="center"/>
+          </w:tcPr>
+          <w:p>
+            <w:proofErr w:type="spellStart"/>
+            <w:r>
+              <w:rPr>
+                <w:rStyle w:val="Enfasigrassetto"/>
+              </w:rPr>
+              <w:t>PhpStorm</w:t>
+            </w:r>
+            <w:proofErr w:type="spellEnd"/>
+          </w:p>
+        </w:tc>
+        <w:tc>
+          <w:tcPr>
+            <w:tcW w:w="4814" w:type="dxa"/>
+            <w:vAlign w:val="center"/>
+          </w:tcPr>
+          <w:p>
+            <w:r>
+              <w:t>IDE (</w:t>
+            </w:r>
+            <w:proofErr w:type="spellStart"/>
+            <w:r>
+              <w:t>Integrated</w:t>
+            </w:r>
+            <w:proofErr w:type="spellEnd"/>
+            <w:r>
+              <w:t xml:space="preserve"> Development Environment) per lo sviluppo PHP. Utilizzate versioni 2023.1 e 2025.1.0.1.</w:t>
+            </w:r>
+          </w:p>
+        </w:tc>
+      </w:tr>
+      <w:tr>
+        <w:tc>
+          <w:tcPr>
+            <w:tcW w:w="4814" w:type="dxa"/>
+            <w:vAlign w:val="center"/>
+          </w:tcPr>
+          <w:p>
+            <w:proofErr w:type="spellStart"/>
+            <w:r>
+              <w:rPr>
+                <w:rStyle w:val="Enfasigrassetto"/>
+              </w:rPr>
+              <w:lastRenderedPageBreak/>
+              <w:t>Request</w:t>
+            </w:r>
+            <w:proofErr w:type="spellEnd"/>
+            <w:r>
+              <w:rPr>
+                <w:rStyle w:val="Enfasigrassetto"/>
+              </w:rPr>
+              <w:t xml:space="preserve"> </w:t>
+            </w:r>
+            <w:proofErr w:type="spellStart"/>
+            <w:r>
+              <w:rPr>
+                <w:rStyle w:val="Enfasigrassetto"/>
+              </w:rPr>
+              <w:t>Validation</w:t>
+            </w:r>
+            <w:proofErr w:type="spellEnd"/>
+          </w:p>
+        </w:tc>
+        <w:tc>
+          <w:tcPr>
+            <w:tcW w:w="4814" w:type="dxa"/>
+            <w:vAlign w:val="center"/>
+          </w:tcPr>
+          <w:p>
+            <w:r>
+              <w:t>Funzionalità di Laravel che consente di validare i dati ricevuti da un form tramite classi dedicate (</w:t>
+            </w:r>
+            <w:proofErr w:type="spellStart"/>
+            <w:r>
+              <w:rPr>
+                <w:rStyle w:val="CodiceHTML"/>
+                <w:rFonts w:eastAsiaTheme="minorHAnsi"/>
+              </w:rPr>
+              <w:t>Request</w:t>
+            </w:r>
+            <w:proofErr w:type="spellEnd"/>
+            <w:r>
+              <w:t>).</w:t>
+            </w:r>
+          </w:p>
+        </w:tc>
+      </w:tr>
+      <w:tr>
+        <w:tc>
+          <w:tcPr>
+            <w:tcW w:w="4814" w:type="dxa"/>
+            <w:vAlign w:val="center"/>
+          </w:tcPr>
+          <w:p>
+            <w:proofErr w:type="spellStart"/>
+            <w:r>
+              <w:rPr>
+                <w:rStyle w:val="Enfasigrassetto"/>
+              </w:rPr>
+              <w:t>Route</w:t>
+            </w:r>
+            <w:proofErr w:type="spellEnd"/>
+          </w:p>
+        </w:tc>
+        <w:tc>
+          <w:tcPr>
+            <w:tcW w:w="4814" w:type="dxa"/>
+            <w:vAlign w:val="center"/>
+          </w:tcPr>
+          <w:p>
+            <w:r>
+              <w:t>Definizione di un URL endpoint in Laravel che collega una richiesta HTTP a una funzione o controller.</w:t>
+            </w:r>
+          </w:p>
+        </w:tc>
+      </w:tr>
+      <w:tr>
+        <w:tc>
+          <w:tcPr>
+            <w:tcW w:w="4814" w:type="dxa"/>
+            <w:vAlign w:val="center"/>
+          </w:tcPr>
+          <w:p>
+            <w:proofErr w:type="spellStart"/>
+            <w:r>
+              <w:rPr>
+                <w:rStyle w:val="Enfasigrassetto"/>
+              </w:rPr>
+              <w:t>Seeder</w:t>
+            </w:r>
+            <w:proofErr w:type="spellEnd"/>
+          </w:p>
+        </w:tc>
+        <w:tc>
+          <w:tcPr>
+            <w:tcW w:w="4814" w:type="dxa"/>
+            <w:vAlign w:val="center"/>
+          </w:tcPr>
+          <w:p>
+            <w:r>
+              <w:t xml:space="preserve">Classe Laravel che popola il database con dati predefiniti o generati da </w:t>
+            </w:r>
+            <w:proofErr w:type="spellStart"/>
+            <w:r>
+              <w:t>factory</w:t>
+            </w:r>
+            <w:proofErr w:type="spellEnd"/>
+            <w:r>
+              <w:t>.</w:t>
+            </w:r>
+          </w:p>
+        </w:tc>
+      </w:tr>
+      <w:tr>
+        <w:tc>
+          <w:tcPr>
+            <w:tcW w:w="4814" w:type="dxa"/>
+            <w:vAlign w:val="center"/>
+          </w:tcPr>
+          <w:p>
+            <w:r>
+              <w:rPr>
+                <w:rStyle w:val="Enfasigrassetto"/>
+              </w:rPr>
+              <w:t>SQL Injection</w:t>
+            </w:r>
+          </w:p>
+        </w:tc>
+        <w:tc>
+          <w:tcPr>
+            <w:tcW w:w="4814" w:type="dxa"/>
+            <w:vAlign w:val="center"/>
+          </w:tcPr>
+          <w:p>
+            <w:r>
+              <w:t xml:space="preserve">Vulnerabilità informatica evitata in Laravel grazie all’uso di </w:t>
+            </w:r>
+            <w:proofErr w:type="spellStart"/>
+            <w:r>
+              <w:t>query</w:t>
+            </w:r>
+            <w:proofErr w:type="spellEnd"/>
+            <w:r>
+              <w:t xml:space="preserve"> preparate e </w:t>
+            </w:r>
+            <w:proofErr w:type="spellStart"/>
+            <w:r>
+              <w:t>Eloquent</w:t>
+            </w:r>
+            <w:proofErr w:type="spellEnd"/>
+            <w:r>
+              <w:t xml:space="preserve"> ORM.</w:t>
+            </w:r>
+          </w:p>
+        </w:tc>
+      </w:tr>
+      <w:tr>
+        <w:tc>
+          <w:tcPr>
+            <w:tcW w:w="4814" w:type="dxa"/>
+            <w:vAlign w:val="center"/>
+          </w:tcPr>
+          <w:p>
+            <w:proofErr w:type="spellStart"/>
+            <w:r>
+              <w:rPr>
+                <w:rStyle w:val="Enfasigrassetto"/>
+              </w:rPr>
+              <w:t>Stripe</w:t>
+            </w:r>
+            <w:proofErr w:type="spellEnd"/>
+          </w:p>
+        </w:tc>
+        <w:tc>
+          <w:tcPr>
+            <w:tcW w:w="4814" w:type="dxa"/>
+            <w:vAlign w:val="center"/>
+          </w:tcPr>
+          <w:p>
+            <w:r>
+              <w:t>Piattaforma per i pagamenti online. Integrata nel progetto per gestire il checkout.</w:t>
+            </w:r>
+          </w:p>
+        </w:tc>
+      </w:tr>
+      <w:tr>
+        <w:tc>
+          <w:tcPr>
+            <w:tcW w:w="4814" w:type="dxa"/>
+            <w:vAlign w:val="center"/>
+          </w:tcPr>
+          <w:p>
+            <w:proofErr w:type="spellStart"/>
+            <w:r>
+              <w:rPr>
+                <w:rStyle w:val="Enfasigrassetto"/>
+              </w:rPr>
+              <w:t>Tailwind</w:t>
+            </w:r>
+            <w:proofErr w:type="spellEnd"/>
+            <w:r>
+              <w:rPr>
+                <w:rStyle w:val="Enfasigrassetto"/>
+              </w:rPr>
+              <w:t xml:space="preserve"> CSS</w:t>
+            </w:r>
+          </w:p>
+        </w:tc>
+        <w:tc>
+          <w:tcPr>
+            <w:tcW w:w="4814" w:type="dxa"/>
+            <w:vAlign w:val="center"/>
+          </w:tcPr>
+          <w:p>
+            <w:r>
+              <w:t>Framework CSS utility-first, utilizzato in Laravel Breeze per il layout delle pagine.</w:t>
+            </w:r>
+          </w:p>
+        </w:tc>
+      </w:tr>
+      <w:tr>
+        <w:tc>
+          <w:tcPr>
+            <w:tcW w:w="4814" w:type="dxa"/>
+            <w:vAlign w:val="center"/>
+          </w:tcPr>
+          <w:p>
+            <w:proofErr w:type="spellStart"/>
+            <w:r>
+              <w:rPr>
+                <w:rStyle w:val="Enfasigrassetto"/>
+              </w:rPr>
+              <w:t>Ubuntu</w:t>
+            </w:r>
+            <w:proofErr w:type="spellEnd"/>
+          </w:p>
+        </w:tc>
+        <w:tc>
+          <w:tcPr>
+            <w:tcW w:w="4814" w:type="dxa"/>
+            <w:vAlign w:val="center"/>
+          </w:tcPr>
+          <w:p>
+            <w:r>
+              <w:t>Distribuzione Linux utilizzata come sistema operativo del server di produzione. Versione: 5.15.0-119-generic.</w:t>
+            </w:r>
+          </w:p>
+        </w:tc>
+      </w:tr>
+      <w:tr>
+        <w:tc>
+          <w:tcPr>
+            <w:tcW w:w="4814" w:type="dxa"/>
+            <w:vAlign w:val="center"/>
+          </w:tcPr>
+          <w:p>
+            <w:proofErr w:type="spellStart"/>
+            <w:r>
+              <w:rPr>
+                <w:rStyle w:val="Enfasigrassetto"/>
+              </w:rPr>
+              <w:t>Validation</w:t>
+            </w:r>
+            <w:proofErr w:type="spellEnd"/>
+          </w:p>
+        </w:tc>
+        <w:tc>
+          <w:tcPr>
+            <w:tcW w:w="4814" w:type="dxa"/>
+            <w:vAlign w:val="center"/>
+          </w:tcPr>
+          <w:p>
+            <w:r>
+              <w:t xml:space="preserve">Controllo dei dati inseriti nei form. Laravel gestisce la validazione lato server con classi </w:t>
+            </w:r>
+            <w:proofErr w:type="spellStart"/>
+            <w:r>
+              <w:t>Request</w:t>
+            </w:r>
+            <w:proofErr w:type="spellEnd"/>
+            <w:r>
+              <w:t>.</w:t>
+            </w:r>
+          </w:p>
+        </w:tc>
+      </w:tr>
+      <w:tr>
+        <w:tc>
+          <w:tcPr>
+            <w:tcW w:w="4814" w:type="dxa"/>
+            <w:vAlign w:val="center"/>
+          </w:tcPr>
+          <w:p>
+            <w:r>
+              <w:rPr>
+                <w:rStyle w:val="Enfasigrassetto"/>
+              </w:rPr>
+              <w:t>Vendor</w:t>
+            </w:r>
+          </w:p>
+        </w:tc>
+        <w:tc>
+          <w:tcPr>
+            <w:tcW w:w="4814" w:type="dxa"/>
+            <w:vAlign w:val="center"/>
+          </w:tcPr>
+          <w:p>
+            <w:r>
+              <w:t>Nella struttura Laravel, cartella o componente responsabile per pacchetti esterni gestiti da Composer.</w:t>
+            </w:r>
+          </w:p>
+        </w:tc>
+      </w:tr>
+      <w:tr>
+        <w:tc>
+          <w:tcPr>
+            <w:tcW w:w="4814" w:type="dxa"/>
+            <w:vAlign w:val="center"/>
+          </w:tcPr>
+          <w:p>
+            <w:r>
+              <w:rPr>
+                <w:rStyle w:val="Enfasigrassetto"/>
+              </w:rPr>
+              <w:t>View</w:t>
+            </w:r>
+          </w:p>
+        </w:tc>
+        <w:tc>
+          <w:tcPr>
+            <w:tcW w:w="4814" w:type="dxa"/>
+            <w:vAlign w:val="center"/>
+          </w:tcPr>
+          <w:p>
+            <w:r>
+              <w:t xml:space="preserve">Componente dell’architettura MVC che definisce l’interfaccia utente (solitamente </w:t>
+            </w:r>
+            <w:proofErr w:type="gramStart"/>
+            <w:r>
+              <w:t xml:space="preserve">file </w:t>
+            </w:r>
+            <w:r>
+              <w:rPr>
+                <w:rStyle w:val="CodiceHTML"/>
+                <w:rFonts w:eastAsiaTheme="minorHAnsi"/>
+              </w:rPr>
+              <w:t>.</w:t>
+            </w:r>
+            <w:proofErr w:type="spellStart"/>
+            <w:proofErr w:type="gramEnd"/>
+            <w:r>
+              <w:rPr>
+                <w:rStyle w:val="CodiceHTML"/>
+                <w:rFonts w:eastAsiaTheme="minorHAnsi"/>
+              </w:rPr>
+              <w:t>blade.php</w:t>
+            </w:r>
+            <w:proofErr w:type="spellEnd"/>
+            <w:r>
+              <w:t xml:space="preserve"> in Laravel).</w:t>
+            </w:r>
+          </w:p>
+        </w:tc>
+      </w:tr>
+      <w:tr>
+        <w:tc>
+          <w:tcPr>
+            <w:tcW w:w="4814" w:type="dxa"/>
+            <w:vAlign w:val="center"/>
+          </w:tcPr>
+          <w:p>
+            <w:r>
+              <w:rPr>
+                <w:rStyle w:val="Enfasigrassetto"/>
+              </w:rPr>
+              <w:t>Visual Studio Code</w:t>
+            </w:r>
+          </w:p>
+        </w:tc>
+        <w:tc>
+          <w:tcPr>
+            <w:tcW w:w="4814" w:type="dxa"/>
+            <w:vAlign w:val="center"/>
+          </w:tcPr>
+          <w:p>
+            <w:r>
+              <w:t>Editor di codice utilizzato per lo sviluppo front-end o PHP. Versione: 1.78.2.</w:t>
+            </w:r>
+          </w:p>
+        </w:tc>
+      </w:tr>
+      <w:tr>
+        <w:tc>
+          <w:tcPr>
+            <w:tcW w:w="4814" w:type="dxa"/>
+            <w:vAlign w:val="center"/>
+          </w:tcPr>
+          <w:p>
+            <w:r>
+              <w:rPr>
+                <w:rStyle w:val="Enfasigrassetto"/>
+              </w:rPr>
+              <w:t>XSS (Cross Site Scripting)</w:t>
+            </w:r>
+          </w:p>
+        </w:tc>
+        <w:tc>
+          <w:tcPr>
+            <w:tcW w:w="4814" w:type="dxa"/>
+            <w:vAlign w:val="center"/>
+          </w:tcPr>
+          <w:p>
+            <w:r>
+              <w:t xml:space="preserve">Tipo di vulnerabilità prevenuta in Laravel grazie </w:t>
+            </w:r>
+            <w:proofErr w:type="spellStart"/>
+            <w:r>
+              <w:t>all’escape</w:t>
+            </w:r>
+            <w:proofErr w:type="spellEnd"/>
+            <w:r>
+              <w:t xml:space="preserve"> automatico delle variabili nelle </w:t>
+            </w:r>
+            <w:proofErr w:type="spellStart"/>
+            <w:r>
+              <w:t>Blade</w:t>
+            </w:r>
+            <w:proofErr w:type="spellEnd"/>
+            <w:r>
+              <w:t xml:space="preserve"> view.</w:t>
             </w:r>
           </w:p>
         </w:tc>
@@ -28012,12 +29327,8 @@
       <w:pPr>
         <w:rPr>
           <w:b/>
-          <w:lang w:val="it-IT"/>
-        </w:rPr>
-      </w:pPr>
-      <w:bookmarkStart w:id="68" w:name="_Toc94790469"/>
-      <w:bookmarkStart w:id="69" w:name="_GoBack"/>
-      <w:bookmarkEnd w:id="69"/>
+        </w:rPr>
+      </w:pPr>
     </w:p>
     <w:bookmarkEnd w:id="68"/>
     <w:p>
@@ -28033,10 +29344,10 @@
         </w:rPr>
         <w:t>Sitografia</w:t>
       </w:r>
-      <w:bookmarkStart w:id="70" w:name="_Toc461179234"/>
+      <w:bookmarkStart w:id="69" w:name="_Toc461179234"/>
       <w:bookmarkEnd w:id="65"/>
     </w:p>
-    <w:bookmarkEnd w:id="70"/>
+    <w:bookmarkEnd w:id="69"/>
     <w:p>
       <w:pPr>
         <w:pStyle w:val="Paragrafoelenco"/>
@@ -28084,7 +29395,7 @@
           <w:lang w:val="fr-CH"/>
         </w:rPr>
       </w:pPr>
-      <w:hyperlink r:id="rId46" w:history="1">
+      <w:hyperlink r:id="rId48" w:history="1">
         <w:r>
           <w:rPr>
             <w:rStyle w:val="Collegamentoipertestuale"/>
@@ -28119,7 +29430,7 @@
           <w:lang w:val="fr-CH"/>
         </w:rPr>
       </w:pPr>
-      <w:hyperlink r:id="rId47" w:history="1">
+      <w:hyperlink r:id="rId49" w:history="1">
         <w:r>
           <w:rPr>
             <w:rStyle w:val="Collegamentoipertestuale"/>
@@ -28138,7 +29449,7 @@
         </w:numPr>
         <w:spacing w:after="160" w:line="259" w:lineRule="auto"/>
       </w:pPr>
-      <w:hyperlink r:id="rId48" w:history="1">
+      <w:hyperlink r:id="rId50" w:history="1">
         <w:r>
           <w:rPr>
             <w:rStyle w:val="Collegamentoipertestuale"/>
@@ -28156,7 +29467,7 @@
         </w:numPr>
         <w:spacing w:after="160" w:line="259" w:lineRule="auto"/>
       </w:pPr>
-      <w:hyperlink r:id="rId49" w:history="1">
+      <w:hyperlink r:id="rId51" w:history="1">
         <w:r>
           <w:rPr>
             <w:rStyle w:val="Collegamentoipertestuale"/>
@@ -28177,7 +29488,7 @@
           <w:lang w:val="fr-CH"/>
         </w:rPr>
       </w:pPr>
-      <w:hyperlink r:id="rId50" w:history="1">
+      <w:hyperlink r:id="rId52" w:history="1">
         <w:r>
           <w:rPr>
             <w:rStyle w:val="Collegamentoipertestuale"/>
@@ -28212,7 +29523,7 @@
           <w:lang w:val="fr-CH"/>
         </w:rPr>
       </w:pPr>
-      <w:hyperlink r:id="rId51" w:history="1">
+      <w:hyperlink r:id="rId53" w:history="1">
         <w:r>
           <w:rPr>
             <w:rStyle w:val="Collegamentoipertestuale"/>
@@ -28253,7 +29564,7 @@
           <w:lang w:val="fr-CH"/>
         </w:rPr>
       </w:pPr>
-      <w:hyperlink r:id="rId52" w:history="1">
+      <w:hyperlink r:id="rId54" w:history="1">
         <w:r>
           <w:rPr>
             <w:rStyle w:val="Collegamentoipertestuale"/>
@@ -28289,203 +29600,15 @@
         </w:rPr>
         <w:t>Tutorials</w:t>
       </w:r>
+      <w:bookmarkStart w:id="70" w:name="_GoBack"/>
+      <w:bookmarkEnd w:id="70"/>
       <w:proofErr w:type="spellEnd"/>
     </w:p>
-    <w:p>
-      <w:pPr>
-        <w:pStyle w:val="Titolo1"/>
-        <w:rPr>
-          <w:lang w:val="it-IT"/>
-        </w:rPr>
-      </w:pPr>
-      <w:bookmarkStart w:id="71" w:name="_Toc461179235"/>
-      <w:bookmarkStart w:id="72" w:name="_Toc94790473"/>
-      <w:bookmarkStart w:id="73" w:name="_Toc189853881"/>
-      <w:r>
-        <w:rPr>
-          <w:lang w:val="it-IT"/>
-        </w:rPr>
-        <w:t>Allegati</w:t>
-      </w:r>
-      <w:bookmarkEnd w:id="71"/>
-      <w:bookmarkEnd w:id="72"/>
-      <w:bookmarkEnd w:id="73"/>
-    </w:p>
-    <w:p>
-      <w:pPr>
-        <w:rPr>
-          <w:lang w:val="it-IT"/>
-        </w:rPr>
-      </w:pPr>
-      <w:r>
-        <w:rPr>
-          <w:lang w:val="it-IT"/>
-        </w:rPr>
-        <w:t>Elenco degli allegati, esempio:</w:t>
-      </w:r>
-    </w:p>
-    <w:p>
-      <w:pPr>
-        <w:numPr>
-          <w:ilvl w:val="0"/>
-          <w:numId w:val="5"/>
-        </w:numPr>
-      </w:pPr>
-      <w:r>
-        <w:rPr>
-          <w:lang w:val="it-IT"/>
-        </w:rPr>
-        <w:t xml:space="preserve">Diari di lavoro </w:t>
-      </w:r>
-    </w:p>
-    <w:p>
-      <w:pPr>
-        <w:numPr>
-          <w:ilvl w:val="0"/>
-          <w:numId w:val="5"/>
-        </w:numPr>
-        <w:rPr>
-          <w:lang w:val="it-IT"/>
-        </w:rPr>
-      </w:pPr>
-      <w:r>
-        <w:rPr>
-          <w:lang w:val="it-IT"/>
-        </w:rPr>
-        <w:t>Codici sorgente</w:t>
-      </w:r>
-      <w:r>
-        <w:rPr>
-          <w:lang w:val="it-IT"/>
-        </w:rPr>
-        <w:t>/documentazione macchine virtuali</w:t>
-      </w:r>
-    </w:p>
-    <w:p>
-      <w:pPr>
-        <w:numPr>
-          <w:ilvl w:val="0"/>
-          <w:numId w:val="5"/>
-        </w:numPr>
-        <w:rPr>
-          <w:lang w:val="it-IT"/>
-        </w:rPr>
-      </w:pPr>
-      <w:r>
-        <w:rPr>
-          <w:lang w:val="it-IT"/>
-        </w:rPr>
-        <w:t>Istruzioni di installazione</w:t>
-      </w:r>
-      <w:r>
-        <w:rPr>
-          <w:lang w:val="it-IT"/>
-        </w:rPr>
-        <w:t xml:space="preserve"> del prodotto (con credenziali di accesso) e/o di eventuali prodotti terzi</w:t>
-      </w:r>
-    </w:p>
-    <w:p>
-      <w:pPr>
-        <w:numPr>
-          <w:ilvl w:val="0"/>
-          <w:numId w:val="5"/>
-        </w:numPr>
-        <w:rPr>
-          <w:lang w:val="it-IT"/>
-        </w:rPr>
-      </w:pPr>
-      <w:r>
-        <w:rPr>
-          <w:lang w:val="it-IT"/>
-        </w:rPr>
-        <w:t>Documentazione di prodotti di terzi</w:t>
-      </w:r>
-    </w:p>
-    <w:p>
-      <w:pPr>
-        <w:numPr>
-          <w:ilvl w:val="0"/>
-          <w:numId w:val="5"/>
-        </w:numPr>
-        <w:rPr>
-          <w:lang w:val="it-IT"/>
-        </w:rPr>
-      </w:pPr>
-      <w:r>
-        <w:rPr>
-          <w:lang w:val="it-IT"/>
-        </w:rPr>
-        <w:t>Eventuali guide utente /</w:t>
-      </w:r>
-      <w:r>
-        <w:rPr>
-          <w:lang w:val="it-IT"/>
-        </w:rPr>
-        <w:t xml:space="preserve"> </w:t>
-      </w:r>
-      <w:r>
-        <w:rPr>
-          <w:lang w:val="it-IT"/>
-        </w:rPr>
-        <w:t>Manuali di utilizzo</w:t>
-      </w:r>
-    </w:p>
-    <w:p>
-      <w:pPr>
-        <w:numPr>
-          <w:ilvl w:val="0"/>
-          <w:numId w:val="5"/>
-        </w:numPr>
-      </w:pPr>
-      <w:r>
-        <w:rPr>
-          <w:lang w:val="it-IT"/>
-        </w:rPr>
-        <w:t>Mandato e/o Qd</w:t>
-      </w:r>
-      <w:r>
-        <w:rPr>
-          <w:lang w:val="it-IT"/>
-        </w:rPr>
-        <w:t>C</w:t>
-      </w:r>
-    </w:p>
-    <w:p>
-      <w:pPr>
-        <w:numPr>
-          <w:ilvl w:val="0"/>
-          <w:numId w:val="5"/>
-        </w:numPr>
-      </w:pPr>
-      <w:r>
-        <w:t>Prodotto</w:t>
-      </w:r>
-    </w:p>
-    <w:p>
-      <w:pPr>
-        <w:numPr>
-          <w:ilvl w:val="0"/>
-          <w:numId w:val="5"/>
-        </w:numPr>
-      </w:pPr>
-      <w:r>
-        <w:rPr>
-          <w:lang w:val="it-IT"/>
-        </w:rPr>
-        <w:t>…</w:t>
-      </w:r>
-    </w:p>
-    <w:p/>
-    <w:p>
-      <w:pPr>
-        <w:jc w:val="both"/>
-      </w:pPr>
-    </w:p>
     <w:sectPr>
-      <w:headerReference w:type="default" r:id="rId53"/>
-      <w:footerReference w:type="default" r:id="rId54"/>
-      <w:headerReference w:type="first" r:id="rId55"/>
-      <w:footerReference w:type="first" r:id="rId56"/>
+      <w:headerReference w:type="default" r:id="rId55"/>
+      <w:footerReference w:type="default" r:id="rId56"/>
+      <w:headerReference w:type="first" r:id="rId57"/>
+      <w:footerReference w:type="first" r:id="rId58"/>
       <w:pgSz w:w="11906" w:h="16838"/>
       <w:pgMar w:top="1985" w:right="1134" w:bottom="1418" w:left="1134" w:header="567" w:footer="567" w:gutter="0"/>
       <w:pgNumType w:start="1"/>
@@ -30490,6 +31613,119 @@
     </w:lvl>
   </w:abstractNum>
   <w:abstractNum w:abstractNumId="8" w15:restartNumberingAfterBreak="0">
+    <w:nsid w:val="20A62C4F"/>
+    <w:multiLevelType w:val="hybridMultilevel"/>
+    <w:tmpl w:val="40266D42"/>
+    <w:lvl w:ilvl="0" w:tplc="0810000F">
+      <w:start w:val="1"/>
+      <w:numFmt w:val="decimal"/>
+      <w:lvlText w:val="%1."/>
+      <w:lvlJc w:val="left"/>
+      <w:pPr>
+        <w:ind w:left="720" w:hanging="360"/>
+      </w:pPr>
+      <w:rPr>
+        <w:rFonts w:hint="default"/>
+      </w:rPr>
+    </w:lvl>
+    <w:lvl w:ilvl="1" w:tplc="08100003" w:tentative="1">
+      <w:start w:val="1"/>
+      <w:numFmt w:val="bullet"/>
+      <w:lvlText w:val="o"/>
+      <w:lvlJc w:val="left"/>
+      <w:pPr>
+        <w:ind w:left="1440" w:hanging="360"/>
+      </w:pPr>
+      <w:rPr>
+        <w:rFonts w:ascii="Courier New" w:hAnsi="Courier New" w:cs="Courier New" w:hint="default"/>
+      </w:rPr>
+    </w:lvl>
+    <w:lvl w:ilvl="2" w:tplc="08100005" w:tentative="1">
+      <w:start w:val="1"/>
+      <w:numFmt w:val="bullet"/>
+      <w:lvlText w:val=""/>
+      <w:lvlJc w:val="left"/>
+      <w:pPr>
+        <w:ind w:left="2160" w:hanging="360"/>
+      </w:pPr>
+      <w:rPr>
+        <w:rFonts w:ascii="Wingdings" w:hAnsi="Wingdings" w:hint="default"/>
+      </w:rPr>
+    </w:lvl>
+    <w:lvl w:ilvl="3" w:tplc="08100001" w:tentative="1">
+      <w:start w:val="1"/>
+      <w:numFmt w:val="bullet"/>
+      <w:lvlText w:val=""/>
+      <w:lvlJc w:val="left"/>
+      <w:pPr>
+        <w:ind w:left="2880" w:hanging="360"/>
+      </w:pPr>
+      <w:rPr>
+        <w:rFonts w:ascii="Symbol" w:hAnsi="Symbol" w:hint="default"/>
+      </w:rPr>
+    </w:lvl>
+    <w:lvl w:ilvl="4" w:tplc="08100003" w:tentative="1">
+      <w:start w:val="1"/>
+      <w:numFmt w:val="bullet"/>
+      <w:lvlText w:val="o"/>
+      <w:lvlJc w:val="left"/>
+      <w:pPr>
+        <w:ind w:left="3600" w:hanging="360"/>
+      </w:pPr>
+      <w:rPr>
+        <w:rFonts w:ascii="Courier New" w:hAnsi="Courier New" w:cs="Courier New" w:hint="default"/>
+      </w:rPr>
+    </w:lvl>
+    <w:lvl w:ilvl="5" w:tplc="08100005" w:tentative="1">
+      <w:start w:val="1"/>
+      <w:numFmt w:val="bullet"/>
+      <w:lvlText w:val=""/>
+      <w:lvlJc w:val="left"/>
+      <w:pPr>
+        <w:ind w:left="4320" w:hanging="360"/>
+      </w:pPr>
+      <w:rPr>
+        <w:rFonts w:ascii="Wingdings" w:hAnsi="Wingdings" w:hint="default"/>
+      </w:rPr>
+    </w:lvl>
+    <w:lvl w:ilvl="6" w:tplc="08100001" w:tentative="1">
+      <w:start w:val="1"/>
+      <w:numFmt w:val="bullet"/>
+      <w:lvlText w:val=""/>
+      <w:lvlJc w:val="left"/>
+      <w:pPr>
+        <w:ind w:left="5040" w:hanging="360"/>
+      </w:pPr>
+      <w:rPr>
+        <w:rFonts w:ascii="Symbol" w:hAnsi="Symbol" w:hint="default"/>
+      </w:rPr>
+    </w:lvl>
+    <w:lvl w:ilvl="7" w:tplc="08100003" w:tentative="1">
+      <w:start w:val="1"/>
+      <w:numFmt w:val="bullet"/>
+      <w:lvlText w:val="o"/>
+      <w:lvlJc w:val="left"/>
+      <w:pPr>
+        <w:ind w:left="5760" w:hanging="360"/>
+      </w:pPr>
+      <w:rPr>
+        <w:rFonts w:ascii="Courier New" w:hAnsi="Courier New" w:cs="Courier New" w:hint="default"/>
+      </w:rPr>
+    </w:lvl>
+    <w:lvl w:ilvl="8" w:tplc="08100005" w:tentative="1">
+      <w:start w:val="1"/>
+      <w:numFmt w:val="bullet"/>
+      <w:lvlText w:val=""/>
+      <w:lvlJc w:val="left"/>
+      <w:pPr>
+        <w:ind w:left="6480" w:hanging="360"/>
+      </w:pPr>
+      <w:rPr>
+        <w:rFonts w:ascii="Wingdings" w:hAnsi="Wingdings" w:hint="default"/>
+      </w:rPr>
+    </w:lvl>
+  </w:abstractNum>
+  <w:abstractNum w:abstractNumId="9" w15:restartNumberingAfterBreak="0">
     <w:nsid w:val="20DD04AA"/>
     <w:multiLevelType w:val="multilevel"/>
     <w:tmpl w:val="16BA2774"/>
@@ -30638,7 +31874,7 @@
       </w:rPr>
     </w:lvl>
   </w:abstractNum>
-  <w:abstractNum w:abstractNumId="9" w15:restartNumberingAfterBreak="0">
+  <w:abstractNum w:abstractNumId="10" w15:restartNumberingAfterBreak="0">
     <w:nsid w:val="22DC02CA"/>
     <w:multiLevelType w:val="hybridMultilevel"/>
     <w:tmpl w:val="3E6C221C"/>
@@ -30778,7 +32014,7 @@
       </w:rPr>
     </w:lvl>
   </w:abstractNum>
-  <w:abstractNum w:abstractNumId="10" w15:restartNumberingAfterBreak="0">
+  <w:abstractNum w:abstractNumId="11" w15:restartNumberingAfterBreak="0">
     <w:nsid w:val="24A46D31"/>
     <w:multiLevelType w:val="hybridMultilevel"/>
     <w:tmpl w:val="A56221F0"/>
@@ -30891,7 +32127,7 @@
       </w:pPr>
     </w:lvl>
   </w:abstractNum>
-  <w:abstractNum w:abstractNumId="11" w15:restartNumberingAfterBreak="0">
+  <w:abstractNum w:abstractNumId="12" w15:restartNumberingAfterBreak="0">
     <w:nsid w:val="29456697"/>
     <w:multiLevelType w:val="hybridMultilevel"/>
     <w:tmpl w:val="E676C64A"/>
@@ -31004,7 +32240,7 @@
       </w:rPr>
     </w:lvl>
   </w:abstractNum>
-  <w:abstractNum w:abstractNumId="12" w15:restartNumberingAfterBreak="0">
+  <w:abstractNum w:abstractNumId="13" w15:restartNumberingAfterBreak="0">
     <w:nsid w:val="2B9476EC"/>
     <w:multiLevelType w:val="hybridMultilevel"/>
     <w:tmpl w:val="0052BF5C"/>
@@ -31117,7 +32353,7 @@
       </w:rPr>
     </w:lvl>
   </w:abstractNum>
-  <w:abstractNum w:abstractNumId="13" w15:restartNumberingAfterBreak="0">
+  <w:abstractNum w:abstractNumId="14" w15:restartNumberingAfterBreak="0">
     <w:nsid w:val="329D7C3E"/>
     <w:multiLevelType w:val="hybridMultilevel"/>
     <w:tmpl w:val="56E4CEE4"/>
@@ -31230,7 +32466,7 @@
       </w:rPr>
     </w:lvl>
   </w:abstractNum>
-  <w:abstractNum w:abstractNumId="14" w15:restartNumberingAfterBreak="0">
+  <w:abstractNum w:abstractNumId="15" w15:restartNumberingAfterBreak="0">
     <w:nsid w:val="37475F77"/>
     <w:multiLevelType w:val="hybridMultilevel"/>
     <w:tmpl w:val="1FE86E3E"/>
@@ -31343,7 +32579,7 @@
       </w:rPr>
     </w:lvl>
   </w:abstractNum>
-  <w:abstractNum w:abstractNumId="15" w15:restartNumberingAfterBreak="0">
+  <w:abstractNum w:abstractNumId="16" w15:restartNumberingAfterBreak="0">
     <w:nsid w:val="3ADC387C"/>
     <w:multiLevelType w:val="hybridMultilevel"/>
     <w:tmpl w:val="32E4A98A"/>
@@ -31455,7 +32691,7 @@
       </w:rPr>
     </w:lvl>
   </w:abstractNum>
-  <w:abstractNum w:abstractNumId="16" w15:restartNumberingAfterBreak="0">
+  <w:abstractNum w:abstractNumId="17" w15:restartNumberingAfterBreak="0">
     <w:nsid w:val="47990852"/>
     <w:multiLevelType w:val="hybridMultilevel"/>
     <w:tmpl w:val="A79A31A0"/>
@@ -31568,7 +32804,7 @@
       </w:rPr>
     </w:lvl>
   </w:abstractNum>
-  <w:abstractNum w:abstractNumId="17" w15:restartNumberingAfterBreak="0">
+  <w:abstractNum w:abstractNumId="18" w15:restartNumberingAfterBreak="0">
     <w:nsid w:val="521421D7"/>
     <w:multiLevelType w:val="hybridMultilevel"/>
     <w:tmpl w:val="E3CA5F50"/>
@@ -31681,7 +32917,7 @@
       </w:rPr>
     </w:lvl>
   </w:abstractNum>
-  <w:abstractNum w:abstractNumId="18" w15:restartNumberingAfterBreak="0">
+  <w:abstractNum w:abstractNumId="19" w15:restartNumberingAfterBreak="0">
     <w:nsid w:val="57B45EDA"/>
     <w:multiLevelType w:val="hybridMultilevel"/>
     <w:tmpl w:val="9FF06B16"/>
@@ -31794,7 +33030,7 @@
       </w:rPr>
     </w:lvl>
   </w:abstractNum>
-  <w:abstractNum w:abstractNumId="19" w15:restartNumberingAfterBreak="0">
+  <w:abstractNum w:abstractNumId="20" w15:restartNumberingAfterBreak="0">
     <w:nsid w:val="57C86EE7"/>
     <w:multiLevelType w:val="multilevel"/>
     <w:tmpl w:val="4DE6CDEC"/>
@@ -31943,7 +33179,7 @@
       </w:rPr>
     </w:lvl>
   </w:abstractNum>
-  <w:abstractNum w:abstractNumId="20" w15:restartNumberingAfterBreak="0">
+  <w:abstractNum w:abstractNumId="21" w15:restartNumberingAfterBreak="0">
     <w:nsid w:val="5BF17B39"/>
     <w:multiLevelType w:val="hybridMultilevel"/>
     <w:tmpl w:val="0BAC2BA8"/>
@@ -32056,7 +33292,7 @@
       </w:rPr>
     </w:lvl>
   </w:abstractNum>
-  <w:abstractNum w:abstractNumId="21" w15:restartNumberingAfterBreak="0">
+  <w:abstractNum w:abstractNumId="22" w15:restartNumberingAfterBreak="0">
     <w:nsid w:val="630454C8"/>
     <w:multiLevelType w:val="hybridMultilevel"/>
     <w:tmpl w:val="7ED05666"/>
@@ -32169,7 +33405,7 @@
       </w:rPr>
     </w:lvl>
   </w:abstractNum>
-  <w:abstractNum w:abstractNumId="22" w15:restartNumberingAfterBreak="0">
+  <w:abstractNum w:abstractNumId="23" w15:restartNumberingAfterBreak="0">
     <w:nsid w:val="652809B9"/>
     <w:multiLevelType w:val="hybridMultilevel"/>
     <w:tmpl w:val="C10EC632"/>
@@ -32282,7 +33518,7 @@
       </w:rPr>
     </w:lvl>
   </w:abstractNum>
-  <w:abstractNum w:abstractNumId="23" w15:restartNumberingAfterBreak="0">
+  <w:abstractNum w:abstractNumId="24" w15:restartNumberingAfterBreak="0">
     <w:nsid w:val="66871ECE"/>
     <w:multiLevelType w:val="hybridMultilevel"/>
     <w:tmpl w:val="7F74FC56"/>
@@ -32398,7 +33634,7 @@
       </w:pPr>
     </w:lvl>
   </w:abstractNum>
-  <w:abstractNum w:abstractNumId="24" w15:restartNumberingAfterBreak="0">
+  <w:abstractNum w:abstractNumId="25" w15:restartNumberingAfterBreak="0">
     <w:nsid w:val="6ABE5228"/>
     <w:multiLevelType w:val="hybridMultilevel"/>
     <w:tmpl w:val="089EE6D8"/>
@@ -32514,7 +33750,7 @@
       </w:pPr>
     </w:lvl>
   </w:abstractNum>
-  <w:abstractNum w:abstractNumId="25" w15:restartNumberingAfterBreak="0">
+  <w:abstractNum w:abstractNumId="26" w15:restartNumberingAfterBreak="0">
     <w:nsid w:val="6AEC2345"/>
     <w:multiLevelType w:val="hybridMultilevel"/>
     <w:tmpl w:val="4C7E04BC"/>
@@ -32626,7 +33862,7 @@
       </w:rPr>
     </w:lvl>
   </w:abstractNum>
-  <w:abstractNum w:abstractNumId="26" w15:restartNumberingAfterBreak="0">
+  <w:abstractNum w:abstractNumId="27" w15:restartNumberingAfterBreak="0">
     <w:nsid w:val="6BC235CB"/>
     <w:multiLevelType w:val="hybridMultilevel"/>
     <w:tmpl w:val="E448411A"/>
@@ -32739,7 +33975,7 @@
       </w:rPr>
     </w:lvl>
   </w:abstractNum>
-  <w:abstractNum w:abstractNumId="27" w15:restartNumberingAfterBreak="0">
+  <w:abstractNum w:abstractNumId="28" w15:restartNumberingAfterBreak="0">
     <w:nsid w:val="6C1D7334"/>
     <w:multiLevelType w:val="hybridMultilevel"/>
     <w:tmpl w:val="7F20929C"/>
@@ -32855,7 +34091,7 @@
       </w:pPr>
     </w:lvl>
   </w:abstractNum>
-  <w:abstractNum w:abstractNumId="28" w15:restartNumberingAfterBreak="0">
+  <w:abstractNum w:abstractNumId="29" w15:restartNumberingAfterBreak="0">
     <w:nsid w:val="6C827815"/>
     <w:multiLevelType w:val="hybridMultilevel"/>
     <w:tmpl w:val="61685374"/>
@@ -32968,7 +34204,7 @@
       </w:rPr>
     </w:lvl>
   </w:abstractNum>
-  <w:abstractNum w:abstractNumId="29" w15:restartNumberingAfterBreak="0">
+  <w:abstractNum w:abstractNumId="30" w15:restartNumberingAfterBreak="0">
     <w:nsid w:val="72904C79"/>
     <w:multiLevelType w:val="hybridMultilevel"/>
     <w:tmpl w:val="EB328896"/>
@@ -33108,7 +34344,7 @@
       </w:rPr>
     </w:lvl>
   </w:abstractNum>
-  <w:abstractNum w:abstractNumId="30" w15:restartNumberingAfterBreak="0">
+  <w:abstractNum w:abstractNumId="31" w15:restartNumberingAfterBreak="0">
     <w:nsid w:val="74274153"/>
     <w:multiLevelType w:val="hybridMultilevel"/>
     <w:tmpl w:val="903850E8"/>
@@ -33221,7 +34457,7 @@
       </w:rPr>
     </w:lvl>
   </w:abstractNum>
-  <w:abstractNum w:abstractNumId="31" w15:restartNumberingAfterBreak="0">
+  <w:abstractNum w:abstractNumId="32" w15:restartNumberingAfterBreak="0">
     <w:nsid w:val="76DB06C3"/>
     <w:multiLevelType w:val="hybridMultilevel"/>
     <w:tmpl w:val="31DC0C44"/>
@@ -33334,7 +34570,7 @@
       </w:rPr>
     </w:lvl>
   </w:abstractNum>
-  <w:abstractNum w:abstractNumId="32" w15:restartNumberingAfterBreak="0">
+  <w:abstractNum w:abstractNumId="33" w15:restartNumberingAfterBreak="0">
     <w:nsid w:val="79102060"/>
     <w:multiLevelType w:val="hybridMultilevel"/>
     <w:tmpl w:val="7870C630"/>
@@ -33447,7 +34683,7 @@
       </w:rPr>
     </w:lvl>
   </w:abstractNum>
-  <w:abstractNum w:abstractNumId="33" w15:restartNumberingAfterBreak="0">
+  <w:abstractNum w:abstractNumId="34" w15:restartNumberingAfterBreak="0">
     <w:nsid w:val="7ACC392C"/>
     <w:multiLevelType w:val="hybridMultilevel"/>
     <w:tmpl w:val="F282F7F0"/>
@@ -33587,7 +34823,7 @@
       </w:rPr>
     </w:lvl>
   </w:abstractNum>
-  <w:abstractNum w:abstractNumId="34" w15:restartNumberingAfterBreak="0">
+  <w:abstractNum w:abstractNumId="35" w15:restartNumberingAfterBreak="0">
     <w:nsid w:val="7CD54937"/>
     <w:multiLevelType w:val="hybridMultilevel"/>
     <w:tmpl w:val="1AB0305A"/>
@@ -33727,7 +34963,7 @@
       </w:rPr>
     </w:lvl>
   </w:abstractNum>
-  <w:abstractNum w:abstractNumId="35" w15:restartNumberingAfterBreak="0">
+  <w:abstractNum w:abstractNumId="36" w15:restartNumberingAfterBreak="0">
     <w:nsid w:val="7F593CD8"/>
     <w:multiLevelType w:val="hybridMultilevel"/>
     <w:tmpl w:val="3508C29C"/>
@@ -33841,13 +35077,13 @@
     </w:lvl>
   </w:abstractNum>
   <w:num w:numId="1">
-    <w:abstractNumId w:val="19"/>
+    <w:abstractNumId w:val="20"/>
   </w:num>
   <w:num w:numId="2">
     <w:abstractNumId w:val="4"/>
   </w:num>
   <w:num w:numId="3">
-    <w:abstractNumId w:val="9"/>
+    <w:abstractNumId w:val="10"/>
   </w:num>
   <w:num w:numId="4">
     <w:abstractNumId w:val="1"/>
@@ -33856,22 +35092,22 @@
     <w:abstractNumId w:val="5"/>
   </w:num>
   <w:num w:numId="6">
-    <w:abstractNumId w:val="23"/>
+    <w:abstractNumId w:val="24"/>
   </w:num>
   <w:num w:numId="7">
-    <w:abstractNumId w:val="10"/>
+    <w:abstractNumId w:val="11"/>
   </w:num>
   <w:num w:numId="8">
-    <w:abstractNumId w:val="24"/>
+    <w:abstractNumId w:val="25"/>
   </w:num>
   <w:num w:numId="9">
     <w:abstractNumId w:val="0"/>
   </w:num>
   <w:num w:numId="10">
-    <w:abstractNumId w:val="29"/>
+    <w:abstractNumId w:val="30"/>
   </w:num>
   <w:num w:numId="11">
-    <w:abstractNumId w:val="33"/>
+    <w:abstractNumId w:val="34"/>
   </w:num>
   <w:num w:numId="12">
     <w:abstractNumId w:val="6"/>
@@ -33880,43 +35116,43 @@
     <w:abstractNumId w:val="2"/>
   </w:num>
   <w:num w:numId="14">
-    <w:abstractNumId w:val="34"/>
+    <w:abstractNumId w:val="35"/>
   </w:num>
   <w:num w:numId="15">
     <w:abstractNumId w:val="7"/>
   </w:num>
   <w:num w:numId="16">
-    <w:abstractNumId w:val="19"/>
+    <w:abstractNumId w:val="20"/>
   </w:num>
   <w:num w:numId="17">
-    <w:abstractNumId w:val="27"/>
+    <w:abstractNumId w:val="28"/>
   </w:num>
   <w:num w:numId="18">
-    <w:abstractNumId w:val="19"/>
+    <w:abstractNumId w:val="20"/>
   </w:num>
   <w:num w:numId="19">
-    <w:abstractNumId w:val="19"/>
+    <w:abstractNumId w:val="20"/>
   </w:num>
   <w:num w:numId="20">
-    <w:abstractNumId w:val="19"/>
+    <w:abstractNumId w:val="20"/>
   </w:num>
   <w:num w:numId="21">
-    <w:abstractNumId w:val="19"/>
+    <w:abstractNumId w:val="20"/>
   </w:num>
   <w:num w:numId="22">
-    <w:abstractNumId w:val="19"/>
+    <w:abstractNumId w:val="20"/>
   </w:num>
   <w:num w:numId="23">
-    <w:abstractNumId w:val="22"/>
+    <w:abstractNumId w:val="23"/>
   </w:num>
   <w:num w:numId="24">
-    <w:abstractNumId w:val="19"/>
+    <w:abstractNumId w:val="20"/>
   </w:num>
   <w:num w:numId="25">
-    <w:abstractNumId w:val="19"/>
+    <w:abstractNumId w:val="20"/>
   </w:num>
   <w:num w:numId="26">
-    <w:abstractNumId w:val="19"/>
+    <w:abstractNumId w:val="20"/>
     <w:lvlOverride w:ilvl="0">
       <w:startOverride w:val="2"/>
     </w:lvlOverride>
@@ -33925,61 +35161,64 @@
     </w:lvlOverride>
   </w:num>
   <w:num w:numId="27">
+    <w:abstractNumId w:val="32"/>
+  </w:num>
+  <w:num w:numId="28">
+    <w:abstractNumId w:val="13"/>
+  </w:num>
+  <w:num w:numId="29">
+    <w:abstractNumId w:val="16"/>
+  </w:num>
+  <w:num w:numId="30">
+    <w:abstractNumId w:val="12"/>
+  </w:num>
+  <w:num w:numId="31">
+    <w:abstractNumId w:val="33"/>
+  </w:num>
+  <w:num w:numId="32">
+    <w:abstractNumId w:val="36"/>
+  </w:num>
+  <w:num w:numId="33">
+    <w:abstractNumId w:val="27"/>
+  </w:num>
+  <w:num w:numId="34">
+    <w:abstractNumId w:val="19"/>
+  </w:num>
+  <w:num w:numId="35">
     <w:abstractNumId w:val="31"/>
   </w:num>
-  <w:num w:numId="28">
-    <w:abstractNumId w:val="12"/>
+  <w:num w:numId="36">
+    <w:abstractNumId w:val="29"/>
   </w:num>
-  <w:num w:numId="29">
+  <w:num w:numId="37">
+    <w:abstractNumId w:val="21"/>
+  </w:num>
+  <w:num w:numId="38">
+    <w:abstractNumId w:val="14"/>
+  </w:num>
+  <w:num w:numId="39">
+    <w:abstractNumId w:val="9"/>
+  </w:num>
+  <w:num w:numId="40">
+    <w:abstractNumId w:val="18"/>
+  </w:num>
+  <w:num w:numId="41">
     <w:abstractNumId w:val="15"/>
   </w:num>
-  <w:num w:numId="30">
-    <w:abstractNumId w:val="11"/>
-  </w:num>
-  <w:num w:numId="31">
-    <w:abstractNumId w:val="32"/>
-  </w:num>
-  <w:num w:numId="32">
-    <w:abstractNumId w:val="35"/>
-  </w:num>
-  <w:num w:numId="33">
-    <w:abstractNumId w:val="26"/>
-  </w:num>
-  <w:num w:numId="34">
-    <w:abstractNumId w:val="18"/>
-  </w:num>
-  <w:num w:numId="35">
-    <w:abstractNumId w:val="30"/>
-  </w:num>
-  <w:num w:numId="36">
-    <w:abstractNumId w:val="28"/>
-  </w:num>
-  <w:num w:numId="37">
-    <w:abstractNumId w:val="20"/>
-  </w:num>
-  <w:num w:numId="38">
-    <w:abstractNumId w:val="13"/>
-  </w:num>
-  <w:num w:numId="39">
-    <w:abstractNumId w:val="8"/>
-  </w:num>
-  <w:num w:numId="40">
-    <w:abstractNumId w:val="17"/>
-  </w:num>
-  <w:num w:numId="41">
-    <w:abstractNumId w:val="14"/>
-  </w:num>
   <w:num w:numId="42">
-    <w:abstractNumId w:val="21"/>
+    <w:abstractNumId w:val="22"/>
   </w:num>
   <w:num w:numId="43">
     <w:abstractNumId w:val="3"/>
   </w:num>
   <w:num w:numId="44">
-    <w:abstractNumId w:val="16"/>
+    <w:abstractNumId w:val="17"/>
   </w:num>
   <w:num w:numId="45">
-    <w:abstractNumId w:val="25"/>
+    <w:abstractNumId w:val="26"/>
+  </w:num>
+  <w:num w:numId="46">
+    <w:abstractNumId w:val="8"/>
   </w:num>
   <w:numIdMacAtCleanup w:val="14"/>
 </w:numbering>
@@ -35416,7 +36655,7 @@
 </file>
 
 <file path=customXml/itemProps1.xml><?xml version="1.0" encoding="utf-8"?>
-<ds:datastoreItem xmlns:ds="http://schemas.openxmlformats.org/officeDocument/2006/customXml" ds:itemID="{924B3895-C1B2-4696-9259-A5CB31EEF36B}">
+<ds:datastoreItem xmlns:ds="http://schemas.openxmlformats.org/officeDocument/2006/customXml" ds:itemID="{335D473B-5859-4268-A057-C48F8CE0B4B9}">
   <ds:schemaRefs>
     <ds:schemaRef ds:uri="http://schemas.openxmlformats.org/officeDocument/2006/bibliography"/>
   </ds:schemaRefs>

</xml_diff>